<commit_message>
Align customer flow description with diagram including decision steps
</commit_message>
<xml_diff>
--- a/docs/Project-planning.docx
+++ b/docs/Project-planning.docx
@@ -172,7 +172,6 @@
           <w:rFonts w:ascii="Calibri" w:hAnsi="Calibri" w:cs="Calibri"/>
           <w:sz w:val="24"/>
           <w:szCs w:val="24"/>
-          <w:lang w:val="ru-RU"/>
         </w:rPr>
       </w:pPr>
     </w:p>
@@ -229,7 +228,6 @@
           <w:rFonts w:ascii="Calibri" w:hAnsi="Calibri" w:cs="Calibri"/>
           <w:sz w:val="24"/>
           <w:szCs w:val="24"/>
-          <w:lang w:val="ru-RU"/>
         </w:rPr>
       </w:pPr>
     </w:p>
@@ -291,7 +289,6 @@
           <w:rFonts w:ascii="Calibri" w:hAnsi="Calibri" w:cs="Calibri"/>
           <w:sz w:val="24"/>
           <w:szCs w:val="24"/>
-          <w:lang w:val="ru-RU"/>
         </w:rPr>
       </w:pPr>
       <w:r>
@@ -309,7 +306,6 @@
           <w:rFonts w:ascii="Calibri" w:hAnsi="Calibri" w:cs="Calibri"/>
           <w:sz w:val="24"/>
           <w:szCs w:val="24"/>
-          <w:lang w:val="ru-RU"/>
         </w:rPr>
       </w:pPr>
     </w:p>
@@ -351,7 +347,6 @@
           <w:bCs/>
           <w:sz w:val="24"/>
           <w:szCs w:val="24"/>
-          <w:lang w:val="ru-RU"/>
         </w:rPr>
       </w:pPr>
       <w:r>
@@ -451,7 +446,6 @@
           <w:rFonts w:ascii="Calibri" w:hAnsi="Calibri" w:cs="Calibri"/>
           <w:sz w:val="24"/>
           <w:szCs w:val="24"/>
-          <w:lang w:val="ru-RU"/>
         </w:rPr>
       </w:pPr>
       <w:r>
@@ -559,7 +553,6 @@
           <w:rFonts w:ascii="Calibri" w:hAnsi="Calibri" w:cs="Calibri"/>
           <w:sz w:val="24"/>
           <w:szCs w:val="24"/>
-          <w:lang w:val="ru-RU"/>
         </w:rPr>
       </w:pPr>
       <w:r>
@@ -632,7 +625,6 @@
           <w:rFonts w:ascii="Calibri" w:hAnsi="Calibri" w:cs="Calibri"/>
           <w:sz w:val="24"/>
           <w:szCs w:val="24"/>
-          <w:lang w:val="ru-RU"/>
         </w:rPr>
       </w:pPr>
       <w:r>
@@ -705,7 +697,6 @@
           <w:rFonts w:ascii="Calibri" w:hAnsi="Calibri" w:cs="Calibri"/>
           <w:sz w:val="24"/>
           <w:szCs w:val="24"/>
-          <w:lang w:val="ru-RU"/>
         </w:rPr>
       </w:pPr>
       <w:r>
@@ -778,7 +769,6 @@
           <w:rFonts w:ascii="Calibri" w:hAnsi="Calibri" w:cs="Calibri"/>
           <w:sz w:val="24"/>
           <w:szCs w:val="24"/>
-          <w:lang w:val="ru-RU"/>
         </w:rPr>
       </w:pPr>
       <w:r>
@@ -796,7 +786,6 @@
           <w:rFonts w:ascii="Calibri" w:hAnsi="Calibri" w:cs="Calibri"/>
           <w:sz w:val="24"/>
           <w:szCs w:val="24"/>
-          <w:lang w:val="ru-RU"/>
         </w:rPr>
       </w:pPr>
     </w:p>
@@ -812,6 +801,73 @@
       </w:pPr>
       <w:r>
         <w:rPr>
+          <w:noProof/>
+        </w:rPr>
+        <w:drawing>
+          <wp:anchor distT="0" distB="0" distL="114300" distR="114300" simplePos="0" relativeHeight="251658240" behindDoc="0" locked="0" layoutInCell="1" allowOverlap="1" wp14:anchorId="4EC4892E" wp14:editId="15C86516">
+            <wp:simplePos x="0" y="0"/>
+            <wp:positionH relativeFrom="column">
+              <wp:posOffset>2517091</wp:posOffset>
+            </wp:positionH>
+            <wp:positionV relativeFrom="paragraph">
+              <wp:posOffset>96339</wp:posOffset>
+            </wp:positionV>
+            <wp:extent cx="1200785" cy="1804670"/>
+            <wp:effectExtent l="0" t="0" r="0" b="5080"/>
+            <wp:wrapSquare wrapText="bothSides"/>
+            <wp:docPr id="1848916903" name="Picture 1" descr="Фотографии на тему «Женщина в магазине» — скачивайте бесплатные изображения  высокого качества | Freepik"/>
+            <wp:cNvGraphicFramePr>
+              <a:graphicFrameLocks xmlns:a="http://schemas.openxmlformats.org/drawingml/2006/main" noChangeAspect="1"/>
+            </wp:cNvGraphicFramePr>
+            <a:graphic xmlns:a="http://schemas.openxmlformats.org/drawingml/2006/main">
+              <a:graphicData uri="http://schemas.openxmlformats.org/drawingml/2006/picture">
+                <pic:pic xmlns:pic="http://schemas.openxmlformats.org/drawingml/2006/picture">
+                  <pic:nvPicPr>
+                    <pic:cNvPr id="0" name="Picture 1" descr="Фотографии на тему «Женщина в магазине» — скачивайте бесплатные изображения  высокого качества | Freepik"/>
+                    <pic:cNvPicPr>
+                      <a:picLocks noChangeAspect="1" noChangeArrowheads="1"/>
+                    </pic:cNvPicPr>
+                  </pic:nvPicPr>
+                  <pic:blipFill>
+                    <a:blip r:embed="rId5" cstate="print">
+                      <a:extLst>
+                        <a:ext uri="{28A0092B-C50C-407E-A947-70E740481C1C}">
+                          <a14:useLocalDpi xmlns:a14="http://schemas.microsoft.com/office/drawing/2010/main" val="0"/>
+                        </a:ext>
+                      </a:extLst>
+                    </a:blip>
+                    <a:srcRect/>
+                    <a:stretch>
+                      <a:fillRect/>
+                    </a:stretch>
+                  </pic:blipFill>
+                  <pic:spPr bwMode="auto">
+                    <a:xfrm>
+                      <a:off x="0" y="0"/>
+                      <a:ext cx="1200785" cy="1804670"/>
+                    </a:xfrm>
+                    <a:prstGeom prst="rect">
+                      <a:avLst/>
+                    </a:prstGeom>
+                    <a:noFill/>
+                    <a:ln>
+                      <a:noFill/>
+                    </a:ln>
+                  </pic:spPr>
+                </pic:pic>
+              </a:graphicData>
+            </a:graphic>
+            <wp14:sizeRelH relativeFrom="page">
+              <wp14:pctWidth>0</wp14:pctWidth>
+            </wp14:sizeRelH>
+            <wp14:sizeRelV relativeFrom="page">
+              <wp14:pctHeight>0</wp14:pctHeight>
+            </wp14:sizeRelV>
+          </wp:anchor>
+        </w:drawing>
+      </w:r>
+      <w:r>
+        <w:rPr>
           <w:rFonts w:ascii="Calibri" w:hAnsi="Calibri" w:cs="Calibri"/>
           <w:b/>
           <w:bCs/>
@@ -830,24 +886,6 @@
           <w:szCs w:val="24"/>
         </w:rPr>
       </w:pPr>
-      <w:r>
-        <w:rPr>
-          <w:rFonts w:ascii="Calibri" w:hAnsi="Calibri" w:cs="Calibri"/>
-          <w:color w:val="FF0000"/>
-          <w:sz w:val="24"/>
-          <w:szCs w:val="24"/>
-        </w:rPr>
-        <w:t>p</w:t>
-      </w:r>
-      <w:r>
-        <w:rPr>
-          <w:rFonts w:ascii="Calibri" w:hAnsi="Calibri" w:cs="Calibri"/>
-          <w:color w:val="FF0000"/>
-          <w:sz w:val="24"/>
-          <w:szCs w:val="24"/>
-        </w:rPr>
-        <w:t>hoto</w:t>
-      </w:r>
     </w:p>
     <w:p>
       <w:pPr>
@@ -889,7 +927,6 @@
           <w:rFonts w:ascii="Calibri" w:hAnsi="Calibri" w:cs="Calibri"/>
           <w:sz w:val="24"/>
           <w:szCs w:val="24"/>
-          <w:lang w:val="ru-RU"/>
         </w:rPr>
       </w:pPr>
       <w:r>
@@ -963,7 +1000,6 @@
           <w:rFonts w:ascii="Calibri" w:hAnsi="Calibri" w:cs="Calibri"/>
           <w:sz w:val="24"/>
           <w:szCs w:val="24"/>
-          <w:lang w:val="ru-RU"/>
         </w:rPr>
       </w:pPr>
       <w:r>
@@ -1036,7 +1072,6 @@
           <w:rFonts w:ascii="Calibri" w:hAnsi="Calibri" w:cs="Calibri"/>
           <w:sz w:val="24"/>
           <w:szCs w:val="24"/>
-          <w:lang w:val="ru-RU"/>
         </w:rPr>
       </w:pPr>
       <w:r>
@@ -1109,7 +1144,6 @@
           <w:rFonts w:ascii="Calibri" w:hAnsi="Calibri" w:cs="Calibri"/>
           <w:sz w:val="24"/>
           <w:szCs w:val="24"/>
-          <w:lang w:val="ru-RU"/>
         </w:rPr>
       </w:pPr>
       <w:r>
@@ -1182,7 +1216,6 @@
           <w:rFonts w:ascii="Calibri" w:hAnsi="Calibri" w:cs="Calibri"/>
           <w:sz w:val="24"/>
           <w:szCs w:val="24"/>
-          <w:lang w:val="ru-RU"/>
         </w:rPr>
       </w:pPr>
       <w:r>
@@ -1200,7 +1233,6 @@
           <w:rFonts w:ascii="Calibri" w:hAnsi="Calibri" w:cs="Calibri"/>
           <w:sz w:val="24"/>
           <w:szCs w:val="24"/>
-          <w:lang w:val="ru-RU"/>
         </w:rPr>
       </w:pPr>
     </w:p>
@@ -1308,7 +1340,6 @@
           <w:bCs/>
           <w:sz w:val="24"/>
           <w:szCs w:val="24"/>
-          <w:lang w:val="ru-RU"/>
         </w:rPr>
       </w:pPr>
       <w:r>
@@ -1413,7 +1444,6 @@
           <w:rFonts w:ascii="Calibri" w:hAnsi="Calibri" w:cs="Calibri"/>
           <w:sz w:val="24"/>
           <w:szCs w:val="24"/>
-          <w:lang w:val="ru-RU"/>
         </w:rPr>
       </w:pPr>
       <w:r>
@@ -1432,6 +1462,7 @@
           <w:rFonts w:ascii="Calibri" w:hAnsi="Calibri" w:cs="Calibri"/>
           <w:sz w:val="24"/>
           <w:szCs w:val="24"/>
+          <w:lang w:val="ru-RU"/>
         </w:rPr>
       </w:pPr>
       <w:r>
@@ -1447,26 +1478,142 @@
       <w:pPr>
         <w:rPr>
           <w:rFonts w:ascii="Calibri" w:hAnsi="Calibri" w:cs="Calibri"/>
-          <w:sz w:val="24"/>
-          <w:szCs w:val="24"/>
-        </w:rPr>
-      </w:pPr>
-    </w:p>
-    <w:p>
-      <w:pPr>
-        <w:rPr>
-          <w:rFonts w:ascii="Calibri" w:hAnsi="Calibri" w:cs="Calibri"/>
-          <w:sz w:val="24"/>
-          <w:szCs w:val="24"/>
-        </w:rPr>
-      </w:pPr>
-      <w:r>
-        <w:rPr>
-          <w:rFonts w:ascii="Calibri" w:hAnsi="Calibri" w:cs="Calibri"/>
-          <w:sz w:val="24"/>
-          <w:szCs w:val="24"/>
-        </w:rPr>
-        <w:t xml:space="preserve">Visit homepage → Browse product </w:t>
+          <w:color w:val="FF0000"/>
+          <w:sz w:val="24"/>
+          <w:szCs w:val="24"/>
+        </w:rPr>
+      </w:pPr>
+      <w:r>
+        <w:rPr>
+          <w:rFonts w:ascii="Calibri" w:hAnsi="Calibri" w:cs="Calibri"/>
+          <w:sz w:val="24"/>
+          <w:szCs w:val="24"/>
+        </w:rPr>
+        <w:t>Visit website → Browse products → Select product → View product details → Decide whether to add the product to the cart → Add to cart → Decide whether to continue shopping or proceed to checkout → Confirm order.</w:t>
+      </w:r>
+    </w:p>
+    <w:p>
+      <w:pPr>
+        <w:rPr>
+          <w:rFonts w:ascii="Calibri" w:hAnsi="Calibri" w:cs="Calibri"/>
+          <w:sz w:val="24"/>
+          <w:szCs w:val="24"/>
+        </w:rPr>
+      </w:pPr>
+      <w:r>
+        <w:rPr>
+          <w:rFonts w:ascii="Calibri" w:hAnsi="Calibri" w:cs="Calibri"/>
+          <w:noProof/>
+          <w:sz w:val="24"/>
+          <w:szCs w:val="24"/>
+        </w:rPr>
+        <w:drawing>
+          <wp:anchor distT="0" distB="0" distL="114300" distR="114300" simplePos="0" relativeHeight="251659264" behindDoc="0" locked="0" layoutInCell="1" allowOverlap="1" wp14:anchorId="1C981648" wp14:editId="443EC6CA">
+            <wp:simplePos x="0" y="0"/>
+            <wp:positionH relativeFrom="margin">
+              <wp:posOffset>-635</wp:posOffset>
+            </wp:positionH>
+            <wp:positionV relativeFrom="paragraph">
+              <wp:posOffset>302895</wp:posOffset>
+            </wp:positionV>
+            <wp:extent cx="1844675" cy="4346575"/>
+            <wp:effectExtent l="0" t="0" r="3175" b="0"/>
+            <wp:wrapSquare wrapText="bothSides"/>
+            <wp:docPr id="1721594281" name="Picture 2" descr="A diagram of a product&#10;&#10;AI-generated content may be incorrect."/>
+            <wp:cNvGraphicFramePr>
+              <a:graphicFrameLocks xmlns:a="http://schemas.openxmlformats.org/drawingml/2006/main" noChangeAspect="1"/>
+            </wp:cNvGraphicFramePr>
+            <a:graphic xmlns:a="http://schemas.openxmlformats.org/drawingml/2006/main">
+              <a:graphicData uri="http://schemas.openxmlformats.org/drawingml/2006/picture">
+                <pic:pic xmlns:pic="http://schemas.openxmlformats.org/drawingml/2006/picture">
+                  <pic:nvPicPr>
+                    <pic:cNvPr id="1721594281" name="Picture 2" descr="A diagram of a product&#10;&#10;AI-generated content may be incorrect."/>
+                    <pic:cNvPicPr/>
+                  </pic:nvPicPr>
+                  <pic:blipFill>
+                    <a:blip r:embed="rId6">
+                      <a:extLst>
+                        <a:ext uri="{28A0092B-C50C-407E-A947-70E740481C1C}">
+                          <a14:useLocalDpi xmlns:a14="http://schemas.microsoft.com/office/drawing/2010/main" val="0"/>
+                        </a:ext>
+                      </a:extLst>
+                    </a:blip>
+                    <a:stretch>
+                      <a:fillRect/>
+                    </a:stretch>
+                  </pic:blipFill>
+                  <pic:spPr>
+                    <a:xfrm>
+                      <a:off x="0" y="0"/>
+                      <a:ext cx="1844675" cy="4346575"/>
+                    </a:xfrm>
+                    <a:prstGeom prst="rect">
+                      <a:avLst/>
+                    </a:prstGeom>
+                  </pic:spPr>
+                </pic:pic>
+              </a:graphicData>
+            </a:graphic>
+            <wp14:sizeRelH relativeFrom="page">
+              <wp14:pctWidth>0</wp14:pctWidth>
+            </wp14:sizeRelH>
+            <wp14:sizeRelV relativeFrom="page">
+              <wp14:pctHeight>0</wp14:pctHeight>
+            </wp14:sizeRelV>
+          </wp:anchor>
+        </w:drawing>
+      </w:r>
+    </w:p>
+    <w:p>
+      <w:pPr>
+        <w:rPr>
+          <w:rFonts w:ascii="Calibri" w:hAnsi="Calibri" w:cs="Calibri"/>
+          <w:sz w:val="24"/>
+          <w:szCs w:val="24"/>
+          <w:lang w:val="ru-RU"/>
+        </w:rPr>
+      </w:pPr>
+      <w:r>
+        <w:rPr>
+          <w:rFonts w:ascii="Calibri" w:hAnsi="Calibri" w:cs="Calibri"/>
+          <w:sz w:val="24"/>
+          <w:szCs w:val="24"/>
+        </w:rPr>
+        <w:t>Steps:</w:t>
+      </w:r>
+    </w:p>
+    <w:p>
+      <w:pPr>
+        <w:rPr>
+          <w:rFonts w:ascii="Calibri" w:hAnsi="Calibri" w:cs="Calibri"/>
+          <w:sz w:val="24"/>
+          <w:szCs w:val="24"/>
+        </w:rPr>
+      </w:pPr>
+      <w:r>
+        <w:rPr>
+          <w:rFonts w:ascii="Calibri" w:hAnsi="Calibri" w:cs="Calibri"/>
+          <w:sz w:val="24"/>
+          <w:szCs w:val="24"/>
+        </w:rPr>
+        <w:t>1. The customer visits the website homepage.</w:t>
+      </w:r>
+    </w:p>
+    <w:p>
+      <w:pPr>
+        <w:rPr>
+          <w:rFonts w:ascii="Calibri" w:hAnsi="Calibri" w:cs="Calibri"/>
+          <w:sz w:val="24"/>
+          <w:szCs w:val="24"/>
+        </w:rPr>
+      </w:pPr>
+      <w:r>
+        <w:rPr>
+          <w:rFonts w:ascii="Calibri" w:hAnsi="Calibri" w:cs="Calibri"/>
+          <w:sz w:val="24"/>
+          <w:szCs w:val="24"/>
+        </w:rPr>
+        <w:t xml:space="preserve">2. The customer browses the product </w:t>
       </w:r>
       <w:proofErr w:type="spellStart"/>
       <w:r>
@@ -1484,36 +1631,127 @@
           <w:sz w:val="24"/>
           <w:szCs w:val="24"/>
         </w:rPr>
-        <w:t xml:space="preserve"> → Select product → View product details → Add item to cart → Proceed to checkout → Confirm order.</w:t>
-      </w:r>
-    </w:p>
-    <w:p>
-      <w:pPr>
-        <w:rPr>
-          <w:rFonts w:ascii="Calibri" w:hAnsi="Calibri" w:cs="Calibri"/>
-          <w:color w:val="FF0000"/>
-          <w:sz w:val="24"/>
-          <w:szCs w:val="24"/>
-        </w:rPr>
-      </w:pPr>
-      <w:r>
-        <w:rPr>
-          <w:rFonts w:ascii="Calibri" w:hAnsi="Calibri" w:cs="Calibri"/>
-          <w:color w:val="FF0000"/>
-          <w:sz w:val="24"/>
-          <w:szCs w:val="24"/>
-        </w:rPr>
-        <w:t>I’ll add diagram later</w:t>
-      </w:r>
-    </w:p>
-    <w:p>
-      <w:pPr>
-        <w:rPr>
-          <w:rFonts w:ascii="Calibri" w:hAnsi="Calibri" w:cs="Calibri"/>
-          <w:sz w:val="24"/>
-          <w:szCs w:val="24"/>
-        </w:rPr>
-      </w:pPr>
+        <w:t>.</w:t>
+      </w:r>
+    </w:p>
+    <w:p>
+      <w:pPr>
+        <w:rPr>
+          <w:rFonts w:ascii="Calibri" w:hAnsi="Calibri" w:cs="Calibri"/>
+          <w:sz w:val="24"/>
+          <w:szCs w:val="24"/>
+        </w:rPr>
+      </w:pPr>
+      <w:r>
+        <w:rPr>
+          <w:rFonts w:ascii="Calibri" w:hAnsi="Calibri" w:cs="Calibri"/>
+          <w:sz w:val="24"/>
+          <w:szCs w:val="24"/>
+        </w:rPr>
+        <w:t>3. The customer selects a product.</w:t>
+      </w:r>
+    </w:p>
+    <w:p>
+      <w:pPr>
+        <w:rPr>
+          <w:rFonts w:ascii="Calibri" w:hAnsi="Calibri" w:cs="Calibri"/>
+          <w:sz w:val="24"/>
+          <w:szCs w:val="24"/>
+        </w:rPr>
+      </w:pPr>
+      <w:r>
+        <w:rPr>
+          <w:rFonts w:ascii="Calibri" w:hAnsi="Calibri" w:cs="Calibri"/>
+          <w:sz w:val="24"/>
+          <w:szCs w:val="24"/>
+        </w:rPr>
+        <w:t>4. The customer views detailed information about the product.</w:t>
+      </w:r>
+    </w:p>
+    <w:p>
+      <w:pPr>
+        <w:rPr>
+          <w:rFonts w:ascii="Calibri" w:hAnsi="Calibri" w:cs="Calibri"/>
+          <w:sz w:val="24"/>
+          <w:szCs w:val="24"/>
+        </w:rPr>
+      </w:pPr>
+      <w:r>
+        <w:rPr>
+          <w:rFonts w:ascii="Calibri" w:hAnsi="Calibri" w:cs="Calibri"/>
+          <w:sz w:val="24"/>
+          <w:szCs w:val="24"/>
+        </w:rPr>
+        <w:t>5. The customer decides whether to add the product to the cart.</w:t>
+      </w:r>
+    </w:p>
+    <w:p>
+      <w:pPr>
+        <w:rPr>
+          <w:rFonts w:ascii="Calibri" w:hAnsi="Calibri" w:cs="Calibri"/>
+          <w:sz w:val="24"/>
+          <w:szCs w:val="24"/>
+        </w:rPr>
+      </w:pPr>
+      <w:r>
+        <w:rPr>
+          <w:rFonts w:ascii="Calibri" w:hAnsi="Calibri" w:cs="Calibri"/>
+          <w:sz w:val="24"/>
+          <w:szCs w:val="24"/>
+        </w:rPr>
+        <w:t>6. If the customer chooses to add the product, the item is added to the cart.</w:t>
+      </w:r>
+    </w:p>
+    <w:p>
+      <w:pPr>
+        <w:rPr>
+          <w:rFonts w:ascii="Calibri" w:hAnsi="Calibri" w:cs="Calibri"/>
+          <w:sz w:val="24"/>
+          <w:szCs w:val="24"/>
+        </w:rPr>
+      </w:pPr>
+      <w:r>
+        <w:rPr>
+          <w:rFonts w:ascii="Calibri" w:hAnsi="Calibri" w:cs="Calibri"/>
+          <w:sz w:val="24"/>
+          <w:szCs w:val="24"/>
+        </w:rPr>
+        <w:t>7. The customer then decides whether to continue shopping or proceed to checkout.</w:t>
+      </w:r>
+    </w:p>
+    <w:p>
+      <w:pPr>
+        <w:rPr>
+          <w:rFonts w:ascii="Calibri" w:hAnsi="Calibri" w:cs="Calibri"/>
+          <w:sz w:val="24"/>
+          <w:szCs w:val="24"/>
+        </w:rPr>
+      </w:pPr>
+      <w:r>
+        <w:rPr>
+          <w:rFonts w:ascii="Calibri" w:hAnsi="Calibri" w:cs="Calibri"/>
+          <w:sz w:val="24"/>
+          <w:szCs w:val="24"/>
+        </w:rPr>
+        <w:t>8. If the customer continues shopping, they return to browsing products.</w:t>
+      </w:r>
+    </w:p>
+    <w:p>
+      <w:pPr>
+        <w:rPr>
+          <w:rFonts w:ascii="Calibri" w:hAnsi="Calibri" w:cs="Calibri"/>
+          <w:sz w:val="24"/>
+          <w:szCs w:val="24"/>
+        </w:rPr>
+      </w:pPr>
+      <w:r>
+        <w:rPr>
+          <w:rFonts w:ascii="Calibri" w:hAnsi="Calibri" w:cs="Calibri"/>
+          <w:sz w:val="24"/>
+          <w:szCs w:val="24"/>
+        </w:rPr>
+        <w:t>9. If the customer proceeds to checkout, the system processes the order.</w:t>
+      </w:r>
     </w:p>
     <w:p>
       <w:pPr>
@@ -1530,128 +1768,17 @@
           <w:sz w:val="24"/>
           <w:szCs w:val="24"/>
         </w:rPr>
-        <w:t>Steps:</w:t>
-      </w:r>
-    </w:p>
-    <w:p>
-      <w:pPr>
-        <w:rPr>
-          <w:rFonts w:ascii="Calibri" w:hAnsi="Calibri" w:cs="Calibri"/>
-          <w:sz w:val="24"/>
-          <w:szCs w:val="24"/>
-        </w:rPr>
-      </w:pPr>
-      <w:r>
-        <w:rPr>
-          <w:rFonts w:ascii="Calibri" w:hAnsi="Calibri" w:cs="Calibri"/>
-          <w:sz w:val="24"/>
-          <w:szCs w:val="24"/>
-        </w:rPr>
-        <w:t>1. The customer visits the website homepage.</w:t>
-      </w:r>
-    </w:p>
-    <w:p>
-      <w:pPr>
-        <w:rPr>
-          <w:rFonts w:ascii="Calibri" w:hAnsi="Calibri" w:cs="Calibri"/>
-          <w:sz w:val="24"/>
-          <w:szCs w:val="24"/>
-        </w:rPr>
-      </w:pPr>
-      <w:r>
-        <w:rPr>
-          <w:rFonts w:ascii="Calibri" w:hAnsi="Calibri" w:cs="Calibri"/>
-          <w:sz w:val="24"/>
-          <w:szCs w:val="24"/>
-        </w:rPr>
-        <w:t xml:space="preserve">2. The customer browses the product </w:t>
-      </w:r>
-      <w:proofErr w:type="spellStart"/>
-      <w:r>
-        <w:rPr>
-          <w:rFonts w:ascii="Calibri" w:hAnsi="Calibri" w:cs="Calibri"/>
-          <w:sz w:val="24"/>
-          <w:szCs w:val="24"/>
-        </w:rPr>
-        <w:t>catalog</w:t>
-      </w:r>
-      <w:proofErr w:type="spellEnd"/>
-      <w:r>
-        <w:rPr>
-          <w:rFonts w:ascii="Calibri" w:hAnsi="Calibri" w:cs="Calibri"/>
-          <w:sz w:val="24"/>
-          <w:szCs w:val="24"/>
-        </w:rPr>
-        <w:t xml:space="preserve"> or searches for specific products.</w:t>
-      </w:r>
-    </w:p>
-    <w:p>
-      <w:pPr>
-        <w:rPr>
-          <w:rFonts w:ascii="Calibri" w:hAnsi="Calibri" w:cs="Calibri"/>
-          <w:sz w:val="24"/>
-          <w:szCs w:val="24"/>
-        </w:rPr>
-      </w:pPr>
-      <w:r>
-        <w:rPr>
-          <w:rFonts w:ascii="Calibri" w:hAnsi="Calibri" w:cs="Calibri"/>
-          <w:sz w:val="24"/>
-          <w:szCs w:val="24"/>
-        </w:rPr>
-        <w:t>3. The customer selects a product to view detailed information.</w:t>
-      </w:r>
-    </w:p>
-    <w:p>
-      <w:pPr>
-        <w:rPr>
-          <w:rFonts w:ascii="Calibri" w:hAnsi="Calibri" w:cs="Calibri"/>
-          <w:sz w:val="24"/>
-          <w:szCs w:val="24"/>
-        </w:rPr>
-      </w:pPr>
-      <w:r>
-        <w:rPr>
-          <w:rFonts w:ascii="Calibri" w:hAnsi="Calibri" w:cs="Calibri"/>
-          <w:sz w:val="24"/>
-          <w:szCs w:val="24"/>
-        </w:rPr>
-        <w:t>4. The customer adds the selected product to the shopping cart.</w:t>
-      </w:r>
-    </w:p>
-    <w:p>
-      <w:pPr>
-        <w:rPr>
-          <w:rFonts w:ascii="Calibri" w:hAnsi="Calibri" w:cs="Calibri"/>
-          <w:sz w:val="24"/>
-          <w:szCs w:val="24"/>
-        </w:rPr>
-      </w:pPr>
-      <w:r>
-        <w:rPr>
-          <w:rFonts w:ascii="Calibri" w:hAnsi="Calibri" w:cs="Calibri"/>
-          <w:sz w:val="24"/>
-          <w:szCs w:val="24"/>
-        </w:rPr>
-        <w:t>5. The customer proceeds to the checkout page.</w:t>
-      </w:r>
-    </w:p>
-    <w:p>
-      <w:pPr>
-        <w:rPr>
-          <w:rFonts w:ascii="Calibri" w:hAnsi="Calibri" w:cs="Calibri"/>
-          <w:sz w:val="24"/>
-          <w:szCs w:val="24"/>
-        </w:rPr>
-      </w:pPr>
-      <w:r>
-        <w:rPr>
-          <w:rFonts w:ascii="Calibri" w:hAnsi="Calibri" w:cs="Calibri"/>
-          <w:sz w:val="24"/>
-          <w:szCs w:val="24"/>
-        </w:rPr>
-        <w:t>6. The system creates an order record and confirms the order.</w:t>
-      </w:r>
+        <w:t>10. The system confirms the order.</w:t>
+      </w:r>
+    </w:p>
+    <w:p>
+      <w:pPr>
+        <w:rPr>
+          <w:rFonts w:ascii="Calibri" w:hAnsi="Calibri" w:cs="Calibri"/>
+          <w:sz w:val="24"/>
+          <w:szCs w:val="24"/>
+        </w:rPr>
+      </w:pPr>
     </w:p>
     <w:sectPr>
       <w:pgSz w:w="11906" w:h="16838"/>
@@ -2273,6 +2400,7 @@
   <w:style w:type="character" w:default="1" w:styleId="DefaultParagraphFont">
     <w:name w:val="Default Paragraph Font"/>
     <w:uiPriority w:val="1"/>
+    <w:semiHidden/>
     <w:unhideWhenUsed/>
   </w:style>
   <w:style w:type="table" w:default="1" w:styleId="TableNormal">

</xml_diff>

<commit_message>
Refine store manager user flow with CRUD actions
</commit_message>
<xml_diff>
--- a/docs/Project-planning.docx
+++ b/docs/Project-planning.docx
@@ -1261,21 +1261,81 @@
       <w:pPr>
         <w:rPr>
           <w:rFonts w:ascii="Calibri" w:hAnsi="Calibri" w:cs="Calibri"/>
-          <w:sz w:val="24"/>
-          <w:szCs w:val="24"/>
-        </w:rPr>
-      </w:pPr>
-    </w:p>
-    <w:p>
-      <w:pPr>
-        <w:rPr>
-          <w:rFonts w:ascii="Calibri" w:hAnsi="Calibri" w:cs="Calibri"/>
-          <w:b/>
-          <w:bCs/>
-          <w:sz w:val="24"/>
-          <w:szCs w:val="24"/>
-        </w:rPr>
-      </w:pPr>
+          <w:b/>
+          <w:bCs/>
+          <w:sz w:val="24"/>
+          <w:szCs w:val="24"/>
+        </w:rPr>
+      </w:pPr>
+      <w:r>
+        <w:rPr>
+          <w:rFonts w:ascii="Calibri" w:hAnsi="Calibri" w:cs="Calibri"/>
+          <w:b/>
+          <w:bCs/>
+          <w:noProof/>
+          <w:sz w:val="24"/>
+          <w:szCs w:val="24"/>
+        </w:rPr>
+        <w:drawing>
+          <wp:anchor distT="0" distB="0" distL="114300" distR="114300" simplePos="0" relativeHeight="251660288" behindDoc="0" locked="0" layoutInCell="1" allowOverlap="1" wp14:anchorId="3AAB44EC" wp14:editId="567D26BC">
+            <wp:simplePos x="0" y="0"/>
+            <wp:positionH relativeFrom="column">
+              <wp:posOffset>86388</wp:posOffset>
+            </wp:positionH>
+            <wp:positionV relativeFrom="paragraph">
+              <wp:posOffset>-109054</wp:posOffset>
+            </wp:positionV>
+            <wp:extent cx="1152525" cy="3819525"/>
+            <wp:effectExtent l="0" t="0" r="9525" b="9525"/>
+            <wp:wrapSquare wrapText="bothSides"/>
+            <wp:docPr id="1929928172" name="Picture 3" descr="A diagram of a product&#10;&#10;AI-generated content may be incorrect."/>
+            <wp:cNvGraphicFramePr>
+              <a:graphicFrameLocks xmlns:a="http://schemas.openxmlformats.org/drawingml/2006/main" noChangeAspect="1"/>
+            </wp:cNvGraphicFramePr>
+            <a:graphic xmlns:a="http://schemas.openxmlformats.org/drawingml/2006/main">
+              <a:graphicData uri="http://schemas.openxmlformats.org/drawingml/2006/picture">
+                <pic:pic xmlns:pic="http://schemas.openxmlformats.org/drawingml/2006/picture">
+                  <pic:nvPicPr>
+                    <pic:cNvPr id="1929928172" name="Picture 3" descr="A diagram of a product&#10;&#10;AI-generated content may be incorrect."/>
+                    <pic:cNvPicPr/>
+                  </pic:nvPicPr>
+                  <pic:blipFill>
+                    <a:blip r:embed="rId6">
+                      <a:extLst>
+                        <a:ext uri="{28A0092B-C50C-407E-A947-70E740481C1C}">
+                          <a14:useLocalDpi xmlns:a14="http://schemas.microsoft.com/office/drawing/2010/main" val="0"/>
+                        </a:ext>
+                      </a:extLst>
+                    </a:blip>
+                    <a:stretch>
+                      <a:fillRect/>
+                    </a:stretch>
+                  </pic:blipFill>
+                  <pic:spPr>
+                    <a:xfrm>
+                      <a:off x="0" y="0"/>
+                      <a:ext cx="1152525" cy="3819525"/>
+                    </a:xfrm>
+                    <a:prstGeom prst="rect">
+                      <a:avLst/>
+                    </a:prstGeom>
+                  </pic:spPr>
+                </pic:pic>
+              </a:graphicData>
+            </a:graphic>
+          </wp:anchor>
+        </w:drawing>
+      </w:r>
+      <w:r>
+        <w:rPr>
+          <w:rFonts w:ascii="Calibri" w:hAnsi="Calibri" w:cs="Calibri"/>
+          <w:b/>
+          <w:bCs/>
+          <w:sz w:val="24"/>
+          <w:szCs w:val="24"/>
+        </w:rPr>
+        <w:t xml:space="preserve">3.1. </w:t>
+      </w:r>
       <w:r>
         <w:rPr>
           <w:rFonts w:ascii="Calibri" w:hAnsi="Calibri" w:cs="Calibri"/>
@@ -1291,6 +1351,189 @@
       <w:pPr>
         <w:rPr>
           <w:rFonts w:ascii="Calibri" w:hAnsi="Calibri" w:cs="Calibri"/>
+          <w:sz w:val="24"/>
+          <w:szCs w:val="24"/>
+        </w:rPr>
+      </w:pPr>
+      <w:r>
+        <w:rPr>
+          <w:rFonts w:ascii="Calibri" w:hAnsi="Calibri" w:cs="Calibri"/>
+          <w:sz w:val="24"/>
+          <w:szCs w:val="24"/>
+        </w:rPr>
+        <w:t>Login → Access dashboard → View product list → Manage products (add, edit, delete) → Save changes.</w:t>
+      </w:r>
+    </w:p>
+    <w:p>
+      <w:pPr>
+        <w:rPr>
+          <w:rFonts w:ascii="Calibri" w:hAnsi="Calibri" w:cs="Calibri"/>
+          <w:sz w:val="24"/>
+          <w:szCs w:val="24"/>
+        </w:rPr>
+      </w:pPr>
+    </w:p>
+    <w:p>
+      <w:pPr>
+        <w:rPr>
+          <w:rFonts w:ascii="Calibri" w:hAnsi="Calibri" w:cs="Calibri"/>
+          <w:b/>
+          <w:bCs/>
+          <w:sz w:val="24"/>
+          <w:szCs w:val="24"/>
+        </w:rPr>
+      </w:pPr>
+      <w:r>
+        <w:rPr>
+          <w:rFonts w:ascii="Calibri" w:hAnsi="Calibri" w:cs="Calibri"/>
+          <w:b/>
+          <w:bCs/>
+          <w:sz w:val="24"/>
+          <w:szCs w:val="24"/>
+        </w:rPr>
+        <w:t>Steps:</w:t>
+      </w:r>
+    </w:p>
+    <w:p>
+      <w:pPr>
+        <w:rPr>
+          <w:rFonts w:ascii="Calibri" w:hAnsi="Calibri" w:cs="Calibri"/>
+          <w:sz w:val="24"/>
+          <w:szCs w:val="24"/>
+        </w:rPr>
+      </w:pPr>
+      <w:r>
+        <w:rPr>
+          <w:rFonts w:ascii="Calibri" w:hAnsi="Calibri" w:cs="Calibri"/>
+          <w:sz w:val="24"/>
+          <w:szCs w:val="24"/>
+        </w:rPr>
+        <w:t>1. The store manager logs into the system using their credentials.</w:t>
+      </w:r>
+    </w:p>
+    <w:p>
+      <w:pPr>
+        <w:rPr>
+          <w:rFonts w:ascii="Calibri" w:hAnsi="Calibri" w:cs="Calibri"/>
+          <w:sz w:val="24"/>
+          <w:szCs w:val="24"/>
+        </w:rPr>
+      </w:pPr>
+      <w:r>
+        <w:rPr>
+          <w:rFonts w:ascii="Calibri" w:hAnsi="Calibri" w:cs="Calibri"/>
+          <w:sz w:val="24"/>
+          <w:szCs w:val="24"/>
+        </w:rPr>
+        <w:t>2. After authentication, the manager accesses the admin dashboard.</w:t>
+      </w:r>
+    </w:p>
+    <w:p>
+      <w:pPr>
+        <w:rPr>
+          <w:rFonts w:ascii="Calibri" w:hAnsi="Calibri" w:cs="Calibri"/>
+          <w:sz w:val="24"/>
+          <w:szCs w:val="24"/>
+        </w:rPr>
+      </w:pPr>
+      <w:r>
+        <w:rPr>
+          <w:rFonts w:ascii="Calibri" w:hAnsi="Calibri" w:cs="Calibri"/>
+          <w:sz w:val="24"/>
+          <w:szCs w:val="24"/>
+        </w:rPr>
+        <w:t>3. The manager views the list of available products.</w:t>
+      </w:r>
+    </w:p>
+    <w:p>
+      <w:pPr>
+        <w:rPr>
+          <w:rFonts w:ascii="Calibri" w:hAnsi="Calibri" w:cs="Calibri"/>
+          <w:sz w:val="24"/>
+          <w:szCs w:val="24"/>
+        </w:rPr>
+      </w:pPr>
+      <w:r>
+        <w:rPr>
+          <w:rFonts w:ascii="Calibri" w:hAnsi="Calibri" w:cs="Calibri"/>
+          <w:sz w:val="24"/>
+          <w:szCs w:val="24"/>
+        </w:rPr>
+        <w:t>4. The manager can manage products by adding new items, editing existing ones, or deleting products.</w:t>
+      </w:r>
+    </w:p>
+    <w:p>
+      <w:pPr>
+        <w:rPr>
+          <w:rFonts w:ascii="Calibri" w:hAnsi="Calibri" w:cs="Calibri"/>
+          <w:sz w:val="24"/>
+          <w:szCs w:val="24"/>
+        </w:rPr>
+      </w:pPr>
+      <w:r>
+        <w:rPr>
+          <w:rFonts w:ascii="Calibri" w:hAnsi="Calibri" w:cs="Calibri"/>
+          <w:sz w:val="24"/>
+          <w:szCs w:val="24"/>
+        </w:rPr>
+        <w:t>5. The system saves the changes after validation.</w:t>
+      </w:r>
+    </w:p>
+    <w:p>
+      <w:pPr>
+        <w:rPr>
+          <w:rFonts w:ascii="Calibri" w:hAnsi="Calibri" w:cs="Calibri"/>
+          <w:sz w:val="24"/>
+          <w:szCs w:val="24"/>
+        </w:rPr>
+      </w:pPr>
+    </w:p>
+    <w:p>
+      <w:pPr>
+        <w:rPr>
+          <w:rFonts w:ascii="Calibri" w:hAnsi="Calibri" w:cs="Calibri"/>
+          <w:sz w:val="24"/>
+          <w:szCs w:val="24"/>
+        </w:rPr>
+      </w:pPr>
+    </w:p>
+    <w:p>
+      <w:pPr>
+        <w:rPr>
+          <w:rFonts w:ascii="Calibri" w:hAnsi="Calibri" w:cs="Calibri"/>
+          <w:b/>
+          <w:bCs/>
+          <w:sz w:val="24"/>
+          <w:szCs w:val="24"/>
+          <w:lang w:val="ru-RU"/>
+        </w:rPr>
+      </w:pPr>
+      <w:r>
+        <w:rPr>
+          <w:rFonts w:ascii="Calibri" w:hAnsi="Calibri" w:cs="Calibri"/>
+          <w:b/>
+          <w:bCs/>
+          <w:sz w:val="24"/>
+          <w:szCs w:val="24"/>
+        </w:rPr>
+        <w:lastRenderedPageBreak/>
+        <w:t xml:space="preserve">3.2. </w:t>
+      </w:r>
+      <w:r>
+        <w:rPr>
+          <w:rFonts w:ascii="Calibri" w:hAnsi="Calibri" w:cs="Calibri"/>
+          <w:b/>
+          <w:bCs/>
+          <w:sz w:val="24"/>
+          <w:szCs w:val="24"/>
+        </w:rPr>
+        <w:t>Customer Flow</w:t>
+      </w:r>
+    </w:p>
+    <w:p>
+      <w:pPr>
+        <w:rPr>
+          <w:rFonts w:ascii="Calibri" w:hAnsi="Calibri" w:cs="Calibri"/>
           <w:color w:val="FF0000"/>
           <w:sz w:val="24"/>
           <w:szCs w:val="24"/>
@@ -1299,193 +1542,6 @@
       <w:r>
         <w:rPr>
           <w:rFonts w:ascii="Calibri" w:hAnsi="Calibri" w:cs="Calibri"/>
-          <w:color w:val="FF0000"/>
-          <w:sz w:val="24"/>
-          <w:szCs w:val="24"/>
-        </w:rPr>
-        <w:t>I’ll add diagram later</w:t>
-      </w:r>
-    </w:p>
-    <w:p>
-      <w:pPr>
-        <w:rPr>
-          <w:rFonts w:ascii="Calibri" w:hAnsi="Calibri" w:cs="Calibri"/>
-          <w:sz w:val="24"/>
-          <w:szCs w:val="24"/>
-        </w:rPr>
-      </w:pPr>
-      <w:r>
-        <w:rPr>
-          <w:rFonts w:ascii="Calibri" w:hAnsi="Calibri" w:cs="Calibri"/>
-          <w:sz w:val="24"/>
-          <w:szCs w:val="24"/>
-        </w:rPr>
-        <w:t>Login → Access dashboard → View product list → Add new product → Submit form → Product saved → Edit or delete products if necessary.</w:t>
-      </w:r>
-    </w:p>
-    <w:p>
-      <w:pPr>
-        <w:rPr>
-          <w:rFonts w:ascii="Calibri" w:hAnsi="Calibri" w:cs="Calibri"/>
-          <w:sz w:val="24"/>
-          <w:szCs w:val="24"/>
-        </w:rPr>
-      </w:pPr>
-    </w:p>
-    <w:p>
-      <w:pPr>
-        <w:rPr>
-          <w:rFonts w:ascii="Calibri" w:hAnsi="Calibri" w:cs="Calibri"/>
-          <w:b/>
-          <w:bCs/>
-          <w:sz w:val="24"/>
-          <w:szCs w:val="24"/>
-        </w:rPr>
-      </w:pPr>
-      <w:r>
-        <w:rPr>
-          <w:rFonts w:ascii="Calibri" w:hAnsi="Calibri" w:cs="Calibri"/>
-          <w:b/>
-          <w:bCs/>
-          <w:sz w:val="24"/>
-          <w:szCs w:val="24"/>
-        </w:rPr>
-        <w:t>Steps:</w:t>
-      </w:r>
-    </w:p>
-    <w:p>
-      <w:pPr>
-        <w:rPr>
-          <w:rFonts w:ascii="Calibri" w:hAnsi="Calibri" w:cs="Calibri"/>
-          <w:sz w:val="24"/>
-          <w:szCs w:val="24"/>
-        </w:rPr>
-      </w:pPr>
-      <w:r>
-        <w:rPr>
-          <w:rFonts w:ascii="Calibri" w:hAnsi="Calibri" w:cs="Calibri"/>
-          <w:sz w:val="24"/>
-          <w:szCs w:val="24"/>
-        </w:rPr>
-        <w:t>1. The store manager logs into the system using their account credentials.</w:t>
-      </w:r>
-    </w:p>
-    <w:p>
-      <w:pPr>
-        <w:rPr>
-          <w:rFonts w:ascii="Calibri" w:hAnsi="Calibri" w:cs="Calibri"/>
-          <w:sz w:val="24"/>
-          <w:szCs w:val="24"/>
-        </w:rPr>
-      </w:pPr>
-      <w:r>
-        <w:rPr>
-          <w:rFonts w:ascii="Calibri" w:hAnsi="Calibri" w:cs="Calibri"/>
-          <w:sz w:val="24"/>
-          <w:szCs w:val="24"/>
-        </w:rPr>
-        <w:t>2. After authentication, the manager accesses the admin dashboard.</w:t>
-      </w:r>
-    </w:p>
-    <w:p>
-      <w:pPr>
-        <w:rPr>
-          <w:rFonts w:ascii="Calibri" w:hAnsi="Calibri" w:cs="Calibri"/>
-          <w:sz w:val="24"/>
-          <w:szCs w:val="24"/>
-        </w:rPr>
-      </w:pPr>
-      <w:r>
-        <w:rPr>
-          <w:rFonts w:ascii="Calibri" w:hAnsi="Calibri" w:cs="Calibri"/>
-          <w:sz w:val="24"/>
-          <w:szCs w:val="24"/>
-        </w:rPr>
-        <w:t>3. The manager views the list of existing products.</w:t>
-      </w:r>
-    </w:p>
-    <w:p>
-      <w:pPr>
-        <w:rPr>
-          <w:rFonts w:ascii="Calibri" w:hAnsi="Calibri" w:cs="Calibri"/>
-          <w:sz w:val="24"/>
-          <w:szCs w:val="24"/>
-        </w:rPr>
-      </w:pPr>
-      <w:r>
-        <w:rPr>
-          <w:rFonts w:ascii="Calibri" w:hAnsi="Calibri" w:cs="Calibri"/>
-          <w:sz w:val="24"/>
-          <w:szCs w:val="24"/>
-        </w:rPr>
-        <w:t>4. The manager can create a new product by filling in a product form.</w:t>
-      </w:r>
-    </w:p>
-    <w:p>
-      <w:pPr>
-        <w:rPr>
-          <w:rFonts w:ascii="Calibri" w:hAnsi="Calibri" w:cs="Calibri"/>
-          <w:sz w:val="24"/>
-          <w:szCs w:val="24"/>
-        </w:rPr>
-      </w:pPr>
-      <w:r>
-        <w:rPr>
-          <w:rFonts w:ascii="Calibri" w:hAnsi="Calibri" w:cs="Calibri"/>
-          <w:sz w:val="24"/>
-          <w:szCs w:val="24"/>
-        </w:rPr>
-        <w:t>5. The product is saved to the database after validation.</w:t>
-      </w:r>
-    </w:p>
-    <w:p>
-      <w:pPr>
-        <w:rPr>
-          <w:rFonts w:ascii="Calibri" w:hAnsi="Calibri" w:cs="Calibri"/>
-          <w:sz w:val="24"/>
-          <w:szCs w:val="24"/>
-        </w:rPr>
-      </w:pPr>
-      <w:r>
-        <w:rPr>
-          <w:rFonts w:ascii="Calibri" w:hAnsi="Calibri" w:cs="Calibri"/>
-          <w:sz w:val="24"/>
-          <w:szCs w:val="24"/>
-        </w:rPr>
-        <w:lastRenderedPageBreak/>
-        <w:t>6. The manager can later edit product details or remove products when they are no longer available.</w:t>
-      </w:r>
-    </w:p>
-    <w:p>
-      <w:pPr>
-        <w:rPr>
-          <w:rFonts w:ascii="Calibri" w:hAnsi="Calibri" w:cs="Calibri"/>
-          <w:sz w:val="24"/>
-          <w:szCs w:val="24"/>
-          <w:lang w:val="ru-RU"/>
-        </w:rPr>
-      </w:pPr>
-      <w:r>
-        <w:rPr>
-          <w:rFonts w:ascii="Calibri" w:hAnsi="Calibri" w:cs="Calibri"/>
-          <w:sz w:val="24"/>
-          <w:szCs w:val="24"/>
-        </w:rPr>
-        <w:t>Customer Flow</w:t>
-      </w:r>
-    </w:p>
-    <w:p>
-      <w:pPr>
-        <w:rPr>
-          <w:rFonts w:ascii="Calibri" w:hAnsi="Calibri" w:cs="Calibri"/>
-          <w:color w:val="FF0000"/>
-          <w:sz w:val="24"/>
-          <w:szCs w:val="24"/>
-        </w:rPr>
-      </w:pPr>
-      <w:r>
-        <w:rPr>
-          <w:rFonts w:ascii="Calibri" w:hAnsi="Calibri" w:cs="Calibri"/>
           <w:sz w:val="24"/>
           <w:szCs w:val="24"/>
         </w:rPr>
@@ -1508,13 +1564,13 @@
           <w:szCs w:val="24"/>
         </w:rPr>
         <w:drawing>
-          <wp:anchor distT="0" distB="0" distL="114300" distR="114300" simplePos="0" relativeHeight="251659264" behindDoc="0" locked="0" layoutInCell="1" allowOverlap="1" wp14:anchorId="1C981648" wp14:editId="443EC6CA">
+          <wp:anchor distT="0" distB="0" distL="114300" distR="114300" simplePos="0" relativeHeight="251659264" behindDoc="0" locked="0" layoutInCell="1" allowOverlap="1" wp14:anchorId="1C981648" wp14:editId="1D06EBFA">
             <wp:simplePos x="0" y="0"/>
             <wp:positionH relativeFrom="margin">
-              <wp:posOffset>-635</wp:posOffset>
+              <wp:posOffset>-159661</wp:posOffset>
             </wp:positionH>
             <wp:positionV relativeFrom="paragraph">
-              <wp:posOffset>302895</wp:posOffset>
+              <wp:posOffset>215430</wp:posOffset>
             </wp:positionV>
             <wp:extent cx="1844675" cy="4346575"/>
             <wp:effectExtent l="0" t="0" r="3175" b="0"/>
@@ -1531,7 +1587,7 @@
                     <pic:cNvPicPr/>
                   </pic:nvPicPr>
                   <pic:blipFill>
-                    <a:blip r:embed="rId6">
+                    <a:blip r:embed="rId7">
                       <a:extLst>
                         <a:ext uri="{28A0092B-C50C-407E-A947-70E740481C1C}">
                           <a14:useLocalDpi xmlns:a14="http://schemas.microsoft.com/office/drawing/2010/main" val="0"/>
@@ -1568,6 +1624,8 @@
       <w:pPr>
         <w:rPr>
           <w:rFonts w:ascii="Calibri" w:hAnsi="Calibri" w:cs="Calibri"/>
+          <w:b/>
+          <w:bCs/>
           <w:sz w:val="24"/>
           <w:szCs w:val="24"/>
           <w:lang w:val="ru-RU"/>
@@ -1576,6 +1634,8 @@
       <w:r>
         <w:rPr>
           <w:rFonts w:ascii="Calibri" w:hAnsi="Calibri" w:cs="Calibri"/>
+          <w:b/>
+          <w:bCs/>
           <w:sz w:val="24"/>
           <w:szCs w:val="24"/>
         </w:rPr>

</xml_diff>

<commit_message>
add photo for persona1
</commit_message>
<xml_diff>
--- a/docs/Project-planning.docx
+++ b/docs/Project-planning.docx
@@ -110,6 +110,7 @@
           <w:iCs/>
           <w:sz w:val="24"/>
           <w:szCs w:val="24"/>
+          <w:lang w:val="ru-RU"/>
         </w:rPr>
       </w:pPr>
       <w:r>
@@ -347,470 +348,542 @@
           <w:bCs/>
           <w:sz w:val="24"/>
           <w:szCs w:val="24"/>
-        </w:rPr>
-      </w:pPr>
-      <w:r>
-        <w:rPr>
-          <w:rFonts w:ascii="Calibri" w:hAnsi="Calibri" w:cs="Calibri"/>
-          <w:b/>
-          <w:bCs/>
-          <w:sz w:val="24"/>
-          <w:szCs w:val="24"/>
-        </w:rPr>
+          <w:lang w:val="ru-RU"/>
+        </w:rPr>
+      </w:pPr>
+      <w:r>
+        <w:rPr>
+          <w:rFonts w:ascii="Calibri" w:hAnsi="Calibri" w:cs="Calibri"/>
+          <w:b/>
+          <w:bCs/>
+          <w:sz w:val="24"/>
+          <w:szCs w:val="24"/>
+        </w:rPr>
+        <w:lastRenderedPageBreak/>
         <w:t>Persona 1: Store Manager</w:t>
       </w:r>
-    </w:p>
-    <w:p>
-      <w:pPr>
-        <w:rPr>
-          <w:rFonts w:ascii="Calibri" w:hAnsi="Calibri" w:cs="Calibri"/>
-          <w:color w:val="FF0000"/>
-          <w:sz w:val="24"/>
-          <w:szCs w:val="24"/>
-        </w:rPr>
-      </w:pPr>
-      <w:r>
-        <w:rPr>
-          <w:rFonts w:ascii="Calibri" w:hAnsi="Calibri" w:cs="Calibri"/>
-          <w:color w:val="FF0000"/>
-          <w:sz w:val="24"/>
-          <w:szCs w:val="24"/>
-        </w:rPr>
-        <w:lastRenderedPageBreak/>
-        <w:t>p</w:t>
-      </w:r>
-      <w:r>
-        <w:rPr>
-          <w:rFonts w:ascii="Calibri" w:hAnsi="Calibri" w:cs="Calibri"/>
-          <w:color w:val="FF0000"/>
-          <w:sz w:val="24"/>
-          <w:szCs w:val="24"/>
-        </w:rPr>
-        <w:t>hoto</w:t>
-      </w:r>
-    </w:p>
-    <w:p>
-      <w:pPr>
-        <w:rPr>
-          <w:rFonts w:ascii="Calibri" w:hAnsi="Calibri" w:cs="Calibri"/>
-          <w:sz w:val="24"/>
-          <w:szCs w:val="24"/>
-        </w:rPr>
-      </w:pPr>
-    </w:p>
-    <w:p>
-      <w:pPr>
-        <w:rPr>
-          <w:rFonts w:ascii="Calibri" w:hAnsi="Calibri" w:cs="Calibri"/>
-          <w:sz w:val="24"/>
-          <w:szCs w:val="24"/>
-        </w:rPr>
-      </w:pPr>
-      <w:r>
-        <w:rPr>
-          <w:rFonts w:ascii="Calibri" w:hAnsi="Calibri" w:cs="Calibri"/>
-          <w:sz w:val="24"/>
-          <w:szCs w:val="24"/>
-        </w:rPr>
-        <w:t xml:space="preserve">Name: Alex </w:t>
-      </w:r>
-      <w:r>
-        <w:rPr>
-          <w:rFonts w:ascii="Calibri" w:hAnsi="Calibri" w:cs="Calibri"/>
-          <w:sz w:val="24"/>
-          <w:szCs w:val="24"/>
-        </w:rPr>
-        <w:t>O'Brien</w:t>
-      </w:r>
-    </w:p>
-    <w:p>
-      <w:pPr>
-        <w:rPr>
-          <w:rFonts w:ascii="Calibri" w:hAnsi="Calibri" w:cs="Calibri"/>
-          <w:sz w:val="24"/>
-          <w:szCs w:val="24"/>
-        </w:rPr>
-      </w:pPr>
-      <w:r>
-        <w:rPr>
-          <w:rFonts w:ascii="Calibri" w:hAnsi="Calibri" w:cs="Calibri"/>
-          <w:sz w:val="24"/>
-          <w:szCs w:val="24"/>
-        </w:rPr>
-        <w:t>Age: 35</w:t>
-      </w:r>
-    </w:p>
-    <w:p>
-      <w:pPr>
-        <w:rPr>
-          <w:rFonts w:ascii="Calibri" w:hAnsi="Calibri" w:cs="Calibri"/>
-          <w:sz w:val="24"/>
-          <w:szCs w:val="24"/>
-        </w:rPr>
-      </w:pPr>
-      <w:r>
-        <w:rPr>
-          <w:rFonts w:ascii="Calibri" w:hAnsi="Calibri" w:cs="Calibri"/>
-          <w:sz w:val="24"/>
-          <w:szCs w:val="24"/>
-        </w:rPr>
-        <w:t>Role: Supermarket Manager</w:t>
-      </w:r>
-    </w:p>
-    <w:p>
-      <w:pPr>
-        <w:rPr>
-          <w:rFonts w:ascii="Calibri" w:hAnsi="Calibri" w:cs="Calibri"/>
-          <w:b/>
-          <w:bCs/>
-          <w:sz w:val="24"/>
-          <w:szCs w:val="24"/>
-        </w:rPr>
-      </w:pPr>
-      <w:r>
-        <w:rPr>
-          <w:rFonts w:ascii="Calibri" w:hAnsi="Calibri" w:cs="Calibri"/>
-          <w:b/>
-          <w:bCs/>
-          <w:sz w:val="24"/>
-          <w:szCs w:val="24"/>
-        </w:rPr>
-        <w:t>Goals:</w:t>
-      </w:r>
-    </w:p>
-    <w:p>
-      <w:pPr>
-        <w:rPr>
-          <w:rFonts w:ascii="Calibri" w:hAnsi="Calibri" w:cs="Calibri"/>
-          <w:sz w:val="24"/>
-          <w:szCs w:val="24"/>
-        </w:rPr>
-      </w:pPr>
-      <w:r>
-        <w:rPr>
-          <w:rFonts w:ascii="Calibri" w:hAnsi="Calibri" w:cs="Calibri"/>
-          <w:sz w:val="24"/>
-          <w:szCs w:val="24"/>
-        </w:rPr>
-        <w:t xml:space="preserve">- Manage the supermarket product </w:t>
-      </w:r>
-      <w:proofErr w:type="spellStart"/>
-      <w:r>
-        <w:rPr>
-          <w:rFonts w:ascii="Calibri" w:hAnsi="Calibri" w:cs="Calibri"/>
-          <w:sz w:val="24"/>
-          <w:szCs w:val="24"/>
-        </w:rPr>
-        <w:t>catalog</w:t>
-      </w:r>
-      <w:proofErr w:type="spellEnd"/>
-      <w:r>
-        <w:rPr>
-          <w:rFonts w:ascii="Calibri" w:hAnsi="Calibri" w:cs="Calibri"/>
-          <w:sz w:val="24"/>
-          <w:szCs w:val="24"/>
-        </w:rPr>
-        <w:t xml:space="preserve"> efficiently.</w:t>
-      </w:r>
-    </w:p>
-    <w:p>
-      <w:pPr>
-        <w:rPr>
-          <w:rFonts w:ascii="Calibri" w:hAnsi="Calibri" w:cs="Calibri"/>
-          <w:sz w:val="24"/>
-          <w:szCs w:val="24"/>
-        </w:rPr>
-      </w:pPr>
-      <w:r>
-        <w:rPr>
-          <w:rFonts w:ascii="Calibri" w:hAnsi="Calibri" w:cs="Calibri"/>
-          <w:sz w:val="24"/>
-          <w:szCs w:val="24"/>
-        </w:rPr>
-        <w:t>- Add new products when new stock arrives.</w:t>
-      </w:r>
-    </w:p>
-    <w:p>
-      <w:pPr>
-        <w:rPr>
-          <w:rFonts w:ascii="Calibri" w:hAnsi="Calibri" w:cs="Calibri"/>
-          <w:sz w:val="24"/>
-          <w:szCs w:val="24"/>
-        </w:rPr>
-      </w:pPr>
-      <w:r>
-        <w:rPr>
-          <w:rFonts w:ascii="Calibri" w:hAnsi="Calibri" w:cs="Calibri"/>
-          <w:sz w:val="24"/>
-          <w:szCs w:val="24"/>
-        </w:rPr>
-        <w:t>- Update product prices and inventory levels.</w:t>
-      </w:r>
-    </w:p>
-    <w:p>
-      <w:pPr>
-        <w:rPr>
-          <w:rFonts w:ascii="Calibri" w:hAnsi="Calibri" w:cs="Calibri"/>
-          <w:sz w:val="24"/>
-          <w:szCs w:val="24"/>
-        </w:rPr>
-      </w:pPr>
-      <w:r>
-        <w:rPr>
-          <w:rFonts w:ascii="Calibri" w:hAnsi="Calibri" w:cs="Calibri"/>
-          <w:sz w:val="24"/>
-          <w:szCs w:val="24"/>
-        </w:rPr>
-        <w:t>- Remove products that are no longer available.</w:t>
-      </w:r>
-    </w:p>
-    <w:p>
-      <w:pPr>
-        <w:rPr>
-          <w:rFonts w:ascii="Calibri" w:hAnsi="Calibri" w:cs="Calibri"/>
-          <w:b/>
-          <w:bCs/>
-          <w:sz w:val="24"/>
-          <w:szCs w:val="24"/>
-        </w:rPr>
-      </w:pPr>
-      <w:r>
-        <w:rPr>
-          <w:rFonts w:ascii="Calibri" w:hAnsi="Calibri" w:cs="Calibri"/>
-          <w:b/>
-          <w:bCs/>
-          <w:sz w:val="24"/>
-          <w:szCs w:val="24"/>
-        </w:rPr>
-        <w:t>Needs:</w:t>
-      </w:r>
-    </w:p>
-    <w:p>
-      <w:pPr>
-        <w:rPr>
-          <w:rFonts w:ascii="Calibri" w:hAnsi="Calibri" w:cs="Calibri"/>
-          <w:sz w:val="24"/>
-          <w:szCs w:val="24"/>
-        </w:rPr>
-      </w:pPr>
-      <w:r>
-        <w:rPr>
-          <w:rFonts w:ascii="Calibri" w:hAnsi="Calibri" w:cs="Calibri"/>
-          <w:sz w:val="24"/>
-          <w:szCs w:val="24"/>
-        </w:rPr>
-        <w:t>- A clear dashboard to manage products and categories.</w:t>
-      </w:r>
-    </w:p>
-    <w:p>
-      <w:pPr>
-        <w:rPr>
-          <w:rFonts w:ascii="Calibri" w:hAnsi="Calibri" w:cs="Calibri"/>
-          <w:sz w:val="24"/>
-          <w:szCs w:val="24"/>
-        </w:rPr>
-      </w:pPr>
-      <w:r>
-        <w:rPr>
-          <w:rFonts w:ascii="Calibri" w:hAnsi="Calibri" w:cs="Calibri"/>
-          <w:sz w:val="24"/>
-          <w:szCs w:val="24"/>
-        </w:rPr>
-        <w:t>- Easy forms for adding and editing product information.</w:t>
-      </w:r>
-    </w:p>
-    <w:p>
-      <w:pPr>
-        <w:rPr>
-          <w:rFonts w:ascii="Calibri" w:hAnsi="Calibri" w:cs="Calibri"/>
-          <w:sz w:val="24"/>
-          <w:szCs w:val="24"/>
-        </w:rPr>
-      </w:pPr>
-      <w:r>
-        <w:rPr>
-          <w:rFonts w:ascii="Calibri" w:hAnsi="Calibri" w:cs="Calibri"/>
-          <w:sz w:val="24"/>
-          <w:szCs w:val="24"/>
-        </w:rPr>
-        <w:t>- Quick access to stock information.</w:t>
-      </w:r>
-    </w:p>
-    <w:p>
-      <w:pPr>
-        <w:rPr>
-          <w:rFonts w:ascii="Calibri" w:hAnsi="Calibri" w:cs="Calibri"/>
-          <w:b/>
-          <w:bCs/>
-          <w:sz w:val="24"/>
-          <w:szCs w:val="24"/>
-        </w:rPr>
-      </w:pPr>
-      <w:r>
-        <w:rPr>
-          <w:rFonts w:ascii="Calibri" w:hAnsi="Calibri" w:cs="Calibri"/>
-          <w:b/>
-          <w:bCs/>
-          <w:sz w:val="24"/>
-          <w:szCs w:val="24"/>
-        </w:rPr>
-        <w:t>Behaviours:</w:t>
-      </w:r>
-    </w:p>
-    <w:p>
-      <w:pPr>
-        <w:rPr>
-          <w:rFonts w:ascii="Calibri" w:hAnsi="Calibri" w:cs="Calibri"/>
-          <w:sz w:val="24"/>
-          <w:szCs w:val="24"/>
-        </w:rPr>
-      </w:pPr>
-      <w:r>
-        <w:rPr>
-          <w:rFonts w:ascii="Calibri" w:hAnsi="Calibri" w:cs="Calibri"/>
-          <w:sz w:val="24"/>
-          <w:szCs w:val="24"/>
-        </w:rPr>
-        <w:t>- Logs into the system daily to monitor products.</w:t>
-      </w:r>
-    </w:p>
-    <w:p>
-      <w:pPr>
-        <w:rPr>
-          <w:rFonts w:ascii="Calibri" w:hAnsi="Calibri" w:cs="Calibri"/>
-          <w:sz w:val="24"/>
-          <w:szCs w:val="24"/>
-        </w:rPr>
-      </w:pPr>
-      <w:r>
-        <w:rPr>
-          <w:rFonts w:ascii="Calibri" w:hAnsi="Calibri" w:cs="Calibri"/>
-          <w:sz w:val="24"/>
-          <w:szCs w:val="24"/>
-        </w:rPr>
-        <w:t>- Updates stock levels and product details regularly.</w:t>
-      </w:r>
-    </w:p>
-    <w:p>
-      <w:pPr>
-        <w:rPr>
-          <w:rFonts w:ascii="Calibri" w:hAnsi="Calibri" w:cs="Calibri"/>
-          <w:sz w:val="24"/>
-          <w:szCs w:val="24"/>
-        </w:rPr>
-      </w:pPr>
-      <w:r>
-        <w:rPr>
-          <w:rFonts w:ascii="Calibri" w:hAnsi="Calibri" w:cs="Calibri"/>
-          <w:sz w:val="24"/>
-          <w:szCs w:val="24"/>
-        </w:rPr>
-        <w:t>- Reviews product availability to ensure accurate inventory data.</w:t>
-      </w:r>
-    </w:p>
-    <w:p>
-      <w:pPr>
-        <w:rPr>
-          <w:rFonts w:ascii="Calibri" w:hAnsi="Calibri" w:cs="Calibri"/>
-          <w:b/>
-          <w:bCs/>
-          <w:sz w:val="24"/>
-          <w:szCs w:val="24"/>
-        </w:rPr>
-      </w:pPr>
-      <w:r>
-        <w:rPr>
-          <w:rFonts w:ascii="Calibri" w:hAnsi="Calibri" w:cs="Calibri"/>
-          <w:b/>
-          <w:bCs/>
-          <w:sz w:val="24"/>
-          <w:szCs w:val="24"/>
-        </w:rPr>
-        <w:t>Frustrations:</w:t>
-      </w:r>
-    </w:p>
-    <w:p>
-      <w:pPr>
-        <w:rPr>
-          <w:rFonts w:ascii="Calibri" w:hAnsi="Calibri" w:cs="Calibri"/>
-          <w:sz w:val="24"/>
-          <w:szCs w:val="24"/>
-        </w:rPr>
-      </w:pPr>
-      <w:r>
-        <w:rPr>
-          <w:rFonts w:ascii="Calibri" w:hAnsi="Calibri" w:cs="Calibri"/>
-          <w:sz w:val="24"/>
-          <w:szCs w:val="24"/>
-        </w:rPr>
-        <w:t>- Manual inventory management is time-consuming.</w:t>
-      </w:r>
-    </w:p>
-    <w:p>
-      <w:pPr>
-        <w:rPr>
-          <w:rFonts w:ascii="Calibri" w:hAnsi="Calibri" w:cs="Calibri"/>
-          <w:sz w:val="24"/>
-          <w:szCs w:val="24"/>
-        </w:rPr>
-      </w:pPr>
-      <w:r>
-        <w:rPr>
-          <w:rFonts w:ascii="Calibri" w:hAnsi="Calibri" w:cs="Calibri"/>
-          <w:sz w:val="24"/>
-          <w:szCs w:val="24"/>
-        </w:rPr>
-        <w:t>- Outdated product information can confuse customers.</w:t>
-      </w:r>
-    </w:p>
-    <w:p>
-      <w:pPr>
-        <w:rPr>
-          <w:rFonts w:ascii="Calibri" w:hAnsi="Calibri" w:cs="Calibri"/>
-          <w:sz w:val="24"/>
-          <w:szCs w:val="24"/>
-        </w:rPr>
-      </w:pPr>
-      <w:r>
-        <w:rPr>
-          <w:rFonts w:ascii="Calibri" w:hAnsi="Calibri" w:cs="Calibri"/>
-          <w:sz w:val="24"/>
-          <w:szCs w:val="24"/>
-        </w:rPr>
-        <w:t>- Lack of a centralized system for product management.</w:t>
-      </w:r>
-    </w:p>
-    <w:p>
-      <w:pPr>
-        <w:rPr>
-          <w:rFonts w:ascii="Calibri" w:hAnsi="Calibri" w:cs="Calibri"/>
-          <w:sz w:val="24"/>
-          <w:szCs w:val="24"/>
-        </w:rPr>
-      </w:pPr>
-    </w:p>
-    <w:p>
-      <w:pPr>
-        <w:rPr>
-          <w:rFonts w:ascii="Calibri" w:hAnsi="Calibri" w:cs="Calibri"/>
-          <w:b/>
-          <w:bCs/>
-          <w:sz w:val="24"/>
-          <w:szCs w:val="24"/>
-        </w:rPr>
-      </w:pPr>
       <w:r>
         <w:rPr>
           <w:noProof/>
         </w:rPr>
         <w:drawing>
-          <wp:anchor distT="0" distB="0" distL="114300" distR="114300" simplePos="0" relativeHeight="251658240" behindDoc="0" locked="0" layoutInCell="1" allowOverlap="1" wp14:anchorId="4EC4892E" wp14:editId="15C86516">
+          <wp:anchor distT="0" distB="0" distL="114300" distR="114300" simplePos="0" relativeHeight="251661312" behindDoc="0" locked="0" layoutInCell="1" allowOverlap="1" wp14:anchorId="317C51B8" wp14:editId="784641B1">
             <wp:simplePos x="0" y="0"/>
             <wp:positionH relativeFrom="column">
-              <wp:posOffset>2517091</wp:posOffset>
+              <wp:posOffset>0</wp:posOffset>
             </wp:positionH>
             <wp:positionV relativeFrom="paragraph">
-              <wp:posOffset>96339</wp:posOffset>
+              <wp:posOffset>1536</wp:posOffset>
+            </wp:positionV>
+            <wp:extent cx="2707553" cy="1807535"/>
+            <wp:effectExtent l="0" t="0" r="0" b="2540"/>
+            <wp:wrapSquare wrapText="bothSides"/>
+            <wp:docPr id="549173039" name="Picture 5" descr="Менеджер мужчина, результатов — 3,4 миллиона: изображения, стоковые  фотографии, картинки без лицензионных платежей | Shutterstock"/>
+            <wp:cNvGraphicFramePr>
+              <a:graphicFrameLocks xmlns:a="http://schemas.openxmlformats.org/drawingml/2006/main" noChangeAspect="1"/>
+            </wp:cNvGraphicFramePr>
+            <a:graphic xmlns:a="http://schemas.openxmlformats.org/drawingml/2006/main">
+              <a:graphicData uri="http://schemas.openxmlformats.org/drawingml/2006/picture">
+                <pic:pic xmlns:pic="http://schemas.openxmlformats.org/drawingml/2006/picture">
+                  <pic:nvPicPr>
+                    <pic:cNvPr id="0" name="Picture 5" descr="Менеджер мужчина, результатов — 3,4 миллиона: изображения, стоковые  фотографии, картинки без лицензионных платежей | Shutterstock"/>
+                    <pic:cNvPicPr>
+                      <a:picLocks noChangeAspect="1" noChangeArrowheads="1"/>
+                    </pic:cNvPicPr>
+                  </pic:nvPicPr>
+                  <pic:blipFill rotWithShape="1">
+                    <a:blip r:embed="rId5">
+                      <a:extLst>
+                        <a:ext uri="{28A0092B-C50C-407E-A947-70E740481C1C}">
+                          <a14:useLocalDpi xmlns:a14="http://schemas.microsoft.com/office/drawing/2010/main" val="0"/>
+                        </a:ext>
+                      </a:extLst>
+                    </a:blip>
+                    <a:srcRect b="7176"/>
+                    <a:stretch>
+                      <a:fillRect/>
+                    </a:stretch>
+                  </pic:blipFill>
+                  <pic:spPr bwMode="auto">
+                    <a:xfrm>
+                      <a:off x="0" y="0"/>
+                      <a:ext cx="2707553" cy="1807535"/>
+                    </a:xfrm>
+                    <a:prstGeom prst="rect">
+                      <a:avLst/>
+                    </a:prstGeom>
+                    <a:noFill/>
+                    <a:ln>
+                      <a:noFill/>
+                    </a:ln>
+                    <a:extLst>
+                      <a:ext uri="{53640926-AAD7-44D8-BBD7-CCE9431645EC}">
+                        <a14:shadowObscured xmlns:a14="http://schemas.microsoft.com/office/drawing/2010/main"/>
+                      </a:ext>
+                    </a:extLst>
+                  </pic:spPr>
+                </pic:pic>
+              </a:graphicData>
+            </a:graphic>
+          </wp:anchor>
+        </w:drawing>
+      </w:r>
+    </w:p>
+    <w:p>
+      <w:pPr>
+        <w:rPr>
+          <w:rFonts w:ascii="Calibri" w:hAnsi="Calibri" w:cs="Calibri"/>
+          <w:sz w:val="24"/>
+          <w:szCs w:val="24"/>
+        </w:rPr>
+      </w:pPr>
+      <w:r>
+        <w:rPr>
+          <w:rFonts w:ascii="Calibri" w:hAnsi="Calibri" w:cs="Calibri"/>
+          <w:sz w:val="24"/>
+          <w:szCs w:val="24"/>
+        </w:rPr>
+        <w:t xml:space="preserve">Name: Alex </w:t>
+      </w:r>
+      <w:r>
+        <w:rPr>
+          <w:rFonts w:ascii="Calibri" w:hAnsi="Calibri" w:cs="Calibri"/>
+          <w:sz w:val="24"/>
+          <w:szCs w:val="24"/>
+        </w:rPr>
+        <w:t>O'Brien</w:t>
+      </w:r>
+    </w:p>
+    <w:p>
+      <w:pPr>
+        <w:rPr>
+          <w:rFonts w:ascii="Calibri" w:hAnsi="Calibri" w:cs="Calibri"/>
+          <w:sz w:val="24"/>
+          <w:szCs w:val="24"/>
+        </w:rPr>
+      </w:pPr>
+      <w:r>
+        <w:rPr>
+          <w:rFonts w:ascii="Calibri" w:hAnsi="Calibri" w:cs="Calibri"/>
+          <w:sz w:val="24"/>
+          <w:szCs w:val="24"/>
+        </w:rPr>
+        <w:t>Age: 35</w:t>
+      </w:r>
+    </w:p>
+    <w:p>
+      <w:pPr>
+        <w:rPr>
+          <w:rFonts w:ascii="Calibri" w:hAnsi="Calibri" w:cs="Calibri"/>
+          <w:sz w:val="24"/>
+          <w:szCs w:val="24"/>
+          <w:lang w:val="ru-RU"/>
+        </w:rPr>
+      </w:pPr>
+      <w:r>
+        <w:rPr>
+          <w:rFonts w:ascii="Calibri" w:hAnsi="Calibri" w:cs="Calibri"/>
+          <w:sz w:val="24"/>
+          <w:szCs w:val="24"/>
+        </w:rPr>
+        <w:t>Role: Supermarket Manager</w:t>
+      </w:r>
+    </w:p>
+    <w:p>
+      <w:pPr>
+        <w:rPr>
+          <w:rFonts w:ascii="Calibri" w:hAnsi="Calibri" w:cs="Calibri"/>
+          <w:sz w:val="24"/>
+          <w:szCs w:val="24"/>
+          <w:lang w:val="ru-RU"/>
+        </w:rPr>
+      </w:pPr>
+    </w:p>
+    <w:p>
+      <w:pPr>
+        <w:rPr>
+          <w:rFonts w:ascii="Calibri" w:hAnsi="Calibri" w:cs="Calibri"/>
+          <w:sz w:val="24"/>
+          <w:szCs w:val="24"/>
+          <w:lang w:val="ru-RU"/>
+        </w:rPr>
+      </w:pPr>
+    </w:p>
+    <w:p>
+      <w:pPr>
+        <w:rPr>
+          <w:rFonts w:ascii="Calibri" w:hAnsi="Calibri" w:cs="Calibri"/>
+          <w:b/>
+          <w:bCs/>
+          <w:sz w:val="24"/>
+          <w:szCs w:val="24"/>
+        </w:rPr>
+      </w:pPr>
+      <w:r>
+        <w:rPr>
+          <w:rFonts w:ascii="Calibri" w:hAnsi="Calibri" w:cs="Calibri"/>
+          <w:b/>
+          <w:bCs/>
+          <w:sz w:val="24"/>
+          <w:szCs w:val="24"/>
+        </w:rPr>
+        <w:t>Goals:</w:t>
+      </w:r>
+    </w:p>
+    <w:p>
+      <w:pPr>
+        <w:rPr>
+          <w:rFonts w:ascii="Calibri" w:hAnsi="Calibri" w:cs="Calibri"/>
+          <w:sz w:val="24"/>
+          <w:szCs w:val="24"/>
+        </w:rPr>
+      </w:pPr>
+      <w:r>
+        <w:rPr>
+          <w:rFonts w:ascii="Calibri" w:hAnsi="Calibri" w:cs="Calibri"/>
+          <w:sz w:val="24"/>
+          <w:szCs w:val="24"/>
+        </w:rPr>
+        <w:t xml:space="preserve">- Manage the supermarket product </w:t>
+      </w:r>
+      <w:proofErr w:type="spellStart"/>
+      <w:r>
+        <w:rPr>
+          <w:rFonts w:ascii="Calibri" w:hAnsi="Calibri" w:cs="Calibri"/>
+          <w:sz w:val="24"/>
+          <w:szCs w:val="24"/>
+        </w:rPr>
+        <w:t>catalog</w:t>
+      </w:r>
+      <w:proofErr w:type="spellEnd"/>
+      <w:r>
+        <w:rPr>
+          <w:rFonts w:ascii="Calibri" w:hAnsi="Calibri" w:cs="Calibri"/>
+          <w:sz w:val="24"/>
+          <w:szCs w:val="24"/>
+        </w:rPr>
+        <w:t xml:space="preserve"> efficiently.</w:t>
+      </w:r>
+    </w:p>
+    <w:p>
+      <w:pPr>
+        <w:rPr>
+          <w:rFonts w:ascii="Calibri" w:hAnsi="Calibri" w:cs="Calibri"/>
+          <w:sz w:val="24"/>
+          <w:szCs w:val="24"/>
+        </w:rPr>
+      </w:pPr>
+      <w:r>
+        <w:rPr>
+          <w:rFonts w:ascii="Calibri" w:hAnsi="Calibri" w:cs="Calibri"/>
+          <w:sz w:val="24"/>
+          <w:szCs w:val="24"/>
+        </w:rPr>
+        <w:t>- Add new products when new stock arrives.</w:t>
+      </w:r>
+    </w:p>
+    <w:p>
+      <w:pPr>
+        <w:rPr>
+          <w:rFonts w:ascii="Calibri" w:hAnsi="Calibri" w:cs="Calibri"/>
+          <w:sz w:val="24"/>
+          <w:szCs w:val="24"/>
+        </w:rPr>
+      </w:pPr>
+      <w:r>
+        <w:rPr>
+          <w:rFonts w:ascii="Calibri" w:hAnsi="Calibri" w:cs="Calibri"/>
+          <w:sz w:val="24"/>
+          <w:szCs w:val="24"/>
+        </w:rPr>
+        <w:t>- Update product prices and inventory levels.</w:t>
+      </w:r>
+    </w:p>
+    <w:p>
+      <w:pPr>
+        <w:rPr>
+          <w:rFonts w:ascii="Calibri" w:hAnsi="Calibri" w:cs="Calibri"/>
+          <w:sz w:val="24"/>
+          <w:szCs w:val="24"/>
+        </w:rPr>
+      </w:pPr>
+      <w:r>
+        <w:rPr>
+          <w:rFonts w:ascii="Calibri" w:hAnsi="Calibri" w:cs="Calibri"/>
+          <w:sz w:val="24"/>
+          <w:szCs w:val="24"/>
+        </w:rPr>
+        <w:t>- Remove products that are no longer available.</w:t>
+      </w:r>
+    </w:p>
+    <w:p>
+      <w:pPr>
+        <w:rPr>
+          <w:rFonts w:ascii="Calibri" w:hAnsi="Calibri" w:cs="Calibri"/>
+          <w:b/>
+          <w:bCs/>
+          <w:sz w:val="24"/>
+          <w:szCs w:val="24"/>
+        </w:rPr>
+      </w:pPr>
+      <w:r>
+        <w:rPr>
+          <w:rFonts w:ascii="Calibri" w:hAnsi="Calibri" w:cs="Calibri"/>
+          <w:b/>
+          <w:bCs/>
+          <w:sz w:val="24"/>
+          <w:szCs w:val="24"/>
+        </w:rPr>
+        <w:t>Needs:</w:t>
+      </w:r>
+    </w:p>
+    <w:p>
+      <w:pPr>
+        <w:rPr>
+          <w:rFonts w:ascii="Calibri" w:hAnsi="Calibri" w:cs="Calibri"/>
+          <w:sz w:val="24"/>
+          <w:szCs w:val="24"/>
+        </w:rPr>
+      </w:pPr>
+      <w:r>
+        <w:rPr>
+          <w:rFonts w:ascii="Calibri" w:hAnsi="Calibri" w:cs="Calibri"/>
+          <w:sz w:val="24"/>
+          <w:szCs w:val="24"/>
+        </w:rPr>
+        <w:t>- A clear dashboard to manage products and categories.</w:t>
+      </w:r>
+    </w:p>
+    <w:p>
+      <w:pPr>
+        <w:rPr>
+          <w:rFonts w:ascii="Calibri" w:hAnsi="Calibri" w:cs="Calibri"/>
+          <w:sz w:val="24"/>
+          <w:szCs w:val="24"/>
+        </w:rPr>
+      </w:pPr>
+      <w:r>
+        <w:rPr>
+          <w:rFonts w:ascii="Calibri" w:hAnsi="Calibri" w:cs="Calibri"/>
+          <w:sz w:val="24"/>
+          <w:szCs w:val="24"/>
+        </w:rPr>
+        <w:t>- Easy forms for adding and editing product information.</w:t>
+      </w:r>
+    </w:p>
+    <w:p>
+      <w:pPr>
+        <w:rPr>
+          <w:rFonts w:ascii="Calibri" w:hAnsi="Calibri" w:cs="Calibri"/>
+          <w:sz w:val="24"/>
+          <w:szCs w:val="24"/>
+        </w:rPr>
+      </w:pPr>
+      <w:r>
+        <w:rPr>
+          <w:rFonts w:ascii="Calibri" w:hAnsi="Calibri" w:cs="Calibri"/>
+          <w:sz w:val="24"/>
+          <w:szCs w:val="24"/>
+        </w:rPr>
+        <w:t>- Quick access to stock information.</w:t>
+      </w:r>
+    </w:p>
+    <w:p>
+      <w:pPr>
+        <w:rPr>
+          <w:rFonts w:ascii="Calibri" w:hAnsi="Calibri" w:cs="Calibri"/>
+          <w:b/>
+          <w:bCs/>
+          <w:sz w:val="24"/>
+          <w:szCs w:val="24"/>
+        </w:rPr>
+      </w:pPr>
+      <w:r>
+        <w:rPr>
+          <w:rFonts w:ascii="Calibri" w:hAnsi="Calibri" w:cs="Calibri"/>
+          <w:b/>
+          <w:bCs/>
+          <w:sz w:val="24"/>
+          <w:szCs w:val="24"/>
+        </w:rPr>
+        <w:t>Behaviours:</w:t>
+      </w:r>
+    </w:p>
+    <w:p>
+      <w:pPr>
+        <w:rPr>
+          <w:rFonts w:ascii="Calibri" w:hAnsi="Calibri" w:cs="Calibri"/>
+          <w:sz w:val="24"/>
+          <w:szCs w:val="24"/>
+        </w:rPr>
+      </w:pPr>
+      <w:r>
+        <w:rPr>
+          <w:rFonts w:ascii="Calibri" w:hAnsi="Calibri" w:cs="Calibri"/>
+          <w:sz w:val="24"/>
+          <w:szCs w:val="24"/>
+        </w:rPr>
+        <w:t>- Logs into the system daily to monitor products.</w:t>
+      </w:r>
+    </w:p>
+    <w:p>
+      <w:pPr>
+        <w:rPr>
+          <w:rFonts w:ascii="Calibri" w:hAnsi="Calibri" w:cs="Calibri"/>
+          <w:sz w:val="24"/>
+          <w:szCs w:val="24"/>
+        </w:rPr>
+      </w:pPr>
+      <w:r>
+        <w:rPr>
+          <w:rFonts w:ascii="Calibri" w:hAnsi="Calibri" w:cs="Calibri"/>
+          <w:sz w:val="24"/>
+          <w:szCs w:val="24"/>
+        </w:rPr>
+        <w:t>- Updates stock levels and product details regularly.</w:t>
+      </w:r>
+    </w:p>
+    <w:p>
+      <w:pPr>
+        <w:rPr>
+          <w:rFonts w:ascii="Calibri" w:hAnsi="Calibri" w:cs="Calibri"/>
+          <w:sz w:val="24"/>
+          <w:szCs w:val="24"/>
+        </w:rPr>
+      </w:pPr>
+      <w:r>
+        <w:rPr>
+          <w:rFonts w:ascii="Calibri" w:hAnsi="Calibri" w:cs="Calibri"/>
+          <w:sz w:val="24"/>
+          <w:szCs w:val="24"/>
+        </w:rPr>
+        <w:t>- Reviews product availability to ensure accurate inventory data.</w:t>
+      </w:r>
+    </w:p>
+    <w:p>
+      <w:pPr>
+        <w:rPr>
+          <w:rFonts w:ascii="Calibri" w:hAnsi="Calibri" w:cs="Calibri"/>
+          <w:b/>
+          <w:bCs/>
+          <w:sz w:val="24"/>
+          <w:szCs w:val="24"/>
+        </w:rPr>
+      </w:pPr>
+      <w:r>
+        <w:rPr>
+          <w:rFonts w:ascii="Calibri" w:hAnsi="Calibri" w:cs="Calibri"/>
+          <w:b/>
+          <w:bCs/>
+          <w:sz w:val="24"/>
+          <w:szCs w:val="24"/>
+        </w:rPr>
+        <w:t>Frustrations:</w:t>
+      </w:r>
+    </w:p>
+    <w:p>
+      <w:pPr>
+        <w:rPr>
+          <w:rFonts w:ascii="Calibri" w:hAnsi="Calibri" w:cs="Calibri"/>
+          <w:sz w:val="24"/>
+          <w:szCs w:val="24"/>
+        </w:rPr>
+      </w:pPr>
+      <w:r>
+        <w:rPr>
+          <w:rFonts w:ascii="Calibri" w:hAnsi="Calibri" w:cs="Calibri"/>
+          <w:sz w:val="24"/>
+          <w:szCs w:val="24"/>
+        </w:rPr>
+        <w:t>- Manual inventory management is time-consuming.</w:t>
+      </w:r>
+    </w:p>
+    <w:p>
+      <w:pPr>
+        <w:rPr>
+          <w:rFonts w:ascii="Calibri" w:hAnsi="Calibri" w:cs="Calibri"/>
+          <w:sz w:val="24"/>
+          <w:szCs w:val="24"/>
+        </w:rPr>
+      </w:pPr>
+      <w:r>
+        <w:rPr>
+          <w:rFonts w:ascii="Calibri" w:hAnsi="Calibri" w:cs="Calibri"/>
+          <w:sz w:val="24"/>
+          <w:szCs w:val="24"/>
+        </w:rPr>
+        <w:t>- Outdated product information can confuse customers.</w:t>
+      </w:r>
+    </w:p>
+    <w:p>
+      <w:pPr>
+        <w:rPr>
+          <w:rFonts w:ascii="Calibri" w:hAnsi="Calibri" w:cs="Calibri"/>
+          <w:sz w:val="24"/>
+          <w:szCs w:val="24"/>
+        </w:rPr>
+      </w:pPr>
+      <w:r>
+        <w:rPr>
+          <w:rFonts w:ascii="Calibri" w:hAnsi="Calibri" w:cs="Calibri"/>
+          <w:sz w:val="24"/>
+          <w:szCs w:val="24"/>
+        </w:rPr>
+        <w:t>- Lack of a centralized system for product management.</w:t>
+      </w:r>
+    </w:p>
+    <w:p>
+      <w:pPr>
+        <w:rPr>
+          <w:rFonts w:ascii="Calibri" w:hAnsi="Calibri" w:cs="Calibri"/>
+          <w:sz w:val="24"/>
+          <w:szCs w:val="24"/>
+        </w:rPr>
+      </w:pPr>
+    </w:p>
+    <w:p>
+      <w:pPr>
+        <w:rPr>
+          <w:rFonts w:ascii="Calibri" w:hAnsi="Calibri" w:cs="Calibri"/>
+          <w:b/>
+          <w:bCs/>
+          <w:sz w:val="24"/>
+          <w:szCs w:val="24"/>
+        </w:rPr>
+      </w:pPr>
+      <w:r>
+        <w:rPr>
+          <w:rFonts w:ascii="Calibri" w:hAnsi="Calibri" w:cs="Calibri"/>
+          <w:b/>
+          <w:bCs/>
+          <w:sz w:val="24"/>
+          <w:szCs w:val="24"/>
+        </w:rPr>
+        <w:t>Persona 2: Customer</w:t>
+      </w:r>
+    </w:p>
+    <w:p>
+      <w:pPr>
+        <w:rPr>
+          <w:rFonts w:ascii="Calibri" w:hAnsi="Calibri" w:cs="Calibri"/>
+          <w:color w:val="FF0000"/>
+          <w:sz w:val="24"/>
+          <w:szCs w:val="24"/>
+        </w:rPr>
+      </w:pPr>
+      <w:r>
+        <w:rPr>
+          <w:noProof/>
+        </w:rPr>
+        <w:lastRenderedPageBreak/>
+        <w:drawing>
+          <wp:anchor distT="0" distB="0" distL="114300" distR="114300" simplePos="0" relativeHeight="251658240" behindDoc="0" locked="0" layoutInCell="1" allowOverlap="1" wp14:anchorId="4EC4892E" wp14:editId="23782614">
+            <wp:simplePos x="0" y="0"/>
+            <wp:positionH relativeFrom="margin">
+              <wp:align>left</wp:align>
+            </wp:positionH>
+            <wp:positionV relativeFrom="paragraph">
+              <wp:posOffset>48806</wp:posOffset>
             </wp:positionV>
             <wp:extent cx="1200785" cy="1804670"/>
             <wp:effectExtent l="0" t="0" r="0" b="5080"/>
@@ -829,7 +902,7 @@
                     </pic:cNvPicPr>
                   </pic:nvPicPr>
                   <pic:blipFill>
-                    <a:blip r:embed="rId5" cstate="print">
+                    <a:blip r:embed="rId6" cstate="print">
                       <a:extLst>
                         <a:ext uri="{28A0092B-C50C-407E-A947-70E740481C1C}">
                           <a14:useLocalDpi xmlns:a14="http://schemas.microsoft.com/office/drawing/2010/main" val="0"/>
@@ -866,26 +939,6 @@
           </wp:anchor>
         </w:drawing>
       </w:r>
-      <w:r>
-        <w:rPr>
-          <w:rFonts w:ascii="Calibri" w:hAnsi="Calibri" w:cs="Calibri"/>
-          <w:b/>
-          <w:bCs/>
-          <w:sz w:val="24"/>
-          <w:szCs w:val="24"/>
-        </w:rPr>
-        <w:t>Persona 2: Customer</w:t>
-      </w:r>
-    </w:p>
-    <w:p>
-      <w:pPr>
-        <w:rPr>
-          <w:rFonts w:ascii="Calibri" w:hAnsi="Calibri" w:cs="Calibri"/>
-          <w:color w:val="FF0000"/>
-          <w:sz w:val="24"/>
-          <w:szCs w:val="24"/>
-        </w:rPr>
-      </w:pPr>
     </w:p>
     <w:p>
       <w:pPr>
@@ -927,6 +980,7 @@
           <w:rFonts w:ascii="Calibri" w:hAnsi="Calibri" w:cs="Calibri"/>
           <w:sz w:val="24"/>
           <w:szCs w:val="24"/>
+          <w:lang w:val="ru-RU"/>
         </w:rPr>
       </w:pPr>
       <w:r>
@@ -942,6 +996,36 @@
       <w:pPr>
         <w:rPr>
           <w:rFonts w:ascii="Calibri" w:hAnsi="Calibri" w:cs="Calibri"/>
+          <w:sz w:val="24"/>
+          <w:szCs w:val="24"/>
+          <w:lang w:val="ru-RU"/>
+        </w:rPr>
+      </w:pPr>
+    </w:p>
+    <w:p>
+      <w:pPr>
+        <w:rPr>
+          <w:rFonts w:ascii="Calibri" w:hAnsi="Calibri" w:cs="Calibri"/>
+          <w:sz w:val="24"/>
+          <w:szCs w:val="24"/>
+          <w:lang w:val="ru-RU"/>
+        </w:rPr>
+      </w:pPr>
+    </w:p>
+    <w:p>
+      <w:pPr>
+        <w:rPr>
+          <w:rFonts w:ascii="Calibri" w:hAnsi="Calibri" w:cs="Calibri"/>
+          <w:sz w:val="24"/>
+          <w:szCs w:val="24"/>
+          <w:lang w:val="ru-RU"/>
+        </w:rPr>
+      </w:pPr>
+    </w:p>
+    <w:p>
+      <w:pPr>
+        <w:rPr>
+          <w:rFonts w:ascii="Calibri" w:hAnsi="Calibri" w:cs="Calibri"/>
           <w:b/>
           <w:bCs/>
           <w:sz w:val="24"/>
@@ -973,309 +1057,311 @@
           <w:sz w:val="24"/>
           <w:szCs w:val="24"/>
         </w:rPr>
+        <w:t>- Browse available supermarket products online.</w:t>
+      </w:r>
+    </w:p>
+    <w:p>
+      <w:pPr>
+        <w:rPr>
+          <w:rFonts w:ascii="Calibri" w:hAnsi="Calibri" w:cs="Calibri"/>
+          <w:sz w:val="24"/>
+          <w:szCs w:val="24"/>
+        </w:rPr>
+      </w:pPr>
+      <w:r>
+        <w:rPr>
+          <w:rFonts w:ascii="Calibri" w:hAnsi="Calibri" w:cs="Calibri"/>
+          <w:sz w:val="24"/>
+          <w:szCs w:val="24"/>
+        </w:rPr>
+        <w:t>- Check prices and product availability before visiting the store.</w:t>
+      </w:r>
+    </w:p>
+    <w:p>
+      <w:pPr>
+        <w:rPr>
+          <w:rFonts w:ascii="Calibri" w:hAnsi="Calibri" w:cs="Calibri"/>
+          <w:sz w:val="24"/>
+          <w:szCs w:val="24"/>
+        </w:rPr>
+      </w:pPr>
+      <w:r>
+        <w:rPr>
+          <w:rFonts w:ascii="Calibri" w:hAnsi="Calibri" w:cs="Calibri"/>
+          <w:sz w:val="24"/>
+          <w:szCs w:val="24"/>
+        </w:rPr>
+        <w:t>- Quickly find products using search or categories.</w:t>
+      </w:r>
+    </w:p>
+    <w:p>
+      <w:pPr>
+        <w:rPr>
+          <w:rFonts w:ascii="Calibri" w:hAnsi="Calibri" w:cs="Calibri"/>
+          <w:b/>
+          <w:bCs/>
+          <w:sz w:val="24"/>
+          <w:szCs w:val="24"/>
+          <w:lang w:val="ru-RU"/>
+        </w:rPr>
+      </w:pPr>
+      <w:r>
+        <w:rPr>
+          <w:rFonts w:ascii="Calibri" w:hAnsi="Calibri" w:cs="Calibri"/>
+          <w:b/>
+          <w:bCs/>
+          <w:sz w:val="24"/>
+          <w:szCs w:val="24"/>
+        </w:rPr>
+        <w:t>Needs:</w:t>
+      </w:r>
+    </w:p>
+    <w:p>
+      <w:pPr>
+        <w:rPr>
+          <w:rFonts w:ascii="Calibri" w:hAnsi="Calibri" w:cs="Calibri"/>
+          <w:sz w:val="24"/>
+          <w:szCs w:val="24"/>
+        </w:rPr>
+      </w:pPr>
+      <w:r>
+        <w:rPr>
+          <w:rFonts w:ascii="Calibri" w:hAnsi="Calibri" w:cs="Calibri"/>
+          <w:sz w:val="24"/>
+          <w:szCs w:val="24"/>
+        </w:rPr>
+        <w:t>- Clear product listings with images and prices.</w:t>
+      </w:r>
+    </w:p>
+    <w:p>
+      <w:pPr>
+        <w:rPr>
+          <w:rFonts w:ascii="Calibri" w:hAnsi="Calibri" w:cs="Calibri"/>
+          <w:sz w:val="24"/>
+          <w:szCs w:val="24"/>
+        </w:rPr>
+      </w:pPr>
+      <w:r>
+        <w:rPr>
+          <w:rFonts w:ascii="Calibri" w:hAnsi="Calibri" w:cs="Calibri"/>
+          <w:sz w:val="24"/>
+          <w:szCs w:val="24"/>
+        </w:rPr>
+        <w:t>- Simple navigation through product categories.</w:t>
+      </w:r>
+    </w:p>
+    <w:p>
+      <w:pPr>
+        <w:rPr>
+          <w:rFonts w:ascii="Calibri" w:hAnsi="Calibri" w:cs="Calibri"/>
+          <w:sz w:val="24"/>
+          <w:szCs w:val="24"/>
+        </w:rPr>
+      </w:pPr>
+      <w:r>
+        <w:rPr>
+          <w:rFonts w:ascii="Calibri" w:hAnsi="Calibri" w:cs="Calibri"/>
+          <w:sz w:val="24"/>
+          <w:szCs w:val="24"/>
+        </w:rPr>
+        <w:t>- A fast and reliable checkout process.</w:t>
+      </w:r>
+    </w:p>
+    <w:p>
+      <w:pPr>
+        <w:rPr>
+          <w:rFonts w:ascii="Calibri" w:hAnsi="Calibri" w:cs="Calibri"/>
+          <w:b/>
+          <w:bCs/>
+          <w:sz w:val="24"/>
+          <w:szCs w:val="24"/>
+        </w:rPr>
+      </w:pPr>
+      <w:r>
+        <w:rPr>
+          <w:rFonts w:ascii="Calibri" w:hAnsi="Calibri" w:cs="Calibri"/>
+          <w:b/>
+          <w:bCs/>
+          <w:sz w:val="24"/>
+          <w:szCs w:val="24"/>
+        </w:rPr>
+        <w:t>Behaviours:</w:t>
+      </w:r>
+    </w:p>
+    <w:p>
+      <w:pPr>
+        <w:rPr>
+          <w:rFonts w:ascii="Calibri" w:hAnsi="Calibri" w:cs="Calibri"/>
+          <w:sz w:val="24"/>
+          <w:szCs w:val="24"/>
+        </w:rPr>
+      </w:pPr>
+      <w:r>
+        <w:rPr>
+          <w:rFonts w:ascii="Calibri" w:hAnsi="Calibri" w:cs="Calibri"/>
+          <w:sz w:val="24"/>
+          <w:szCs w:val="24"/>
+        </w:rPr>
+        <w:t>- Visits the website occasionally before shopping.</w:t>
+      </w:r>
+    </w:p>
+    <w:p>
+      <w:pPr>
+        <w:rPr>
+          <w:rFonts w:ascii="Calibri" w:hAnsi="Calibri" w:cs="Calibri"/>
+          <w:sz w:val="24"/>
+          <w:szCs w:val="24"/>
+        </w:rPr>
+      </w:pPr>
+      <w:r>
+        <w:rPr>
+          <w:rFonts w:ascii="Calibri" w:hAnsi="Calibri" w:cs="Calibri"/>
+          <w:sz w:val="24"/>
+          <w:szCs w:val="24"/>
+        </w:rPr>
+        <w:t>- Searches for specific products using filters or keywords.</w:t>
+      </w:r>
+    </w:p>
+    <w:p>
+      <w:pPr>
+        <w:rPr>
+          <w:rFonts w:ascii="Calibri" w:hAnsi="Calibri" w:cs="Calibri"/>
+          <w:sz w:val="24"/>
+          <w:szCs w:val="24"/>
+        </w:rPr>
+      </w:pPr>
+      <w:r>
+        <w:rPr>
+          <w:rFonts w:ascii="Calibri" w:hAnsi="Calibri" w:cs="Calibri"/>
+          <w:sz w:val="24"/>
+          <w:szCs w:val="24"/>
+        </w:rPr>
+        <w:t>- Adds items to the cart and places orders online.</w:t>
+      </w:r>
+    </w:p>
+    <w:p>
+      <w:pPr>
+        <w:rPr>
+          <w:rFonts w:ascii="Calibri" w:hAnsi="Calibri" w:cs="Calibri"/>
+          <w:b/>
+          <w:bCs/>
+          <w:sz w:val="24"/>
+          <w:szCs w:val="24"/>
+        </w:rPr>
+      </w:pPr>
+      <w:r>
+        <w:rPr>
+          <w:rFonts w:ascii="Calibri" w:hAnsi="Calibri" w:cs="Calibri"/>
+          <w:b/>
+          <w:bCs/>
+          <w:sz w:val="24"/>
+          <w:szCs w:val="24"/>
+        </w:rPr>
+        <w:t>Frustrations:</w:t>
+      </w:r>
+    </w:p>
+    <w:p>
+      <w:pPr>
+        <w:rPr>
+          <w:rFonts w:ascii="Calibri" w:hAnsi="Calibri" w:cs="Calibri"/>
+          <w:sz w:val="24"/>
+          <w:szCs w:val="24"/>
+        </w:rPr>
+      </w:pPr>
+      <w:r>
+        <w:rPr>
+          <w:rFonts w:ascii="Calibri" w:hAnsi="Calibri" w:cs="Calibri"/>
+          <w:sz w:val="24"/>
+          <w:szCs w:val="24"/>
+        </w:rPr>
+        <w:t>- Difficulty finding products in large supermarkets.</w:t>
+      </w:r>
+    </w:p>
+    <w:p>
+      <w:pPr>
+        <w:rPr>
+          <w:rFonts w:ascii="Calibri" w:hAnsi="Calibri" w:cs="Calibri"/>
+          <w:sz w:val="24"/>
+          <w:szCs w:val="24"/>
+        </w:rPr>
+      </w:pPr>
+      <w:r>
+        <w:rPr>
+          <w:rFonts w:ascii="Calibri" w:hAnsi="Calibri" w:cs="Calibri"/>
+          <w:sz w:val="24"/>
+          <w:szCs w:val="24"/>
+        </w:rPr>
+        <w:t>- Lack of clear price information.</w:t>
+      </w:r>
+    </w:p>
+    <w:p>
+      <w:pPr>
+        <w:rPr>
+          <w:rFonts w:ascii="Calibri" w:hAnsi="Calibri" w:cs="Calibri"/>
+          <w:sz w:val="24"/>
+          <w:szCs w:val="24"/>
+        </w:rPr>
+      </w:pPr>
+      <w:r>
+        <w:rPr>
+          <w:rFonts w:ascii="Calibri" w:hAnsi="Calibri" w:cs="Calibri"/>
+          <w:sz w:val="24"/>
+          <w:szCs w:val="24"/>
+        </w:rPr>
+        <w:t>- Limited ability to check product availability in advance.</w:t>
+      </w:r>
+    </w:p>
+    <w:p>
+      <w:pPr>
+        <w:rPr>
+          <w:rFonts w:ascii="Calibri" w:hAnsi="Calibri" w:cs="Calibri"/>
+          <w:sz w:val="24"/>
+          <w:szCs w:val="24"/>
+        </w:rPr>
+      </w:pPr>
+    </w:p>
+    <w:p>
+      <w:pPr>
+        <w:rPr>
+          <w:rFonts w:ascii="Calibri" w:hAnsi="Calibri" w:cs="Calibri"/>
+          <w:b/>
+          <w:bCs/>
+          <w:sz w:val="24"/>
+          <w:szCs w:val="24"/>
+          <w:lang w:val="ru-RU"/>
+        </w:rPr>
+      </w:pPr>
+      <w:r>
+        <w:rPr>
+          <w:rFonts w:ascii="Calibri" w:hAnsi="Calibri" w:cs="Calibri"/>
+          <w:b/>
+          <w:bCs/>
+          <w:sz w:val="24"/>
+          <w:szCs w:val="24"/>
+        </w:rPr>
+        <w:t>3. User Flows / Task Journeys</w:t>
+      </w:r>
+    </w:p>
+    <w:p>
+      <w:pPr>
+        <w:rPr>
+          <w:rFonts w:ascii="Calibri" w:hAnsi="Calibri" w:cs="Calibri"/>
+          <w:b/>
+          <w:bCs/>
+          <w:sz w:val="24"/>
+          <w:szCs w:val="24"/>
+        </w:rPr>
+      </w:pPr>
+      <w:r>
+        <w:rPr>
+          <w:rFonts w:ascii="Calibri" w:hAnsi="Calibri" w:cs="Calibri"/>
+          <w:b/>
+          <w:bCs/>
+          <w:noProof/>
+          <w:sz w:val="24"/>
+          <w:szCs w:val="24"/>
+        </w:rPr>
         <w:lastRenderedPageBreak/>
-        <w:t>- Browse available supermarket products online.</w:t>
-      </w:r>
-    </w:p>
-    <w:p>
-      <w:pPr>
-        <w:rPr>
-          <w:rFonts w:ascii="Calibri" w:hAnsi="Calibri" w:cs="Calibri"/>
-          <w:sz w:val="24"/>
-          <w:szCs w:val="24"/>
-        </w:rPr>
-      </w:pPr>
-      <w:r>
-        <w:rPr>
-          <w:rFonts w:ascii="Calibri" w:hAnsi="Calibri" w:cs="Calibri"/>
-          <w:sz w:val="24"/>
-          <w:szCs w:val="24"/>
-        </w:rPr>
-        <w:t>- Check prices and product availability before visiting the store.</w:t>
-      </w:r>
-    </w:p>
-    <w:p>
-      <w:pPr>
-        <w:rPr>
-          <w:rFonts w:ascii="Calibri" w:hAnsi="Calibri" w:cs="Calibri"/>
-          <w:sz w:val="24"/>
-          <w:szCs w:val="24"/>
-        </w:rPr>
-      </w:pPr>
-      <w:r>
-        <w:rPr>
-          <w:rFonts w:ascii="Calibri" w:hAnsi="Calibri" w:cs="Calibri"/>
-          <w:sz w:val="24"/>
-          <w:szCs w:val="24"/>
-        </w:rPr>
-        <w:t>- Quickly find products using search or categories.</w:t>
-      </w:r>
-    </w:p>
-    <w:p>
-      <w:pPr>
-        <w:rPr>
-          <w:rFonts w:ascii="Calibri" w:hAnsi="Calibri" w:cs="Calibri"/>
-          <w:b/>
-          <w:bCs/>
-          <w:sz w:val="24"/>
-          <w:szCs w:val="24"/>
-        </w:rPr>
-      </w:pPr>
-      <w:r>
-        <w:rPr>
-          <w:rFonts w:ascii="Calibri" w:hAnsi="Calibri" w:cs="Calibri"/>
-          <w:b/>
-          <w:bCs/>
-          <w:sz w:val="24"/>
-          <w:szCs w:val="24"/>
-        </w:rPr>
-        <w:t>Needs:</w:t>
-      </w:r>
-    </w:p>
-    <w:p>
-      <w:pPr>
-        <w:rPr>
-          <w:rFonts w:ascii="Calibri" w:hAnsi="Calibri" w:cs="Calibri"/>
-          <w:sz w:val="24"/>
-          <w:szCs w:val="24"/>
-        </w:rPr>
-      </w:pPr>
-      <w:r>
-        <w:rPr>
-          <w:rFonts w:ascii="Calibri" w:hAnsi="Calibri" w:cs="Calibri"/>
-          <w:sz w:val="24"/>
-          <w:szCs w:val="24"/>
-        </w:rPr>
-        <w:t>- Clear product listings with images and prices.</w:t>
-      </w:r>
-    </w:p>
-    <w:p>
-      <w:pPr>
-        <w:rPr>
-          <w:rFonts w:ascii="Calibri" w:hAnsi="Calibri" w:cs="Calibri"/>
-          <w:sz w:val="24"/>
-          <w:szCs w:val="24"/>
-        </w:rPr>
-      </w:pPr>
-      <w:r>
-        <w:rPr>
-          <w:rFonts w:ascii="Calibri" w:hAnsi="Calibri" w:cs="Calibri"/>
-          <w:sz w:val="24"/>
-          <w:szCs w:val="24"/>
-        </w:rPr>
-        <w:t>- Simple navigation through product categories.</w:t>
-      </w:r>
-    </w:p>
-    <w:p>
-      <w:pPr>
-        <w:rPr>
-          <w:rFonts w:ascii="Calibri" w:hAnsi="Calibri" w:cs="Calibri"/>
-          <w:sz w:val="24"/>
-          <w:szCs w:val="24"/>
-        </w:rPr>
-      </w:pPr>
-      <w:r>
-        <w:rPr>
-          <w:rFonts w:ascii="Calibri" w:hAnsi="Calibri" w:cs="Calibri"/>
-          <w:sz w:val="24"/>
-          <w:szCs w:val="24"/>
-        </w:rPr>
-        <w:t>- A fast and reliable checkout process.</w:t>
-      </w:r>
-    </w:p>
-    <w:p>
-      <w:pPr>
-        <w:rPr>
-          <w:rFonts w:ascii="Calibri" w:hAnsi="Calibri" w:cs="Calibri"/>
-          <w:b/>
-          <w:bCs/>
-          <w:sz w:val="24"/>
-          <w:szCs w:val="24"/>
-        </w:rPr>
-      </w:pPr>
-      <w:r>
-        <w:rPr>
-          <w:rFonts w:ascii="Calibri" w:hAnsi="Calibri" w:cs="Calibri"/>
-          <w:b/>
-          <w:bCs/>
-          <w:sz w:val="24"/>
-          <w:szCs w:val="24"/>
-        </w:rPr>
-        <w:t>Behaviours:</w:t>
-      </w:r>
-    </w:p>
-    <w:p>
-      <w:pPr>
-        <w:rPr>
-          <w:rFonts w:ascii="Calibri" w:hAnsi="Calibri" w:cs="Calibri"/>
-          <w:sz w:val="24"/>
-          <w:szCs w:val="24"/>
-        </w:rPr>
-      </w:pPr>
-      <w:r>
-        <w:rPr>
-          <w:rFonts w:ascii="Calibri" w:hAnsi="Calibri" w:cs="Calibri"/>
-          <w:sz w:val="24"/>
-          <w:szCs w:val="24"/>
-        </w:rPr>
-        <w:t>- Visits the website occasionally before shopping.</w:t>
-      </w:r>
-    </w:p>
-    <w:p>
-      <w:pPr>
-        <w:rPr>
-          <w:rFonts w:ascii="Calibri" w:hAnsi="Calibri" w:cs="Calibri"/>
-          <w:sz w:val="24"/>
-          <w:szCs w:val="24"/>
-        </w:rPr>
-      </w:pPr>
-      <w:r>
-        <w:rPr>
-          <w:rFonts w:ascii="Calibri" w:hAnsi="Calibri" w:cs="Calibri"/>
-          <w:sz w:val="24"/>
-          <w:szCs w:val="24"/>
-        </w:rPr>
-        <w:t>- Searches for specific products using filters or keywords.</w:t>
-      </w:r>
-    </w:p>
-    <w:p>
-      <w:pPr>
-        <w:rPr>
-          <w:rFonts w:ascii="Calibri" w:hAnsi="Calibri" w:cs="Calibri"/>
-          <w:sz w:val="24"/>
-          <w:szCs w:val="24"/>
-        </w:rPr>
-      </w:pPr>
-      <w:r>
-        <w:rPr>
-          <w:rFonts w:ascii="Calibri" w:hAnsi="Calibri" w:cs="Calibri"/>
-          <w:sz w:val="24"/>
-          <w:szCs w:val="24"/>
-        </w:rPr>
-        <w:t>- Adds items to the cart and places orders online.</w:t>
-      </w:r>
-    </w:p>
-    <w:p>
-      <w:pPr>
-        <w:rPr>
-          <w:rFonts w:ascii="Calibri" w:hAnsi="Calibri" w:cs="Calibri"/>
-          <w:b/>
-          <w:bCs/>
-          <w:sz w:val="24"/>
-          <w:szCs w:val="24"/>
-        </w:rPr>
-      </w:pPr>
-      <w:r>
-        <w:rPr>
-          <w:rFonts w:ascii="Calibri" w:hAnsi="Calibri" w:cs="Calibri"/>
-          <w:b/>
-          <w:bCs/>
-          <w:sz w:val="24"/>
-          <w:szCs w:val="24"/>
-        </w:rPr>
-        <w:t>Frustrations:</w:t>
-      </w:r>
-    </w:p>
-    <w:p>
-      <w:pPr>
-        <w:rPr>
-          <w:rFonts w:ascii="Calibri" w:hAnsi="Calibri" w:cs="Calibri"/>
-          <w:sz w:val="24"/>
-          <w:szCs w:val="24"/>
-        </w:rPr>
-      </w:pPr>
-      <w:r>
-        <w:rPr>
-          <w:rFonts w:ascii="Calibri" w:hAnsi="Calibri" w:cs="Calibri"/>
-          <w:sz w:val="24"/>
-          <w:szCs w:val="24"/>
-        </w:rPr>
-        <w:t>- Difficulty finding products in large supermarkets.</w:t>
-      </w:r>
-    </w:p>
-    <w:p>
-      <w:pPr>
-        <w:rPr>
-          <w:rFonts w:ascii="Calibri" w:hAnsi="Calibri" w:cs="Calibri"/>
-          <w:sz w:val="24"/>
-          <w:szCs w:val="24"/>
-        </w:rPr>
-      </w:pPr>
-      <w:r>
-        <w:rPr>
-          <w:rFonts w:ascii="Calibri" w:hAnsi="Calibri" w:cs="Calibri"/>
-          <w:sz w:val="24"/>
-          <w:szCs w:val="24"/>
-        </w:rPr>
-        <w:t>- Lack of clear price information.</w:t>
-      </w:r>
-    </w:p>
-    <w:p>
-      <w:pPr>
-        <w:rPr>
-          <w:rFonts w:ascii="Calibri" w:hAnsi="Calibri" w:cs="Calibri"/>
-          <w:sz w:val="24"/>
-          <w:szCs w:val="24"/>
-        </w:rPr>
-      </w:pPr>
-      <w:r>
-        <w:rPr>
-          <w:rFonts w:ascii="Calibri" w:hAnsi="Calibri" w:cs="Calibri"/>
-          <w:sz w:val="24"/>
-          <w:szCs w:val="24"/>
-        </w:rPr>
-        <w:t>- Limited ability to check product availability in advance.</w:t>
-      </w:r>
-    </w:p>
-    <w:p>
-      <w:pPr>
-        <w:rPr>
-          <w:rFonts w:ascii="Calibri" w:hAnsi="Calibri" w:cs="Calibri"/>
-          <w:sz w:val="24"/>
-          <w:szCs w:val="24"/>
-        </w:rPr>
-      </w:pPr>
-    </w:p>
-    <w:p>
-      <w:pPr>
-        <w:rPr>
-          <w:rFonts w:ascii="Calibri" w:hAnsi="Calibri" w:cs="Calibri"/>
-          <w:b/>
-          <w:bCs/>
-          <w:sz w:val="24"/>
-          <w:szCs w:val="24"/>
-        </w:rPr>
-      </w:pPr>
-      <w:r>
-        <w:rPr>
-          <w:rFonts w:ascii="Calibri" w:hAnsi="Calibri" w:cs="Calibri"/>
-          <w:b/>
-          <w:bCs/>
-          <w:sz w:val="24"/>
-          <w:szCs w:val="24"/>
-        </w:rPr>
-        <w:t>3. User Flows / Task Journeys</w:t>
-      </w:r>
-    </w:p>
-    <w:p>
-      <w:pPr>
-        <w:rPr>
-          <w:rFonts w:ascii="Calibri" w:hAnsi="Calibri" w:cs="Calibri"/>
-          <w:b/>
-          <w:bCs/>
-          <w:sz w:val="24"/>
-          <w:szCs w:val="24"/>
-        </w:rPr>
-      </w:pPr>
-      <w:r>
-        <w:rPr>
-          <w:rFonts w:ascii="Calibri" w:hAnsi="Calibri" w:cs="Calibri"/>
-          <w:b/>
-          <w:bCs/>
-          <w:noProof/>
-          <w:sz w:val="24"/>
-          <w:szCs w:val="24"/>
-        </w:rPr>
         <w:drawing>
           <wp:anchor distT="0" distB="0" distL="114300" distR="114300" simplePos="0" relativeHeight="251660288" behindDoc="0" locked="0" layoutInCell="1" allowOverlap="1" wp14:anchorId="3AAB44EC" wp14:editId="567D26BC">
             <wp:simplePos x="0" y="0"/>
@@ -1300,7 +1386,7 @@
                     <pic:cNvPicPr/>
                   </pic:nvPicPr>
                   <pic:blipFill>
-                    <a:blip r:embed="rId6">
+                    <a:blip r:embed="rId7">
                       <a:extLst>
                         <a:ext uri="{28A0092B-C50C-407E-A947-70E740481C1C}">
                           <a14:useLocalDpi xmlns:a14="http://schemas.microsoft.com/office/drawing/2010/main" val="0"/>
@@ -1516,53 +1602,53 @@
           <w:sz w:val="24"/>
           <w:szCs w:val="24"/>
         </w:rPr>
+        <w:t xml:space="preserve">3.2. </w:t>
+      </w:r>
+      <w:r>
+        <w:rPr>
+          <w:rFonts w:ascii="Calibri" w:hAnsi="Calibri" w:cs="Calibri"/>
+          <w:b/>
+          <w:bCs/>
+          <w:sz w:val="24"/>
+          <w:szCs w:val="24"/>
+        </w:rPr>
+        <w:t>Customer Flow</w:t>
+      </w:r>
+    </w:p>
+    <w:p>
+      <w:pPr>
+        <w:rPr>
+          <w:rFonts w:ascii="Calibri" w:hAnsi="Calibri" w:cs="Calibri"/>
+          <w:color w:val="FF0000"/>
+          <w:sz w:val="24"/>
+          <w:szCs w:val="24"/>
+        </w:rPr>
+      </w:pPr>
+      <w:r>
+        <w:rPr>
+          <w:rFonts w:ascii="Calibri" w:hAnsi="Calibri" w:cs="Calibri"/>
+          <w:sz w:val="24"/>
+          <w:szCs w:val="24"/>
+        </w:rPr>
+        <w:t>Visit website → Browse products → Select product → View product details → Decide whether to add the product to the cart → Add to cart → Decide whether to continue shopping or proceed to checkout → Confirm order.</w:t>
+      </w:r>
+    </w:p>
+    <w:p>
+      <w:pPr>
+        <w:rPr>
+          <w:rFonts w:ascii="Calibri" w:hAnsi="Calibri" w:cs="Calibri"/>
+          <w:sz w:val="24"/>
+          <w:szCs w:val="24"/>
+        </w:rPr>
+      </w:pPr>
+      <w:r>
+        <w:rPr>
+          <w:rFonts w:ascii="Calibri" w:hAnsi="Calibri" w:cs="Calibri"/>
+          <w:noProof/>
+          <w:sz w:val="24"/>
+          <w:szCs w:val="24"/>
+        </w:rPr>
         <w:lastRenderedPageBreak/>
-        <w:t xml:space="preserve">3.2. </w:t>
-      </w:r>
-      <w:r>
-        <w:rPr>
-          <w:rFonts w:ascii="Calibri" w:hAnsi="Calibri" w:cs="Calibri"/>
-          <w:b/>
-          <w:bCs/>
-          <w:sz w:val="24"/>
-          <w:szCs w:val="24"/>
-        </w:rPr>
-        <w:t>Customer Flow</w:t>
-      </w:r>
-    </w:p>
-    <w:p>
-      <w:pPr>
-        <w:rPr>
-          <w:rFonts w:ascii="Calibri" w:hAnsi="Calibri" w:cs="Calibri"/>
-          <w:color w:val="FF0000"/>
-          <w:sz w:val="24"/>
-          <w:szCs w:val="24"/>
-        </w:rPr>
-      </w:pPr>
-      <w:r>
-        <w:rPr>
-          <w:rFonts w:ascii="Calibri" w:hAnsi="Calibri" w:cs="Calibri"/>
-          <w:sz w:val="24"/>
-          <w:szCs w:val="24"/>
-        </w:rPr>
-        <w:t>Visit website → Browse products → Select product → View product details → Decide whether to add the product to the cart → Add to cart → Decide whether to continue shopping or proceed to checkout → Confirm order.</w:t>
-      </w:r>
-    </w:p>
-    <w:p>
-      <w:pPr>
-        <w:rPr>
-          <w:rFonts w:ascii="Calibri" w:hAnsi="Calibri" w:cs="Calibri"/>
-          <w:sz w:val="24"/>
-          <w:szCs w:val="24"/>
-        </w:rPr>
-      </w:pPr>
-      <w:r>
-        <w:rPr>
-          <w:rFonts w:ascii="Calibri" w:hAnsi="Calibri" w:cs="Calibri"/>
-          <w:noProof/>
-          <w:sz w:val="24"/>
-          <w:szCs w:val="24"/>
-        </w:rPr>
         <w:drawing>
           <wp:anchor distT="0" distB="0" distL="114300" distR="114300" simplePos="0" relativeHeight="251659264" behindDoc="0" locked="0" layoutInCell="1" allowOverlap="1" wp14:anchorId="1C981648" wp14:editId="1D06EBFA">
             <wp:simplePos x="0" y="0"/>
@@ -1587,7 +1673,7 @@
                     <pic:cNvPicPr/>
                   </pic:nvPicPr>
                   <pic:blipFill>
-                    <a:blip r:embed="rId7">
+                    <a:blip r:embed="rId8">
                       <a:extLst>
                         <a:ext uri="{28A0092B-C50C-407E-A947-70E740481C1C}">
                           <a14:useLocalDpi xmlns:a14="http://schemas.microsoft.com/office/drawing/2010/main" val="0"/>

</xml_diff>

<commit_message>
Add section headings and  project scope and included features
</commit_message>
<xml_diff>
--- a/docs/Project-planning.docx
+++ b/docs/Project-planning.docx
@@ -392,7 +392,7 @@
                     </pic:cNvPicPr>
                   </pic:nvPicPr>
                   <pic:blipFill rotWithShape="1">
-                    <a:blip r:embed="rId5">
+                    <a:blip r:embed="rId6">
                       <a:extLst>
                         <a:ext uri="{28A0092B-C50C-407E-A947-70E740481C1C}">
                           <a14:useLocalDpi xmlns:a14="http://schemas.microsoft.com/office/drawing/2010/main" val="0"/>
@@ -902,7 +902,7 @@
                     </pic:cNvPicPr>
                   </pic:nvPicPr>
                   <pic:blipFill>
-                    <a:blip r:embed="rId6" cstate="print">
+                    <a:blip r:embed="rId7" cstate="print">
                       <a:extLst>
                         <a:ext uri="{28A0092B-C50C-407E-A947-70E740481C1C}">
                           <a14:useLocalDpi xmlns:a14="http://schemas.microsoft.com/office/drawing/2010/main" val="0"/>
@@ -1328,7 +1328,6 @@
           <w:bCs/>
           <w:sz w:val="24"/>
           <w:szCs w:val="24"/>
-          <w:lang w:val="ru-RU"/>
         </w:rPr>
       </w:pPr>
       <w:r>
@@ -1386,7 +1385,7 @@
                     <pic:cNvPicPr/>
                   </pic:nvPicPr>
                   <pic:blipFill>
-                    <a:blip r:embed="rId7">
+                    <a:blip r:embed="rId8">
                       <a:extLst>
                         <a:ext uri="{28A0092B-C50C-407E-A947-70E740481C1C}">
                           <a14:useLocalDpi xmlns:a14="http://schemas.microsoft.com/office/drawing/2010/main" val="0"/>
@@ -1673,7 +1672,7 @@
                     <pic:cNvPicPr/>
                   </pic:nvPicPr>
                   <pic:blipFill>
-                    <a:blip r:embed="rId8">
+                    <a:blip r:embed="rId9">
                       <a:extLst>
                         <a:ext uri="{28A0092B-C50C-407E-A947-70E740481C1C}">
                           <a14:useLocalDpi xmlns:a14="http://schemas.microsoft.com/office/drawing/2010/main" val="0"/>
@@ -1905,17 +1904,2058 @@
           <w:rFonts w:ascii="Calibri" w:hAnsi="Calibri" w:cs="Calibri"/>
           <w:sz w:val="24"/>
           <w:szCs w:val="24"/>
+        </w:rPr>
+      </w:pPr>
+      <w:r>
+        <w:rPr>
+          <w:rFonts w:ascii="Calibri" w:hAnsi="Calibri" w:cs="Calibri"/>
+          <w:sz w:val="24"/>
+          <w:szCs w:val="24"/>
+        </w:rPr>
+        <w:t>10. The system confirms the order.</w:t>
+      </w:r>
+    </w:p>
+    <w:p>
+      <w:pPr>
+        <w:rPr>
+          <w:rFonts w:ascii="Calibri" w:hAnsi="Calibri" w:cs="Calibri"/>
+          <w:sz w:val="24"/>
+          <w:szCs w:val="24"/>
+        </w:rPr>
+      </w:pPr>
+    </w:p>
+    <w:p>
+      <w:pPr>
+        <w:rPr>
+          <w:rFonts w:ascii="Calibri" w:hAnsi="Calibri" w:cs="Calibri"/>
+          <w:b/>
+          <w:bCs/>
+          <w:sz w:val="24"/>
+          <w:szCs w:val="24"/>
+        </w:rPr>
+      </w:pPr>
+      <w:r>
+        <w:rPr>
+          <w:rFonts w:ascii="Calibri" w:hAnsi="Calibri" w:cs="Calibri"/>
+          <w:b/>
+          <w:bCs/>
+          <w:sz w:val="24"/>
+          <w:szCs w:val="24"/>
+        </w:rPr>
+        <w:t>4. Low-Fidelity Wireframes</w:t>
+      </w:r>
+    </w:p>
+    <w:p>
+      <w:pPr>
+        <w:rPr>
+          <w:rFonts w:ascii="Calibri" w:hAnsi="Calibri" w:cs="Calibri"/>
+          <w:b/>
+          <w:bCs/>
+          <w:color w:val="FF0000"/>
+          <w:sz w:val="24"/>
+          <w:szCs w:val="24"/>
+        </w:rPr>
+      </w:pPr>
+      <w:proofErr w:type="spellStart"/>
+      <w:r>
+        <w:rPr>
+          <w:rFonts w:ascii="Calibri" w:hAnsi="Calibri" w:cs="Calibri"/>
+          <w:b/>
+          <w:bCs/>
+          <w:color w:val="FF0000"/>
+          <w:sz w:val="24"/>
+          <w:szCs w:val="24"/>
+        </w:rPr>
+        <w:t>Описывает</w:t>
+      </w:r>
+      <w:proofErr w:type="spellEnd"/>
+      <w:r>
+        <w:rPr>
+          <w:rFonts w:ascii="Calibri" w:hAnsi="Calibri" w:cs="Calibri"/>
+          <w:b/>
+          <w:bCs/>
+          <w:color w:val="FF0000"/>
+          <w:sz w:val="24"/>
+          <w:szCs w:val="24"/>
+        </w:rPr>
+        <w:t xml:space="preserve"> </w:t>
+      </w:r>
+      <w:proofErr w:type="spellStart"/>
+      <w:r>
+        <w:rPr>
+          <w:rFonts w:ascii="Calibri" w:hAnsi="Calibri" w:cs="Calibri"/>
+          <w:b/>
+          <w:bCs/>
+          <w:color w:val="FF0000"/>
+          <w:sz w:val="24"/>
+          <w:szCs w:val="24"/>
+        </w:rPr>
+        <w:t>страницы</w:t>
+      </w:r>
+      <w:proofErr w:type="spellEnd"/>
+      <w:r>
+        <w:rPr>
+          <w:rFonts w:ascii="Calibri" w:hAnsi="Calibri" w:cs="Calibri"/>
+          <w:b/>
+          <w:bCs/>
+          <w:color w:val="FF0000"/>
+          <w:sz w:val="24"/>
+          <w:szCs w:val="24"/>
+        </w:rPr>
+        <w:t xml:space="preserve"> (</w:t>
+      </w:r>
+      <w:proofErr w:type="spellStart"/>
+      <w:r>
+        <w:rPr>
+          <w:rFonts w:ascii="Calibri" w:hAnsi="Calibri" w:cs="Calibri"/>
+          <w:b/>
+          <w:bCs/>
+          <w:color w:val="FF0000"/>
+          <w:sz w:val="24"/>
+          <w:szCs w:val="24"/>
+        </w:rPr>
+        <w:t>без</w:t>
+      </w:r>
+      <w:proofErr w:type="spellEnd"/>
+      <w:r>
+        <w:rPr>
+          <w:rFonts w:ascii="Calibri" w:hAnsi="Calibri" w:cs="Calibri"/>
+          <w:b/>
+          <w:bCs/>
+          <w:color w:val="FF0000"/>
+          <w:sz w:val="24"/>
+          <w:szCs w:val="24"/>
+        </w:rPr>
+        <w:t xml:space="preserve"> </w:t>
+      </w:r>
+      <w:proofErr w:type="spellStart"/>
+      <w:r>
+        <w:rPr>
+          <w:rFonts w:ascii="Calibri" w:hAnsi="Calibri" w:cs="Calibri"/>
+          <w:b/>
+          <w:bCs/>
+          <w:color w:val="FF0000"/>
+          <w:sz w:val="24"/>
+          <w:szCs w:val="24"/>
+        </w:rPr>
+        <w:t>дизайна</w:t>
+      </w:r>
+      <w:proofErr w:type="spellEnd"/>
+      <w:r>
+        <w:rPr>
+          <w:rFonts w:ascii="Calibri" w:hAnsi="Calibri" w:cs="Calibri"/>
+          <w:b/>
+          <w:bCs/>
+          <w:color w:val="FF0000"/>
+          <w:sz w:val="24"/>
+          <w:szCs w:val="24"/>
+        </w:rPr>
+        <w:t>):</w:t>
+      </w:r>
+    </w:p>
+    <w:p>
+      <w:pPr>
+        <w:numPr>
+          <w:ilvl w:val="0"/>
+          <w:numId w:val="1"/>
+        </w:numPr>
+        <w:rPr>
+          <w:rFonts w:ascii="Calibri" w:hAnsi="Calibri" w:cs="Calibri"/>
+          <w:b/>
+          <w:bCs/>
+          <w:color w:val="FF0000"/>
+          <w:sz w:val="24"/>
+          <w:szCs w:val="24"/>
+        </w:rPr>
+      </w:pPr>
+      <w:r>
+        <w:rPr>
+          <w:rFonts w:ascii="Calibri" w:hAnsi="Calibri" w:cs="Calibri"/>
+          <w:b/>
+          <w:bCs/>
+          <w:color w:val="FF0000"/>
+          <w:sz w:val="24"/>
+          <w:szCs w:val="24"/>
+        </w:rPr>
+        <w:t xml:space="preserve">Homepage </w:t>
+      </w:r>
+    </w:p>
+    <w:p>
+      <w:pPr>
+        <w:numPr>
+          <w:ilvl w:val="0"/>
+          <w:numId w:val="1"/>
+        </w:numPr>
+        <w:rPr>
+          <w:rFonts w:ascii="Calibri" w:hAnsi="Calibri" w:cs="Calibri"/>
+          <w:b/>
+          <w:bCs/>
+          <w:color w:val="FF0000"/>
+          <w:sz w:val="24"/>
+          <w:szCs w:val="24"/>
+        </w:rPr>
+      </w:pPr>
+      <w:r>
+        <w:rPr>
+          <w:rFonts w:ascii="Calibri" w:hAnsi="Calibri" w:cs="Calibri"/>
+          <w:b/>
+          <w:bCs/>
+          <w:color w:val="FF0000"/>
+          <w:sz w:val="24"/>
+          <w:szCs w:val="24"/>
+        </w:rPr>
+        <w:t xml:space="preserve">Product List </w:t>
+      </w:r>
+    </w:p>
+    <w:p>
+      <w:pPr>
+        <w:numPr>
+          <w:ilvl w:val="0"/>
+          <w:numId w:val="1"/>
+        </w:numPr>
+        <w:rPr>
+          <w:rFonts w:ascii="Calibri" w:hAnsi="Calibri" w:cs="Calibri"/>
+          <w:b/>
+          <w:bCs/>
+          <w:color w:val="FF0000"/>
+          <w:sz w:val="24"/>
+          <w:szCs w:val="24"/>
+        </w:rPr>
+      </w:pPr>
+      <w:r>
+        <w:rPr>
+          <w:rFonts w:ascii="Calibri" w:hAnsi="Calibri" w:cs="Calibri"/>
+          <w:b/>
+          <w:bCs/>
+          <w:color w:val="FF0000"/>
+          <w:sz w:val="24"/>
+          <w:szCs w:val="24"/>
+        </w:rPr>
+        <w:t xml:space="preserve">Product Details </w:t>
+      </w:r>
+    </w:p>
+    <w:p>
+      <w:pPr>
+        <w:numPr>
+          <w:ilvl w:val="0"/>
+          <w:numId w:val="1"/>
+        </w:numPr>
+        <w:rPr>
+          <w:rFonts w:ascii="Calibri" w:hAnsi="Calibri" w:cs="Calibri"/>
+          <w:b/>
+          <w:bCs/>
+          <w:color w:val="FF0000"/>
+          <w:sz w:val="24"/>
+          <w:szCs w:val="24"/>
+        </w:rPr>
+      </w:pPr>
+      <w:r>
+        <w:rPr>
+          <w:rFonts w:ascii="Calibri" w:hAnsi="Calibri" w:cs="Calibri"/>
+          <w:b/>
+          <w:bCs/>
+          <w:color w:val="FF0000"/>
+          <w:sz w:val="24"/>
+          <w:szCs w:val="24"/>
+        </w:rPr>
+        <w:t xml:space="preserve">Admin Dashboard </w:t>
+      </w:r>
+    </w:p>
+    <w:p>
+      <w:pPr>
+        <w:numPr>
+          <w:ilvl w:val="0"/>
+          <w:numId w:val="1"/>
+        </w:numPr>
+        <w:rPr>
+          <w:rFonts w:ascii="Calibri" w:hAnsi="Calibri" w:cs="Calibri"/>
+          <w:b/>
+          <w:bCs/>
+          <w:color w:val="FF0000"/>
+          <w:sz w:val="24"/>
+          <w:szCs w:val="24"/>
+        </w:rPr>
+      </w:pPr>
+      <w:r>
+        <w:rPr>
+          <w:rFonts w:ascii="Calibri" w:hAnsi="Calibri" w:cs="Calibri"/>
+          <w:b/>
+          <w:bCs/>
+          <w:color w:val="FF0000"/>
+          <w:sz w:val="24"/>
+          <w:szCs w:val="24"/>
+        </w:rPr>
+        <w:t>Add/Edit Product</w:t>
+      </w:r>
+    </w:p>
+    <w:p>
+      <w:pPr>
+        <w:rPr>
+          <w:rFonts w:ascii="Calibri" w:hAnsi="Calibri" w:cs="Calibri"/>
+          <w:b/>
+          <w:bCs/>
+          <w:sz w:val="24"/>
+          <w:szCs w:val="24"/>
           <w:lang w:val="ru-RU"/>
         </w:rPr>
       </w:pPr>
-      <w:r>
-        <w:rPr>
-          <w:rFonts w:ascii="Calibri" w:hAnsi="Calibri" w:cs="Calibri"/>
-          <w:sz w:val="24"/>
-          <w:szCs w:val="24"/>
-        </w:rPr>
-        <w:t>10. The system confirms the order.</w:t>
-      </w:r>
+    </w:p>
+    <w:p>
+      <w:pPr>
+        <w:rPr>
+          <w:rFonts w:ascii="Calibri" w:hAnsi="Calibri" w:cs="Calibri"/>
+          <w:b/>
+          <w:bCs/>
+          <w:sz w:val="24"/>
+          <w:szCs w:val="24"/>
+          <w:lang w:val="ru-RU"/>
+        </w:rPr>
+      </w:pPr>
+      <w:r>
+        <w:rPr>
+          <w:rFonts w:ascii="Calibri" w:hAnsi="Calibri" w:cs="Calibri"/>
+          <w:b/>
+          <w:bCs/>
+          <w:sz w:val="24"/>
+          <w:szCs w:val="24"/>
+        </w:rPr>
+        <w:t>5. Project Scope</w:t>
+      </w:r>
+    </w:p>
+    <w:p>
+      <w:pPr>
+        <w:rPr>
+          <w:rFonts w:ascii="Calibri" w:hAnsi="Calibri" w:cs="Calibri"/>
+          <w:b/>
+          <w:bCs/>
+          <w:sz w:val="24"/>
+          <w:szCs w:val="24"/>
+          <w:lang w:val="ru-RU"/>
+        </w:rPr>
+      </w:pPr>
+      <w:r>
+        <w:rPr>
+          <w:rFonts w:ascii="Calibri" w:hAnsi="Calibri" w:cs="Calibri"/>
+          <w:b/>
+          <w:bCs/>
+          <w:sz w:val="24"/>
+          <w:szCs w:val="24"/>
+        </w:rPr>
+        <w:t>Included Features</w:t>
+      </w:r>
+    </w:p>
+    <w:p>
+      <w:pPr>
+        <w:rPr>
+          <w:rFonts w:ascii="Calibri" w:hAnsi="Calibri" w:cs="Calibri"/>
+          <w:sz w:val="24"/>
+          <w:szCs w:val="24"/>
+        </w:rPr>
+      </w:pPr>
+      <w:r>
+        <w:rPr>
+          <w:rFonts w:ascii="Calibri" w:hAnsi="Calibri" w:cs="Calibri"/>
+          <w:sz w:val="24"/>
+          <w:szCs w:val="24"/>
+        </w:rPr>
+        <w:t>The system will include the following features:</w:t>
+      </w:r>
+    </w:p>
+    <w:p>
+      <w:pPr>
+        <w:rPr>
+          <w:rFonts w:ascii="Calibri" w:hAnsi="Calibri" w:cs="Calibri"/>
+          <w:sz w:val="24"/>
+          <w:szCs w:val="24"/>
+        </w:rPr>
+      </w:pPr>
+    </w:p>
+    <w:p>
+      <w:pPr>
+        <w:rPr>
+          <w:rFonts w:ascii="Calibri" w:hAnsi="Calibri" w:cs="Calibri"/>
+          <w:sz w:val="24"/>
+          <w:szCs w:val="24"/>
+        </w:rPr>
+      </w:pPr>
+      <w:r>
+        <w:rPr>
+          <w:rFonts w:ascii="Calibri" w:hAnsi="Calibri" w:cs="Calibri"/>
+          <w:sz w:val="24"/>
+          <w:szCs w:val="24"/>
+        </w:rPr>
+        <w:t>- User authentication including registration and login</w:t>
+      </w:r>
+    </w:p>
+    <w:p>
+      <w:pPr>
+        <w:rPr>
+          <w:rFonts w:ascii="Calibri" w:hAnsi="Calibri" w:cs="Calibri"/>
+          <w:sz w:val="24"/>
+          <w:szCs w:val="24"/>
+        </w:rPr>
+      </w:pPr>
+      <w:r>
+        <w:rPr>
+          <w:rFonts w:ascii="Calibri" w:hAnsi="Calibri" w:cs="Calibri"/>
+          <w:sz w:val="24"/>
+          <w:szCs w:val="24"/>
+        </w:rPr>
+        <w:lastRenderedPageBreak/>
+        <w:t xml:space="preserve">- Product </w:t>
+      </w:r>
+      <w:proofErr w:type="spellStart"/>
+      <w:r>
+        <w:rPr>
+          <w:rFonts w:ascii="Calibri" w:hAnsi="Calibri" w:cs="Calibri"/>
+          <w:sz w:val="24"/>
+          <w:szCs w:val="24"/>
+        </w:rPr>
+        <w:t>catalog</w:t>
+      </w:r>
+      <w:proofErr w:type="spellEnd"/>
+      <w:r>
+        <w:rPr>
+          <w:rFonts w:ascii="Calibri" w:hAnsi="Calibri" w:cs="Calibri"/>
+          <w:sz w:val="24"/>
+          <w:szCs w:val="24"/>
+        </w:rPr>
+        <w:t xml:space="preserve"> browsing for customers</w:t>
+      </w:r>
+    </w:p>
+    <w:p>
+      <w:pPr>
+        <w:rPr>
+          <w:rFonts w:ascii="Calibri" w:hAnsi="Calibri" w:cs="Calibri"/>
+          <w:sz w:val="24"/>
+          <w:szCs w:val="24"/>
+        </w:rPr>
+      </w:pPr>
+      <w:r>
+        <w:rPr>
+          <w:rFonts w:ascii="Calibri" w:hAnsi="Calibri" w:cs="Calibri"/>
+          <w:sz w:val="24"/>
+          <w:szCs w:val="24"/>
+        </w:rPr>
+        <w:t>- Product management using CRUD operations</w:t>
+      </w:r>
+    </w:p>
+    <w:p>
+      <w:pPr>
+        <w:rPr>
+          <w:rFonts w:ascii="Calibri" w:hAnsi="Calibri" w:cs="Calibri"/>
+          <w:sz w:val="24"/>
+          <w:szCs w:val="24"/>
+        </w:rPr>
+      </w:pPr>
+      <w:r>
+        <w:rPr>
+          <w:rFonts w:ascii="Calibri" w:hAnsi="Calibri" w:cs="Calibri"/>
+          <w:sz w:val="24"/>
+          <w:szCs w:val="24"/>
+        </w:rPr>
+        <w:t>- Category-based product organization</w:t>
+      </w:r>
+    </w:p>
+    <w:p>
+      <w:pPr>
+        <w:rPr>
+          <w:rFonts w:ascii="Calibri" w:hAnsi="Calibri" w:cs="Calibri"/>
+          <w:sz w:val="24"/>
+          <w:szCs w:val="24"/>
+        </w:rPr>
+      </w:pPr>
+      <w:r>
+        <w:rPr>
+          <w:rFonts w:ascii="Calibri" w:hAnsi="Calibri" w:cs="Calibri"/>
+          <w:sz w:val="24"/>
+          <w:szCs w:val="24"/>
+        </w:rPr>
+        <w:t>- Shopping cart functionality</w:t>
+      </w:r>
+    </w:p>
+    <w:p>
+      <w:pPr>
+        <w:rPr>
+          <w:rFonts w:ascii="Calibri" w:hAnsi="Calibri" w:cs="Calibri"/>
+          <w:sz w:val="24"/>
+          <w:szCs w:val="24"/>
+        </w:rPr>
+      </w:pPr>
+      <w:r>
+        <w:rPr>
+          <w:rFonts w:ascii="Calibri" w:hAnsi="Calibri" w:cs="Calibri"/>
+          <w:sz w:val="24"/>
+          <w:szCs w:val="24"/>
+        </w:rPr>
+        <w:t>- Order creation and order history</w:t>
+      </w:r>
+    </w:p>
+    <w:p>
+      <w:pPr>
+        <w:rPr>
+          <w:rFonts w:ascii="Calibri" w:hAnsi="Calibri" w:cs="Calibri"/>
+          <w:sz w:val="24"/>
+          <w:szCs w:val="24"/>
+        </w:rPr>
+      </w:pPr>
+      <w:r>
+        <w:rPr>
+          <w:rFonts w:ascii="Calibri" w:hAnsi="Calibri" w:cs="Calibri"/>
+          <w:sz w:val="24"/>
+          <w:szCs w:val="24"/>
+        </w:rPr>
+        <w:t>- Form validation on both client side and server side</w:t>
+      </w:r>
+    </w:p>
+    <w:p>
+      <w:pPr>
+        <w:ind w:left="720"/>
+        <w:rPr>
+          <w:rFonts w:ascii="Calibri" w:hAnsi="Calibri" w:cs="Calibri"/>
+          <w:color w:val="FF0000"/>
+          <w:sz w:val="24"/>
+          <w:szCs w:val="24"/>
+        </w:rPr>
+      </w:pPr>
+    </w:p>
+    <w:p>
+      <w:pPr>
+        <w:ind w:left="720"/>
+        <w:rPr>
+          <w:rFonts w:ascii="Calibri" w:hAnsi="Calibri" w:cs="Calibri"/>
+          <w:b/>
+          <w:bCs/>
+          <w:sz w:val="24"/>
+          <w:szCs w:val="24"/>
+        </w:rPr>
+      </w:pPr>
+      <w:r>
+        <w:rPr>
+          <w:rFonts w:ascii="Calibri" w:hAnsi="Calibri" w:cs="Calibri"/>
+          <w:b/>
+          <w:bCs/>
+          <w:sz w:val="24"/>
+          <w:szCs w:val="24"/>
+        </w:rPr>
+        <w:t>6. Core Functional Features</w:t>
+      </w:r>
+    </w:p>
+    <w:p>
+      <w:pPr>
+        <w:ind w:left="720"/>
+        <w:rPr>
+          <w:rFonts w:ascii="Calibri" w:hAnsi="Calibri" w:cs="Calibri"/>
+          <w:color w:val="FF0000"/>
+          <w:sz w:val="24"/>
+          <w:szCs w:val="24"/>
+        </w:rPr>
+      </w:pPr>
+      <w:proofErr w:type="spellStart"/>
+      <w:r>
+        <w:rPr>
+          <w:rFonts w:ascii="Calibri" w:hAnsi="Calibri" w:cs="Calibri"/>
+          <w:color w:val="FF0000"/>
+          <w:sz w:val="24"/>
+          <w:szCs w:val="24"/>
+        </w:rPr>
+        <w:t>Коротко</w:t>
+      </w:r>
+      <w:proofErr w:type="spellEnd"/>
+      <w:r>
+        <w:rPr>
+          <w:rFonts w:ascii="Calibri" w:hAnsi="Calibri" w:cs="Calibri"/>
+          <w:color w:val="FF0000"/>
+          <w:sz w:val="24"/>
+          <w:szCs w:val="24"/>
+        </w:rPr>
+        <w:t xml:space="preserve"> </w:t>
+      </w:r>
+      <w:proofErr w:type="spellStart"/>
+      <w:r>
+        <w:rPr>
+          <w:rFonts w:ascii="Calibri" w:hAnsi="Calibri" w:cs="Calibri"/>
+          <w:color w:val="FF0000"/>
+          <w:sz w:val="24"/>
+          <w:szCs w:val="24"/>
+        </w:rPr>
+        <w:t>описывает</w:t>
+      </w:r>
+      <w:proofErr w:type="spellEnd"/>
+      <w:r>
+        <w:rPr>
+          <w:rFonts w:ascii="Calibri" w:hAnsi="Calibri" w:cs="Calibri"/>
+          <w:color w:val="FF0000"/>
+          <w:sz w:val="24"/>
+          <w:szCs w:val="24"/>
+        </w:rPr>
+        <w:t>:</w:t>
+      </w:r>
+    </w:p>
+    <w:p>
+      <w:pPr>
+        <w:numPr>
+          <w:ilvl w:val="0"/>
+          <w:numId w:val="4"/>
+        </w:numPr>
+        <w:rPr>
+          <w:rFonts w:ascii="Calibri" w:hAnsi="Calibri" w:cs="Calibri"/>
+          <w:color w:val="FF0000"/>
+          <w:sz w:val="24"/>
+          <w:szCs w:val="24"/>
+        </w:rPr>
+      </w:pPr>
+      <w:r>
+        <w:rPr>
+          <w:rFonts w:ascii="Calibri" w:hAnsi="Calibri" w:cs="Calibri"/>
+          <w:color w:val="FF0000"/>
+          <w:sz w:val="24"/>
+          <w:szCs w:val="24"/>
+        </w:rPr>
+        <w:t xml:space="preserve">authentication </w:t>
+      </w:r>
+    </w:p>
+    <w:p>
+      <w:pPr>
+        <w:numPr>
+          <w:ilvl w:val="0"/>
+          <w:numId w:val="4"/>
+        </w:numPr>
+        <w:rPr>
+          <w:rFonts w:ascii="Calibri" w:hAnsi="Calibri" w:cs="Calibri"/>
+          <w:color w:val="FF0000"/>
+          <w:sz w:val="24"/>
+          <w:szCs w:val="24"/>
+        </w:rPr>
+      </w:pPr>
+      <w:r>
+        <w:rPr>
+          <w:rFonts w:ascii="Calibri" w:hAnsi="Calibri" w:cs="Calibri"/>
+          <w:color w:val="FF0000"/>
+          <w:sz w:val="24"/>
+          <w:szCs w:val="24"/>
+        </w:rPr>
+        <w:t xml:space="preserve">product </w:t>
+      </w:r>
+      <w:proofErr w:type="spellStart"/>
+      <w:r>
+        <w:rPr>
+          <w:rFonts w:ascii="Calibri" w:hAnsi="Calibri" w:cs="Calibri"/>
+          <w:color w:val="FF0000"/>
+          <w:sz w:val="24"/>
+          <w:szCs w:val="24"/>
+        </w:rPr>
+        <w:t>catalog</w:t>
+      </w:r>
+      <w:proofErr w:type="spellEnd"/>
+      <w:r>
+        <w:rPr>
+          <w:rFonts w:ascii="Calibri" w:hAnsi="Calibri" w:cs="Calibri"/>
+          <w:color w:val="FF0000"/>
+          <w:sz w:val="24"/>
+          <w:szCs w:val="24"/>
+        </w:rPr>
+        <w:t xml:space="preserve"> </w:t>
+      </w:r>
+    </w:p>
+    <w:p>
+      <w:pPr>
+        <w:numPr>
+          <w:ilvl w:val="0"/>
+          <w:numId w:val="4"/>
+        </w:numPr>
+        <w:rPr>
+          <w:rFonts w:ascii="Calibri" w:hAnsi="Calibri" w:cs="Calibri"/>
+          <w:color w:val="FF0000"/>
+          <w:sz w:val="24"/>
+          <w:szCs w:val="24"/>
+        </w:rPr>
+      </w:pPr>
+      <w:r>
+        <w:rPr>
+          <w:rFonts w:ascii="Calibri" w:hAnsi="Calibri" w:cs="Calibri"/>
+          <w:color w:val="FF0000"/>
+          <w:sz w:val="24"/>
+          <w:szCs w:val="24"/>
+        </w:rPr>
+        <w:t xml:space="preserve">CRUD </w:t>
+      </w:r>
+    </w:p>
+    <w:p>
+      <w:pPr>
+        <w:numPr>
+          <w:ilvl w:val="0"/>
+          <w:numId w:val="4"/>
+        </w:numPr>
+        <w:rPr>
+          <w:rFonts w:ascii="Calibri" w:hAnsi="Calibri" w:cs="Calibri"/>
+          <w:color w:val="FF0000"/>
+          <w:sz w:val="24"/>
+          <w:szCs w:val="24"/>
+        </w:rPr>
+      </w:pPr>
+      <w:r>
+        <w:rPr>
+          <w:rFonts w:ascii="Calibri" w:hAnsi="Calibri" w:cs="Calibri"/>
+          <w:color w:val="FF0000"/>
+          <w:sz w:val="24"/>
+          <w:szCs w:val="24"/>
+        </w:rPr>
+        <w:t xml:space="preserve">cart </w:t>
+      </w:r>
+    </w:p>
+    <w:p>
+      <w:pPr>
+        <w:numPr>
+          <w:ilvl w:val="0"/>
+          <w:numId w:val="4"/>
+        </w:numPr>
+        <w:rPr>
+          <w:rFonts w:ascii="Calibri" w:hAnsi="Calibri" w:cs="Calibri"/>
+          <w:color w:val="FF0000"/>
+          <w:sz w:val="24"/>
+          <w:szCs w:val="24"/>
+        </w:rPr>
+      </w:pPr>
+      <w:r>
+        <w:rPr>
+          <w:rFonts w:ascii="Calibri" w:hAnsi="Calibri" w:cs="Calibri"/>
+          <w:color w:val="FF0000"/>
+          <w:sz w:val="24"/>
+          <w:szCs w:val="24"/>
+        </w:rPr>
+        <w:t>orders</w:t>
+      </w:r>
+    </w:p>
+    <w:p>
+      <w:pPr>
+        <w:ind w:left="720"/>
+        <w:rPr>
+          <w:rFonts w:ascii="Calibri" w:hAnsi="Calibri" w:cs="Calibri"/>
+          <w:b/>
+          <w:bCs/>
+          <w:sz w:val="24"/>
+          <w:szCs w:val="24"/>
+        </w:rPr>
+      </w:pPr>
+      <w:r>
+        <w:rPr>
+          <w:rFonts w:ascii="Calibri" w:hAnsi="Calibri" w:cs="Calibri"/>
+          <w:b/>
+          <w:bCs/>
+          <w:sz w:val="24"/>
+          <w:szCs w:val="24"/>
+        </w:rPr>
+        <w:t>7. Suggested Data Model</w:t>
+      </w:r>
+    </w:p>
+    <w:p>
+      <w:pPr>
+        <w:ind w:left="720"/>
+        <w:rPr>
+          <w:rFonts w:ascii="Calibri" w:hAnsi="Calibri" w:cs="Calibri"/>
+          <w:color w:val="FF0000"/>
+          <w:sz w:val="24"/>
+          <w:szCs w:val="24"/>
+        </w:rPr>
+      </w:pPr>
+      <w:proofErr w:type="spellStart"/>
+      <w:r>
+        <w:rPr>
+          <w:rFonts w:ascii="Calibri" w:hAnsi="Calibri" w:cs="Calibri"/>
+          <w:color w:val="FF0000"/>
+          <w:sz w:val="24"/>
+          <w:szCs w:val="24"/>
+        </w:rPr>
+        <w:t>Таблицы</w:t>
+      </w:r>
+      <w:proofErr w:type="spellEnd"/>
+      <w:r>
+        <w:rPr>
+          <w:rFonts w:ascii="Calibri" w:hAnsi="Calibri" w:cs="Calibri"/>
+          <w:color w:val="FF0000"/>
+          <w:sz w:val="24"/>
+          <w:szCs w:val="24"/>
+        </w:rPr>
+        <w:t>:</w:t>
+      </w:r>
+    </w:p>
+    <w:p>
+      <w:pPr>
+        <w:ind w:left="720"/>
+        <w:rPr>
+          <w:rFonts w:ascii="Calibri" w:hAnsi="Calibri" w:cs="Calibri"/>
+          <w:color w:val="FF0000"/>
+          <w:sz w:val="24"/>
+          <w:szCs w:val="24"/>
+        </w:rPr>
+      </w:pPr>
+      <w:r>
+        <w:rPr>
+          <w:rFonts w:ascii="Calibri" w:hAnsi="Calibri" w:cs="Calibri"/>
+          <w:color w:val="FF0000"/>
+          <w:sz w:val="24"/>
+          <w:szCs w:val="24"/>
+        </w:rPr>
+        <w:t>users</w:t>
+      </w:r>
+      <w:r>
+        <w:rPr>
+          <w:rFonts w:ascii="Calibri" w:hAnsi="Calibri" w:cs="Calibri"/>
+          <w:color w:val="FF0000"/>
+          <w:sz w:val="24"/>
+          <w:szCs w:val="24"/>
+        </w:rPr>
+        <w:br/>
+        <w:t>roles</w:t>
+      </w:r>
+      <w:r>
+        <w:rPr>
+          <w:rFonts w:ascii="Calibri" w:hAnsi="Calibri" w:cs="Calibri"/>
+          <w:color w:val="FF0000"/>
+          <w:sz w:val="24"/>
+          <w:szCs w:val="24"/>
+        </w:rPr>
+        <w:br/>
+        <w:t>products</w:t>
+      </w:r>
+      <w:r>
+        <w:rPr>
+          <w:rFonts w:ascii="Calibri" w:hAnsi="Calibri" w:cs="Calibri"/>
+          <w:color w:val="FF0000"/>
+          <w:sz w:val="24"/>
+          <w:szCs w:val="24"/>
+        </w:rPr>
+        <w:br/>
+        <w:t>categories</w:t>
+      </w:r>
+      <w:r>
+        <w:rPr>
+          <w:rFonts w:ascii="Calibri" w:hAnsi="Calibri" w:cs="Calibri"/>
+          <w:color w:val="FF0000"/>
+          <w:sz w:val="24"/>
+          <w:szCs w:val="24"/>
+        </w:rPr>
+        <w:br/>
+        <w:t>orders</w:t>
+      </w:r>
+      <w:r>
+        <w:rPr>
+          <w:rFonts w:ascii="Calibri" w:hAnsi="Calibri" w:cs="Calibri"/>
+          <w:color w:val="FF0000"/>
+          <w:sz w:val="24"/>
+          <w:szCs w:val="24"/>
+        </w:rPr>
+        <w:br/>
+      </w:r>
+      <w:proofErr w:type="spellStart"/>
+      <w:r>
+        <w:rPr>
+          <w:rFonts w:ascii="Calibri" w:hAnsi="Calibri" w:cs="Calibri"/>
+          <w:color w:val="FF0000"/>
+          <w:sz w:val="24"/>
+          <w:szCs w:val="24"/>
+        </w:rPr>
+        <w:t>order_items</w:t>
+      </w:r>
+      <w:proofErr w:type="spellEnd"/>
+      <w:r>
+        <w:rPr>
+          <w:rFonts w:ascii="Calibri" w:hAnsi="Calibri" w:cs="Calibri"/>
+          <w:color w:val="FF0000"/>
+          <w:sz w:val="24"/>
+          <w:szCs w:val="24"/>
+        </w:rPr>
+        <w:br/>
+        <w:t>carts</w:t>
+      </w:r>
+      <w:r>
+        <w:rPr>
+          <w:rFonts w:ascii="Calibri" w:hAnsi="Calibri" w:cs="Calibri"/>
+          <w:color w:val="FF0000"/>
+          <w:sz w:val="24"/>
+          <w:szCs w:val="24"/>
+        </w:rPr>
+        <w:br/>
+      </w:r>
+      <w:proofErr w:type="spellStart"/>
+      <w:r>
+        <w:rPr>
+          <w:rFonts w:ascii="Calibri" w:hAnsi="Calibri" w:cs="Calibri"/>
+          <w:color w:val="FF0000"/>
+          <w:sz w:val="24"/>
+          <w:szCs w:val="24"/>
+        </w:rPr>
+        <w:t>cart_items</w:t>
+      </w:r>
+      <w:proofErr w:type="spellEnd"/>
+    </w:p>
+    <w:p>
+      <w:pPr>
+        <w:numPr>
+          <w:ilvl w:val="0"/>
+          <w:numId w:val="5"/>
+        </w:numPr>
+        <w:rPr>
+          <w:rFonts w:ascii="Calibri" w:hAnsi="Calibri" w:cs="Calibri"/>
+          <w:color w:val="FF0000"/>
+          <w:sz w:val="24"/>
+          <w:szCs w:val="24"/>
+        </w:rPr>
+      </w:pPr>
+      <w:proofErr w:type="spellStart"/>
+      <w:r>
+        <w:rPr>
+          <w:rFonts w:ascii="Calibri" w:hAnsi="Calibri" w:cs="Calibri"/>
+          <w:color w:val="FF0000"/>
+          <w:sz w:val="24"/>
+          <w:szCs w:val="24"/>
+        </w:rPr>
+        <w:t>связи</w:t>
+      </w:r>
+      <w:proofErr w:type="spellEnd"/>
+      <w:r>
+        <w:rPr>
+          <w:rFonts w:ascii="Calibri" w:hAnsi="Calibri" w:cs="Calibri"/>
+          <w:color w:val="FF0000"/>
+          <w:sz w:val="24"/>
+          <w:szCs w:val="24"/>
+        </w:rPr>
+        <w:t xml:space="preserve"> </w:t>
+      </w:r>
+      <w:proofErr w:type="spellStart"/>
+      <w:r>
+        <w:rPr>
+          <w:rFonts w:ascii="Calibri" w:hAnsi="Calibri" w:cs="Calibri"/>
+          <w:color w:val="FF0000"/>
+          <w:sz w:val="24"/>
+          <w:szCs w:val="24"/>
+        </w:rPr>
+        <w:t>между</w:t>
+      </w:r>
+      <w:proofErr w:type="spellEnd"/>
+      <w:r>
+        <w:rPr>
+          <w:rFonts w:ascii="Calibri" w:hAnsi="Calibri" w:cs="Calibri"/>
+          <w:color w:val="FF0000"/>
+          <w:sz w:val="24"/>
+          <w:szCs w:val="24"/>
+        </w:rPr>
+        <w:t xml:space="preserve"> </w:t>
+      </w:r>
+      <w:proofErr w:type="spellStart"/>
+      <w:r>
+        <w:rPr>
+          <w:rFonts w:ascii="Calibri" w:hAnsi="Calibri" w:cs="Calibri"/>
+          <w:color w:val="FF0000"/>
+          <w:sz w:val="24"/>
+          <w:szCs w:val="24"/>
+        </w:rPr>
+        <w:t>ними</w:t>
+      </w:r>
+      <w:proofErr w:type="spellEnd"/>
+      <w:r>
+        <w:rPr>
+          <w:rFonts w:ascii="Calibri" w:hAnsi="Calibri" w:cs="Calibri"/>
+          <w:color w:val="FF0000"/>
+          <w:sz w:val="24"/>
+          <w:szCs w:val="24"/>
+        </w:rPr>
+        <w:t xml:space="preserve"> </w:t>
+      </w:r>
+    </w:p>
+    <w:p>
+      <w:pPr>
+        <w:rPr>
+          <w:rFonts w:ascii="Calibri" w:hAnsi="Calibri" w:cs="Calibri"/>
+          <w:color w:val="FF0000"/>
+          <w:sz w:val="24"/>
+          <w:szCs w:val="24"/>
+        </w:rPr>
+      </w:pPr>
+    </w:p>
+    <w:p>
+      <w:pPr>
+        <w:rPr>
+          <w:rFonts w:ascii="Calibri" w:hAnsi="Calibri" w:cs="Calibri"/>
+          <w:b/>
+          <w:bCs/>
+          <w:sz w:val="24"/>
+          <w:szCs w:val="24"/>
+        </w:rPr>
+      </w:pPr>
+      <w:r>
+        <w:rPr>
+          <w:rFonts w:ascii="Calibri" w:hAnsi="Calibri" w:cs="Calibri"/>
+          <w:b/>
+          <w:bCs/>
+          <w:sz w:val="24"/>
+          <w:szCs w:val="24"/>
+        </w:rPr>
+        <w:t>8. Validation and Business Rules</w:t>
+      </w:r>
+    </w:p>
+    <w:p>
+      <w:pPr>
+        <w:rPr>
+          <w:rFonts w:ascii="Calibri" w:hAnsi="Calibri" w:cs="Calibri"/>
+          <w:color w:val="FF0000"/>
+          <w:sz w:val="24"/>
+          <w:szCs w:val="24"/>
+        </w:rPr>
+      </w:pPr>
+      <w:proofErr w:type="spellStart"/>
+      <w:r>
+        <w:rPr>
+          <w:rFonts w:ascii="Calibri" w:hAnsi="Calibri" w:cs="Calibri"/>
+          <w:color w:val="FF0000"/>
+          <w:sz w:val="24"/>
+          <w:szCs w:val="24"/>
+        </w:rPr>
+        <w:t>Примеры</w:t>
+      </w:r>
+      <w:proofErr w:type="spellEnd"/>
+      <w:r>
+        <w:rPr>
+          <w:rFonts w:ascii="Calibri" w:hAnsi="Calibri" w:cs="Calibri"/>
+          <w:color w:val="FF0000"/>
+          <w:sz w:val="24"/>
+          <w:szCs w:val="24"/>
+        </w:rPr>
+        <w:t>:</w:t>
+      </w:r>
+    </w:p>
+    <w:p>
+      <w:pPr>
+        <w:numPr>
+          <w:ilvl w:val="0"/>
+          <w:numId w:val="6"/>
+        </w:numPr>
+        <w:rPr>
+          <w:rFonts w:ascii="Calibri" w:hAnsi="Calibri" w:cs="Calibri"/>
+          <w:color w:val="FF0000"/>
+          <w:sz w:val="24"/>
+          <w:szCs w:val="24"/>
+        </w:rPr>
+      </w:pPr>
+      <w:r>
+        <w:rPr>
+          <w:rFonts w:ascii="Calibri" w:hAnsi="Calibri" w:cs="Calibri"/>
+          <w:color w:val="FF0000"/>
+          <w:sz w:val="24"/>
+          <w:szCs w:val="24"/>
+        </w:rPr>
+        <w:t xml:space="preserve">price &gt; 0 </w:t>
+      </w:r>
+    </w:p>
+    <w:p>
+      <w:pPr>
+        <w:numPr>
+          <w:ilvl w:val="0"/>
+          <w:numId w:val="6"/>
+        </w:numPr>
+        <w:rPr>
+          <w:rFonts w:ascii="Calibri" w:hAnsi="Calibri" w:cs="Calibri"/>
+          <w:color w:val="FF0000"/>
+          <w:sz w:val="24"/>
+          <w:szCs w:val="24"/>
+        </w:rPr>
+      </w:pPr>
+      <w:r>
+        <w:rPr>
+          <w:rFonts w:ascii="Calibri" w:hAnsi="Calibri" w:cs="Calibri"/>
+          <w:color w:val="FF0000"/>
+          <w:sz w:val="24"/>
+          <w:szCs w:val="24"/>
+        </w:rPr>
+        <w:t xml:space="preserve">stock ≥ 0 </w:t>
+      </w:r>
+    </w:p>
+    <w:p>
+      <w:pPr>
+        <w:numPr>
+          <w:ilvl w:val="0"/>
+          <w:numId w:val="6"/>
+        </w:numPr>
+        <w:rPr>
+          <w:rFonts w:ascii="Calibri" w:hAnsi="Calibri" w:cs="Calibri"/>
+          <w:color w:val="FF0000"/>
+          <w:sz w:val="24"/>
+          <w:szCs w:val="24"/>
+        </w:rPr>
+      </w:pPr>
+      <w:r>
+        <w:rPr>
+          <w:rFonts w:ascii="Calibri" w:hAnsi="Calibri" w:cs="Calibri"/>
+          <w:color w:val="FF0000"/>
+          <w:sz w:val="24"/>
+          <w:szCs w:val="24"/>
+        </w:rPr>
+        <w:t xml:space="preserve">email unique </w:t>
+      </w:r>
+    </w:p>
+    <w:p>
+      <w:pPr>
+        <w:numPr>
+          <w:ilvl w:val="0"/>
+          <w:numId w:val="6"/>
+        </w:numPr>
+        <w:rPr>
+          <w:rFonts w:ascii="Calibri" w:hAnsi="Calibri" w:cs="Calibri"/>
+          <w:color w:val="FF0000"/>
+          <w:sz w:val="24"/>
+          <w:szCs w:val="24"/>
+        </w:rPr>
+      </w:pPr>
+      <w:proofErr w:type="spellStart"/>
+      <w:r>
+        <w:rPr>
+          <w:rFonts w:ascii="Calibri" w:hAnsi="Calibri" w:cs="Calibri"/>
+          <w:color w:val="FF0000"/>
+          <w:sz w:val="24"/>
+          <w:szCs w:val="24"/>
+        </w:rPr>
+        <w:t>нельзя</w:t>
+      </w:r>
+      <w:proofErr w:type="spellEnd"/>
+      <w:r>
+        <w:rPr>
+          <w:rFonts w:ascii="Calibri" w:hAnsi="Calibri" w:cs="Calibri"/>
+          <w:color w:val="FF0000"/>
+          <w:sz w:val="24"/>
+          <w:szCs w:val="24"/>
+        </w:rPr>
+        <w:t xml:space="preserve"> </w:t>
+      </w:r>
+      <w:proofErr w:type="spellStart"/>
+      <w:r>
+        <w:rPr>
+          <w:rFonts w:ascii="Calibri" w:hAnsi="Calibri" w:cs="Calibri"/>
+          <w:color w:val="FF0000"/>
+          <w:sz w:val="24"/>
+          <w:szCs w:val="24"/>
+        </w:rPr>
+        <w:t>заказать</w:t>
+      </w:r>
+      <w:proofErr w:type="spellEnd"/>
+      <w:r>
+        <w:rPr>
+          <w:rFonts w:ascii="Calibri" w:hAnsi="Calibri" w:cs="Calibri"/>
+          <w:color w:val="FF0000"/>
+          <w:sz w:val="24"/>
+          <w:szCs w:val="24"/>
+        </w:rPr>
+        <w:t xml:space="preserve"> </w:t>
+      </w:r>
+      <w:proofErr w:type="spellStart"/>
+      <w:r>
+        <w:rPr>
+          <w:rFonts w:ascii="Calibri" w:hAnsi="Calibri" w:cs="Calibri"/>
+          <w:color w:val="FF0000"/>
+          <w:sz w:val="24"/>
+          <w:szCs w:val="24"/>
+        </w:rPr>
+        <w:t>больше</w:t>
+      </w:r>
+      <w:proofErr w:type="spellEnd"/>
+      <w:r>
+        <w:rPr>
+          <w:rFonts w:ascii="Calibri" w:hAnsi="Calibri" w:cs="Calibri"/>
+          <w:color w:val="FF0000"/>
+          <w:sz w:val="24"/>
+          <w:szCs w:val="24"/>
+        </w:rPr>
+        <w:t xml:space="preserve"> stock</w:t>
+      </w:r>
+    </w:p>
+    <w:p>
+      <w:pPr>
+        <w:rPr>
+          <w:rFonts w:ascii="Calibri" w:hAnsi="Calibri" w:cs="Calibri"/>
+          <w:b/>
+          <w:bCs/>
+          <w:sz w:val="24"/>
+          <w:szCs w:val="24"/>
+        </w:rPr>
+      </w:pPr>
+      <w:r>
+        <w:rPr>
+          <w:rFonts w:ascii="Calibri" w:hAnsi="Calibri" w:cs="Calibri"/>
+          <w:b/>
+          <w:bCs/>
+          <w:sz w:val="24"/>
+          <w:szCs w:val="24"/>
+        </w:rPr>
+        <w:lastRenderedPageBreak/>
+        <w:t>9. Security and Authorization</w:t>
+      </w:r>
+    </w:p>
+    <w:p>
+      <w:pPr>
+        <w:numPr>
+          <w:ilvl w:val="0"/>
+          <w:numId w:val="7"/>
+        </w:numPr>
+        <w:rPr>
+          <w:rFonts w:ascii="Calibri" w:hAnsi="Calibri" w:cs="Calibri"/>
+          <w:color w:val="FF0000"/>
+          <w:sz w:val="24"/>
+          <w:szCs w:val="24"/>
+        </w:rPr>
+      </w:pPr>
+      <w:r>
+        <w:rPr>
+          <w:rFonts w:ascii="Calibri" w:hAnsi="Calibri" w:cs="Calibri"/>
+          <w:color w:val="FF0000"/>
+          <w:sz w:val="24"/>
+          <w:szCs w:val="24"/>
+        </w:rPr>
+        <w:t xml:space="preserve">login system </w:t>
+      </w:r>
+    </w:p>
+    <w:p>
+      <w:pPr>
+        <w:numPr>
+          <w:ilvl w:val="0"/>
+          <w:numId w:val="7"/>
+        </w:numPr>
+        <w:rPr>
+          <w:rFonts w:ascii="Calibri" w:hAnsi="Calibri" w:cs="Calibri"/>
+          <w:color w:val="FF0000"/>
+          <w:sz w:val="24"/>
+          <w:szCs w:val="24"/>
+        </w:rPr>
+      </w:pPr>
+      <w:r>
+        <w:rPr>
+          <w:rFonts w:ascii="Calibri" w:hAnsi="Calibri" w:cs="Calibri"/>
+          <w:color w:val="FF0000"/>
+          <w:sz w:val="24"/>
+          <w:szCs w:val="24"/>
+        </w:rPr>
+        <w:t xml:space="preserve">middleware </w:t>
+      </w:r>
+    </w:p>
+    <w:p>
+      <w:pPr>
+        <w:numPr>
+          <w:ilvl w:val="0"/>
+          <w:numId w:val="7"/>
+        </w:numPr>
+        <w:rPr>
+          <w:rFonts w:ascii="Calibri" w:hAnsi="Calibri" w:cs="Calibri"/>
+          <w:color w:val="FF0000"/>
+          <w:sz w:val="24"/>
+          <w:szCs w:val="24"/>
+        </w:rPr>
+      </w:pPr>
+      <w:r>
+        <w:rPr>
+          <w:rFonts w:ascii="Calibri" w:hAnsi="Calibri" w:cs="Calibri"/>
+          <w:color w:val="FF0000"/>
+          <w:sz w:val="24"/>
+          <w:szCs w:val="24"/>
+        </w:rPr>
+        <w:t xml:space="preserve">CSRF </w:t>
+      </w:r>
+    </w:p>
+    <w:p>
+      <w:pPr>
+        <w:numPr>
+          <w:ilvl w:val="0"/>
+          <w:numId w:val="7"/>
+        </w:numPr>
+        <w:rPr>
+          <w:rFonts w:ascii="Calibri" w:hAnsi="Calibri" w:cs="Calibri"/>
+          <w:color w:val="FF0000"/>
+          <w:sz w:val="24"/>
+          <w:szCs w:val="24"/>
+        </w:rPr>
+      </w:pPr>
+      <w:r>
+        <w:rPr>
+          <w:rFonts w:ascii="Calibri" w:hAnsi="Calibri" w:cs="Calibri"/>
+          <w:color w:val="FF0000"/>
+          <w:sz w:val="24"/>
+          <w:szCs w:val="24"/>
+        </w:rPr>
+        <w:t>role-based access</w:t>
+      </w:r>
+    </w:p>
+    <w:p>
+      <w:pPr>
+        <w:rPr>
+          <w:rFonts w:ascii="Calibri" w:hAnsi="Calibri" w:cs="Calibri"/>
+          <w:color w:val="FF0000"/>
+          <w:sz w:val="24"/>
+          <w:szCs w:val="24"/>
+        </w:rPr>
+      </w:pPr>
+    </w:p>
+    <w:p>
+      <w:pPr>
+        <w:rPr>
+          <w:rFonts w:ascii="Calibri" w:hAnsi="Calibri" w:cs="Calibri"/>
+          <w:b/>
+          <w:bCs/>
+          <w:sz w:val="24"/>
+          <w:szCs w:val="24"/>
+        </w:rPr>
+      </w:pPr>
+      <w:r>
+        <w:rPr>
+          <w:rFonts w:ascii="Calibri" w:hAnsi="Calibri" w:cs="Calibri"/>
+          <w:b/>
+          <w:bCs/>
+          <w:sz w:val="24"/>
+          <w:szCs w:val="24"/>
+        </w:rPr>
+        <w:t>10. User Interface and Pages</w:t>
+      </w:r>
+    </w:p>
+    <w:p>
+      <w:pPr>
+        <w:rPr>
+          <w:rFonts w:ascii="Calibri" w:hAnsi="Calibri" w:cs="Calibri"/>
+          <w:color w:val="FF0000"/>
+          <w:sz w:val="24"/>
+          <w:szCs w:val="24"/>
+        </w:rPr>
+      </w:pPr>
+      <w:proofErr w:type="spellStart"/>
+      <w:r>
+        <w:rPr>
+          <w:rFonts w:ascii="Calibri" w:hAnsi="Calibri" w:cs="Calibri"/>
+          <w:color w:val="FF0000"/>
+          <w:sz w:val="24"/>
+          <w:szCs w:val="24"/>
+        </w:rPr>
+        <w:t>Список</w:t>
+      </w:r>
+      <w:proofErr w:type="spellEnd"/>
+      <w:r>
+        <w:rPr>
+          <w:rFonts w:ascii="Calibri" w:hAnsi="Calibri" w:cs="Calibri"/>
+          <w:color w:val="FF0000"/>
+          <w:sz w:val="24"/>
+          <w:szCs w:val="24"/>
+        </w:rPr>
+        <w:t xml:space="preserve"> </w:t>
+      </w:r>
+      <w:proofErr w:type="spellStart"/>
+      <w:r>
+        <w:rPr>
+          <w:rFonts w:ascii="Calibri" w:hAnsi="Calibri" w:cs="Calibri"/>
+          <w:color w:val="FF0000"/>
+          <w:sz w:val="24"/>
+          <w:szCs w:val="24"/>
+        </w:rPr>
+        <w:t>страниц</w:t>
+      </w:r>
+      <w:proofErr w:type="spellEnd"/>
+      <w:r>
+        <w:rPr>
+          <w:rFonts w:ascii="Calibri" w:hAnsi="Calibri" w:cs="Calibri"/>
+          <w:color w:val="FF0000"/>
+          <w:sz w:val="24"/>
+          <w:szCs w:val="24"/>
+        </w:rPr>
+        <w:t>:</w:t>
+      </w:r>
+    </w:p>
+    <w:p>
+      <w:pPr>
+        <w:numPr>
+          <w:ilvl w:val="0"/>
+          <w:numId w:val="8"/>
+        </w:numPr>
+        <w:rPr>
+          <w:rFonts w:ascii="Calibri" w:hAnsi="Calibri" w:cs="Calibri"/>
+          <w:color w:val="FF0000"/>
+          <w:sz w:val="24"/>
+          <w:szCs w:val="24"/>
+        </w:rPr>
+      </w:pPr>
+      <w:r>
+        <w:rPr>
+          <w:rFonts w:ascii="Calibri" w:hAnsi="Calibri" w:cs="Calibri"/>
+          <w:color w:val="FF0000"/>
+          <w:sz w:val="24"/>
+          <w:szCs w:val="24"/>
+        </w:rPr>
+        <w:t xml:space="preserve">Home </w:t>
+      </w:r>
+    </w:p>
+    <w:p>
+      <w:pPr>
+        <w:numPr>
+          <w:ilvl w:val="0"/>
+          <w:numId w:val="8"/>
+        </w:numPr>
+        <w:rPr>
+          <w:rFonts w:ascii="Calibri" w:hAnsi="Calibri" w:cs="Calibri"/>
+          <w:color w:val="FF0000"/>
+          <w:sz w:val="24"/>
+          <w:szCs w:val="24"/>
+        </w:rPr>
+      </w:pPr>
+      <w:r>
+        <w:rPr>
+          <w:rFonts w:ascii="Calibri" w:hAnsi="Calibri" w:cs="Calibri"/>
+          <w:color w:val="FF0000"/>
+          <w:sz w:val="24"/>
+          <w:szCs w:val="24"/>
+        </w:rPr>
+        <w:t xml:space="preserve">Products </w:t>
+      </w:r>
+    </w:p>
+    <w:p>
+      <w:pPr>
+        <w:numPr>
+          <w:ilvl w:val="0"/>
+          <w:numId w:val="8"/>
+        </w:numPr>
+        <w:rPr>
+          <w:rFonts w:ascii="Calibri" w:hAnsi="Calibri" w:cs="Calibri"/>
+          <w:color w:val="FF0000"/>
+          <w:sz w:val="24"/>
+          <w:szCs w:val="24"/>
+        </w:rPr>
+      </w:pPr>
+      <w:r>
+        <w:rPr>
+          <w:rFonts w:ascii="Calibri" w:hAnsi="Calibri" w:cs="Calibri"/>
+          <w:color w:val="FF0000"/>
+          <w:sz w:val="24"/>
+          <w:szCs w:val="24"/>
+        </w:rPr>
+        <w:t xml:space="preserve">Product Details </w:t>
+      </w:r>
+    </w:p>
+    <w:p>
+      <w:pPr>
+        <w:numPr>
+          <w:ilvl w:val="0"/>
+          <w:numId w:val="8"/>
+        </w:numPr>
+        <w:rPr>
+          <w:rFonts w:ascii="Calibri" w:hAnsi="Calibri" w:cs="Calibri"/>
+          <w:color w:val="FF0000"/>
+          <w:sz w:val="24"/>
+          <w:szCs w:val="24"/>
+        </w:rPr>
+      </w:pPr>
+      <w:r>
+        <w:rPr>
+          <w:rFonts w:ascii="Calibri" w:hAnsi="Calibri" w:cs="Calibri"/>
+          <w:color w:val="FF0000"/>
+          <w:sz w:val="24"/>
+          <w:szCs w:val="24"/>
+        </w:rPr>
+        <w:t xml:space="preserve">Cart </w:t>
+      </w:r>
+    </w:p>
+    <w:p>
+      <w:pPr>
+        <w:numPr>
+          <w:ilvl w:val="0"/>
+          <w:numId w:val="8"/>
+        </w:numPr>
+        <w:rPr>
+          <w:rFonts w:ascii="Calibri" w:hAnsi="Calibri" w:cs="Calibri"/>
+          <w:color w:val="FF0000"/>
+          <w:sz w:val="24"/>
+          <w:szCs w:val="24"/>
+        </w:rPr>
+      </w:pPr>
+      <w:r>
+        <w:rPr>
+          <w:rFonts w:ascii="Calibri" w:hAnsi="Calibri" w:cs="Calibri"/>
+          <w:color w:val="FF0000"/>
+          <w:sz w:val="24"/>
+          <w:szCs w:val="24"/>
+        </w:rPr>
+        <w:t xml:space="preserve">Checkout </w:t>
+      </w:r>
+    </w:p>
+    <w:p>
+      <w:pPr>
+        <w:numPr>
+          <w:ilvl w:val="0"/>
+          <w:numId w:val="8"/>
+        </w:numPr>
+        <w:rPr>
+          <w:rFonts w:ascii="Calibri" w:hAnsi="Calibri" w:cs="Calibri"/>
+          <w:color w:val="FF0000"/>
+          <w:sz w:val="24"/>
+          <w:szCs w:val="24"/>
+        </w:rPr>
+      </w:pPr>
+      <w:r>
+        <w:rPr>
+          <w:rFonts w:ascii="Calibri" w:hAnsi="Calibri" w:cs="Calibri"/>
+          <w:color w:val="FF0000"/>
+          <w:sz w:val="24"/>
+          <w:szCs w:val="24"/>
+        </w:rPr>
+        <w:t xml:space="preserve">Login/Register </w:t>
+      </w:r>
+    </w:p>
+    <w:p>
+      <w:pPr>
+        <w:numPr>
+          <w:ilvl w:val="0"/>
+          <w:numId w:val="8"/>
+        </w:numPr>
+        <w:rPr>
+          <w:rFonts w:ascii="Calibri" w:hAnsi="Calibri" w:cs="Calibri"/>
+          <w:color w:val="FF0000"/>
+          <w:sz w:val="24"/>
+          <w:szCs w:val="24"/>
+        </w:rPr>
+      </w:pPr>
+      <w:r>
+        <w:rPr>
+          <w:rFonts w:ascii="Calibri" w:hAnsi="Calibri" w:cs="Calibri"/>
+          <w:color w:val="FF0000"/>
+          <w:sz w:val="24"/>
+          <w:szCs w:val="24"/>
+        </w:rPr>
+        <w:t>Admin Dashboard</w:t>
+      </w:r>
+    </w:p>
+    <w:p>
+      <w:pPr>
+        <w:rPr>
+          <w:rFonts w:ascii="Calibri" w:hAnsi="Calibri" w:cs="Calibri"/>
+          <w:b/>
+          <w:bCs/>
+          <w:sz w:val="24"/>
+          <w:szCs w:val="24"/>
+        </w:rPr>
+      </w:pPr>
+      <w:r>
+        <w:rPr>
+          <w:rFonts w:ascii="Calibri" w:hAnsi="Calibri" w:cs="Calibri"/>
+          <w:b/>
+          <w:bCs/>
+          <w:sz w:val="24"/>
+          <w:szCs w:val="24"/>
+        </w:rPr>
+        <w:t>11. Technical Architecture</w:t>
+      </w:r>
+    </w:p>
+    <w:p>
+      <w:pPr>
+        <w:rPr>
+          <w:rFonts w:ascii="Calibri" w:hAnsi="Calibri" w:cs="Calibri"/>
+          <w:color w:val="FF0000"/>
+          <w:sz w:val="24"/>
+          <w:szCs w:val="24"/>
+        </w:rPr>
+      </w:pPr>
+      <w:r>
+        <w:rPr>
+          <w:rFonts w:ascii="Calibri" w:hAnsi="Calibri" w:cs="Calibri"/>
+          <w:color w:val="FF0000"/>
+          <w:sz w:val="24"/>
+          <w:szCs w:val="24"/>
+        </w:rPr>
+        <w:t>MVC:</w:t>
+      </w:r>
+    </w:p>
+    <w:p>
+      <w:pPr>
+        <w:numPr>
+          <w:ilvl w:val="0"/>
+          <w:numId w:val="9"/>
+        </w:numPr>
+        <w:rPr>
+          <w:rFonts w:ascii="Calibri" w:hAnsi="Calibri" w:cs="Calibri"/>
+          <w:color w:val="FF0000"/>
+          <w:sz w:val="24"/>
+          <w:szCs w:val="24"/>
+        </w:rPr>
+      </w:pPr>
+      <w:r>
+        <w:rPr>
+          <w:rFonts w:ascii="Calibri" w:hAnsi="Calibri" w:cs="Calibri"/>
+          <w:color w:val="FF0000"/>
+          <w:sz w:val="24"/>
+          <w:szCs w:val="24"/>
+        </w:rPr>
+        <w:t xml:space="preserve">Models </w:t>
+      </w:r>
+    </w:p>
+    <w:p>
+      <w:pPr>
+        <w:numPr>
+          <w:ilvl w:val="0"/>
+          <w:numId w:val="9"/>
+        </w:numPr>
+        <w:rPr>
+          <w:rFonts w:ascii="Calibri" w:hAnsi="Calibri" w:cs="Calibri"/>
+          <w:color w:val="FF0000"/>
+          <w:sz w:val="24"/>
+          <w:szCs w:val="24"/>
+        </w:rPr>
+      </w:pPr>
+      <w:r>
+        <w:rPr>
+          <w:rFonts w:ascii="Calibri" w:hAnsi="Calibri" w:cs="Calibri"/>
+          <w:color w:val="FF0000"/>
+          <w:sz w:val="24"/>
+          <w:szCs w:val="24"/>
+        </w:rPr>
+        <w:t xml:space="preserve">Controllers </w:t>
+      </w:r>
+    </w:p>
+    <w:p>
+      <w:pPr>
+        <w:numPr>
+          <w:ilvl w:val="0"/>
+          <w:numId w:val="9"/>
+        </w:numPr>
+        <w:rPr>
+          <w:rFonts w:ascii="Calibri" w:hAnsi="Calibri" w:cs="Calibri"/>
+          <w:color w:val="FF0000"/>
+          <w:sz w:val="24"/>
+          <w:szCs w:val="24"/>
+        </w:rPr>
+      </w:pPr>
+      <w:r>
+        <w:rPr>
+          <w:rFonts w:ascii="Calibri" w:hAnsi="Calibri" w:cs="Calibri"/>
+          <w:color w:val="FF0000"/>
+          <w:sz w:val="24"/>
+          <w:szCs w:val="24"/>
+        </w:rPr>
+        <w:t xml:space="preserve">Views </w:t>
+      </w:r>
+    </w:p>
+    <w:p>
+      <w:pPr>
+        <w:numPr>
+          <w:ilvl w:val="0"/>
+          <w:numId w:val="9"/>
+        </w:numPr>
+        <w:rPr>
+          <w:rFonts w:ascii="Calibri" w:hAnsi="Calibri" w:cs="Calibri"/>
+          <w:color w:val="FF0000"/>
+          <w:sz w:val="24"/>
+          <w:szCs w:val="24"/>
+        </w:rPr>
+      </w:pPr>
+      <w:r>
+        <w:rPr>
+          <w:rFonts w:ascii="Calibri" w:hAnsi="Calibri" w:cs="Calibri"/>
+          <w:color w:val="FF0000"/>
+          <w:sz w:val="24"/>
+          <w:szCs w:val="24"/>
+        </w:rPr>
+        <w:t xml:space="preserve">Routes </w:t>
+      </w:r>
+    </w:p>
+    <w:p>
+      <w:pPr>
+        <w:numPr>
+          <w:ilvl w:val="0"/>
+          <w:numId w:val="9"/>
+        </w:numPr>
+        <w:rPr>
+          <w:rFonts w:ascii="Calibri" w:hAnsi="Calibri" w:cs="Calibri"/>
+          <w:color w:val="FF0000"/>
+          <w:sz w:val="24"/>
+          <w:szCs w:val="24"/>
+        </w:rPr>
+      </w:pPr>
+      <w:r>
+        <w:rPr>
+          <w:rFonts w:ascii="Calibri" w:hAnsi="Calibri" w:cs="Calibri"/>
+          <w:color w:val="FF0000"/>
+          <w:sz w:val="24"/>
+          <w:szCs w:val="24"/>
+        </w:rPr>
+        <w:t>Middleware</w:t>
+      </w:r>
+    </w:p>
+    <w:p>
+      <w:pPr>
+        <w:rPr>
+          <w:rFonts w:ascii="Calibri" w:hAnsi="Calibri" w:cs="Calibri"/>
+          <w:b/>
+          <w:bCs/>
+          <w:sz w:val="24"/>
+          <w:szCs w:val="24"/>
+        </w:rPr>
+      </w:pPr>
+      <w:r>
+        <w:rPr>
+          <w:rFonts w:ascii="Calibri" w:hAnsi="Calibri" w:cs="Calibri"/>
+          <w:b/>
+          <w:bCs/>
+          <w:sz w:val="24"/>
+          <w:szCs w:val="24"/>
+        </w:rPr>
+        <w:t>12. Assumptions and Limitations</w:t>
+      </w:r>
+    </w:p>
+    <w:p>
+      <w:pPr>
+        <w:rPr>
+          <w:rFonts w:ascii="Calibri" w:hAnsi="Calibri" w:cs="Calibri"/>
+          <w:color w:val="FF0000"/>
+          <w:sz w:val="24"/>
+          <w:szCs w:val="24"/>
+        </w:rPr>
+      </w:pPr>
+      <w:proofErr w:type="spellStart"/>
+      <w:r>
+        <w:rPr>
+          <w:rFonts w:ascii="Calibri" w:hAnsi="Calibri" w:cs="Calibri"/>
+          <w:color w:val="FF0000"/>
+          <w:sz w:val="24"/>
+          <w:szCs w:val="24"/>
+        </w:rPr>
+        <w:t>Примеры</w:t>
+      </w:r>
+      <w:proofErr w:type="spellEnd"/>
+      <w:r>
+        <w:rPr>
+          <w:rFonts w:ascii="Calibri" w:hAnsi="Calibri" w:cs="Calibri"/>
+          <w:color w:val="FF0000"/>
+          <w:sz w:val="24"/>
+          <w:szCs w:val="24"/>
+        </w:rPr>
+        <w:t>:</w:t>
+      </w:r>
+    </w:p>
+    <w:p>
+      <w:pPr>
+        <w:numPr>
+          <w:ilvl w:val="0"/>
+          <w:numId w:val="10"/>
+        </w:numPr>
+        <w:rPr>
+          <w:rFonts w:ascii="Calibri" w:hAnsi="Calibri" w:cs="Calibri"/>
+          <w:color w:val="FF0000"/>
+          <w:sz w:val="24"/>
+          <w:szCs w:val="24"/>
+        </w:rPr>
+      </w:pPr>
+      <w:proofErr w:type="spellStart"/>
+      <w:r>
+        <w:rPr>
+          <w:rFonts w:ascii="Calibri" w:hAnsi="Calibri" w:cs="Calibri"/>
+          <w:color w:val="FF0000"/>
+          <w:sz w:val="24"/>
+          <w:szCs w:val="24"/>
+        </w:rPr>
+        <w:t>нет</w:t>
+      </w:r>
+      <w:proofErr w:type="spellEnd"/>
+      <w:r>
+        <w:rPr>
+          <w:rFonts w:ascii="Calibri" w:hAnsi="Calibri" w:cs="Calibri"/>
+          <w:color w:val="FF0000"/>
+          <w:sz w:val="24"/>
+          <w:szCs w:val="24"/>
+        </w:rPr>
+        <w:t xml:space="preserve"> </w:t>
+      </w:r>
+      <w:proofErr w:type="spellStart"/>
+      <w:r>
+        <w:rPr>
+          <w:rFonts w:ascii="Calibri" w:hAnsi="Calibri" w:cs="Calibri"/>
+          <w:color w:val="FF0000"/>
+          <w:sz w:val="24"/>
+          <w:szCs w:val="24"/>
+        </w:rPr>
+        <w:t>оплаты</w:t>
+      </w:r>
+      <w:proofErr w:type="spellEnd"/>
+      <w:r>
+        <w:rPr>
+          <w:rFonts w:ascii="Calibri" w:hAnsi="Calibri" w:cs="Calibri"/>
+          <w:color w:val="FF0000"/>
+          <w:sz w:val="24"/>
+          <w:szCs w:val="24"/>
+        </w:rPr>
+        <w:t xml:space="preserve"> </w:t>
+      </w:r>
+    </w:p>
+    <w:p>
+      <w:pPr>
+        <w:numPr>
+          <w:ilvl w:val="0"/>
+          <w:numId w:val="10"/>
+        </w:numPr>
+        <w:rPr>
+          <w:rFonts w:ascii="Calibri" w:hAnsi="Calibri" w:cs="Calibri"/>
+          <w:color w:val="FF0000"/>
+          <w:sz w:val="24"/>
+          <w:szCs w:val="24"/>
+        </w:rPr>
+      </w:pPr>
+      <w:r>
+        <w:rPr>
+          <w:rFonts w:ascii="Calibri" w:hAnsi="Calibri" w:cs="Calibri"/>
+          <w:color w:val="FF0000"/>
+          <w:sz w:val="24"/>
+          <w:szCs w:val="24"/>
+        </w:rPr>
+        <w:t xml:space="preserve">web-only </w:t>
+      </w:r>
+    </w:p>
+    <w:p>
+      <w:pPr>
+        <w:numPr>
+          <w:ilvl w:val="0"/>
+          <w:numId w:val="10"/>
+        </w:numPr>
+        <w:rPr>
+          <w:rFonts w:ascii="Calibri" w:hAnsi="Calibri" w:cs="Calibri"/>
+          <w:color w:val="FF0000"/>
+          <w:sz w:val="24"/>
+          <w:szCs w:val="24"/>
+        </w:rPr>
+      </w:pPr>
+      <w:proofErr w:type="spellStart"/>
+      <w:r>
+        <w:rPr>
+          <w:rFonts w:ascii="Calibri" w:hAnsi="Calibri" w:cs="Calibri"/>
+          <w:color w:val="FF0000"/>
+          <w:sz w:val="24"/>
+          <w:szCs w:val="24"/>
+        </w:rPr>
+        <w:t>без</w:t>
+      </w:r>
+      <w:proofErr w:type="spellEnd"/>
+      <w:r>
+        <w:rPr>
+          <w:rFonts w:ascii="Calibri" w:hAnsi="Calibri" w:cs="Calibri"/>
+          <w:color w:val="FF0000"/>
+          <w:sz w:val="24"/>
+          <w:szCs w:val="24"/>
+        </w:rPr>
+        <w:t xml:space="preserve"> </w:t>
+      </w:r>
+      <w:proofErr w:type="spellStart"/>
+      <w:r>
+        <w:rPr>
+          <w:rFonts w:ascii="Calibri" w:hAnsi="Calibri" w:cs="Calibri"/>
+          <w:color w:val="FF0000"/>
+          <w:sz w:val="24"/>
+          <w:szCs w:val="24"/>
+        </w:rPr>
+        <w:t>аналитики</w:t>
+      </w:r>
+      <w:proofErr w:type="spellEnd"/>
+    </w:p>
+    <w:p>
+      <w:pPr>
+        <w:rPr>
+          <w:rFonts w:ascii="Calibri" w:hAnsi="Calibri" w:cs="Calibri"/>
+          <w:b/>
+          <w:bCs/>
+          <w:sz w:val="24"/>
+          <w:szCs w:val="24"/>
+        </w:rPr>
+      </w:pPr>
+      <w:r>
+        <w:rPr>
+          <w:rFonts w:ascii="Calibri" w:hAnsi="Calibri" w:cs="Calibri"/>
+          <w:b/>
+          <w:bCs/>
+          <w:sz w:val="24"/>
+          <w:szCs w:val="24"/>
+        </w:rPr>
+        <w:t>13. Future Improvements</w:t>
+      </w:r>
+    </w:p>
+    <w:p>
+      <w:pPr>
+        <w:rPr>
+          <w:rFonts w:ascii="Calibri" w:hAnsi="Calibri" w:cs="Calibri"/>
+          <w:color w:val="FF0000"/>
+          <w:sz w:val="24"/>
+          <w:szCs w:val="24"/>
+        </w:rPr>
+      </w:pPr>
+      <w:proofErr w:type="spellStart"/>
+      <w:r>
+        <w:rPr>
+          <w:rFonts w:ascii="Calibri" w:hAnsi="Calibri" w:cs="Calibri"/>
+          <w:color w:val="FF0000"/>
+          <w:sz w:val="24"/>
+          <w:szCs w:val="24"/>
+        </w:rPr>
+        <w:t>Примеры</w:t>
+      </w:r>
+      <w:proofErr w:type="spellEnd"/>
+      <w:r>
+        <w:rPr>
+          <w:rFonts w:ascii="Calibri" w:hAnsi="Calibri" w:cs="Calibri"/>
+          <w:color w:val="FF0000"/>
+          <w:sz w:val="24"/>
+          <w:szCs w:val="24"/>
+        </w:rPr>
+        <w:t>:</w:t>
+      </w:r>
+    </w:p>
+    <w:p>
+      <w:pPr>
+        <w:numPr>
+          <w:ilvl w:val="0"/>
+          <w:numId w:val="11"/>
+        </w:numPr>
+        <w:rPr>
+          <w:rFonts w:ascii="Calibri" w:hAnsi="Calibri" w:cs="Calibri"/>
+          <w:color w:val="FF0000"/>
+          <w:sz w:val="24"/>
+          <w:szCs w:val="24"/>
+        </w:rPr>
+      </w:pPr>
+      <w:r>
+        <w:rPr>
+          <w:rFonts w:ascii="Calibri" w:hAnsi="Calibri" w:cs="Calibri"/>
+          <w:color w:val="FF0000"/>
+          <w:sz w:val="24"/>
+          <w:szCs w:val="24"/>
+        </w:rPr>
+        <w:lastRenderedPageBreak/>
+        <w:t xml:space="preserve">payments </w:t>
+      </w:r>
+    </w:p>
+    <w:p>
+      <w:pPr>
+        <w:numPr>
+          <w:ilvl w:val="0"/>
+          <w:numId w:val="11"/>
+        </w:numPr>
+        <w:rPr>
+          <w:rFonts w:ascii="Calibri" w:hAnsi="Calibri" w:cs="Calibri"/>
+          <w:color w:val="FF0000"/>
+          <w:sz w:val="24"/>
+          <w:szCs w:val="24"/>
+        </w:rPr>
+      </w:pPr>
+      <w:r>
+        <w:rPr>
+          <w:rFonts w:ascii="Calibri" w:hAnsi="Calibri" w:cs="Calibri"/>
+          <w:color w:val="FF0000"/>
+          <w:sz w:val="24"/>
+          <w:szCs w:val="24"/>
+        </w:rPr>
+        <w:t xml:space="preserve">discounts </w:t>
+      </w:r>
+    </w:p>
+    <w:p>
+      <w:pPr>
+        <w:numPr>
+          <w:ilvl w:val="0"/>
+          <w:numId w:val="11"/>
+        </w:numPr>
+        <w:rPr>
+          <w:rFonts w:ascii="Calibri" w:hAnsi="Calibri" w:cs="Calibri"/>
+          <w:color w:val="FF0000"/>
+          <w:sz w:val="24"/>
+          <w:szCs w:val="24"/>
+        </w:rPr>
+      </w:pPr>
+      <w:r>
+        <w:rPr>
+          <w:rFonts w:ascii="Calibri" w:hAnsi="Calibri" w:cs="Calibri"/>
+          <w:color w:val="FF0000"/>
+          <w:sz w:val="24"/>
+          <w:szCs w:val="24"/>
+        </w:rPr>
+        <w:t xml:space="preserve">reviews </w:t>
+      </w:r>
+    </w:p>
+    <w:p>
+      <w:pPr>
+        <w:numPr>
+          <w:ilvl w:val="0"/>
+          <w:numId w:val="11"/>
+        </w:numPr>
+        <w:rPr>
+          <w:rFonts w:ascii="Calibri" w:hAnsi="Calibri" w:cs="Calibri"/>
+          <w:color w:val="FF0000"/>
+          <w:sz w:val="24"/>
+          <w:szCs w:val="24"/>
+        </w:rPr>
+      </w:pPr>
+      <w:r>
+        <w:rPr>
+          <w:rFonts w:ascii="Calibri" w:hAnsi="Calibri" w:cs="Calibri"/>
+          <w:color w:val="FF0000"/>
+          <w:sz w:val="24"/>
+          <w:szCs w:val="24"/>
+        </w:rPr>
+        <w:t>analytics</w:t>
+      </w:r>
+    </w:p>
+    <w:p>
+      <w:pPr>
+        <w:rPr>
+          <w:rFonts w:ascii="Calibri" w:hAnsi="Calibri" w:cs="Calibri"/>
+          <w:color w:val="FF0000"/>
+          <w:sz w:val="24"/>
+          <w:szCs w:val="24"/>
+        </w:rPr>
+      </w:pPr>
+    </w:p>
+    <w:p>
+      <w:pPr>
+        <w:rPr>
+          <w:rFonts w:ascii="Calibri" w:hAnsi="Calibri" w:cs="Calibri"/>
+          <w:color w:val="FF0000"/>
+          <w:sz w:val="24"/>
+          <w:szCs w:val="24"/>
+        </w:rPr>
+      </w:pPr>
+    </w:p>
+    <w:p>
+      <w:pPr>
+        <w:rPr>
+          <w:rFonts w:ascii="Calibri" w:hAnsi="Calibri" w:cs="Calibri"/>
+          <w:color w:val="FF0000"/>
+          <w:sz w:val="24"/>
+          <w:szCs w:val="24"/>
+        </w:rPr>
+      </w:pPr>
+    </w:p>
+    <w:p>
+      <w:pPr>
+        <w:rPr>
+          <w:rFonts w:ascii="Calibri" w:hAnsi="Calibri" w:cs="Calibri"/>
+          <w:color w:val="FF0000"/>
+          <w:sz w:val="24"/>
+          <w:szCs w:val="24"/>
+        </w:rPr>
+      </w:pPr>
+    </w:p>
+    <w:p>
+      <w:pPr>
+        <w:rPr>
+          <w:rFonts w:ascii="Calibri" w:hAnsi="Calibri" w:cs="Calibri"/>
+          <w:color w:val="FF0000"/>
+          <w:sz w:val="24"/>
+          <w:szCs w:val="24"/>
+        </w:rPr>
+      </w:pPr>
+    </w:p>
+    <w:p>
+      <w:pPr>
+        <w:ind w:left="720"/>
+        <w:rPr>
+          <w:rFonts w:ascii="Calibri" w:hAnsi="Calibri" w:cs="Calibri"/>
+          <w:color w:val="FF0000"/>
+          <w:sz w:val="24"/>
+          <w:szCs w:val="24"/>
+        </w:rPr>
+      </w:pPr>
     </w:p>
     <w:p>
       <w:pPr>
@@ -1934,6 +3974,1683 @@
     </w:sectPr>
   </w:body>
 </w:document>
+</file>
+
+<file path=word/numbering.xml><?xml version="1.0" encoding="utf-8"?>
+<w:numbering xmlns:wpc="http://schemas.microsoft.com/office/word/2010/wordprocessingCanvas" xmlns:cx="http://schemas.microsoft.com/office/drawing/2014/chartex" xmlns:cx1="http://schemas.microsoft.com/office/drawing/2015/9/8/chartex" xmlns:cx2="http://schemas.microsoft.com/office/drawing/2015/10/21/chartex" xmlns:cx3="http://schemas.microsoft.com/office/drawing/2016/5/9/chartex" xmlns:cx4="http://schemas.microsoft.com/office/drawing/2016/5/10/chartex" xmlns:cx5="http://schemas.microsoft.com/office/drawing/2016/5/11/chartex" xmlns:cx6="http://schemas.microsoft.com/office/drawing/2016/5/12/chartex" xmlns:cx7="http://schemas.microsoft.com/office/drawing/2016/5/13/chartex" xmlns:cx8="http://schemas.microsoft.com/office/drawing/2016/5/14/chartex" xmlns:mc="http://schemas.openxmlformats.org/markup-compatibility/2006" xmlns:aink="http://schemas.microsoft.com/office/drawing/2016/ink" xmlns:am3d="http://schemas.microsoft.com/office/drawing/2017/model3d" xmlns:o="urn:schemas-microsoft-com:office:office" xmlns:oel="http://schemas.microsoft.com/office/2019/extlst" xmlns:r="http://schemas.openxmlformats.org/officeDocument/2006/relationships" xmlns:m="http://schemas.openxmlformats.org/officeDocument/2006/math" xmlns:v="urn:schemas-microsoft-com:vml" xmlns:wp14="http://schemas.microsoft.com/office/word/2010/wordprocessingDrawing" xmlns:wp="http://schemas.openxmlformats.org/drawingml/2006/wordprocessingDrawing" xmlns:w10="urn:schemas-microsoft-com:office:word" xmlns:w="http://schemas.openxmlformats.org/wordprocessingml/2006/main" xmlns:w14="http://schemas.microsoft.com/office/word/2010/wordml" xmlns:w15="http://schemas.microsoft.com/office/word/2012/wordml" xmlns:w16cex="http://schemas.microsoft.com/office/word/2018/wordml/cex" xmlns:w16cid="http://schemas.microsoft.com/office/word/2016/wordml/cid" xmlns:w16="http://schemas.microsoft.com/office/word/2018/wordml" xmlns:w16du="http://schemas.microsoft.com/office/word/2023/wordml/word16du" xmlns:w16sdtdh="http://schemas.microsoft.com/office/word/2020/wordml/sdtdatahash" xmlns:w16sdtfl="http://schemas.microsoft.com/office/word/2024/wordml/sdtformatlock" xmlns:w16se="http://schemas.microsoft.com/office/word/2015/wordml/symex" xmlns:wpg="http://schemas.microsoft.com/office/word/2010/wordprocessingGroup" xmlns:wpi="http://schemas.microsoft.com/office/word/2010/wordprocessingInk" xmlns:wne="http://schemas.microsoft.com/office/word/2006/wordml" xmlns:wps="http://schemas.microsoft.com/office/word/2010/wordprocessingShape" mc:Ignorable="w14 w15 w16se w16cid w16 w16cex w16sdtdh w16sdtfl w16du wp14">
+  <w:abstractNum w:abstractNumId="0" w15:restartNumberingAfterBreak="0">
+    <w:nsid w:val="138D29E9"/>
+    <w:multiLevelType w:val="multilevel"/>
+    <w:tmpl w:val="EEB414E8"/>
+    <w:lvl w:ilvl="0">
+      <w:start w:val="1"/>
+      <w:numFmt w:val="bullet"/>
+      <w:lvlText w:val=""/>
+      <w:lvlJc w:val="left"/>
+      <w:pPr>
+        <w:tabs>
+          <w:tab w:val="num" w:pos="720"/>
+        </w:tabs>
+        <w:ind w:left="720" w:hanging="360"/>
+      </w:pPr>
+      <w:rPr>
+        <w:rFonts w:ascii="Symbol" w:hAnsi="Symbol" w:hint="default"/>
+        <w:sz w:val="20"/>
+      </w:rPr>
+    </w:lvl>
+    <w:lvl w:ilvl="1" w:tentative="1">
+      <w:start w:val="1"/>
+      <w:numFmt w:val="bullet"/>
+      <w:lvlText w:val="o"/>
+      <w:lvlJc w:val="left"/>
+      <w:pPr>
+        <w:tabs>
+          <w:tab w:val="num" w:pos="1440"/>
+        </w:tabs>
+        <w:ind w:left="1440" w:hanging="360"/>
+      </w:pPr>
+      <w:rPr>
+        <w:rFonts w:ascii="Courier New" w:hAnsi="Courier New" w:hint="default"/>
+        <w:sz w:val="20"/>
+      </w:rPr>
+    </w:lvl>
+    <w:lvl w:ilvl="2" w:tentative="1">
+      <w:start w:val="1"/>
+      <w:numFmt w:val="bullet"/>
+      <w:lvlText w:val=""/>
+      <w:lvlJc w:val="left"/>
+      <w:pPr>
+        <w:tabs>
+          <w:tab w:val="num" w:pos="2160"/>
+        </w:tabs>
+        <w:ind w:left="2160" w:hanging="360"/>
+      </w:pPr>
+      <w:rPr>
+        <w:rFonts w:ascii="Wingdings" w:hAnsi="Wingdings" w:hint="default"/>
+        <w:sz w:val="20"/>
+      </w:rPr>
+    </w:lvl>
+    <w:lvl w:ilvl="3" w:tentative="1">
+      <w:start w:val="1"/>
+      <w:numFmt w:val="bullet"/>
+      <w:lvlText w:val=""/>
+      <w:lvlJc w:val="left"/>
+      <w:pPr>
+        <w:tabs>
+          <w:tab w:val="num" w:pos="2880"/>
+        </w:tabs>
+        <w:ind w:left="2880" w:hanging="360"/>
+      </w:pPr>
+      <w:rPr>
+        <w:rFonts w:ascii="Wingdings" w:hAnsi="Wingdings" w:hint="default"/>
+        <w:sz w:val="20"/>
+      </w:rPr>
+    </w:lvl>
+    <w:lvl w:ilvl="4" w:tentative="1">
+      <w:start w:val="1"/>
+      <w:numFmt w:val="bullet"/>
+      <w:lvlText w:val=""/>
+      <w:lvlJc w:val="left"/>
+      <w:pPr>
+        <w:tabs>
+          <w:tab w:val="num" w:pos="3600"/>
+        </w:tabs>
+        <w:ind w:left="3600" w:hanging="360"/>
+      </w:pPr>
+      <w:rPr>
+        <w:rFonts w:ascii="Wingdings" w:hAnsi="Wingdings" w:hint="default"/>
+        <w:sz w:val="20"/>
+      </w:rPr>
+    </w:lvl>
+    <w:lvl w:ilvl="5" w:tentative="1">
+      <w:start w:val="1"/>
+      <w:numFmt w:val="bullet"/>
+      <w:lvlText w:val=""/>
+      <w:lvlJc w:val="left"/>
+      <w:pPr>
+        <w:tabs>
+          <w:tab w:val="num" w:pos="4320"/>
+        </w:tabs>
+        <w:ind w:left="4320" w:hanging="360"/>
+      </w:pPr>
+      <w:rPr>
+        <w:rFonts w:ascii="Wingdings" w:hAnsi="Wingdings" w:hint="default"/>
+        <w:sz w:val="20"/>
+      </w:rPr>
+    </w:lvl>
+    <w:lvl w:ilvl="6" w:tentative="1">
+      <w:start w:val="1"/>
+      <w:numFmt w:val="bullet"/>
+      <w:lvlText w:val=""/>
+      <w:lvlJc w:val="left"/>
+      <w:pPr>
+        <w:tabs>
+          <w:tab w:val="num" w:pos="5040"/>
+        </w:tabs>
+        <w:ind w:left="5040" w:hanging="360"/>
+      </w:pPr>
+      <w:rPr>
+        <w:rFonts w:ascii="Wingdings" w:hAnsi="Wingdings" w:hint="default"/>
+        <w:sz w:val="20"/>
+      </w:rPr>
+    </w:lvl>
+    <w:lvl w:ilvl="7" w:tentative="1">
+      <w:start w:val="1"/>
+      <w:numFmt w:val="bullet"/>
+      <w:lvlText w:val=""/>
+      <w:lvlJc w:val="left"/>
+      <w:pPr>
+        <w:tabs>
+          <w:tab w:val="num" w:pos="5760"/>
+        </w:tabs>
+        <w:ind w:left="5760" w:hanging="360"/>
+      </w:pPr>
+      <w:rPr>
+        <w:rFonts w:ascii="Wingdings" w:hAnsi="Wingdings" w:hint="default"/>
+        <w:sz w:val="20"/>
+      </w:rPr>
+    </w:lvl>
+    <w:lvl w:ilvl="8" w:tentative="1">
+      <w:start w:val="1"/>
+      <w:numFmt w:val="bullet"/>
+      <w:lvlText w:val=""/>
+      <w:lvlJc w:val="left"/>
+      <w:pPr>
+        <w:tabs>
+          <w:tab w:val="num" w:pos="6480"/>
+        </w:tabs>
+        <w:ind w:left="6480" w:hanging="360"/>
+      </w:pPr>
+      <w:rPr>
+        <w:rFonts w:ascii="Wingdings" w:hAnsi="Wingdings" w:hint="default"/>
+        <w:sz w:val="20"/>
+      </w:rPr>
+    </w:lvl>
+  </w:abstractNum>
+  <w:abstractNum w:abstractNumId="1" w15:restartNumberingAfterBreak="0">
+    <w:nsid w:val="1EF13FF4"/>
+    <w:multiLevelType w:val="multilevel"/>
+    <w:tmpl w:val="7BA60442"/>
+    <w:lvl w:ilvl="0">
+      <w:start w:val="1"/>
+      <w:numFmt w:val="bullet"/>
+      <w:lvlText w:val=""/>
+      <w:lvlJc w:val="left"/>
+      <w:pPr>
+        <w:tabs>
+          <w:tab w:val="num" w:pos="720"/>
+        </w:tabs>
+        <w:ind w:left="720" w:hanging="360"/>
+      </w:pPr>
+      <w:rPr>
+        <w:rFonts w:ascii="Symbol" w:hAnsi="Symbol" w:hint="default"/>
+        <w:sz w:val="20"/>
+      </w:rPr>
+    </w:lvl>
+    <w:lvl w:ilvl="1" w:tentative="1">
+      <w:start w:val="1"/>
+      <w:numFmt w:val="bullet"/>
+      <w:lvlText w:val="o"/>
+      <w:lvlJc w:val="left"/>
+      <w:pPr>
+        <w:tabs>
+          <w:tab w:val="num" w:pos="1440"/>
+        </w:tabs>
+        <w:ind w:left="1440" w:hanging="360"/>
+      </w:pPr>
+      <w:rPr>
+        <w:rFonts w:ascii="Courier New" w:hAnsi="Courier New" w:hint="default"/>
+        <w:sz w:val="20"/>
+      </w:rPr>
+    </w:lvl>
+    <w:lvl w:ilvl="2" w:tentative="1">
+      <w:start w:val="1"/>
+      <w:numFmt w:val="bullet"/>
+      <w:lvlText w:val=""/>
+      <w:lvlJc w:val="left"/>
+      <w:pPr>
+        <w:tabs>
+          <w:tab w:val="num" w:pos="2160"/>
+        </w:tabs>
+        <w:ind w:left="2160" w:hanging="360"/>
+      </w:pPr>
+      <w:rPr>
+        <w:rFonts w:ascii="Wingdings" w:hAnsi="Wingdings" w:hint="default"/>
+        <w:sz w:val="20"/>
+      </w:rPr>
+    </w:lvl>
+    <w:lvl w:ilvl="3" w:tentative="1">
+      <w:start w:val="1"/>
+      <w:numFmt w:val="bullet"/>
+      <w:lvlText w:val=""/>
+      <w:lvlJc w:val="left"/>
+      <w:pPr>
+        <w:tabs>
+          <w:tab w:val="num" w:pos="2880"/>
+        </w:tabs>
+        <w:ind w:left="2880" w:hanging="360"/>
+      </w:pPr>
+      <w:rPr>
+        <w:rFonts w:ascii="Wingdings" w:hAnsi="Wingdings" w:hint="default"/>
+        <w:sz w:val="20"/>
+      </w:rPr>
+    </w:lvl>
+    <w:lvl w:ilvl="4" w:tentative="1">
+      <w:start w:val="1"/>
+      <w:numFmt w:val="bullet"/>
+      <w:lvlText w:val=""/>
+      <w:lvlJc w:val="left"/>
+      <w:pPr>
+        <w:tabs>
+          <w:tab w:val="num" w:pos="3600"/>
+        </w:tabs>
+        <w:ind w:left="3600" w:hanging="360"/>
+      </w:pPr>
+      <w:rPr>
+        <w:rFonts w:ascii="Wingdings" w:hAnsi="Wingdings" w:hint="default"/>
+        <w:sz w:val="20"/>
+      </w:rPr>
+    </w:lvl>
+    <w:lvl w:ilvl="5" w:tentative="1">
+      <w:start w:val="1"/>
+      <w:numFmt w:val="bullet"/>
+      <w:lvlText w:val=""/>
+      <w:lvlJc w:val="left"/>
+      <w:pPr>
+        <w:tabs>
+          <w:tab w:val="num" w:pos="4320"/>
+        </w:tabs>
+        <w:ind w:left="4320" w:hanging="360"/>
+      </w:pPr>
+      <w:rPr>
+        <w:rFonts w:ascii="Wingdings" w:hAnsi="Wingdings" w:hint="default"/>
+        <w:sz w:val="20"/>
+      </w:rPr>
+    </w:lvl>
+    <w:lvl w:ilvl="6" w:tentative="1">
+      <w:start w:val="1"/>
+      <w:numFmt w:val="bullet"/>
+      <w:lvlText w:val=""/>
+      <w:lvlJc w:val="left"/>
+      <w:pPr>
+        <w:tabs>
+          <w:tab w:val="num" w:pos="5040"/>
+        </w:tabs>
+        <w:ind w:left="5040" w:hanging="360"/>
+      </w:pPr>
+      <w:rPr>
+        <w:rFonts w:ascii="Wingdings" w:hAnsi="Wingdings" w:hint="default"/>
+        <w:sz w:val="20"/>
+      </w:rPr>
+    </w:lvl>
+    <w:lvl w:ilvl="7" w:tentative="1">
+      <w:start w:val="1"/>
+      <w:numFmt w:val="bullet"/>
+      <w:lvlText w:val=""/>
+      <w:lvlJc w:val="left"/>
+      <w:pPr>
+        <w:tabs>
+          <w:tab w:val="num" w:pos="5760"/>
+        </w:tabs>
+        <w:ind w:left="5760" w:hanging="360"/>
+      </w:pPr>
+      <w:rPr>
+        <w:rFonts w:ascii="Wingdings" w:hAnsi="Wingdings" w:hint="default"/>
+        <w:sz w:val="20"/>
+      </w:rPr>
+    </w:lvl>
+    <w:lvl w:ilvl="8" w:tentative="1">
+      <w:start w:val="1"/>
+      <w:numFmt w:val="bullet"/>
+      <w:lvlText w:val=""/>
+      <w:lvlJc w:val="left"/>
+      <w:pPr>
+        <w:tabs>
+          <w:tab w:val="num" w:pos="6480"/>
+        </w:tabs>
+        <w:ind w:left="6480" w:hanging="360"/>
+      </w:pPr>
+      <w:rPr>
+        <w:rFonts w:ascii="Wingdings" w:hAnsi="Wingdings" w:hint="default"/>
+        <w:sz w:val="20"/>
+      </w:rPr>
+    </w:lvl>
+  </w:abstractNum>
+  <w:abstractNum w:abstractNumId="2" w15:restartNumberingAfterBreak="0">
+    <w:nsid w:val="2AF81D0A"/>
+    <w:multiLevelType w:val="multilevel"/>
+    <w:tmpl w:val="9350F178"/>
+    <w:lvl w:ilvl="0">
+      <w:start w:val="1"/>
+      <w:numFmt w:val="bullet"/>
+      <w:lvlText w:val=""/>
+      <w:lvlJc w:val="left"/>
+      <w:pPr>
+        <w:tabs>
+          <w:tab w:val="num" w:pos="720"/>
+        </w:tabs>
+        <w:ind w:left="720" w:hanging="360"/>
+      </w:pPr>
+      <w:rPr>
+        <w:rFonts w:ascii="Symbol" w:hAnsi="Symbol" w:hint="default"/>
+        <w:sz w:val="20"/>
+      </w:rPr>
+    </w:lvl>
+    <w:lvl w:ilvl="1" w:tentative="1">
+      <w:start w:val="1"/>
+      <w:numFmt w:val="bullet"/>
+      <w:lvlText w:val="o"/>
+      <w:lvlJc w:val="left"/>
+      <w:pPr>
+        <w:tabs>
+          <w:tab w:val="num" w:pos="1440"/>
+        </w:tabs>
+        <w:ind w:left="1440" w:hanging="360"/>
+      </w:pPr>
+      <w:rPr>
+        <w:rFonts w:ascii="Courier New" w:hAnsi="Courier New" w:hint="default"/>
+        <w:sz w:val="20"/>
+      </w:rPr>
+    </w:lvl>
+    <w:lvl w:ilvl="2" w:tentative="1">
+      <w:start w:val="1"/>
+      <w:numFmt w:val="bullet"/>
+      <w:lvlText w:val=""/>
+      <w:lvlJc w:val="left"/>
+      <w:pPr>
+        <w:tabs>
+          <w:tab w:val="num" w:pos="2160"/>
+        </w:tabs>
+        <w:ind w:left="2160" w:hanging="360"/>
+      </w:pPr>
+      <w:rPr>
+        <w:rFonts w:ascii="Wingdings" w:hAnsi="Wingdings" w:hint="default"/>
+        <w:sz w:val="20"/>
+      </w:rPr>
+    </w:lvl>
+    <w:lvl w:ilvl="3" w:tentative="1">
+      <w:start w:val="1"/>
+      <w:numFmt w:val="bullet"/>
+      <w:lvlText w:val=""/>
+      <w:lvlJc w:val="left"/>
+      <w:pPr>
+        <w:tabs>
+          <w:tab w:val="num" w:pos="2880"/>
+        </w:tabs>
+        <w:ind w:left="2880" w:hanging="360"/>
+      </w:pPr>
+      <w:rPr>
+        <w:rFonts w:ascii="Wingdings" w:hAnsi="Wingdings" w:hint="default"/>
+        <w:sz w:val="20"/>
+      </w:rPr>
+    </w:lvl>
+    <w:lvl w:ilvl="4" w:tentative="1">
+      <w:start w:val="1"/>
+      <w:numFmt w:val="bullet"/>
+      <w:lvlText w:val=""/>
+      <w:lvlJc w:val="left"/>
+      <w:pPr>
+        <w:tabs>
+          <w:tab w:val="num" w:pos="3600"/>
+        </w:tabs>
+        <w:ind w:left="3600" w:hanging="360"/>
+      </w:pPr>
+      <w:rPr>
+        <w:rFonts w:ascii="Wingdings" w:hAnsi="Wingdings" w:hint="default"/>
+        <w:sz w:val="20"/>
+      </w:rPr>
+    </w:lvl>
+    <w:lvl w:ilvl="5" w:tentative="1">
+      <w:start w:val="1"/>
+      <w:numFmt w:val="bullet"/>
+      <w:lvlText w:val=""/>
+      <w:lvlJc w:val="left"/>
+      <w:pPr>
+        <w:tabs>
+          <w:tab w:val="num" w:pos="4320"/>
+        </w:tabs>
+        <w:ind w:left="4320" w:hanging="360"/>
+      </w:pPr>
+      <w:rPr>
+        <w:rFonts w:ascii="Wingdings" w:hAnsi="Wingdings" w:hint="default"/>
+        <w:sz w:val="20"/>
+      </w:rPr>
+    </w:lvl>
+    <w:lvl w:ilvl="6" w:tentative="1">
+      <w:start w:val="1"/>
+      <w:numFmt w:val="bullet"/>
+      <w:lvlText w:val=""/>
+      <w:lvlJc w:val="left"/>
+      <w:pPr>
+        <w:tabs>
+          <w:tab w:val="num" w:pos="5040"/>
+        </w:tabs>
+        <w:ind w:left="5040" w:hanging="360"/>
+      </w:pPr>
+      <w:rPr>
+        <w:rFonts w:ascii="Wingdings" w:hAnsi="Wingdings" w:hint="default"/>
+        <w:sz w:val="20"/>
+      </w:rPr>
+    </w:lvl>
+    <w:lvl w:ilvl="7" w:tentative="1">
+      <w:start w:val="1"/>
+      <w:numFmt w:val="bullet"/>
+      <w:lvlText w:val=""/>
+      <w:lvlJc w:val="left"/>
+      <w:pPr>
+        <w:tabs>
+          <w:tab w:val="num" w:pos="5760"/>
+        </w:tabs>
+        <w:ind w:left="5760" w:hanging="360"/>
+      </w:pPr>
+      <w:rPr>
+        <w:rFonts w:ascii="Wingdings" w:hAnsi="Wingdings" w:hint="default"/>
+        <w:sz w:val="20"/>
+      </w:rPr>
+    </w:lvl>
+    <w:lvl w:ilvl="8" w:tentative="1">
+      <w:start w:val="1"/>
+      <w:numFmt w:val="bullet"/>
+      <w:lvlText w:val=""/>
+      <w:lvlJc w:val="left"/>
+      <w:pPr>
+        <w:tabs>
+          <w:tab w:val="num" w:pos="6480"/>
+        </w:tabs>
+        <w:ind w:left="6480" w:hanging="360"/>
+      </w:pPr>
+      <w:rPr>
+        <w:rFonts w:ascii="Wingdings" w:hAnsi="Wingdings" w:hint="default"/>
+        <w:sz w:val="20"/>
+      </w:rPr>
+    </w:lvl>
+  </w:abstractNum>
+  <w:abstractNum w:abstractNumId="3" w15:restartNumberingAfterBreak="0">
+    <w:nsid w:val="513E7456"/>
+    <w:multiLevelType w:val="multilevel"/>
+    <w:tmpl w:val="ADB8EC60"/>
+    <w:lvl w:ilvl="0">
+      <w:start w:val="1"/>
+      <w:numFmt w:val="bullet"/>
+      <w:lvlText w:val=""/>
+      <w:lvlJc w:val="left"/>
+      <w:pPr>
+        <w:tabs>
+          <w:tab w:val="num" w:pos="720"/>
+        </w:tabs>
+        <w:ind w:left="720" w:hanging="360"/>
+      </w:pPr>
+      <w:rPr>
+        <w:rFonts w:ascii="Symbol" w:hAnsi="Symbol" w:hint="default"/>
+        <w:sz w:val="20"/>
+      </w:rPr>
+    </w:lvl>
+    <w:lvl w:ilvl="1" w:tentative="1">
+      <w:start w:val="1"/>
+      <w:numFmt w:val="bullet"/>
+      <w:lvlText w:val="o"/>
+      <w:lvlJc w:val="left"/>
+      <w:pPr>
+        <w:tabs>
+          <w:tab w:val="num" w:pos="1440"/>
+        </w:tabs>
+        <w:ind w:left="1440" w:hanging="360"/>
+      </w:pPr>
+      <w:rPr>
+        <w:rFonts w:ascii="Courier New" w:hAnsi="Courier New" w:hint="default"/>
+        <w:sz w:val="20"/>
+      </w:rPr>
+    </w:lvl>
+    <w:lvl w:ilvl="2" w:tentative="1">
+      <w:start w:val="1"/>
+      <w:numFmt w:val="bullet"/>
+      <w:lvlText w:val=""/>
+      <w:lvlJc w:val="left"/>
+      <w:pPr>
+        <w:tabs>
+          <w:tab w:val="num" w:pos="2160"/>
+        </w:tabs>
+        <w:ind w:left="2160" w:hanging="360"/>
+      </w:pPr>
+      <w:rPr>
+        <w:rFonts w:ascii="Wingdings" w:hAnsi="Wingdings" w:hint="default"/>
+        <w:sz w:val="20"/>
+      </w:rPr>
+    </w:lvl>
+    <w:lvl w:ilvl="3" w:tentative="1">
+      <w:start w:val="1"/>
+      <w:numFmt w:val="bullet"/>
+      <w:lvlText w:val=""/>
+      <w:lvlJc w:val="left"/>
+      <w:pPr>
+        <w:tabs>
+          <w:tab w:val="num" w:pos="2880"/>
+        </w:tabs>
+        <w:ind w:left="2880" w:hanging="360"/>
+      </w:pPr>
+      <w:rPr>
+        <w:rFonts w:ascii="Wingdings" w:hAnsi="Wingdings" w:hint="default"/>
+        <w:sz w:val="20"/>
+      </w:rPr>
+    </w:lvl>
+    <w:lvl w:ilvl="4" w:tentative="1">
+      <w:start w:val="1"/>
+      <w:numFmt w:val="bullet"/>
+      <w:lvlText w:val=""/>
+      <w:lvlJc w:val="left"/>
+      <w:pPr>
+        <w:tabs>
+          <w:tab w:val="num" w:pos="3600"/>
+        </w:tabs>
+        <w:ind w:left="3600" w:hanging="360"/>
+      </w:pPr>
+      <w:rPr>
+        <w:rFonts w:ascii="Wingdings" w:hAnsi="Wingdings" w:hint="default"/>
+        <w:sz w:val="20"/>
+      </w:rPr>
+    </w:lvl>
+    <w:lvl w:ilvl="5" w:tentative="1">
+      <w:start w:val="1"/>
+      <w:numFmt w:val="bullet"/>
+      <w:lvlText w:val=""/>
+      <w:lvlJc w:val="left"/>
+      <w:pPr>
+        <w:tabs>
+          <w:tab w:val="num" w:pos="4320"/>
+        </w:tabs>
+        <w:ind w:left="4320" w:hanging="360"/>
+      </w:pPr>
+      <w:rPr>
+        <w:rFonts w:ascii="Wingdings" w:hAnsi="Wingdings" w:hint="default"/>
+        <w:sz w:val="20"/>
+      </w:rPr>
+    </w:lvl>
+    <w:lvl w:ilvl="6" w:tentative="1">
+      <w:start w:val="1"/>
+      <w:numFmt w:val="bullet"/>
+      <w:lvlText w:val=""/>
+      <w:lvlJc w:val="left"/>
+      <w:pPr>
+        <w:tabs>
+          <w:tab w:val="num" w:pos="5040"/>
+        </w:tabs>
+        <w:ind w:left="5040" w:hanging="360"/>
+      </w:pPr>
+      <w:rPr>
+        <w:rFonts w:ascii="Wingdings" w:hAnsi="Wingdings" w:hint="default"/>
+        <w:sz w:val="20"/>
+      </w:rPr>
+    </w:lvl>
+    <w:lvl w:ilvl="7" w:tentative="1">
+      <w:start w:val="1"/>
+      <w:numFmt w:val="bullet"/>
+      <w:lvlText w:val=""/>
+      <w:lvlJc w:val="left"/>
+      <w:pPr>
+        <w:tabs>
+          <w:tab w:val="num" w:pos="5760"/>
+        </w:tabs>
+        <w:ind w:left="5760" w:hanging="360"/>
+      </w:pPr>
+      <w:rPr>
+        <w:rFonts w:ascii="Wingdings" w:hAnsi="Wingdings" w:hint="default"/>
+        <w:sz w:val="20"/>
+      </w:rPr>
+    </w:lvl>
+    <w:lvl w:ilvl="8" w:tentative="1">
+      <w:start w:val="1"/>
+      <w:numFmt w:val="bullet"/>
+      <w:lvlText w:val=""/>
+      <w:lvlJc w:val="left"/>
+      <w:pPr>
+        <w:tabs>
+          <w:tab w:val="num" w:pos="6480"/>
+        </w:tabs>
+        <w:ind w:left="6480" w:hanging="360"/>
+      </w:pPr>
+      <w:rPr>
+        <w:rFonts w:ascii="Wingdings" w:hAnsi="Wingdings" w:hint="default"/>
+        <w:sz w:val="20"/>
+      </w:rPr>
+    </w:lvl>
+  </w:abstractNum>
+  <w:abstractNum w:abstractNumId="4" w15:restartNumberingAfterBreak="0">
+    <w:nsid w:val="5E4A0861"/>
+    <w:multiLevelType w:val="multilevel"/>
+    <w:tmpl w:val="28580818"/>
+    <w:lvl w:ilvl="0">
+      <w:start w:val="1"/>
+      <w:numFmt w:val="bullet"/>
+      <w:lvlText w:val=""/>
+      <w:lvlJc w:val="left"/>
+      <w:pPr>
+        <w:tabs>
+          <w:tab w:val="num" w:pos="720"/>
+        </w:tabs>
+        <w:ind w:left="720" w:hanging="360"/>
+      </w:pPr>
+      <w:rPr>
+        <w:rFonts w:ascii="Symbol" w:hAnsi="Symbol" w:hint="default"/>
+        <w:sz w:val="20"/>
+      </w:rPr>
+    </w:lvl>
+    <w:lvl w:ilvl="1" w:tentative="1">
+      <w:start w:val="1"/>
+      <w:numFmt w:val="bullet"/>
+      <w:lvlText w:val="o"/>
+      <w:lvlJc w:val="left"/>
+      <w:pPr>
+        <w:tabs>
+          <w:tab w:val="num" w:pos="1440"/>
+        </w:tabs>
+        <w:ind w:left="1440" w:hanging="360"/>
+      </w:pPr>
+      <w:rPr>
+        <w:rFonts w:ascii="Courier New" w:hAnsi="Courier New" w:hint="default"/>
+        <w:sz w:val="20"/>
+      </w:rPr>
+    </w:lvl>
+    <w:lvl w:ilvl="2" w:tentative="1">
+      <w:start w:val="1"/>
+      <w:numFmt w:val="bullet"/>
+      <w:lvlText w:val=""/>
+      <w:lvlJc w:val="left"/>
+      <w:pPr>
+        <w:tabs>
+          <w:tab w:val="num" w:pos="2160"/>
+        </w:tabs>
+        <w:ind w:left="2160" w:hanging="360"/>
+      </w:pPr>
+      <w:rPr>
+        <w:rFonts w:ascii="Wingdings" w:hAnsi="Wingdings" w:hint="default"/>
+        <w:sz w:val="20"/>
+      </w:rPr>
+    </w:lvl>
+    <w:lvl w:ilvl="3" w:tentative="1">
+      <w:start w:val="1"/>
+      <w:numFmt w:val="bullet"/>
+      <w:lvlText w:val=""/>
+      <w:lvlJc w:val="left"/>
+      <w:pPr>
+        <w:tabs>
+          <w:tab w:val="num" w:pos="2880"/>
+        </w:tabs>
+        <w:ind w:left="2880" w:hanging="360"/>
+      </w:pPr>
+      <w:rPr>
+        <w:rFonts w:ascii="Wingdings" w:hAnsi="Wingdings" w:hint="default"/>
+        <w:sz w:val="20"/>
+      </w:rPr>
+    </w:lvl>
+    <w:lvl w:ilvl="4" w:tentative="1">
+      <w:start w:val="1"/>
+      <w:numFmt w:val="bullet"/>
+      <w:lvlText w:val=""/>
+      <w:lvlJc w:val="left"/>
+      <w:pPr>
+        <w:tabs>
+          <w:tab w:val="num" w:pos="3600"/>
+        </w:tabs>
+        <w:ind w:left="3600" w:hanging="360"/>
+      </w:pPr>
+      <w:rPr>
+        <w:rFonts w:ascii="Wingdings" w:hAnsi="Wingdings" w:hint="default"/>
+        <w:sz w:val="20"/>
+      </w:rPr>
+    </w:lvl>
+    <w:lvl w:ilvl="5" w:tentative="1">
+      <w:start w:val="1"/>
+      <w:numFmt w:val="bullet"/>
+      <w:lvlText w:val=""/>
+      <w:lvlJc w:val="left"/>
+      <w:pPr>
+        <w:tabs>
+          <w:tab w:val="num" w:pos="4320"/>
+        </w:tabs>
+        <w:ind w:left="4320" w:hanging="360"/>
+      </w:pPr>
+      <w:rPr>
+        <w:rFonts w:ascii="Wingdings" w:hAnsi="Wingdings" w:hint="default"/>
+        <w:sz w:val="20"/>
+      </w:rPr>
+    </w:lvl>
+    <w:lvl w:ilvl="6" w:tentative="1">
+      <w:start w:val="1"/>
+      <w:numFmt w:val="bullet"/>
+      <w:lvlText w:val=""/>
+      <w:lvlJc w:val="left"/>
+      <w:pPr>
+        <w:tabs>
+          <w:tab w:val="num" w:pos="5040"/>
+        </w:tabs>
+        <w:ind w:left="5040" w:hanging="360"/>
+      </w:pPr>
+      <w:rPr>
+        <w:rFonts w:ascii="Wingdings" w:hAnsi="Wingdings" w:hint="default"/>
+        <w:sz w:val="20"/>
+      </w:rPr>
+    </w:lvl>
+    <w:lvl w:ilvl="7" w:tentative="1">
+      <w:start w:val="1"/>
+      <w:numFmt w:val="bullet"/>
+      <w:lvlText w:val=""/>
+      <w:lvlJc w:val="left"/>
+      <w:pPr>
+        <w:tabs>
+          <w:tab w:val="num" w:pos="5760"/>
+        </w:tabs>
+        <w:ind w:left="5760" w:hanging="360"/>
+      </w:pPr>
+      <w:rPr>
+        <w:rFonts w:ascii="Wingdings" w:hAnsi="Wingdings" w:hint="default"/>
+        <w:sz w:val="20"/>
+      </w:rPr>
+    </w:lvl>
+    <w:lvl w:ilvl="8" w:tentative="1">
+      <w:start w:val="1"/>
+      <w:numFmt w:val="bullet"/>
+      <w:lvlText w:val=""/>
+      <w:lvlJc w:val="left"/>
+      <w:pPr>
+        <w:tabs>
+          <w:tab w:val="num" w:pos="6480"/>
+        </w:tabs>
+        <w:ind w:left="6480" w:hanging="360"/>
+      </w:pPr>
+      <w:rPr>
+        <w:rFonts w:ascii="Wingdings" w:hAnsi="Wingdings" w:hint="default"/>
+        <w:sz w:val="20"/>
+      </w:rPr>
+    </w:lvl>
+  </w:abstractNum>
+  <w:abstractNum w:abstractNumId="5" w15:restartNumberingAfterBreak="0">
+    <w:nsid w:val="5F4C4220"/>
+    <w:multiLevelType w:val="multilevel"/>
+    <w:tmpl w:val="284A272E"/>
+    <w:lvl w:ilvl="0">
+      <w:start w:val="1"/>
+      <w:numFmt w:val="bullet"/>
+      <w:lvlText w:val=""/>
+      <w:lvlJc w:val="left"/>
+      <w:pPr>
+        <w:tabs>
+          <w:tab w:val="num" w:pos="720"/>
+        </w:tabs>
+        <w:ind w:left="720" w:hanging="360"/>
+      </w:pPr>
+      <w:rPr>
+        <w:rFonts w:ascii="Symbol" w:hAnsi="Symbol" w:hint="default"/>
+        <w:sz w:val="20"/>
+      </w:rPr>
+    </w:lvl>
+    <w:lvl w:ilvl="1" w:tentative="1">
+      <w:start w:val="1"/>
+      <w:numFmt w:val="bullet"/>
+      <w:lvlText w:val="o"/>
+      <w:lvlJc w:val="left"/>
+      <w:pPr>
+        <w:tabs>
+          <w:tab w:val="num" w:pos="1440"/>
+        </w:tabs>
+        <w:ind w:left="1440" w:hanging="360"/>
+      </w:pPr>
+      <w:rPr>
+        <w:rFonts w:ascii="Courier New" w:hAnsi="Courier New" w:hint="default"/>
+        <w:sz w:val="20"/>
+      </w:rPr>
+    </w:lvl>
+    <w:lvl w:ilvl="2" w:tentative="1">
+      <w:start w:val="1"/>
+      <w:numFmt w:val="bullet"/>
+      <w:lvlText w:val=""/>
+      <w:lvlJc w:val="left"/>
+      <w:pPr>
+        <w:tabs>
+          <w:tab w:val="num" w:pos="2160"/>
+        </w:tabs>
+        <w:ind w:left="2160" w:hanging="360"/>
+      </w:pPr>
+      <w:rPr>
+        <w:rFonts w:ascii="Wingdings" w:hAnsi="Wingdings" w:hint="default"/>
+        <w:sz w:val="20"/>
+      </w:rPr>
+    </w:lvl>
+    <w:lvl w:ilvl="3" w:tentative="1">
+      <w:start w:val="1"/>
+      <w:numFmt w:val="bullet"/>
+      <w:lvlText w:val=""/>
+      <w:lvlJc w:val="left"/>
+      <w:pPr>
+        <w:tabs>
+          <w:tab w:val="num" w:pos="2880"/>
+        </w:tabs>
+        <w:ind w:left="2880" w:hanging="360"/>
+      </w:pPr>
+      <w:rPr>
+        <w:rFonts w:ascii="Wingdings" w:hAnsi="Wingdings" w:hint="default"/>
+        <w:sz w:val="20"/>
+      </w:rPr>
+    </w:lvl>
+    <w:lvl w:ilvl="4" w:tentative="1">
+      <w:start w:val="1"/>
+      <w:numFmt w:val="bullet"/>
+      <w:lvlText w:val=""/>
+      <w:lvlJc w:val="left"/>
+      <w:pPr>
+        <w:tabs>
+          <w:tab w:val="num" w:pos="3600"/>
+        </w:tabs>
+        <w:ind w:left="3600" w:hanging="360"/>
+      </w:pPr>
+      <w:rPr>
+        <w:rFonts w:ascii="Wingdings" w:hAnsi="Wingdings" w:hint="default"/>
+        <w:sz w:val="20"/>
+      </w:rPr>
+    </w:lvl>
+    <w:lvl w:ilvl="5" w:tentative="1">
+      <w:start w:val="1"/>
+      <w:numFmt w:val="bullet"/>
+      <w:lvlText w:val=""/>
+      <w:lvlJc w:val="left"/>
+      <w:pPr>
+        <w:tabs>
+          <w:tab w:val="num" w:pos="4320"/>
+        </w:tabs>
+        <w:ind w:left="4320" w:hanging="360"/>
+      </w:pPr>
+      <w:rPr>
+        <w:rFonts w:ascii="Wingdings" w:hAnsi="Wingdings" w:hint="default"/>
+        <w:sz w:val="20"/>
+      </w:rPr>
+    </w:lvl>
+    <w:lvl w:ilvl="6" w:tentative="1">
+      <w:start w:val="1"/>
+      <w:numFmt w:val="bullet"/>
+      <w:lvlText w:val=""/>
+      <w:lvlJc w:val="left"/>
+      <w:pPr>
+        <w:tabs>
+          <w:tab w:val="num" w:pos="5040"/>
+        </w:tabs>
+        <w:ind w:left="5040" w:hanging="360"/>
+      </w:pPr>
+      <w:rPr>
+        <w:rFonts w:ascii="Wingdings" w:hAnsi="Wingdings" w:hint="default"/>
+        <w:sz w:val="20"/>
+      </w:rPr>
+    </w:lvl>
+    <w:lvl w:ilvl="7" w:tentative="1">
+      <w:start w:val="1"/>
+      <w:numFmt w:val="bullet"/>
+      <w:lvlText w:val=""/>
+      <w:lvlJc w:val="left"/>
+      <w:pPr>
+        <w:tabs>
+          <w:tab w:val="num" w:pos="5760"/>
+        </w:tabs>
+        <w:ind w:left="5760" w:hanging="360"/>
+      </w:pPr>
+      <w:rPr>
+        <w:rFonts w:ascii="Wingdings" w:hAnsi="Wingdings" w:hint="default"/>
+        <w:sz w:val="20"/>
+      </w:rPr>
+    </w:lvl>
+    <w:lvl w:ilvl="8" w:tentative="1">
+      <w:start w:val="1"/>
+      <w:numFmt w:val="bullet"/>
+      <w:lvlText w:val=""/>
+      <w:lvlJc w:val="left"/>
+      <w:pPr>
+        <w:tabs>
+          <w:tab w:val="num" w:pos="6480"/>
+        </w:tabs>
+        <w:ind w:left="6480" w:hanging="360"/>
+      </w:pPr>
+      <w:rPr>
+        <w:rFonts w:ascii="Wingdings" w:hAnsi="Wingdings" w:hint="default"/>
+        <w:sz w:val="20"/>
+      </w:rPr>
+    </w:lvl>
+  </w:abstractNum>
+  <w:abstractNum w:abstractNumId="6" w15:restartNumberingAfterBreak="0">
+    <w:nsid w:val="693B4451"/>
+    <w:multiLevelType w:val="multilevel"/>
+    <w:tmpl w:val="263E7694"/>
+    <w:lvl w:ilvl="0">
+      <w:start w:val="1"/>
+      <w:numFmt w:val="bullet"/>
+      <w:lvlText w:val=""/>
+      <w:lvlJc w:val="left"/>
+      <w:pPr>
+        <w:tabs>
+          <w:tab w:val="num" w:pos="720"/>
+        </w:tabs>
+        <w:ind w:left="720" w:hanging="360"/>
+      </w:pPr>
+      <w:rPr>
+        <w:rFonts w:ascii="Symbol" w:hAnsi="Symbol" w:hint="default"/>
+        <w:sz w:val="20"/>
+      </w:rPr>
+    </w:lvl>
+    <w:lvl w:ilvl="1" w:tentative="1">
+      <w:start w:val="1"/>
+      <w:numFmt w:val="bullet"/>
+      <w:lvlText w:val="o"/>
+      <w:lvlJc w:val="left"/>
+      <w:pPr>
+        <w:tabs>
+          <w:tab w:val="num" w:pos="1440"/>
+        </w:tabs>
+        <w:ind w:left="1440" w:hanging="360"/>
+      </w:pPr>
+      <w:rPr>
+        <w:rFonts w:ascii="Courier New" w:hAnsi="Courier New" w:hint="default"/>
+        <w:sz w:val="20"/>
+      </w:rPr>
+    </w:lvl>
+    <w:lvl w:ilvl="2" w:tentative="1">
+      <w:start w:val="1"/>
+      <w:numFmt w:val="bullet"/>
+      <w:lvlText w:val=""/>
+      <w:lvlJc w:val="left"/>
+      <w:pPr>
+        <w:tabs>
+          <w:tab w:val="num" w:pos="2160"/>
+        </w:tabs>
+        <w:ind w:left="2160" w:hanging="360"/>
+      </w:pPr>
+      <w:rPr>
+        <w:rFonts w:ascii="Wingdings" w:hAnsi="Wingdings" w:hint="default"/>
+        <w:sz w:val="20"/>
+      </w:rPr>
+    </w:lvl>
+    <w:lvl w:ilvl="3" w:tentative="1">
+      <w:start w:val="1"/>
+      <w:numFmt w:val="bullet"/>
+      <w:lvlText w:val=""/>
+      <w:lvlJc w:val="left"/>
+      <w:pPr>
+        <w:tabs>
+          <w:tab w:val="num" w:pos="2880"/>
+        </w:tabs>
+        <w:ind w:left="2880" w:hanging="360"/>
+      </w:pPr>
+      <w:rPr>
+        <w:rFonts w:ascii="Wingdings" w:hAnsi="Wingdings" w:hint="default"/>
+        <w:sz w:val="20"/>
+      </w:rPr>
+    </w:lvl>
+    <w:lvl w:ilvl="4" w:tentative="1">
+      <w:start w:val="1"/>
+      <w:numFmt w:val="bullet"/>
+      <w:lvlText w:val=""/>
+      <w:lvlJc w:val="left"/>
+      <w:pPr>
+        <w:tabs>
+          <w:tab w:val="num" w:pos="3600"/>
+        </w:tabs>
+        <w:ind w:left="3600" w:hanging="360"/>
+      </w:pPr>
+      <w:rPr>
+        <w:rFonts w:ascii="Wingdings" w:hAnsi="Wingdings" w:hint="default"/>
+        <w:sz w:val="20"/>
+      </w:rPr>
+    </w:lvl>
+    <w:lvl w:ilvl="5" w:tentative="1">
+      <w:start w:val="1"/>
+      <w:numFmt w:val="bullet"/>
+      <w:lvlText w:val=""/>
+      <w:lvlJc w:val="left"/>
+      <w:pPr>
+        <w:tabs>
+          <w:tab w:val="num" w:pos="4320"/>
+        </w:tabs>
+        <w:ind w:left="4320" w:hanging="360"/>
+      </w:pPr>
+      <w:rPr>
+        <w:rFonts w:ascii="Wingdings" w:hAnsi="Wingdings" w:hint="default"/>
+        <w:sz w:val="20"/>
+      </w:rPr>
+    </w:lvl>
+    <w:lvl w:ilvl="6" w:tentative="1">
+      <w:start w:val="1"/>
+      <w:numFmt w:val="bullet"/>
+      <w:lvlText w:val=""/>
+      <w:lvlJc w:val="left"/>
+      <w:pPr>
+        <w:tabs>
+          <w:tab w:val="num" w:pos="5040"/>
+        </w:tabs>
+        <w:ind w:left="5040" w:hanging="360"/>
+      </w:pPr>
+      <w:rPr>
+        <w:rFonts w:ascii="Wingdings" w:hAnsi="Wingdings" w:hint="default"/>
+        <w:sz w:val="20"/>
+      </w:rPr>
+    </w:lvl>
+    <w:lvl w:ilvl="7" w:tentative="1">
+      <w:start w:val="1"/>
+      <w:numFmt w:val="bullet"/>
+      <w:lvlText w:val=""/>
+      <w:lvlJc w:val="left"/>
+      <w:pPr>
+        <w:tabs>
+          <w:tab w:val="num" w:pos="5760"/>
+        </w:tabs>
+        <w:ind w:left="5760" w:hanging="360"/>
+      </w:pPr>
+      <w:rPr>
+        <w:rFonts w:ascii="Wingdings" w:hAnsi="Wingdings" w:hint="default"/>
+        <w:sz w:val="20"/>
+      </w:rPr>
+    </w:lvl>
+    <w:lvl w:ilvl="8" w:tentative="1">
+      <w:start w:val="1"/>
+      <w:numFmt w:val="bullet"/>
+      <w:lvlText w:val=""/>
+      <w:lvlJc w:val="left"/>
+      <w:pPr>
+        <w:tabs>
+          <w:tab w:val="num" w:pos="6480"/>
+        </w:tabs>
+        <w:ind w:left="6480" w:hanging="360"/>
+      </w:pPr>
+      <w:rPr>
+        <w:rFonts w:ascii="Wingdings" w:hAnsi="Wingdings" w:hint="default"/>
+        <w:sz w:val="20"/>
+      </w:rPr>
+    </w:lvl>
+  </w:abstractNum>
+  <w:abstractNum w:abstractNumId="7" w15:restartNumberingAfterBreak="0">
+    <w:nsid w:val="6A0E626A"/>
+    <w:multiLevelType w:val="multilevel"/>
+    <w:tmpl w:val="8ED63830"/>
+    <w:lvl w:ilvl="0">
+      <w:start w:val="1"/>
+      <w:numFmt w:val="bullet"/>
+      <w:lvlText w:val=""/>
+      <w:lvlJc w:val="left"/>
+      <w:pPr>
+        <w:tabs>
+          <w:tab w:val="num" w:pos="720"/>
+        </w:tabs>
+        <w:ind w:left="720" w:hanging="360"/>
+      </w:pPr>
+      <w:rPr>
+        <w:rFonts w:ascii="Symbol" w:hAnsi="Symbol" w:hint="default"/>
+        <w:sz w:val="20"/>
+      </w:rPr>
+    </w:lvl>
+    <w:lvl w:ilvl="1" w:tentative="1">
+      <w:start w:val="1"/>
+      <w:numFmt w:val="bullet"/>
+      <w:lvlText w:val="o"/>
+      <w:lvlJc w:val="left"/>
+      <w:pPr>
+        <w:tabs>
+          <w:tab w:val="num" w:pos="1440"/>
+        </w:tabs>
+        <w:ind w:left="1440" w:hanging="360"/>
+      </w:pPr>
+      <w:rPr>
+        <w:rFonts w:ascii="Courier New" w:hAnsi="Courier New" w:hint="default"/>
+        <w:sz w:val="20"/>
+      </w:rPr>
+    </w:lvl>
+    <w:lvl w:ilvl="2" w:tentative="1">
+      <w:start w:val="1"/>
+      <w:numFmt w:val="bullet"/>
+      <w:lvlText w:val=""/>
+      <w:lvlJc w:val="left"/>
+      <w:pPr>
+        <w:tabs>
+          <w:tab w:val="num" w:pos="2160"/>
+        </w:tabs>
+        <w:ind w:left="2160" w:hanging="360"/>
+      </w:pPr>
+      <w:rPr>
+        <w:rFonts w:ascii="Wingdings" w:hAnsi="Wingdings" w:hint="default"/>
+        <w:sz w:val="20"/>
+      </w:rPr>
+    </w:lvl>
+    <w:lvl w:ilvl="3" w:tentative="1">
+      <w:start w:val="1"/>
+      <w:numFmt w:val="bullet"/>
+      <w:lvlText w:val=""/>
+      <w:lvlJc w:val="left"/>
+      <w:pPr>
+        <w:tabs>
+          <w:tab w:val="num" w:pos="2880"/>
+        </w:tabs>
+        <w:ind w:left="2880" w:hanging="360"/>
+      </w:pPr>
+      <w:rPr>
+        <w:rFonts w:ascii="Wingdings" w:hAnsi="Wingdings" w:hint="default"/>
+        <w:sz w:val="20"/>
+      </w:rPr>
+    </w:lvl>
+    <w:lvl w:ilvl="4" w:tentative="1">
+      <w:start w:val="1"/>
+      <w:numFmt w:val="bullet"/>
+      <w:lvlText w:val=""/>
+      <w:lvlJc w:val="left"/>
+      <w:pPr>
+        <w:tabs>
+          <w:tab w:val="num" w:pos="3600"/>
+        </w:tabs>
+        <w:ind w:left="3600" w:hanging="360"/>
+      </w:pPr>
+      <w:rPr>
+        <w:rFonts w:ascii="Wingdings" w:hAnsi="Wingdings" w:hint="default"/>
+        <w:sz w:val="20"/>
+      </w:rPr>
+    </w:lvl>
+    <w:lvl w:ilvl="5" w:tentative="1">
+      <w:start w:val="1"/>
+      <w:numFmt w:val="bullet"/>
+      <w:lvlText w:val=""/>
+      <w:lvlJc w:val="left"/>
+      <w:pPr>
+        <w:tabs>
+          <w:tab w:val="num" w:pos="4320"/>
+        </w:tabs>
+        <w:ind w:left="4320" w:hanging="360"/>
+      </w:pPr>
+      <w:rPr>
+        <w:rFonts w:ascii="Wingdings" w:hAnsi="Wingdings" w:hint="default"/>
+        <w:sz w:val="20"/>
+      </w:rPr>
+    </w:lvl>
+    <w:lvl w:ilvl="6" w:tentative="1">
+      <w:start w:val="1"/>
+      <w:numFmt w:val="bullet"/>
+      <w:lvlText w:val=""/>
+      <w:lvlJc w:val="left"/>
+      <w:pPr>
+        <w:tabs>
+          <w:tab w:val="num" w:pos="5040"/>
+        </w:tabs>
+        <w:ind w:left="5040" w:hanging="360"/>
+      </w:pPr>
+      <w:rPr>
+        <w:rFonts w:ascii="Wingdings" w:hAnsi="Wingdings" w:hint="default"/>
+        <w:sz w:val="20"/>
+      </w:rPr>
+    </w:lvl>
+    <w:lvl w:ilvl="7" w:tentative="1">
+      <w:start w:val="1"/>
+      <w:numFmt w:val="bullet"/>
+      <w:lvlText w:val=""/>
+      <w:lvlJc w:val="left"/>
+      <w:pPr>
+        <w:tabs>
+          <w:tab w:val="num" w:pos="5760"/>
+        </w:tabs>
+        <w:ind w:left="5760" w:hanging="360"/>
+      </w:pPr>
+      <w:rPr>
+        <w:rFonts w:ascii="Wingdings" w:hAnsi="Wingdings" w:hint="default"/>
+        <w:sz w:val="20"/>
+      </w:rPr>
+    </w:lvl>
+    <w:lvl w:ilvl="8" w:tentative="1">
+      <w:start w:val="1"/>
+      <w:numFmt w:val="bullet"/>
+      <w:lvlText w:val=""/>
+      <w:lvlJc w:val="left"/>
+      <w:pPr>
+        <w:tabs>
+          <w:tab w:val="num" w:pos="6480"/>
+        </w:tabs>
+        <w:ind w:left="6480" w:hanging="360"/>
+      </w:pPr>
+      <w:rPr>
+        <w:rFonts w:ascii="Wingdings" w:hAnsi="Wingdings" w:hint="default"/>
+        <w:sz w:val="20"/>
+      </w:rPr>
+    </w:lvl>
+  </w:abstractNum>
+  <w:abstractNum w:abstractNumId="8" w15:restartNumberingAfterBreak="0">
+    <w:nsid w:val="71A1717A"/>
+    <w:multiLevelType w:val="multilevel"/>
+    <w:tmpl w:val="4B6E2D12"/>
+    <w:lvl w:ilvl="0">
+      <w:start w:val="1"/>
+      <w:numFmt w:val="bullet"/>
+      <w:lvlText w:val=""/>
+      <w:lvlJc w:val="left"/>
+      <w:pPr>
+        <w:tabs>
+          <w:tab w:val="num" w:pos="720"/>
+        </w:tabs>
+        <w:ind w:left="720" w:hanging="360"/>
+      </w:pPr>
+      <w:rPr>
+        <w:rFonts w:ascii="Symbol" w:hAnsi="Symbol" w:hint="default"/>
+        <w:sz w:val="20"/>
+      </w:rPr>
+    </w:lvl>
+    <w:lvl w:ilvl="1" w:tentative="1">
+      <w:start w:val="1"/>
+      <w:numFmt w:val="bullet"/>
+      <w:lvlText w:val="o"/>
+      <w:lvlJc w:val="left"/>
+      <w:pPr>
+        <w:tabs>
+          <w:tab w:val="num" w:pos="1440"/>
+        </w:tabs>
+        <w:ind w:left="1440" w:hanging="360"/>
+      </w:pPr>
+      <w:rPr>
+        <w:rFonts w:ascii="Courier New" w:hAnsi="Courier New" w:hint="default"/>
+        <w:sz w:val="20"/>
+      </w:rPr>
+    </w:lvl>
+    <w:lvl w:ilvl="2" w:tentative="1">
+      <w:start w:val="1"/>
+      <w:numFmt w:val="bullet"/>
+      <w:lvlText w:val=""/>
+      <w:lvlJc w:val="left"/>
+      <w:pPr>
+        <w:tabs>
+          <w:tab w:val="num" w:pos="2160"/>
+        </w:tabs>
+        <w:ind w:left="2160" w:hanging="360"/>
+      </w:pPr>
+      <w:rPr>
+        <w:rFonts w:ascii="Wingdings" w:hAnsi="Wingdings" w:hint="default"/>
+        <w:sz w:val="20"/>
+      </w:rPr>
+    </w:lvl>
+    <w:lvl w:ilvl="3" w:tentative="1">
+      <w:start w:val="1"/>
+      <w:numFmt w:val="bullet"/>
+      <w:lvlText w:val=""/>
+      <w:lvlJc w:val="left"/>
+      <w:pPr>
+        <w:tabs>
+          <w:tab w:val="num" w:pos="2880"/>
+        </w:tabs>
+        <w:ind w:left="2880" w:hanging="360"/>
+      </w:pPr>
+      <w:rPr>
+        <w:rFonts w:ascii="Wingdings" w:hAnsi="Wingdings" w:hint="default"/>
+        <w:sz w:val="20"/>
+      </w:rPr>
+    </w:lvl>
+    <w:lvl w:ilvl="4" w:tentative="1">
+      <w:start w:val="1"/>
+      <w:numFmt w:val="bullet"/>
+      <w:lvlText w:val=""/>
+      <w:lvlJc w:val="left"/>
+      <w:pPr>
+        <w:tabs>
+          <w:tab w:val="num" w:pos="3600"/>
+        </w:tabs>
+        <w:ind w:left="3600" w:hanging="360"/>
+      </w:pPr>
+      <w:rPr>
+        <w:rFonts w:ascii="Wingdings" w:hAnsi="Wingdings" w:hint="default"/>
+        <w:sz w:val="20"/>
+      </w:rPr>
+    </w:lvl>
+    <w:lvl w:ilvl="5" w:tentative="1">
+      <w:start w:val="1"/>
+      <w:numFmt w:val="bullet"/>
+      <w:lvlText w:val=""/>
+      <w:lvlJc w:val="left"/>
+      <w:pPr>
+        <w:tabs>
+          <w:tab w:val="num" w:pos="4320"/>
+        </w:tabs>
+        <w:ind w:left="4320" w:hanging="360"/>
+      </w:pPr>
+      <w:rPr>
+        <w:rFonts w:ascii="Wingdings" w:hAnsi="Wingdings" w:hint="default"/>
+        <w:sz w:val="20"/>
+      </w:rPr>
+    </w:lvl>
+    <w:lvl w:ilvl="6" w:tentative="1">
+      <w:start w:val="1"/>
+      <w:numFmt w:val="bullet"/>
+      <w:lvlText w:val=""/>
+      <w:lvlJc w:val="left"/>
+      <w:pPr>
+        <w:tabs>
+          <w:tab w:val="num" w:pos="5040"/>
+        </w:tabs>
+        <w:ind w:left="5040" w:hanging="360"/>
+      </w:pPr>
+      <w:rPr>
+        <w:rFonts w:ascii="Wingdings" w:hAnsi="Wingdings" w:hint="default"/>
+        <w:sz w:val="20"/>
+      </w:rPr>
+    </w:lvl>
+    <w:lvl w:ilvl="7" w:tentative="1">
+      <w:start w:val="1"/>
+      <w:numFmt w:val="bullet"/>
+      <w:lvlText w:val=""/>
+      <w:lvlJc w:val="left"/>
+      <w:pPr>
+        <w:tabs>
+          <w:tab w:val="num" w:pos="5760"/>
+        </w:tabs>
+        <w:ind w:left="5760" w:hanging="360"/>
+      </w:pPr>
+      <w:rPr>
+        <w:rFonts w:ascii="Wingdings" w:hAnsi="Wingdings" w:hint="default"/>
+        <w:sz w:val="20"/>
+      </w:rPr>
+    </w:lvl>
+    <w:lvl w:ilvl="8" w:tentative="1">
+      <w:start w:val="1"/>
+      <w:numFmt w:val="bullet"/>
+      <w:lvlText w:val=""/>
+      <w:lvlJc w:val="left"/>
+      <w:pPr>
+        <w:tabs>
+          <w:tab w:val="num" w:pos="6480"/>
+        </w:tabs>
+        <w:ind w:left="6480" w:hanging="360"/>
+      </w:pPr>
+      <w:rPr>
+        <w:rFonts w:ascii="Wingdings" w:hAnsi="Wingdings" w:hint="default"/>
+        <w:sz w:val="20"/>
+      </w:rPr>
+    </w:lvl>
+  </w:abstractNum>
+  <w:abstractNum w:abstractNumId="9" w15:restartNumberingAfterBreak="0">
+    <w:nsid w:val="751441A0"/>
+    <w:multiLevelType w:val="multilevel"/>
+    <w:tmpl w:val="ACC47C8E"/>
+    <w:lvl w:ilvl="0">
+      <w:start w:val="1"/>
+      <w:numFmt w:val="bullet"/>
+      <w:lvlText w:val=""/>
+      <w:lvlJc w:val="left"/>
+      <w:pPr>
+        <w:tabs>
+          <w:tab w:val="num" w:pos="720"/>
+        </w:tabs>
+        <w:ind w:left="720" w:hanging="360"/>
+      </w:pPr>
+      <w:rPr>
+        <w:rFonts w:ascii="Symbol" w:hAnsi="Symbol" w:hint="default"/>
+        <w:sz w:val="20"/>
+      </w:rPr>
+    </w:lvl>
+    <w:lvl w:ilvl="1" w:tentative="1">
+      <w:start w:val="1"/>
+      <w:numFmt w:val="bullet"/>
+      <w:lvlText w:val="o"/>
+      <w:lvlJc w:val="left"/>
+      <w:pPr>
+        <w:tabs>
+          <w:tab w:val="num" w:pos="1440"/>
+        </w:tabs>
+        <w:ind w:left="1440" w:hanging="360"/>
+      </w:pPr>
+      <w:rPr>
+        <w:rFonts w:ascii="Courier New" w:hAnsi="Courier New" w:hint="default"/>
+        <w:sz w:val="20"/>
+      </w:rPr>
+    </w:lvl>
+    <w:lvl w:ilvl="2" w:tentative="1">
+      <w:start w:val="1"/>
+      <w:numFmt w:val="bullet"/>
+      <w:lvlText w:val=""/>
+      <w:lvlJc w:val="left"/>
+      <w:pPr>
+        <w:tabs>
+          <w:tab w:val="num" w:pos="2160"/>
+        </w:tabs>
+        <w:ind w:left="2160" w:hanging="360"/>
+      </w:pPr>
+      <w:rPr>
+        <w:rFonts w:ascii="Wingdings" w:hAnsi="Wingdings" w:hint="default"/>
+        <w:sz w:val="20"/>
+      </w:rPr>
+    </w:lvl>
+    <w:lvl w:ilvl="3" w:tentative="1">
+      <w:start w:val="1"/>
+      <w:numFmt w:val="bullet"/>
+      <w:lvlText w:val=""/>
+      <w:lvlJc w:val="left"/>
+      <w:pPr>
+        <w:tabs>
+          <w:tab w:val="num" w:pos="2880"/>
+        </w:tabs>
+        <w:ind w:left="2880" w:hanging="360"/>
+      </w:pPr>
+      <w:rPr>
+        <w:rFonts w:ascii="Wingdings" w:hAnsi="Wingdings" w:hint="default"/>
+        <w:sz w:val="20"/>
+      </w:rPr>
+    </w:lvl>
+    <w:lvl w:ilvl="4" w:tentative="1">
+      <w:start w:val="1"/>
+      <w:numFmt w:val="bullet"/>
+      <w:lvlText w:val=""/>
+      <w:lvlJc w:val="left"/>
+      <w:pPr>
+        <w:tabs>
+          <w:tab w:val="num" w:pos="3600"/>
+        </w:tabs>
+        <w:ind w:left="3600" w:hanging="360"/>
+      </w:pPr>
+      <w:rPr>
+        <w:rFonts w:ascii="Wingdings" w:hAnsi="Wingdings" w:hint="default"/>
+        <w:sz w:val="20"/>
+      </w:rPr>
+    </w:lvl>
+    <w:lvl w:ilvl="5" w:tentative="1">
+      <w:start w:val="1"/>
+      <w:numFmt w:val="bullet"/>
+      <w:lvlText w:val=""/>
+      <w:lvlJc w:val="left"/>
+      <w:pPr>
+        <w:tabs>
+          <w:tab w:val="num" w:pos="4320"/>
+        </w:tabs>
+        <w:ind w:left="4320" w:hanging="360"/>
+      </w:pPr>
+      <w:rPr>
+        <w:rFonts w:ascii="Wingdings" w:hAnsi="Wingdings" w:hint="default"/>
+        <w:sz w:val="20"/>
+      </w:rPr>
+    </w:lvl>
+    <w:lvl w:ilvl="6" w:tentative="1">
+      <w:start w:val="1"/>
+      <w:numFmt w:val="bullet"/>
+      <w:lvlText w:val=""/>
+      <w:lvlJc w:val="left"/>
+      <w:pPr>
+        <w:tabs>
+          <w:tab w:val="num" w:pos="5040"/>
+        </w:tabs>
+        <w:ind w:left="5040" w:hanging="360"/>
+      </w:pPr>
+      <w:rPr>
+        <w:rFonts w:ascii="Wingdings" w:hAnsi="Wingdings" w:hint="default"/>
+        <w:sz w:val="20"/>
+      </w:rPr>
+    </w:lvl>
+    <w:lvl w:ilvl="7" w:tentative="1">
+      <w:start w:val="1"/>
+      <w:numFmt w:val="bullet"/>
+      <w:lvlText w:val=""/>
+      <w:lvlJc w:val="left"/>
+      <w:pPr>
+        <w:tabs>
+          <w:tab w:val="num" w:pos="5760"/>
+        </w:tabs>
+        <w:ind w:left="5760" w:hanging="360"/>
+      </w:pPr>
+      <w:rPr>
+        <w:rFonts w:ascii="Wingdings" w:hAnsi="Wingdings" w:hint="default"/>
+        <w:sz w:val="20"/>
+      </w:rPr>
+    </w:lvl>
+    <w:lvl w:ilvl="8" w:tentative="1">
+      <w:start w:val="1"/>
+      <w:numFmt w:val="bullet"/>
+      <w:lvlText w:val=""/>
+      <w:lvlJc w:val="left"/>
+      <w:pPr>
+        <w:tabs>
+          <w:tab w:val="num" w:pos="6480"/>
+        </w:tabs>
+        <w:ind w:left="6480" w:hanging="360"/>
+      </w:pPr>
+      <w:rPr>
+        <w:rFonts w:ascii="Wingdings" w:hAnsi="Wingdings" w:hint="default"/>
+        <w:sz w:val="20"/>
+      </w:rPr>
+    </w:lvl>
+  </w:abstractNum>
+  <w:abstractNum w:abstractNumId="10" w15:restartNumberingAfterBreak="0">
+    <w:nsid w:val="77DA3FE9"/>
+    <w:multiLevelType w:val="multilevel"/>
+    <w:tmpl w:val="1ABAC4C6"/>
+    <w:lvl w:ilvl="0">
+      <w:start w:val="1"/>
+      <w:numFmt w:val="bullet"/>
+      <w:lvlText w:val=""/>
+      <w:lvlJc w:val="left"/>
+      <w:pPr>
+        <w:tabs>
+          <w:tab w:val="num" w:pos="720"/>
+        </w:tabs>
+        <w:ind w:left="720" w:hanging="360"/>
+      </w:pPr>
+      <w:rPr>
+        <w:rFonts w:ascii="Symbol" w:hAnsi="Symbol" w:hint="default"/>
+        <w:sz w:val="20"/>
+      </w:rPr>
+    </w:lvl>
+    <w:lvl w:ilvl="1" w:tentative="1">
+      <w:start w:val="1"/>
+      <w:numFmt w:val="bullet"/>
+      <w:lvlText w:val="o"/>
+      <w:lvlJc w:val="left"/>
+      <w:pPr>
+        <w:tabs>
+          <w:tab w:val="num" w:pos="1440"/>
+        </w:tabs>
+        <w:ind w:left="1440" w:hanging="360"/>
+      </w:pPr>
+      <w:rPr>
+        <w:rFonts w:ascii="Courier New" w:hAnsi="Courier New" w:hint="default"/>
+        <w:sz w:val="20"/>
+      </w:rPr>
+    </w:lvl>
+    <w:lvl w:ilvl="2" w:tentative="1">
+      <w:start w:val="1"/>
+      <w:numFmt w:val="bullet"/>
+      <w:lvlText w:val=""/>
+      <w:lvlJc w:val="left"/>
+      <w:pPr>
+        <w:tabs>
+          <w:tab w:val="num" w:pos="2160"/>
+        </w:tabs>
+        <w:ind w:left="2160" w:hanging="360"/>
+      </w:pPr>
+      <w:rPr>
+        <w:rFonts w:ascii="Wingdings" w:hAnsi="Wingdings" w:hint="default"/>
+        <w:sz w:val="20"/>
+      </w:rPr>
+    </w:lvl>
+    <w:lvl w:ilvl="3" w:tentative="1">
+      <w:start w:val="1"/>
+      <w:numFmt w:val="bullet"/>
+      <w:lvlText w:val=""/>
+      <w:lvlJc w:val="left"/>
+      <w:pPr>
+        <w:tabs>
+          <w:tab w:val="num" w:pos="2880"/>
+        </w:tabs>
+        <w:ind w:left="2880" w:hanging="360"/>
+      </w:pPr>
+      <w:rPr>
+        <w:rFonts w:ascii="Wingdings" w:hAnsi="Wingdings" w:hint="default"/>
+        <w:sz w:val="20"/>
+      </w:rPr>
+    </w:lvl>
+    <w:lvl w:ilvl="4" w:tentative="1">
+      <w:start w:val="1"/>
+      <w:numFmt w:val="bullet"/>
+      <w:lvlText w:val=""/>
+      <w:lvlJc w:val="left"/>
+      <w:pPr>
+        <w:tabs>
+          <w:tab w:val="num" w:pos="3600"/>
+        </w:tabs>
+        <w:ind w:left="3600" w:hanging="360"/>
+      </w:pPr>
+      <w:rPr>
+        <w:rFonts w:ascii="Wingdings" w:hAnsi="Wingdings" w:hint="default"/>
+        <w:sz w:val="20"/>
+      </w:rPr>
+    </w:lvl>
+    <w:lvl w:ilvl="5" w:tentative="1">
+      <w:start w:val="1"/>
+      <w:numFmt w:val="bullet"/>
+      <w:lvlText w:val=""/>
+      <w:lvlJc w:val="left"/>
+      <w:pPr>
+        <w:tabs>
+          <w:tab w:val="num" w:pos="4320"/>
+        </w:tabs>
+        <w:ind w:left="4320" w:hanging="360"/>
+      </w:pPr>
+      <w:rPr>
+        <w:rFonts w:ascii="Wingdings" w:hAnsi="Wingdings" w:hint="default"/>
+        <w:sz w:val="20"/>
+      </w:rPr>
+    </w:lvl>
+    <w:lvl w:ilvl="6" w:tentative="1">
+      <w:start w:val="1"/>
+      <w:numFmt w:val="bullet"/>
+      <w:lvlText w:val=""/>
+      <w:lvlJc w:val="left"/>
+      <w:pPr>
+        <w:tabs>
+          <w:tab w:val="num" w:pos="5040"/>
+        </w:tabs>
+        <w:ind w:left="5040" w:hanging="360"/>
+      </w:pPr>
+      <w:rPr>
+        <w:rFonts w:ascii="Wingdings" w:hAnsi="Wingdings" w:hint="default"/>
+        <w:sz w:val="20"/>
+      </w:rPr>
+    </w:lvl>
+    <w:lvl w:ilvl="7" w:tentative="1">
+      <w:start w:val="1"/>
+      <w:numFmt w:val="bullet"/>
+      <w:lvlText w:val=""/>
+      <w:lvlJc w:val="left"/>
+      <w:pPr>
+        <w:tabs>
+          <w:tab w:val="num" w:pos="5760"/>
+        </w:tabs>
+        <w:ind w:left="5760" w:hanging="360"/>
+      </w:pPr>
+      <w:rPr>
+        <w:rFonts w:ascii="Wingdings" w:hAnsi="Wingdings" w:hint="default"/>
+        <w:sz w:val="20"/>
+      </w:rPr>
+    </w:lvl>
+    <w:lvl w:ilvl="8" w:tentative="1">
+      <w:start w:val="1"/>
+      <w:numFmt w:val="bullet"/>
+      <w:lvlText w:val=""/>
+      <w:lvlJc w:val="left"/>
+      <w:pPr>
+        <w:tabs>
+          <w:tab w:val="num" w:pos="6480"/>
+        </w:tabs>
+        <w:ind w:left="6480" w:hanging="360"/>
+      </w:pPr>
+      <w:rPr>
+        <w:rFonts w:ascii="Wingdings" w:hAnsi="Wingdings" w:hint="default"/>
+        <w:sz w:val="20"/>
+      </w:rPr>
+    </w:lvl>
+  </w:abstractNum>
+  <w:num w:numId="1" w16cid:durableId="1605188969">
+    <w:abstractNumId w:val="9"/>
+  </w:num>
+  <w:num w:numId="2" w16cid:durableId="9645316">
+    <w:abstractNumId w:val="4"/>
+  </w:num>
+  <w:num w:numId="3" w16cid:durableId="456680895">
+    <w:abstractNumId w:val="2"/>
+  </w:num>
+  <w:num w:numId="4" w16cid:durableId="918178008">
+    <w:abstractNumId w:val="8"/>
+  </w:num>
+  <w:num w:numId="5" w16cid:durableId="873543329">
+    <w:abstractNumId w:val="10"/>
+  </w:num>
+  <w:num w:numId="6" w16cid:durableId="1090664078">
+    <w:abstractNumId w:val="0"/>
+  </w:num>
+  <w:num w:numId="7" w16cid:durableId="2048066824">
+    <w:abstractNumId w:val="7"/>
+  </w:num>
+  <w:num w:numId="8" w16cid:durableId="1410270621">
+    <w:abstractNumId w:val="1"/>
+  </w:num>
+  <w:num w:numId="9" w16cid:durableId="1260989984">
+    <w:abstractNumId w:val="5"/>
+  </w:num>
+  <w:num w:numId="10" w16cid:durableId="1578369752">
+    <w:abstractNumId w:val="3"/>
+  </w:num>
+  <w:num w:numId="11" w16cid:durableId="1402750936">
+    <w:abstractNumId w:val="6"/>
+  </w:num>
+</w:numbering>
 </file>
 
 <file path=word/styles.xml><?xml version="1.0" encoding="utf-8"?>
@@ -2546,7 +6263,6 @@
   <w:style w:type="character" w:default="1" w:styleId="DefaultParagraphFont">
     <w:name w:val="Default Paragraph Font"/>
     <w:uiPriority w:val="1"/>
-    <w:semiHidden/>
     <w:unhideWhenUsed/>
   </w:style>
   <w:style w:type="table" w:default="1" w:styleId="TableNormal">

</xml_diff>

<commit_message>
Add excluded features to project scope
</commit_message>
<xml_diff>
--- a/docs/Project-planning.docx
+++ b/docs/Project-planning.docx
@@ -2224,6 +2224,7 @@
     </w:p>
     <w:p>
       <w:pPr>
+        <w:ind w:firstLine="720"/>
         <w:rPr>
           <w:rFonts w:ascii="Calibri" w:hAnsi="Calibri" w:cs="Calibri"/>
           <w:b/>
@@ -2250,6 +2251,7 @@
           <w:rFonts w:ascii="Calibri" w:hAnsi="Calibri" w:cs="Calibri"/>
           <w:sz w:val="24"/>
           <w:szCs w:val="24"/>
+          <w:lang w:val="ru-RU"/>
         </w:rPr>
       </w:pPr>
       <w:r>
@@ -2269,15 +2271,6 @@
           <w:szCs w:val="24"/>
         </w:rPr>
       </w:pPr>
-    </w:p>
-    <w:p>
-      <w:pPr>
-        <w:rPr>
-          <w:rFonts w:ascii="Calibri" w:hAnsi="Calibri" w:cs="Calibri"/>
-          <w:sz w:val="24"/>
-          <w:szCs w:val="24"/>
-        </w:rPr>
-      </w:pPr>
       <w:r>
         <w:rPr>
           <w:rFonts w:ascii="Calibri" w:hAnsi="Calibri" w:cs="Calibri"/>
@@ -2301,42 +2294,42 @@
           <w:sz w:val="24"/>
           <w:szCs w:val="24"/>
         </w:rPr>
+        <w:t xml:space="preserve">- Product </w:t>
+      </w:r>
+      <w:proofErr w:type="spellStart"/>
+      <w:r>
+        <w:rPr>
+          <w:rFonts w:ascii="Calibri" w:hAnsi="Calibri" w:cs="Calibri"/>
+          <w:sz w:val="24"/>
+          <w:szCs w:val="24"/>
+        </w:rPr>
+        <w:t>catalog</w:t>
+      </w:r>
+      <w:proofErr w:type="spellEnd"/>
+      <w:r>
+        <w:rPr>
+          <w:rFonts w:ascii="Calibri" w:hAnsi="Calibri" w:cs="Calibri"/>
+          <w:sz w:val="24"/>
+          <w:szCs w:val="24"/>
+        </w:rPr>
+        <w:t xml:space="preserve"> browsing for customers</w:t>
+      </w:r>
+    </w:p>
+    <w:p>
+      <w:pPr>
+        <w:rPr>
+          <w:rFonts w:ascii="Calibri" w:hAnsi="Calibri" w:cs="Calibri"/>
+          <w:sz w:val="24"/>
+          <w:szCs w:val="24"/>
+        </w:rPr>
+      </w:pPr>
+      <w:r>
+        <w:rPr>
+          <w:rFonts w:ascii="Calibri" w:hAnsi="Calibri" w:cs="Calibri"/>
+          <w:sz w:val="24"/>
+          <w:szCs w:val="24"/>
+        </w:rPr>
         <w:lastRenderedPageBreak/>
-        <w:t xml:space="preserve">- Product </w:t>
-      </w:r>
-      <w:proofErr w:type="spellStart"/>
-      <w:r>
-        <w:rPr>
-          <w:rFonts w:ascii="Calibri" w:hAnsi="Calibri" w:cs="Calibri"/>
-          <w:sz w:val="24"/>
-          <w:szCs w:val="24"/>
-        </w:rPr>
-        <w:t>catalog</w:t>
-      </w:r>
-      <w:proofErr w:type="spellEnd"/>
-      <w:r>
-        <w:rPr>
-          <w:rFonts w:ascii="Calibri" w:hAnsi="Calibri" w:cs="Calibri"/>
-          <w:sz w:val="24"/>
-          <w:szCs w:val="24"/>
-        </w:rPr>
-        <w:t xml:space="preserve"> browsing for customers</w:t>
-      </w:r>
-    </w:p>
-    <w:p>
-      <w:pPr>
-        <w:rPr>
-          <w:rFonts w:ascii="Calibri" w:hAnsi="Calibri" w:cs="Calibri"/>
-          <w:sz w:val="24"/>
-          <w:szCs w:val="24"/>
-        </w:rPr>
-      </w:pPr>
-      <w:r>
-        <w:rPr>
-          <w:rFonts w:ascii="Calibri" w:hAnsi="Calibri" w:cs="Calibri"/>
-          <w:sz w:val="24"/>
-          <w:szCs w:val="24"/>
-        </w:rPr>
         <w:t>- Product management using CRUD operations</w:t>
       </w:r>
     </w:p>
@@ -2413,11 +2406,108 @@
         <w:ind w:left="720"/>
         <w:rPr>
           <w:rFonts w:ascii="Calibri" w:hAnsi="Calibri" w:cs="Calibri"/>
-          <w:color w:val="FF0000"/>
-          <w:sz w:val="24"/>
-          <w:szCs w:val="24"/>
-        </w:rPr>
-      </w:pPr>
+          <w:b/>
+          <w:bCs/>
+          <w:sz w:val="24"/>
+          <w:szCs w:val="24"/>
+        </w:rPr>
+      </w:pPr>
+      <w:r>
+        <w:rPr>
+          <w:rFonts w:ascii="Calibri" w:hAnsi="Calibri" w:cs="Calibri"/>
+          <w:b/>
+          <w:bCs/>
+          <w:sz w:val="24"/>
+          <w:szCs w:val="24"/>
+        </w:rPr>
+        <w:t>Excluded Features</w:t>
+      </w:r>
+    </w:p>
+    <w:p>
+      <w:pPr>
+        <w:rPr>
+          <w:rFonts w:ascii="Calibri" w:hAnsi="Calibri" w:cs="Calibri"/>
+          <w:sz w:val="24"/>
+          <w:szCs w:val="24"/>
+          <w:lang w:val="ru-RU"/>
+        </w:rPr>
+      </w:pPr>
+      <w:r>
+        <w:rPr>
+          <w:rFonts w:ascii="Calibri" w:hAnsi="Calibri" w:cs="Calibri"/>
+          <w:sz w:val="24"/>
+          <w:szCs w:val="24"/>
+        </w:rPr>
+        <w:t>To keep the project manageable within the time frame, the following features are excluded:</w:t>
+      </w:r>
+    </w:p>
+    <w:p>
+      <w:pPr>
+        <w:rPr>
+          <w:rFonts w:ascii="Calibri" w:hAnsi="Calibri" w:cs="Calibri"/>
+          <w:sz w:val="24"/>
+          <w:szCs w:val="24"/>
+        </w:rPr>
+      </w:pPr>
+      <w:r>
+        <w:rPr>
+          <w:rFonts w:ascii="Calibri" w:hAnsi="Calibri" w:cs="Calibri"/>
+          <w:sz w:val="24"/>
+          <w:szCs w:val="24"/>
+        </w:rPr>
+        <w:t>- Online payment gateway integration</w:t>
+      </w:r>
+    </w:p>
+    <w:p>
+      <w:pPr>
+        <w:rPr>
+          <w:rFonts w:ascii="Calibri" w:hAnsi="Calibri" w:cs="Calibri"/>
+          <w:sz w:val="24"/>
+          <w:szCs w:val="24"/>
+        </w:rPr>
+      </w:pPr>
+      <w:r>
+        <w:rPr>
+          <w:rFonts w:ascii="Calibri" w:hAnsi="Calibri" w:cs="Calibri"/>
+          <w:sz w:val="24"/>
+          <w:szCs w:val="24"/>
+        </w:rPr>
+        <w:t>- Delivery route management</w:t>
+      </w:r>
+    </w:p>
+    <w:p>
+      <w:pPr>
+        <w:rPr>
+          <w:rFonts w:ascii="Calibri" w:hAnsi="Calibri" w:cs="Calibri"/>
+          <w:sz w:val="24"/>
+          <w:szCs w:val="24"/>
+        </w:rPr>
+      </w:pPr>
+      <w:r>
+        <w:rPr>
+          <w:rFonts w:ascii="Calibri" w:hAnsi="Calibri" w:cs="Calibri"/>
+          <w:sz w:val="24"/>
+          <w:szCs w:val="24"/>
+        </w:rPr>
+        <w:t>- Advanced analytics dashboards</w:t>
+      </w:r>
+    </w:p>
+    <w:p>
+      <w:pPr>
+        <w:rPr>
+          <w:rFonts w:ascii="Calibri" w:hAnsi="Calibri" w:cs="Calibri"/>
+          <w:sz w:val="24"/>
+          <w:szCs w:val="24"/>
+        </w:rPr>
+      </w:pPr>
+      <w:r>
+        <w:rPr>
+          <w:rFonts w:ascii="Calibri" w:hAnsi="Calibri" w:cs="Calibri"/>
+          <w:sz w:val="24"/>
+          <w:szCs w:val="24"/>
+        </w:rPr>
+        <w:t>- Multi-language support</w:t>
+      </w:r>
     </w:p>
     <w:p>
       <w:pPr>
@@ -2945,6 +3035,7 @@
           <w:sz w:val="24"/>
           <w:szCs w:val="24"/>
         </w:rPr>
+        <w:lastRenderedPageBreak/>
         <w:t xml:space="preserve">price &gt; 0 </w:t>
       </w:r>
     </w:p>
@@ -3086,7 +3177,6 @@
           <w:sz w:val="24"/>
           <w:szCs w:val="24"/>
         </w:rPr>
-        <w:lastRenderedPageBreak/>
         <w:t>9. Security and Authorization</w:t>
       </w:r>
     </w:p>
@@ -3704,6 +3794,7 @@
           <w:sz w:val="24"/>
           <w:szCs w:val="24"/>
         </w:rPr>
+        <w:lastRenderedPageBreak/>
         <w:t xml:space="preserve">web-only </w:t>
       </w:r>
     </w:p>
@@ -3823,7 +3914,6 @@
           <w:sz w:val="24"/>
           <w:szCs w:val="24"/>
         </w:rPr>
-        <w:lastRenderedPageBreak/>
         <w:t xml:space="preserve">payments </w:t>
       </w:r>
     </w:p>

</xml_diff>

<commit_message>
refresh project document design with blue theme and improved headings
</commit_message>
<xml_diff>
--- a/docs/Project-planning.docx
+++ b/docs/Project-planning.docx
@@ -4,376 +4,217 @@
   <w:body>
     <w:p>
       <w:pPr>
-        <w:keepNext/>
-        <w:keepLines/>
-        <w:spacing w:after="60" w:line="276" w:lineRule="auto"/>
-        <w:jc w:val="center"/>
-        <w:rPr>
-          <w:rFonts w:ascii="Arial" w:eastAsia="Arial" w:hAnsi="Arial" w:cs="Arial"/>
-          <w:sz w:val="52"/>
-          <w:szCs w:val="52"/>
+        <w:pStyle w:val="Title"/>
+        <w:rPr>
+          <w:rFonts w:eastAsia="Arial"/>
           <w:lang w:val="en-GB" w:eastAsia="en-IE"/>
         </w:rPr>
       </w:pPr>
       <w:bookmarkStart w:id="0" w:name="_Hlk224220027"/>
       <w:r>
         <w:rPr>
-          <w:rFonts w:ascii="Arial" w:eastAsia="Arial" w:hAnsi="Arial" w:cs="Arial"/>
-          <w:sz w:val="52"/>
-          <w:szCs w:val="52"/>
+          <w:rFonts w:eastAsia="Arial"/>
           <w:lang w:val="en-GB" w:eastAsia="en-IE"/>
         </w:rPr>
         <w:t>Project Planning and UX Artefacts</w:t>
       </w:r>
-    </w:p>
-    <w:bookmarkEnd w:id="0"/>
-    <w:p>
-      <w:pPr>
-        <w:rPr>
-          <w:lang w:val="en-GB"/>
-        </w:rPr>
-      </w:pPr>
-    </w:p>
-    <w:p>
-      <w:pPr>
-        <w:jc w:val="center"/>
-        <w:rPr>
-          <w:rFonts w:ascii="Calibri" w:hAnsi="Calibri" w:cs="Calibri"/>
-          <w:sz w:val="40"/>
-          <w:szCs w:val="40"/>
-        </w:rPr>
-      </w:pPr>
-      <w:r>
-        <w:rPr>
-          <w:rFonts w:ascii="Calibri" w:hAnsi="Calibri" w:cs="Calibri"/>
-          <w:sz w:val="40"/>
-          <w:szCs w:val="40"/>
-        </w:rPr>
+      <w:bookmarkEnd w:id="0"/>
+    </w:p>
+    <w:p>
+      <w:pPr>
+        <w:pStyle w:val="Heading1"/>
+      </w:pPr>
+      <w:r>
         <w:t>Supermarket Store Web Platform (Laravel MVC)</w:t>
       </w:r>
     </w:p>
     <w:p>
-      <w:pPr>
-        <w:rPr>
-          <w:rFonts w:ascii="Calibri" w:hAnsi="Calibri" w:cs="Calibri"/>
-          <w:sz w:val="24"/>
-          <w:szCs w:val="24"/>
-        </w:rPr>
-      </w:pPr>
-      <w:r>
-        <w:rPr>
-          <w:rFonts w:ascii="Calibri" w:hAnsi="Calibri" w:cs="Calibri"/>
-          <w:sz w:val="24"/>
-          <w:szCs w:val="24"/>
-        </w:rPr>
-        <w:t>Authors:</w:t>
-      </w:r>
-    </w:p>
-    <w:p>
-      <w:pPr>
-        <w:rPr>
-          <w:rFonts w:ascii="Calibri" w:hAnsi="Calibri" w:cs="Calibri"/>
-          <w:i/>
-          <w:iCs/>
-          <w:sz w:val="24"/>
-          <w:szCs w:val="24"/>
-        </w:rPr>
-      </w:pPr>
-      <w:r>
-        <w:rPr>
-          <w:rFonts w:ascii="Calibri" w:hAnsi="Calibri" w:cs="Calibri"/>
-          <w:i/>
-          <w:iCs/>
-          <w:sz w:val="24"/>
-          <w:szCs w:val="24"/>
-        </w:rPr>
-        <w:t xml:space="preserve">Nikita </w:t>
-      </w:r>
-      <w:proofErr w:type="spellStart"/>
-      <w:r>
-        <w:rPr>
-          <w:rFonts w:ascii="Calibri" w:hAnsi="Calibri" w:cs="Calibri"/>
-          <w:i/>
-          <w:iCs/>
-          <w:sz w:val="24"/>
-          <w:szCs w:val="24"/>
-        </w:rPr>
-        <w:t>Smiichyk</w:t>
-      </w:r>
-      <w:proofErr w:type="spellEnd"/>
-    </w:p>
-    <w:p>
-      <w:pPr>
-        <w:rPr>
-          <w:rFonts w:ascii="Calibri" w:hAnsi="Calibri" w:cs="Calibri"/>
-          <w:i/>
-          <w:iCs/>
-          <w:sz w:val="24"/>
-          <w:szCs w:val="24"/>
-          <w:lang w:val="ru-RU"/>
-        </w:rPr>
-      </w:pPr>
-      <w:r>
-        <w:rPr>
-          <w:rFonts w:ascii="Calibri" w:hAnsi="Calibri" w:cs="Calibri"/>
-          <w:i/>
-          <w:iCs/>
-          <w:sz w:val="24"/>
-          <w:szCs w:val="24"/>
-        </w:rPr>
-        <w:t>Hanna Bokariuk</w:t>
-      </w:r>
-    </w:p>
-    <w:p>
-      <w:pPr>
-        <w:rPr>
-          <w:rFonts w:ascii="Calibri" w:hAnsi="Calibri" w:cs="Calibri"/>
-          <w:sz w:val="24"/>
-          <w:szCs w:val="24"/>
-        </w:rPr>
-      </w:pPr>
-    </w:p>
-    <w:p>
-      <w:pPr>
-        <w:rPr>
-          <w:rFonts w:ascii="Calibri" w:hAnsi="Calibri" w:cs="Calibri"/>
-          <w:sz w:val="24"/>
-          <w:szCs w:val="24"/>
-        </w:rPr>
-      </w:pPr>
-      <w:r>
-        <w:rPr>
-          <w:rFonts w:ascii="Calibri" w:hAnsi="Calibri" w:cs="Calibri"/>
-          <w:sz w:val="24"/>
-          <w:szCs w:val="24"/>
-        </w:rPr>
-        <w:t>Module: Server-Side Development</w:t>
-      </w:r>
-    </w:p>
-    <w:p>
-      <w:pPr>
-        <w:rPr>
-          <w:rFonts w:ascii="Calibri" w:hAnsi="Calibri" w:cs="Calibri"/>
-          <w:sz w:val="24"/>
-          <w:szCs w:val="24"/>
-        </w:rPr>
-      </w:pPr>
-      <w:r>
-        <w:rPr>
-          <w:rFonts w:ascii="Calibri" w:hAnsi="Calibri" w:cs="Calibri"/>
-          <w:sz w:val="24"/>
-          <w:szCs w:val="24"/>
-        </w:rPr>
-        <w:t>Framework: Laravel (MVC Architecture)</w:t>
-      </w:r>
-    </w:p>
-    <w:p>
-      <w:pPr>
-        <w:rPr>
-          <w:rFonts w:ascii="Calibri" w:hAnsi="Calibri" w:cs="Calibri"/>
-          <w:sz w:val="24"/>
-          <w:szCs w:val="24"/>
-        </w:rPr>
-      </w:pPr>
-    </w:p>
-    <w:p>
-      <w:pPr>
-        <w:rPr>
-          <w:rFonts w:ascii="Calibri" w:hAnsi="Calibri" w:cs="Calibri"/>
+      <w:r>
+        <w:rPr>
           <w:b/>
           <w:bCs/>
-          <w:sz w:val="24"/>
-          <w:szCs w:val="24"/>
-        </w:rPr>
-      </w:pPr>
-      <w:r>
-        <w:rPr>
-          <w:rFonts w:ascii="Calibri" w:hAnsi="Calibri" w:cs="Calibri"/>
+        </w:rPr>
+        <w:t>Authors</w:t>
+      </w:r>
+      <w:r>
+        <w:t>:</w:t>
+      </w:r>
+      <w:r>
+        <w:t xml:space="preserve"> </w:t>
+      </w:r>
+      <w:r>
+        <w:t>Nikita Smiichyk</w:t>
+      </w:r>
+      <w:r>
+        <w:t xml:space="preserve">, </w:t>
+      </w:r>
+      <w:r>
+        <w:t>Hanna Bokariuk</w:t>
+      </w:r>
+    </w:p>
+    <w:p>
+      <w:r>
+        <w:rPr>
           <w:b/>
           <w:bCs/>
-          <w:sz w:val="24"/>
-          <w:szCs w:val="24"/>
-        </w:rPr>
-        <w:t>1. Project Concept and Problem Statement</w:t>
-      </w:r>
-    </w:p>
-    <w:p>
-      <w:pPr>
-        <w:rPr>
-          <w:rFonts w:ascii="Calibri" w:hAnsi="Calibri" w:cs="Calibri"/>
-          <w:sz w:val="24"/>
-          <w:szCs w:val="24"/>
-        </w:rPr>
-      </w:pPr>
-    </w:p>
-    <w:p>
-      <w:pPr>
-        <w:rPr>
-          <w:rFonts w:ascii="Calibri" w:hAnsi="Calibri" w:cs="Calibri"/>
-          <w:sz w:val="24"/>
-          <w:szCs w:val="24"/>
-        </w:rPr>
-      </w:pPr>
-      <w:r>
-        <w:rPr>
-          <w:rFonts w:ascii="Calibri" w:hAnsi="Calibri" w:cs="Calibri"/>
-          <w:sz w:val="24"/>
-          <w:szCs w:val="24"/>
-        </w:rPr>
-        <w:t>The Supermarket Store Web Platform is a dynamic, data-driven web application designed to support both online shopping and internal supermarket management. The system is developed using the Laravel framework following the Model-View-Controller (MVC) architecture.</w:t>
-      </w:r>
-    </w:p>
-    <w:p>
-      <w:pPr>
-        <w:rPr>
-          <w:rFonts w:ascii="Calibri" w:hAnsi="Calibri" w:cs="Calibri"/>
-          <w:sz w:val="24"/>
-          <w:szCs w:val="24"/>
-        </w:rPr>
-      </w:pPr>
-    </w:p>
-    <w:p>
-      <w:pPr>
-        <w:rPr>
-          <w:rFonts w:ascii="Calibri" w:hAnsi="Calibri" w:cs="Calibri"/>
-          <w:sz w:val="24"/>
-          <w:szCs w:val="24"/>
-        </w:rPr>
-      </w:pPr>
-      <w:r>
-        <w:rPr>
-          <w:rFonts w:ascii="Calibri" w:hAnsi="Calibri" w:cs="Calibri"/>
-          <w:sz w:val="24"/>
-          <w:szCs w:val="24"/>
-        </w:rPr>
-        <w:t>Many small and medium-sized supermarkets still rely on manual processes or disconnected tools to manage product data, inventory, and customer orders. This often results in outdated product information, inefficient workflows, and poor visibility of available stock.</w:t>
-      </w:r>
-    </w:p>
-    <w:p>
-      <w:pPr>
-        <w:rPr>
-          <w:rFonts w:ascii="Calibri" w:hAnsi="Calibri" w:cs="Calibri"/>
-          <w:sz w:val="24"/>
-          <w:szCs w:val="24"/>
-        </w:rPr>
-      </w:pPr>
-    </w:p>
-    <w:p>
-      <w:pPr>
-        <w:rPr>
-          <w:rFonts w:ascii="Calibri" w:hAnsi="Calibri" w:cs="Calibri"/>
-          <w:sz w:val="24"/>
-          <w:szCs w:val="24"/>
-        </w:rPr>
-      </w:pPr>
-      <w:r>
-        <w:rPr>
-          <w:rFonts w:ascii="Calibri" w:hAnsi="Calibri" w:cs="Calibri"/>
-          <w:sz w:val="24"/>
-          <w:szCs w:val="24"/>
-        </w:rPr>
-        <w:t>The purpose of this project is to develop a structured web platform where customers can browse products and place orders, while administrators can manage product information, categories, and inventory in a secure and organized system.</w:t>
-      </w:r>
-    </w:p>
-    <w:p>
-      <w:pPr>
-        <w:rPr>
-          <w:rFonts w:ascii="Calibri" w:hAnsi="Calibri" w:cs="Calibri"/>
-          <w:sz w:val="24"/>
-          <w:szCs w:val="24"/>
-        </w:rPr>
-      </w:pPr>
-    </w:p>
-    <w:p>
-      <w:pPr>
-        <w:rPr>
-          <w:rFonts w:ascii="Calibri" w:hAnsi="Calibri" w:cs="Calibri"/>
-          <w:sz w:val="24"/>
-          <w:szCs w:val="24"/>
-        </w:rPr>
-      </w:pPr>
-      <w:r>
-        <w:rPr>
-          <w:rFonts w:ascii="Calibri" w:hAnsi="Calibri" w:cs="Calibri"/>
-          <w:sz w:val="24"/>
-          <w:szCs w:val="24"/>
-        </w:rPr>
-        <w:t>The platform demonstrates practical server-side development skills including CRUD operations, database management, authentication, validation, and MVC architecture.</w:t>
-      </w:r>
-    </w:p>
-    <w:p>
-      <w:pPr>
-        <w:rPr>
-          <w:rFonts w:ascii="Calibri" w:hAnsi="Calibri" w:cs="Calibri"/>
-          <w:sz w:val="24"/>
-          <w:szCs w:val="24"/>
-        </w:rPr>
-      </w:pPr>
-    </w:p>
-    <w:p>
-      <w:pPr>
-        <w:rPr>
-          <w:rFonts w:ascii="Calibri" w:hAnsi="Calibri" w:cs="Calibri"/>
+        </w:rPr>
+        <w:t>Module</w:t>
+      </w:r>
+      <w:r>
+        <w:t>: Server-Side Development</w:t>
+      </w:r>
+    </w:p>
+    <w:p>
+      <w:r>
+        <w:rPr>
           <w:b/>
           <w:bCs/>
-          <w:sz w:val="24"/>
-          <w:szCs w:val="24"/>
-        </w:rPr>
-      </w:pPr>
-      <w:r>
-        <w:rPr>
-          <w:rFonts w:ascii="Calibri" w:hAnsi="Calibri" w:cs="Calibri"/>
-          <w:b/>
-          <w:bCs/>
-          <w:sz w:val="24"/>
-          <w:szCs w:val="24"/>
-        </w:rPr>
+        </w:rPr>
+        <w:t>Framework</w:t>
+      </w:r>
+      <w:r>
+        <w:t>: Laravel (MVC Architecture)</w:t>
+      </w:r>
+    </w:p>
+    <w:p>
+      <w:pPr>
+        <w:rPr>
+          <w:rFonts w:ascii="Calibri" w:hAnsi="Calibri" w:cs="Calibri"/>
+          <w:sz w:val="24"/>
+          <w:szCs w:val="24"/>
+        </w:rPr>
+      </w:pPr>
+    </w:p>
+    <w:p>
+      <w:pPr>
+        <w:pStyle w:val="Heading2"/>
+      </w:pPr>
+      <w:r>
+        <w:t>1. Project Concept and Problem Statement</w:t>
+      </w:r>
+    </w:p>
+    <w:p>
+      <w:pPr>
+        <w:rPr>
+          <w:rFonts w:ascii="Calibri" w:hAnsi="Calibri" w:cs="Calibri"/>
+          <w:sz w:val="24"/>
+          <w:szCs w:val="24"/>
+        </w:rPr>
+      </w:pPr>
+      <w:r>
+        <w:rPr>
+          <w:rFonts w:ascii="Calibri" w:hAnsi="Calibri" w:cs="Calibri"/>
+          <w:sz w:val="24"/>
+          <w:szCs w:val="24"/>
+        </w:rPr>
+        <w:t>The Supermarket Store Web Platform is a dynamic, data-driven web application designed to support both online shopping and internal supermarket management. The system is developed using the Laravel framework following the Model-View-Controller (MVC) architecture.</w:t>
+      </w:r>
+    </w:p>
+    <w:p>
+      <w:pPr>
+        <w:rPr>
+          <w:rFonts w:ascii="Calibri" w:hAnsi="Calibri" w:cs="Calibri"/>
+          <w:sz w:val="24"/>
+          <w:szCs w:val="24"/>
+        </w:rPr>
+      </w:pPr>
+      <w:r>
+        <w:rPr>
+          <w:rFonts w:ascii="Calibri" w:hAnsi="Calibri" w:cs="Calibri"/>
+          <w:sz w:val="24"/>
+          <w:szCs w:val="24"/>
+        </w:rPr>
+        <w:t>Many small and medium-sized supermarkets still rely on manual processes or disconnected tools to manage product data, inventory, and customer orders. This often results in outdated product information, inefficient workflows, and poor visibility of available stock.</w:t>
+      </w:r>
+    </w:p>
+    <w:p>
+      <w:pPr>
+        <w:rPr>
+          <w:rFonts w:ascii="Calibri" w:hAnsi="Calibri" w:cs="Calibri"/>
+          <w:sz w:val="24"/>
+          <w:szCs w:val="24"/>
+        </w:rPr>
+      </w:pPr>
+      <w:r>
+        <w:rPr>
+          <w:rFonts w:ascii="Calibri" w:hAnsi="Calibri" w:cs="Calibri"/>
+          <w:sz w:val="24"/>
+          <w:szCs w:val="24"/>
+        </w:rPr>
+        <w:t>The purpose of this project is to develop a structured web platform where customers can browse products and place orders, while administrators can manage product information, categories, and inventory in a secure and organized system.</w:t>
+      </w:r>
+    </w:p>
+    <w:p>
+      <w:pPr>
+        <w:rPr>
+          <w:rFonts w:ascii="Calibri" w:hAnsi="Calibri" w:cs="Calibri"/>
+          <w:sz w:val="24"/>
+          <w:szCs w:val="24"/>
+        </w:rPr>
+      </w:pPr>
+      <w:r>
+        <w:rPr>
+          <w:rFonts w:ascii="Calibri" w:hAnsi="Calibri" w:cs="Calibri"/>
+          <w:sz w:val="24"/>
+          <w:szCs w:val="24"/>
+        </w:rPr>
+        <w:t>The platform demonstrates practical server-side development skills including CRUD operations, database management, authentication, validation, and MVC architecture.</w:t>
+      </w:r>
+    </w:p>
+    <w:p>
+      <w:pPr>
+        <w:rPr>
+          <w:rFonts w:ascii="Calibri" w:hAnsi="Calibri" w:cs="Calibri"/>
+          <w:sz w:val="24"/>
+          <w:szCs w:val="24"/>
+        </w:rPr>
+      </w:pPr>
+      <w:r>
+        <w:rPr>
+          <w:rFonts w:ascii="Calibri" w:hAnsi="Calibri" w:cs="Calibri"/>
+          <w:sz w:val="24"/>
+          <w:szCs w:val="24"/>
+        </w:rPr>
+        <w:br w:type="page"/>
+      </w:r>
+    </w:p>
+    <w:p>
+      <w:pPr>
+        <w:pStyle w:val="Heading2"/>
+      </w:pPr>
+      <w:r>
+        <w:lastRenderedPageBreak/>
         <w:t>2. User Personas</w:t>
       </w:r>
     </w:p>
     <w:p>
       <w:pPr>
-        <w:rPr>
-          <w:rFonts w:ascii="Calibri" w:hAnsi="Calibri" w:cs="Calibri"/>
-          <w:sz w:val="24"/>
-          <w:szCs w:val="24"/>
-        </w:rPr>
-      </w:pPr>
-    </w:p>
-    <w:p>
-      <w:pPr>
-        <w:rPr>
-          <w:rFonts w:ascii="Calibri" w:hAnsi="Calibri" w:cs="Calibri"/>
-          <w:b/>
-          <w:bCs/>
-          <w:sz w:val="24"/>
-          <w:szCs w:val="24"/>
-          <w:lang w:val="ru-RU"/>
-        </w:rPr>
-      </w:pPr>
-      <w:r>
-        <w:rPr>
-          <w:rFonts w:ascii="Calibri" w:hAnsi="Calibri" w:cs="Calibri"/>
-          <w:b/>
-          <w:bCs/>
-          <w:sz w:val="24"/>
-          <w:szCs w:val="24"/>
-        </w:rPr>
-        <w:lastRenderedPageBreak/>
+        <w:pStyle w:val="Heading3"/>
+      </w:pPr>
+      <w:r>
         <w:t>Persona 1: Store Manager</w:t>
       </w:r>
+    </w:p>
+    <w:p>
+      <w:pPr>
+        <w:rPr>
+          <w:rFonts w:ascii="Calibri" w:hAnsi="Calibri" w:cs="Calibri"/>
+          <w:sz w:val="24"/>
+          <w:szCs w:val="24"/>
+        </w:rPr>
+      </w:pPr>
       <w:r>
         <w:rPr>
           <w:noProof/>
         </w:rPr>
         <w:drawing>
-          <wp:anchor distT="0" distB="0" distL="114300" distR="114300" simplePos="0" relativeHeight="251661312" behindDoc="0" locked="0" layoutInCell="1" allowOverlap="1" wp14:anchorId="317C51B8" wp14:editId="784641B1">
+          <wp:anchor distT="0" distB="0" distL="114300" distR="114300" simplePos="0" relativeHeight="251661312" behindDoc="0" locked="0" layoutInCell="1" allowOverlap="1" wp14:anchorId="317C51B8" wp14:editId="6F3D22DE">
             <wp:simplePos x="0" y="0"/>
             <wp:positionH relativeFrom="column">
               <wp:posOffset>0</wp:posOffset>
             </wp:positionH>
             <wp:positionV relativeFrom="paragraph">
-              <wp:posOffset>1536</wp:posOffset>
+              <wp:posOffset>50507</wp:posOffset>
             </wp:positionV>
             <wp:extent cx="2707553" cy="1807535"/>
             <wp:effectExtent l="0" t="0" r="0" b="2540"/>
@@ -428,15 +269,6 @@
           </wp:anchor>
         </w:drawing>
       </w:r>
-    </w:p>
-    <w:p>
-      <w:pPr>
-        <w:rPr>
-          <w:rFonts w:ascii="Calibri" w:hAnsi="Calibri" w:cs="Calibri"/>
-          <w:sz w:val="24"/>
-          <w:szCs w:val="24"/>
-        </w:rPr>
-      </w:pPr>
       <w:r>
         <w:rPr>
           <w:rFonts w:ascii="Calibri" w:hAnsi="Calibri" w:cs="Calibri"/>
@@ -477,7 +309,6 @@
           <w:rFonts w:ascii="Calibri" w:hAnsi="Calibri" w:cs="Calibri"/>
           <w:sz w:val="24"/>
           <w:szCs w:val="24"/>
-          <w:lang w:val="ru-RU"/>
         </w:rPr>
       </w:pPr>
       <w:r>
@@ -495,17 +326,24 @@
           <w:rFonts w:ascii="Calibri" w:hAnsi="Calibri" w:cs="Calibri"/>
           <w:sz w:val="24"/>
           <w:szCs w:val="24"/>
-          <w:lang w:val="ru-RU"/>
-        </w:rPr>
-      </w:pPr>
-    </w:p>
-    <w:p>
-      <w:pPr>
-        <w:rPr>
-          <w:rFonts w:ascii="Calibri" w:hAnsi="Calibri" w:cs="Calibri"/>
-          <w:sz w:val="24"/>
-          <w:szCs w:val="24"/>
-          <w:lang w:val="ru-RU"/>
+        </w:rPr>
+      </w:pPr>
+    </w:p>
+    <w:p>
+      <w:pPr>
+        <w:rPr>
+          <w:rFonts w:ascii="Calibri" w:hAnsi="Calibri" w:cs="Calibri"/>
+          <w:sz w:val="24"/>
+          <w:szCs w:val="24"/>
+        </w:rPr>
+      </w:pPr>
+    </w:p>
+    <w:p>
+      <w:pPr>
+        <w:rPr>
+          <w:rFonts w:ascii="Calibri" w:hAnsi="Calibri" w:cs="Calibri"/>
+          <w:sz w:val="24"/>
+          <w:szCs w:val="24"/>
         </w:rPr>
       </w:pPr>
     </w:p>
@@ -843,22 +681,10 @@
     </w:p>
     <w:p>
       <w:pPr>
-        <w:rPr>
-          <w:rFonts w:ascii="Calibri" w:hAnsi="Calibri" w:cs="Calibri"/>
-          <w:b/>
-          <w:bCs/>
-          <w:sz w:val="24"/>
-          <w:szCs w:val="24"/>
-        </w:rPr>
-      </w:pPr>
-      <w:r>
-        <w:rPr>
-          <w:rFonts w:ascii="Calibri" w:hAnsi="Calibri" w:cs="Calibri"/>
-          <w:b/>
-          <w:bCs/>
-          <w:sz w:val="24"/>
-          <w:szCs w:val="24"/>
-        </w:rPr>
+        <w:pStyle w:val="Heading3"/>
+      </w:pPr>
+      <w:r>
+        <w:lastRenderedPageBreak/>
         <w:t>Persona 2: Customer</w:t>
       </w:r>
     </w:p>
@@ -875,7 +701,6 @@
         <w:rPr>
           <w:noProof/>
         </w:rPr>
-        <w:lastRenderedPageBreak/>
         <w:drawing>
           <wp:anchor distT="0" distB="0" distL="114300" distR="114300" simplePos="0" relativeHeight="251658240" behindDoc="0" locked="0" layoutInCell="1" allowOverlap="1" wp14:anchorId="4EC4892E" wp14:editId="23782614">
             <wp:simplePos x="0" y="0"/>
@@ -980,7 +805,6 @@
           <w:rFonts w:ascii="Calibri" w:hAnsi="Calibri" w:cs="Calibri"/>
           <w:sz w:val="24"/>
           <w:szCs w:val="24"/>
-          <w:lang w:val="ru-RU"/>
         </w:rPr>
       </w:pPr>
       <w:r>
@@ -998,27 +822,15 @@
           <w:rFonts w:ascii="Calibri" w:hAnsi="Calibri" w:cs="Calibri"/>
           <w:sz w:val="24"/>
           <w:szCs w:val="24"/>
-          <w:lang w:val="ru-RU"/>
-        </w:rPr>
-      </w:pPr>
-    </w:p>
-    <w:p>
-      <w:pPr>
-        <w:rPr>
-          <w:rFonts w:ascii="Calibri" w:hAnsi="Calibri" w:cs="Calibri"/>
-          <w:sz w:val="24"/>
-          <w:szCs w:val="24"/>
-          <w:lang w:val="ru-RU"/>
-        </w:rPr>
-      </w:pPr>
-    </w:p>
-    <w:p>
-      <w:pPr>
-        <w:rPr>
-          <w:rFonts w:ascii="Calibri" w:hAnsi="Calibri" w:cs="Calibri"/>
-          <w:sz w:val="24"/>
-          <w:szCs w:val="24"/>
-          <w:lang w:val="ru-RU"/>
+        </w:rPr>
+      </w:pPr>
+    </w:p>
+    <w:p>
+      <w:pPr>
+        <w:rPr>
+          <w:rFonts w:ascii="Calibri" w:hAnsi="Calibri" w:cs="Calibri"/>
+          <w:sz w:val="24"/>
+          <w:szCs w:val="24"/>
         </w:rPr>
       </w:pPr>
     </w:p>
@@ -1102,7 +914,6 @@
           <w:bCs/>
           <w:sz w:val="24"/>
           <w:szCs w:val="24"/>
-          <w:lang w:val="ru-RU"/>
         </w:rPr>
       </w:pPr>
       <w:r>
@@ -1319,34 +1130,39 @@
           <w:szCs w:val="24"/>
         </w:rPr>
       </w:pPr>
-    </w:p>
-    <w:p>
-      <w:pPr>
-        <w:rPr>
-          <w:rFonts w:ascii="Calibri" w:hAnsi="Calibri" w:cs="Calibri"/>
-          <w:b/>
-          <w:bCs/>
-          <w:sz w:val="24"/>
-          <w:szCs w:val="24"/>
-        </w:rPr>
-      </w:pPr>
-      <w:r>
-        <w:rPr>
-          <w:rFonts w:ascii="Calibri" w:hAnsi="Calibri" w:cs="Calibri"/>
-          <w:b/>
-          <w:bCs/>
-          <w:sz w:val="24"/>
-          <w:szCs w:val="24"/>
-        </w:rPr>
+      <w:r>
+        <w:rPr>
+          <w:rFonts w:ascii="Calibri" w:hAnsi="Calibri" w:cs="Calibri"/>
+          <w:sz w:val="24"/>
+          <w:szCs w:val="24"/>
+        </w:rPr>
+        <w:br w:type="page"/>
+      </w:r>
+    </w:p>
+    <w:p>
+      <w:pPr>
+        <w:pStyle w:val="Heading2"/>
+      </w:pPr>
+      <w:r>
+        <w:lastRenderedPageBreak/>
         <w:t>3. User Flows / Task Journeys</w:t>
       </w:r>
     </w:p>
     <w:p>
       <w:pPr>
-        <w:rPr>
-          <w:rFonts w:ascii="Calibri" w:hAnsi="Calibri" w:cs="Calibri"/>
-          <w:b/>
-          <w:bCs/>
+        <w:pStyle w:val="Heading4"/>
+      </w:pPr>
+      <w:r>
+        <w:t xml:space="preserve">3.1. </w:t>
+      </w:r>
+      <w:r>
+        <w:t>Store Manager Flow</w:t>
+      </w:r>
+    </w:p>
+    <w:p>
+      <w:pPr>
+        <w:rPr>
+          <w:rFonts w:ascii="Calibri" w:hAnsi="Calibri" w:cs="Calibri"/>
           <w:sz w:val="24"/>
           <w:szCs w:val="24"/>
         </w:rPr>
@@ -1360,18 +1176,17 @@
           <w:sz w:val="24"/>
           <w:szCs w:val="24"/>
         </w:rPr>
-        <w:lastRenderedPageBreak/>
         <w:drawing>
-          <wp:anchor distT="0" distB="0" distL="114300" distR="114300" simplePos="0" relativeHeight="251660288" behindDoc="0" locked="0" layoutInCell="1" allowOverlap="1" wp14:anchorId="3AAB44EC" wp14:editId="567D26BC">
+          <wp:anchor distT="0" distB="0" distL="114300" distR="114300" simplePos="0" relativeHeight="251660288" behindDoc="0" locked="0" layoutInCell="1" allowOverlap="1" wp14:anchorId="3AAB44EC" wp14:editId="36025EDE">
             <wp:simplePos x="0" y="0"/>
             <wp:positionH relativeFrom="column">
-              <wp:posOffset>86388</wp:posOffset>
+              <wp:posOffset>85725</wp:posOffset>
             </wp:positionH>
             <wp:positionV relativeFrom="paragraph">
-              <wp:posOffset>-109054</wp:posOffset>
+              <wp:posOffset>149535</wp:posOffset>
             </wp:positionV>
             <wp:extent cx="1152525" cy="3819525"/>
-            <wp:effectExtent l="0" t="0" r="9525" b="9525"/>
+            <wp:effectExtent l="0" t="0" r="3175" b="3175"/>
             <wp:wrapSquare wrapText="bothSides"/>
             <wp:docPr id="1929928172" name="Picture 3" descr="A diagram of a product&#10;&#10;AI-generated content may be incorrect."/>
             <wp:cNvGraphicFramePr>
@@ -1408,19 +1223,40 @@
                 </pic:pic>
               </a:graphicData>
             </a:graphic>
+            <wp14:sizeRelH relativeFrom="margin">
+              <wp14:pctWidth>0</wp14:pctWidth>
+            </wp14:sizeRelH>
           </wp:anchor>
         </w:drawing>
       </w:r>
       <w:r>
         <w:rPr>
           <w:rFonts w:ascii="Calibri" w:hAnsi="Calibri" w:cs="Calibri"/>
+          <w:sz w:val="24"/>
+          <w:szCs w:val="24"/>
+        </w:rPr>
+        <w:t>Login → Access dashboard → View product list → Manage products (add, edit, delete) → Save changes.</w:t>
+      </w:r>
+    </w:p>
+    <w:p>
+      <w:pPr>
+        <w:rPr>
+          <w:rFonts w:ascii="Calibri" w:hAnsi="Calibri" w:cs="Calibri"/>
+          <w:sz w:val="24"/>
+          <w:szCs w:val="24"/>
+        </w:rPr>
+      </w:pPr>
+    </w:p>
+    <w:p>
+      <w:pPr>
+        <w:rPr>
+          <w:rFonts w:ascii="Calibri" w:hAnsi="Calibri" w:cs="Calibri"/>
           <w:b/>
           <w:bCs/>
           <w:sz w:val="24"/>
           <w:szCs w:val="24"/>
         </w:rPr>
-        <w:t xml:space="preserve">3.1. </w:t>
-      </w:r>
+      </w:pPr>
       <w:r>
         <w:rPr>
           <w:rFonts w:ascii="Calibri" w:hAnsi="Calibri" w:cs="Calibri"/>
@@ -1429,53 +1265,6 @@
           <w:sz w:val="24"/>
           <w:szCs w:val="24"/>
         </w:rPr>
-        <w:t>Store Manager Flow</w:t>
-      </w:r>
-    </w:p>
-    <w:p>
-      <w:pPr>
-        <w:rPr>
-          <w:rFonts w:ascii="Calibri" w:hAnsi="Calibri" w:cs="Calibri"/>
-          <w:sz w:val="24"/>
-          <w:szCs w:val="24"/>
-        </w:rPr>
-      </w:pPr>
-      <w:r>
-        <w:rPr>
-          <w:rFonts w:ascii="Calibri" w:hAnsi="Calibri" w:cs="Calibri"/>
-          <w:sz w:val="24"/>
-          <w:szCs w:val="24"/>
-        </w:rPr>
-        <w:t>Login → Access dashboard → View product list → Manage products (add, edit, delete) → Save changes.</w:t>
-      </w:r>
-    </w:p>
-    <w:p>
-      <w:pPr>
-        <w:rPr>
-          <w:rFonts w:ascii="Calibri" w:hAnsi="Calibri" w:cs="Calibri"/>
-          <w:sz w:val="24"/>
-          <w:szCs w:val="24"/>
-        </w:rPr>
-      </w:pPr>
-    </w:p>
-    <w:p>
-      <w:pPr>
-        <w:rPr>
-          <w:rFonts w:ascii="Calibri" w:hAnsi="Calibri" w:cs="Calibri"/>
-          <w:b/>
-          <w:bCs/>
-          <w:sz w:val="24"/>
-          <w:szCs w:val="24"/>
-        </w:rPr>
-      </w:pPr>
-      <w:r>
-        <w:rPr>
-          <w:rFonts w:ascii="Calibri" w:hAnsi="Calibri" w:cs="Calibri"/>
-          <w:b/>
-          <w:bCs/>
-          <w:sz w:val="24"/>
-          <w:szCs w:val="24"/>
-        </w:rPr>
         <w:t>Steps:</w:t>
       </w:r>
     </w:p>
@@ -1586,31 +1375,19 @@
       <w:pPr>
         <w:rPr>
           <w:rFonts w:ascii="Calibri" w:hAnsi="Calibri" w:cs="Calibri"/>
-          <w:b/>
-          <w:bCs/>
-          <w:sz w:val="24"/>
-          <w:szCs w:val="24"/>
-          <w:lang w:val="ru-RU"/>
-        </w:rPr>
-      </w:pPr>
-      <w:r>
-        <w:rPr>
-          <w:rFonts w:ascii="Calibri" w:hAnsi="Calibri" w:cs="Calibri"/>
-          <w:b/>
-          <w:bCs/>
-          <w:sz w:val="24"/>
-          <w:szCs w:val="24"/>
-        </w:rPr>
+          <w:sz w:val="24"/>
+          <w:szCs w:val="24"/>
+        </w:rPr>
+      </w:pPr>
+    </w:p>
+    <w:p>
+      <w:pPr>
+        <w:pStyle w:val="Heading3"/>
+      </w:pPr>
+      <w:r>
         <w:t xml:space="preserve">3.2. </w:t>
       </w:r>
       <w:r>
-        <w:rPr>
-          <w:rFonts w:ascii="Calibri" w:hAnsi="Calibri" w:cs="Calibri"/>
-          <w:b/>
-          <w:bCs/>
-          <w:sz w:val="24"/>
-          <w:szCs w:val="24"/>
-        </w:rPr>
         <w:t>Customer Flow</w:t>
       </w:r>
     </w:p>
@@ -1713,7 +1490,6 @@
           <w:bCs/>
           <w:sz w:val="24"/>
           <w:szCs w:val="24"/>
-          <w:lang w:val="ru-RU"/>
         </w:rPr>
       </w:pPr>
       <w:r>
@@ -1926,12 +1702,49 @@
     </w:p>
     <w:p>
       <w:pPr>
+        <w:pStyle w:val="Heading2"/>
+        <w:rPr>
+          <w:lang w:val="ru-RU"/>
+        </w:rPr>
+      </w:pPr>
+      <w:r>
+        <w:rPr>
+          <w:lang w:val="ru-RU"/>
+        </w:rPr>
+        <w:t xml:space="preserve">4. </w:t>
+      </w:r>
+      <w:r>
+        <w:t>Low</w:t>
+      </w:r>
+      <w:r>
+        <w:rPr>
+          <w:lang w:val="ru-RU"/>
+        </w:rPr>
+        <w:t>-</w:t>
+      </w:r>
+      <w:r>
+        <w:t>Fidelity</w:t>
+      </w:r>
+      <w:r>
+        <w:rPr>
+          <w:lang w:val="ru-RU"/>
+        </w:rPr>
+        <w:t xml:space="preserve"> </w:t>
+      </w:r>
+      <w:r>
+        <w:t>Wireframes</w:t>
+      </w:r>
+    </w:p>
+    <w:p>
+      <w:pPr>
         <w:rPr>
           <w:rFonts w:ascii="Calibri" w:hAnsi="Calibri" w:cs="Calibri"/>
           <w:b/>
           <w:bCs/>
-          <w:sz w:val="24"/>
-          <w:szCs w:val="24"/>
+          <w:color w:val="FF0000"/>
+          <w:sz w:val="24"/>
+          <w:szCs w:val="24"/>
+          <w:lang w:val="ru-RU"/>
         </w:rPr>
       </w:pPr>
       <w:r>
@@ -1939,118 +1752,12 @@
           <w:rFonts w:ascii="Calibri" w:hAnsi="Calibri" w:cs="Calibri"/>
           <w:b/>
           <w:bCs/>
-          <w:sz w:val="24"/>
-          <w:szCs w:val="24"/>
-        </w:rPr>
-        <w:t>4. Low-Fidelity Wireframes</w:t>
-      </w:r>
-    </w:p>
-    <w:p>
-      <w:pPr>
-        <w:rPr>
-          <w:rFonts w:ascii="Calibri" w:hAnsi="Calibri" w:cs="Calibri"/>
-          <w:b/>
-          <w:bCs/>
-          <w:color w:val="FF0000"/>
-          <w:sz w:val="24"/>
-          <w:szCs w:val="24"/>
-        </w:rPr>
-      </w:pPr>
-      <w:proofErr w:type="spellStart"/>
-      <w:r>
-        <w:rPr>
-          <w:rFonts w:ascii="Calibri" w:hAnsi="Calibri" w:cs="Calibri"/>
-          <w:b/>
-          <w:bCs/>
-          <w:color w:val="FF0000"/>
-          <w:sz w:val="24"/>
-          <w:szCs w:val="24"/>
-        </w:rPr>
-        <w:t>Описывает</w:t>
-      </w:r>
-      <w:proofErr w:type="spellEnd"/>
-      <w:r>
-        <w:rPr>
-          <w:rFonts w:ascii="Calibri" w:hAnsi="Calibri" w:cs="Calibri"/>
-          <w:b/>
-          <w:bCs/>
-          <w:color w:val="FF0000"/>
-          <w:sz w:val="24"/>
-          <w:szCs w:val="24"/>
-        </w:rPr>
-        <w:t xml:space="preserve"> </w:t>
-      </w:r>
-      <w:proofErr w:type="spellStart"/>
-      <w:r>
-        <w:rPr>
-          <w:rFonts w:ascii="Calibri" w:hAnsi="Calibri" w:cs="Calibri"/>
-          <w:b/>
-          <w:bCs/>
-          <w:color w:val="FF0000"/>
-          <w:sz w:val="24"/>
-          <w:szCs w:val="24"/>
-        </w:rPr>
-        <w:t>страницы</w:t>
-      </w:r>
-      <w:proofErr w:type="spellEnd"/>
-      <w:r>
-        <w:rPr>
-          <w:rFonts w:ascii="Calibri" w:hAnsi="Calibri" w:cs="Calibri"/>
-          <w:b/>
-          <w:bCs/>
-          <w:color w:val="FF0000"/>
-          <w:sz w:val="24"/>
-          <w:szCs w:val="24"/>
-        </w:rPr>
-        <w:t xml:space="preserve"> (</w:t>
-      </w:r>
-      <w:proofErr w:type="spellStart"/>
-      <w:r>
-        <w:rPr>
-          <w:rFonts w:ascii="Calibri" w:hAnsi="Calibri" w:cs="Calibri"/>
-          <w:b/>
-          <w:bCs/>
-          <w:color w:val="FF0000"/>
-          <w:sz w:val="24"/>
-          <w:szCs w:val="24"/>
-        </w:rPr>
-        <w:t>без</w:t>
-      </w:r>
-      <w:proofErr w:type="spellEnd"/>
-      <w:r>
-        <w:rPr>
-          <w:rFonts w:ascii="Calibri" w:hAnsi="Calibri" w:cs="Calibri"/>
-          <w:b/>
-          <w:bCs/>
-          <w:color w:val="FF0000"/>
-          <w:sz w:val="24"/>
-          <w:szCs w:val="24"/>
-        </w:rPr>
-        <w:t xml:space="preserve"> </w:t>
-      </w:r>
-      <w:proofErr w:type="spellStart"/>
-      <w:r>
-        <w:rPr>
-          <w:rFonts w:ascii="Calibri" w:hAnsi="Calibri" w:cs="Calibri"/>
-          <w:b/>
-          <w:bCs/>
-          <w:color w:val="FF0000"/>
-          <w:sz w:val="24"/>
-          <w:szCs w:val="24"/>
-        </w:rPr>
-        <w:t>дизайна</w:t>
-      </w:r>
-      <w:proofErr w:type="spellEnd"/>
-      <w:r>
-        <w:rPr>
-          <w:rFonts w:ascii="Calibri" w:hAnsi="Calibri" w:cs="Calibri"/>
-          <w:b/>
-          <w:bCs/>
-          <w:color w:val="FF0000"/>
-          <w:sz w:val="24"/>
-          <w:szCs w:val="24"/>
-        </w:rPr>
-        <w:t>):</w:t>
+          <w:color w:val="FF0000"/>
+          <w:sz w:val="24"/>
+          <w:szCs w:val="24"/>
+          <w:lang w:val="ru-RU"/>
+        </w:rPr>
+        <w:t>Описывает страницы (без дизайна):</w:t>
       </w:r>
     </w:p>
     <w:p>
@@ -2202,6 +1909,18 @@
     </w:p>
     <w:p>
       <w:pPr>
+        <w:pStyle w:val="Heading2"/>
+        <w:rPr>
+          <w:lang w:val="ru-RU"/>
+        </w:rPr>
+      </w:pPr>
+      <w:r>
+        <w:t>5. Project Scope</w:t>
+      </w:r>
+    </w:p>
+    <w:p>
+      <w:pPr>
+        <w:ind w:firstLine="720"/>
         <w:rPr>
           <w:rFonts w:ascii="Calibri" w:hAnsi="Calibri" w:cs="Calibri"/>
           <w:b/>
@@ -2219,19 +1938,173 @@
           <w:sz w:val="24"/>
           <w:szCs w:val="24"/>
         </w:rPr>
-        <w:t>5. Project Scope</w:t>
-      </w:r>
-    </w:p>
-    <w:p>
-      <w:pPr>
-        <w:ind w:firstLine="720"/>
+        <w:lastRenderedPageBreak/>
+        <w:t>Included Features</w:t>
+      </w:r>
+    </w:p>
+    <w:p>
+      <w:pPr>
+        <w:rPr>
+          <w:rFonts w:ascii="Calibri" w:hAnsi="Calibri" w:cs="Calibri"/>
+          <w:sz w:val="24"/>
+          <w:szCs w:val="24"/>
+        </w:rPr>
+      </w:pPr>
+      <w:r>
+        <w:rPr>
+          <w:rFonts w:ascii="Calibri" w:hAnsi="Calibri" w:cs="Calibri"/>
+          <w:sz w:val="24"/>
+          <w:szCs w:val="24"/>
+        </w:rPr>
+        <w:t>The system will include the following features:</w:t>
+      </w:r>
+    </w:p>
+    <w:p>
+      <w:pPr>
+        <w:rPr>
+          <w:rFonts w:ascii="Calibri" w:hAnsi="Calibri" w:cs="Calibri"/>
+          <w:sz w:val="24"/>
+          <w:szCs w:val="24"/>
+        </w:rPr>
+      </w:pPr>
+      <w:r>
+        <w:rPr>
+          <w:rFonts w:ascii="Calibri" w:hAnsi="Calibri" w:cs="Calibri"/>
+          <w:sz w:val="24"/>
+          <w:szCs w:val="24"/>
+        </w:rPr>
+        <w:t>- User authentication including registration and login</w:t>
+      </w:r>
+    </w:p>
+    <w:p>
+      <w:pPr>
+        <w:rPr>
+          <w:rFonts w:ascii="Calibri" w:hAnsi="Calibri" w:cs="Calibri"/>
+          <w:sz w:val="24"/>
+          <w:szCs w:val="24"/>
+        </w:rPr>
+      </w:pPr>
+      <w:r>
+        <w:rPr>
+          <w:rFonts w:ascii="Calibri" w:hAnsi="Calibri" w:cs="Calibri"/>
+          <w:sz w:val="24"/>
+          <w:szCs w:val="24"/>
+        </w:rPr>
+        <w:t xml:space="preserve">- Product </w:t>
+      </w:r>
+      <w:proofErr w:type="spellStart"/>
+      <w:r>
+        <w:rPr>
+          <w:rFonts w:ascii="Calibri" w:hAnsi="Calibri" w:cs="Calibri"/>
+          <w:sz w:val="24"/>
+          <w:szCs w:val="24"/>
+        </w:rPr>
+        <w:t>catalog</w:t>
+      </w:r>
+      <w:proofErr w:type="spellEnd"/>
+      <w:r>
+        <w:rPr>
+          <w:rFonts w:ascii="Calibri" w:hAnsi="Calibri" w:cs="Calibri"/>
+          <w:sz w:val="24"/>
+          <w:szCs w:val="24"/>
+        </w:rPr>
+        <w:t xml:space="preserve"> browsing for customers</w:t>
+      </w:r>
+    </w:p>
+    <w:p>
+      <w:pPr>
+        <w:rPr>
+          <w:rFonts w:ascii="Calibri" w:hAnsi="Calibri" w:cs="Calibri"/>
+          <w:sz w:val="24"/>
+          <w:szCs w:val="24"/>
+        </w:rPr>
+      </w:pPr>
+      <w:r>
+        <w:rPr>
+          <w:rFonts w:ascii="Calibri" w:hAnsi="Calibri" w:cs="Calibri"/>
+          <w:sz w:val="24"/>
+          <w:szCs w:val="24"/>
+        </w:rPr>
+        <w:t>- Product management using CRUD operations</w:t>
+      </w:r>
+    </w:p>
+    <w:p>
+      <w:pPr>
+        <w:rPr>
+          <w:rFonts w:ascii="Calibri" w:hAnsi="Calibri" w:cs="Calibri"/>
+          <w:sz w:val="24"/>
+          <w:szCs w:val="24"/>
+        </w:rPr>
+      </w:pPr>
+      <w:r>
+        <w:rPr>
+          <w:rFonts w:ascii="Calibri" w:hAnsi="Calibri" w:cs="Calibri"/>
+          <w:sz w:val="24"/>
+          <w:szCs w:val="24"/>
+        </w:rPr>
+        <w:t>- Category-based product organization</w:t>
+      </w:r>
+    </w:p>
+    <w:p>
+      <w:pPr>
+        <w:rPr>
+          <w:rFonts w:ascii="Calibri" w:hAnsi="Calibri" w:cs="Calibri"/>
+          <w:sz w:val="24"/>
+          <w:szCs w:val="24"/>
+        </w:rPr>
+      </w:pPr>
+      <w:r>
+        <w:rPr>
+          <w:rFonts w:ascii="Calibri" w:hAnsi="Calibri" w:cs="Calibri"/>
+          <w:sz w:val="24"/>
+          <w:szCs w:val="24"/>
+        </w:rPr>
+        <w:t>- Shopping cart functionality</w:t>
+      </w:r>
+    </w:p>
+    <w:p>
+      <w:pPr>
+        <w:rPr>
+          <w:rFonts w:ascii="Calibri" w:hAnsi="Calibri" w:cs="Calibri"/>
+          <w:sz w:val="24"/>
+          <w:szCs w:val="24"/>
+        </w:rPr>
+      </w:pPr>
+      <w:r>
+        <w:rPr>
+          <w:rFonts w:ascii="Calibri" w:hAnsi="Calibri" w:cs="Calibri"/>
+          <w:sz w:val="24"/>
+          <w:szCs w:val="24"/>
+        </w:rPr>
+        <w:t>- Order creation and order history</w:t>
+      </w:r>
+    </w:p>
+    <w:p>
+      <w:pPr>
+        <w:rPr>
+          <w:rFonts w:ascii="Calibri" w:hAnsi="Calibri" w:cs="Calibri"/>
+          <w:sz w:val="24"/>
+          <w:szCs w:val="24"/>
+        </w:rPr>
+      </w:pPr>
+      <w:r>
+        <w:rPr>
+          <w:rFonts w:ascii="Calibri" w:hAnsi="Calibri" w:cs="Calibri"/>
+          <w:sz w:val="24"/>
+          <w:szCs w:val="24"/>
+        </w:rPr>
+        <w:t>- Form validation on both client side and server side</w:t>
+      </w:r>
+    </w:p>
+    <w:p>
+      <w:pPr>
+        <w:ind w:left="720"/>
         <w:rPr>
           <w:rFonts w:ascii="Calibri" w:hAnsi="Calibri" w:cs="Calibri"/>
           <w:b/>
           <w:bCs/>
           <w:sz w:val="24"/>
           <w:szCs w:val="24"/>
-          <w:lang w:val="ru-RU"/>
         </w:rPr>
       </w:pPr>
       <w:r>
@@ -2242,184 +2115,6 @@
           <w:sz w:val="24"/>
           <w:szCs w:val="24"/>
         </w:rPr>
-        <w:t>Included Features</w:t>
-      </w:r>
-    </w:p>
-    <w:p>
-      <w:pPr>
-        <w:rPr>
-          <w:rFonts w:ascii="Calibri" w:hAnsi="Calibri" w:cs="Calibri"/>
-          <w:sz w:val="24"/>
-          <w:szCs w:val="24"/>
-          <w:lang w:val="ru-RU"/>
-        </w:rPr>
-      </w:pPr>
-      <w:r>
-        <w:rPr>
-          <w:rFonts w:ascii="Calibri" w:hAnsi="Calibri" w:cs="Calibri"/>
-          <w:sz w:val="24"/>
-          <w:szCs w:val="24"/>
-        </w:rPr>
-        <w:t>The system will include the following features:</w:t>
-      </w:r>
-    </w:p>
-    <w:p>
-      <w:pPr>
-        <w:rPr>
-          <w:rFonts w:ascii="Calibri" w:hAnsi="Calibri" w:cs="Calibri"/>
-          <w:sz w:val="24"/>
-          <w:szCs w:val="24"/>
-        </w:rPr>
-      </w:pPr>
-      <w:r>
-        <w:rPr>
-          <w:rFonts w:ascii="Calibri" w:hAnsi="Calibri" w:cs="Calibri"/>
-          <w:sz w:val="24"/>
-          <w:szCs w:val="24"/>
-        </w:rPr>
-        <w:t>- User authentication including registration and login</w:t>
-      </w:r>
-    </w:p>
-    <w:p>
-      <w:pPr>
-        <w:rPr>
-          <w:rFonts w:ascii="Calibri" w:hAnsi="Calibri" w:cs="Calibri"/>
-          <w:sz w:val="24"/>
-          <w:szCs w:val="24"/>
-        </w:rPr>
-      </w:pPr>
-      <w:r>
-        <w:rPr>
-          <w:rFonts w:ascii="Calibri" w:hAnsi="Calibri" w:cs="Calibri"/>
-          <w:sz w:val="24"/>
-          <w:szCs w:val="24"/>
-        </w:rPr>
-        <w:t xml:space="preserve">- Product </w:t>
-      </w:r>
-      <w:proofErr w:type="spellStart"/>
-      <w:r>
-        <w:rPr>
-          <w:rFonts w:ascii="Calibri" w:hAnsi="Calibri" w:cs="Calibri"/>
-          <w:sz w:val="24"/>
-          <w:szCs w:val="24"/>
-        </w:rPr>
-        <w:t>catalog</w:t>
-      </w:r>
-      <w:proofErr w:type="spellEnd"/>
-      <w:r>
-        <w:rPr>
-          <w:rFonts w:ascii="Calibri" w:hAnsi="Calibri" w:cs="Calibri"/>
-          <w:sz w:val="24"/>
-          <w:szCs w:val="24"/>
-        </w:rPr>
-        <w:t xml:space="preserve"> browsing for customers</w:t>
-      </w:r>
-    </w:p>
-    <w:p>
-      <w:pPr>
-        <w:rPr>
-          <w:rFonts w:ascii="Calibri" w:hAnsi="Calibri" w:cs="Calibri"/>
-          <w:sz w:val="24"/>
-          <w:szCs w:val="24"/>
-        </w:rPr>
-      </w:pPr>
-      <w:r>
-        <w:rPr>
-          <w:rFonts w:ascii="Calibri" w:hAnsi="Calibri" w:cs="Calibri"/>
-          <w:sz w:val="24"/>
-          <w:szCs w:val="24"/>
-        </w:rPr>
-        <w:lastRenderedPageBreak/>
-        <w:t>- Product management using CRUD operations</w:t>
-      </w:r>
-    </w:p>
-    <w:p>
-      <w:pPr>
-        <w:rPr>
-          <w:rFonts w:ascii="Calibri" w:hAnsi="Calibri" w:cs="Calibri"/>
-          <w:sz w:val="24"/>
-          <w:szCs w:val="24"/>
-        </w:rPr>
-      </w:pPr>
-      <w:r>
-        <w:rPr>
-          <w:rFonts w:ascii="Calibri" w:hAnsi="Calibri" w:cs="Calibri"/>
-          <w:sz w:val="24"/>
-          <w:szCs w:val="24"/>
-        </w:rPr>
-        <w:t>- Category-based product organization</w:t>
-      </w:r>
-    </w:p>
-    <w:p>
-      <w:pPr>
-        <w:rPr>
-          <w:rFonts w:ascii="Calibri" w:hAnsi="Calibri" w:cs="Calibri"/>
-          <w:sz w:val="24"/>
-          <w:szCs w:val="24"/>
-        </w:rPr>
-      </w:pPr>
-      <w:r>
-        <w:rPr>
-          <w:rFonts w:ascii="Calibri" w:hAnsi="Calibri" w:cs="Calibri"/>
-          <w:sz w:val="24"/>
-          <w:szCs w:val="24"/>
-        </w:rPr>
-        <w:t>- Shopping cart functionality</w:t>
-      </w:r>
-    </w:p>
-    <w:p>
-      <w:pPr>
-        <w:rPr>
-          <w:rFonts w:ascii="Calibri" w:hAnsi="Calibri" w:cs="Calibri"/>
-          <w:sz w:val="24"/>
-          <w:szCs w:val="24"/>
-        </w:rPr>
-      </w:pPr>
-      <w:r>
-        <w:rPr>
-          <w:rFonts w:ascii="Calibri" w:hAnsi="Calibri" w:cs="Calibri"/>
-          <w:sz w:val="24"/>
-          <w:szCs w:val="24"/>
-        </w:rPr>
-        <w:t>- Order creation and order history</w:t>
-      </w:r>
-    </w:p>
-    <w:p>
-      <w:pPr>
-        <w:rPr>
-          <w:rFonts w:ascii="Calibri" w:hAnsi="Calibri" w:cs="Calibri"/>
-          <w:sz w:val="24"/>
-          <w:szCs w:val="24"/>
-        </w:rPr>
-      </w:pPr>
-      <w:r>
-        <w:rPr>
-          <w:rFonts w:ascii="Calibri" w:hAnsi="Calibri" w:cs="Calibri"/>
-          <w:sz w:val="24"/>
-          <w:szCs w:val="24"/>
-        </w:rPr>
-        <w:t>- Form validation on both client side and server side</w:t>
-      </w:r>
-    </w:p>
-    <w:p>
-      <w:pPr>
-        <w:ind w:left="720"/>
-        <w:rPr>
-          <w:rFonts w:ascii="Calibri" w:hAnsi="Calibri" w:cs="Calibri"/>
-          <w:b/>
-          <w:bCs/>
-          <w:sz w:val="24"/>
-          <w:szCs w:val="24"/>
-        </w:rPr>
-      </w:pPr>
-      <w:r>
-        <w:rPr>
-          <w:rFonts w:ascii="Calibri" w:hAnsi="Calibri" w:cs="Calibri"/>
-          <w:b/>
-          <w:bCs/>
-          <w:sz w:val="24"/>
-          <w:szCs w:val="24"/>
-        </w:rPr>
         <w:t>Excluded Features</w:t>
       </w:r>
     </w:p>
@@ -2429,7 +2124,6 @@
           <w:rFonts w:ascii="Calibri" w:hAnsi="Calibri" w:cs="Calibri"/>
           <w:sz w:val="24"/>
           <w:szCs w:val="24"/>
-          <w:lang w:val="ru-RU"/>
         </w:rPr>
       </w:pPr>
       <w:r>
@@ -2511,23 +2205,18 @@
     </w:p>
     <w:p>
       <w:pPr>
-        <w:ind w:left="720"/>
-        <w:rPr>
-          <w:rFonts w:ascii="Calibri" w:hAnsi="Calibri" w:cs="Calibri"/>
-          <w:b/>
-          <w:bCs/>
-          <w:sz w:val="24"/>
-          <w:szCs w:val="24"/>
-        </w:rPr>
-      </w:pPr>
-      <w:r>
-        <w:rPr>
-          <w:rFonts w:ascii="Calibri" w:hAnsi="Calibri" w:cs="Calibri"/>
-          <w:b/>
-          <w:bCs/>
-          <w:sz w:val="24"/>
-          <w:szCs w:val="24"/>
-        </w:rPr>
+        <w:rPr>
+          <w:rFonts w:ascii="Calibri" w:hAnsi="Calibri" w:cs="Calibri"/>
+          <w:sz w:val="24"/>
+          <w:szCs w:val="24"/>
+        </w:rPr>
+      </w:pPr>
+    </w:p>
+    <w:p>
+      <w:pPr>
+        <w:pStyle w:val="Heading2"/>
+      </w:pPr>
+      <w:r>
         <w:t>6. Core Functional Features</w:t>
       </w:r>
     </w:p>
@@ -2719,24 +2408,51 @@
     </w:p>
     <w:p>
       <w:pPr>
+        <w:rPr>
+          <w:rFonts w:ascii="Calibri" w:hAnsi="Calibri" w:cs="Calibri"/>
+          <w:color w:val="FF0000"/>
+          <w:sz w:val="24"/>
+          <w:szCs w:val="24"/>
+        </w:rPr>
+      </w:pPr>
+    </w:p>
+    <w:p>
+      <w:pPr>
+        <w:pStyle w:val="Heading2"/>
+      </w:pPr>
+      <w:r>
+        <w:t>7. Suggested Data Model</w:t>
+      </w:r>
+    </w:p>
+    <w:p>
+      <w:pPr>
         <w:ind w:left="720"/>
         <w:rPr>
           <w:rFonts w:ascii="Calibri" w:hAnsi="Calibri" w:cs="Calibri"/>
-          <w:b/>
-          <w:bCs/>
-          <w:sz w:val="24"/>
-          <w:szCs w:val="24"/>
-        </w:rPr>
-      </w:pPr>
-      <w:r>
-        <w:rPr>
-          <w:rFonts w:ascii="Calibri" w:hAnsi="Calibri" w:cs="Calibri"/>
-          <w:b/>
-          <w:bCs/>
-          <w:sz w:val="24"/>
-          <w:szCs w:val="24"/>
-        </w:rPr>
-        <w:t>7. Suggested Data Model</w:t>
+          <w:color w:val="FF0000"/>
+          <w:sz w:val="24"/>
+          <w:szCs w:val="24"/>
+        </w:rPr>
+      </w:pPr>
+      <w:proofErr w:type="spellStart"/>
+      <w:r>
+        <w:rPr>
+          <w:rFonts w:ascii="Calibri" w:hAnsi="Calibri" w:cs="Calibri"/>
+          <w:color w:val="FF0000"/>
+          <w:sz w:val="24"/>
+          <w:szCs w:val="24"/>
+        </w:rPr>
+        <w:t>Таблицы</w:t>
+      </w:r>
+      <w:proofErr w:type="spellEnd"/>
+      <w:r>
+        <w:rPr>
+          <w:rFonts w:ascii="Calibri" w:hAnsi="Calibri" w:cs="Calibri"/>
+          <w:color w:val="FF0000"/>
+          <w:sz w:val="24"/>
+          <w:szCs w:val="24"/>
+        </w:rPr>
+        <w:t>:</w:t>
       </w:r>
     </w:p>
     <w:p>
@@ -2749,44 +2465,14 @@
           <w:szCs w:val="24"/>
         </w:rPr>
       </w:pPr>
-      <w:proofErr w:type="spellStart"/>
-      <w:r>
-        <w:rPr>
-          <w:rFonts w:ascii="Calibri" w:hAnsi="Calibri" w:cs="Calibri"/>
-          <w:color w:val="FF0000"/>
-          <w:sz w:val="24"/>
-          <w:szCs w:val="24"/>
-        </w:rPr>
-        <w:t>Таблицы</w:t>
-      </w:r>
-      <w:proofErr w:type="spellEnd"/>
-      <w:r>
-        <w:rPr>
-          <w:rFonts w:ascii="Calibri" w:hAnsi="Calibri" w:cs="Calibri"/>
-          <w:color w:val="FF0000"/>
-          <w:sz w:val="24"/>
-          <w:szCs w:val="24"/>
-        </w:rPr>
-        <w:t>:</w:t>
-      </w:r>
-    </w:p>
-    <w:p>
-      <w:pPr>
-        <w:ind w:left="720"/>
-        <w:rPr>
-          <w:rFonts w:ascii="Calibri" w:hAnsi="Calibri" w:cs="Calibri"/>
-          <w:color w:val="FF0000"/>
-          <w:sz w:val="24"/>
-          <w:szCs w:val="24"/>
-        </w:rPr>
-      </w:pPr>
-      <w:r>
-        <w:rPr>
-          <w:rFonts w:ascii="Calibri" w:hAnsi="Calibri" w:cs="Calibri"/>
-          <w:color w:val="FF0000"/>
-          <w:sz w:val="24"/>
-          <w:szCs w:val="24"/>
-        </w:rPr>
+      <w:r>
+        <w:rPr>
+          <w:rFonts w:ascii="Calibri" w:hAnsi="Calibri" w:cs="Calibri"/>
+          <w:color w:val="FF0000"/>
+          <w:sz w:val="24"/>
+          <w:szCs w:val="24"/>
+        </w:rPr>
+        <w:lastRenderedPageBreak/>
         <w:t>users</w:t>
       </w:r>
       <w:r>
@@ -2966,22 +2652,9 @@
     </w:p>
     <w:p>
       <w:pPr>
-        <w:rPr>
-          <w:rFonts w:ascii="Calibri" w:hAnsi="Calibri" w:cs="Calibri"/>
-          <w:b/>
-          <w:bCs/>
-          <w:sz w:val="24"/>
-          <w:szCs w:val="24"/>
-        </w:rPr>
-      </w:pPr>
-      <w:r>
-        <w:rPr>
-          <w:rFonts w:ascii="Calibri" w:hAnsi="Calibri" w:cs="Calibri"/>
-          <w:b/>
-          <w:bCs/>
-          <w:sz w:val="24"/>
-          <w:szCs w:val="24"/>
-        </w:rPr>
+        <w:pStyle w:val="Heading2"/>
+      </w:pPr>
+      <w:r>
         <w:t>8. Validation and Business Rules</w:t>
       </w:r>
     </w:p>
@@ -3035,7 +2708,6 @@
           <w:sz w:val="24"/>
           <w:szCs w:val="24"/>
         </w:rPr>
-        <w:lastRenderedPageBreak/>
         <w:t xml:space="preserve">price &gt; 0 </w:t>
       </w:r>
     </w:p>
@@ -3163,20 +2835,17 @@
       <w:pPr>
         <w:rPr>
           <w:rFonts w:ascii="Calibri" w:hAnsi="Calibri" w:cs="Calibri"/>
-          <w:b/>
-          <w:bCs/>
-          <w:sz w:val="24"/>
-          <w:szCs w:val="24"/>
-        </w:rPr>
-      </w:pPr>
-      <w:r>
-        <w:rPr>
-          <w:rFonts w:ascii="Calibri" w:hAnsi="Calibri" w:cs="Calibri"/>
-          <w:b/>
-          <w:bCs/>
-          <w:sz w:val="24"/>
-          <w:szCs w:val="24"/>
-        </w:rPr>
+          <w:color w:val="FF0000"/>
+          <w:sz w:val="24"/>
+          <w:szCs w:val="24"/>
+        </w:rPr>
+      </w:pPr>
+    </w:p>
+    <w:p>
+      <w:pPr>
+        <w:pStyle w:val="Heading2"/>
+      </w:pPr>
+      <w:r>
         <w:t>9. Security and Authorization</w:t>
       </w:r>
     </w:p>
@@ -3284,22 +2953,9 @@
     </w:p>
     <w:p>
       <w:pPr>
-        <w:rPr>
-          <w:rFonts w:ascii="Calibri" w:hAnsi="Calibri" w:cs="Calibri"/>
-          <w:b/>
-          <w:bCs/>
-          <w:sz w:val="24"/>
-          <w:szCs w:val="24"/>
-        </w:rPr>
-      </w:pPr>
-      <w:r>
-        <w:rPr>
-          <w:rFonts w:ascii="Calibri" w:hAnsi="Calibri" w:cs="Calibri"/>
-          <w:b/>
-          <w:bCs/>
-          <w:sz w:val="24"/>
-          <w:szCs w:val="24"/>
-        </w:rPr>
+        <w:pStyle w:val="Heading2"/>
+      </w:pPr>
+      <w:r>
         <w:t>10. User Interface and Pages</w:t>
       </w:r>
     </w:p>
@@ -3442,6 +3098,7 @@
           <w:sz w:val="24"/>
           <w:szCs w:val="24"/>
         </w:rPr>
+        <w:lastRenderedPageBreak/>
         <w:t xml:space="preserve">Cart </w:t>
       </w:r>
     </w:p>
@@ -3518,20 +3175,17 @@
       <w:pPr>
         <w:rPr>
           <w:rFonts w:ascii="Calibri" w:hAnsi="Calibri" w:cs="Calibri"/>
-          <w:b/>
-          <w:bCs/>
-          <w:sz w:val="24"/>
-          <w:szCs w:val="24"/>
-        </w:rPr>
-      </w:pPr>
-      <w:r>
-        <w:rPr>
-          <w:rFonts w:ascii="Calibri" w:hAnsi="Calibri" w:cs="Calibri"/>
-          <w:b/>
-          <w:bCs/>
-          <w:sz w:val="24"/>
-          <w:szCs w:val="24"/>
-        </w:rPr>
+          <w:color w:val="FF0000"/>
+          <w:sz w:val="24"/>
+          <w:szCs w:val="24"/>
+        </w:rPr>
+      </w:pPr>
+    </w:p>
+    <w:p>
+      <w:pPr>
+        <w:pStyle w:val="Heading2"/>
+      </w:pPr>
+      <w:r>
         <w:t>11. Technical Architecture</w:t>
       </w:r>
     </w:p>
@@ -3673,20 +3327,17 @@
       <w:pPr>
         <w:rPr>
           <w:rFonts w:ascii="Calibri" w:hAnsi="Calibri" w:cs="Calibri"/>
-          <w:b/>
-          <w:bCs/>
-          <w:sz w:val="24"/>
-          <w:szCs w:val="24"/>
-        </w:rPr>
-      </w:pPr>
-      <w:r>
-        <w:rPr>
-          <w:rFonts w:ascii="Calibri" w:hAnsi="Calibri" w:cs="Calibri"/>
-          <w:b/>
-          <w:bCs/>
-          <w:sz w:val="24"/>
-          <w:szCs w:val="24"/>
-        </w:rPr>
+          <w:color w:val="FF0000"/>
+          <w:sz w:val="24"/>
+          <w:szCs w:val="24"/>
+        </w:rPr>
+      </w:pPr>
+    </w:p>
+    <w:p>
+      <w:pPr>
+        <w:pStyle w:val="Heading2"/>
+      </w:pPr>
+      <w:r>
         <w:t>12. Assumptions and Limitations</w:t>
       </w:r>
     </w:p>
@@ -3794,7 +3445,6 @@
           <w:sz w:val="24"/>
           <w:szCs w:val="24"/>
         </w:rPr>
-        <w:lastRenderedPageBreak/>
         <w:t xml:space="preserve">web-only </w:t>
       </w:r>
     </w:p>
@@ -3847,20 +3497,17 @@
       <w:pPr>
         <w:rPr>
           <w:rFonts w:ascii="Calibri" w:hAnsi="Calibri" w:cs="Calibri"/>
-          <w:b/>
-          <w:bCs/>
-          <w:sz w:val="24"/>
-          <w:szCs w:val="24"/>
-        </w:rPr>
-      </w:pPr>
-      <w:r>
-        <w:rPr>
-          <w:rFonts w:ascii="Calibri" w:hAnsi="Calibri" w:cs="Calibri"/>
-          <w:b/>
-          <w:bCs/>
-          <w:sz w:val="24"/>
-          <w:szCs w:val="24"/>
-        </w:rPr>
+          <w:color w:val="FF0000"/>
+          <w:sz w:val="24"/>
+          <w:szCs w:val="24"/>
+        </w:rPr>
+      </w:pPr>
+    </w:p>
+    <w:p>
+      <w:pPr>
+        <w:pStyle w:val="Heading2"/>
+      </w:pPr>
+      <w:r>
         <w:t>13. Future Improvements</w:t>
       </w:r>
     </w:p>
@@ -3985,76 +3632,6 @@
         </w:rPr>
         <w:t>analytics</w:t>
       </w:r>
-    </w:p>
-    <w:p>
-      <w:pPr>
-        <w:rPr>
-          <w:rFonts w:ascii="Calibri" w:hAnsi="Calibri" w:cs="Calibri"/>
-          <w:color w:val="FF0000"/>
-          <w:sz w:val="24"/>
-          <w:szCs w:val="24"/>
-        </w:rPr>
-      </w:pPr>
-    </w:p>
-    <w:p>
-      <w:pPr>
-        <w:rPr>
-          <w:rFonts w:ascii="Calibri" w:hAnsi="Calibri" w:cs="Calibri"/>
-          <w:color w:val="FF0000"/>
-          <w:sz w:val="24"/>
-          <w:szCs w:val="24"/>
-        </w:rPr>
-      </w:pPr>
-    </w:p>
-    <w:p>
-      <w:pPr>
-        <w:rPr>
-          <w:rFonts w:ascii="Calibri" w:hAnsi="Calibri" w:cs="Calibri"/>
-          <w:color w:val="FF0000"/>
-          <w:sz w:val="24"/>
-          <w:szCs w:val="24"/>
-        </w:rPr>
-      </w:pPr>
-    </w:p>
-    <w:p>
-      <w:pPr>
-        <w:rPr>
-          <w:rFonts w:ascii="Calibri" w:hAnsi="Calibri" w:cs="Calibri"/>
-          <w:color w:val="FF0000"/>
-          <w:sz w:val="24"/>
-          <w:szCs w:val="24"/>
-        </w:rPr>
-      </w:pPr>
-    </w:p>
-    <w:p>
-      <w:pPr>
-        <w:rPr>
-          <w:rFonts w:ascii="Calibri" w:hAnsi="Calibri" w:cs="Calibri"/>
-          <w:color w:val="FF0000"/>
-          <w:sz w:val="24"/>
-          <w:szCs w:val="24"/>
-        </w:rPr>
-      </w:pPr>
-    </w:p>
-    <w:p>
-      <w:pPr>
-        <w:ind w:left="720"/>
-        <w:rPr>
-          <w:rFonts w:ascii="Calibri" w:hAnsi="Calibri" w:cs="Calibri"/>
-          <w:color w:val="FF0000"/>
-          <w:sz w:val="24"/>
-          <w:szCs w:val="24"/>
-        </w:rPr>
-      </w:pPr>
-    </w:p>
-    <w:p>
-      <w:pPr>
-        <w:rPr>
-          <w:rFonts w:ascii="Calibri" w:hAnsi="Calibri" w:cs="Calibri"/>
-          <w:sz w:val="24"/>
-          <w:szCs w:val="24"/>
-        </w:rPr>
-      </w:pPr>
     </w:p>
     <w:sectPr>
       <w:pgSz w:w="11906" w:h="16838"/>
@@ -5704,6 +5281,119 @@
       <w:rPr>
         <w:rFonts w:ascii="Wingdings" w:hAnsi="Wingdings" w:hint="default"/>
         <w:sz w:val="20"/>
+      </w:rPr>
+    </w:lvl>
+  </w:abstractNum>
+  <w:abstractNum w:abstractNumId="11" w15:restartNumberingAfterBreak="0">
+    <w:nsid w:val="79911088"/>
+    <w:multiLevelType w:val="hybridMultilevel"/>
+    <w:tmpl w:val="B89254AA"/>
+    <w:lvl w:ilvl="0" w:tplc="5ED0EE42">
+      <w:start w:val="1"/>
+      <w:numFmt w:val="bullet"/>
+      <w:lvlText w:val=""/>
+      <w:lvlJc w:val="left"/>
+      <w:pPr>
+        <w:ind w:left="1440" w:hanging="360"/>
+      </w:pPr>
+      <w:rPr>
+        <w:rFonts w:ascii="Symbol" w:hAnsi="Symbol" w:hint="default"/>
+      </w:rPr>
+    </w:lvl>
+    <w:lvl w:ilvl="1" w:tplc="04090003" w:tentative="1">
+      <w:start w:val="1"/>
+      <w:numFmt w:val="bullet"/>
+      <w:lvlText w:val="o"/>
+      <w:lvlJc w:val="left"/>
+      <w:pPr>
+        <w:ind w:left="1440" w:hanging="360"/>
+      </w:pPr>
+      <w:rPr>
+        <w:rFonts w:ascii="Courier New" w:hAnsi="Courier New" w:cs="Courier New" w:hint="default"/>
+      </w:rPr>
+    </w:lvl>
+    <w:lvl w:ilvl="2" w:tplc="04090005" w:tentative="1">
+      <w:start w:val="1"/>
+      <w:numFmt w:val="bullet"/>
+      <w:lvlText w:val=""/>
+      <w:lvlJc w:val="left"/>
+      <w:pPr>
+        <w:ind w:left="2160" w:hanging="360"/>
+      </w:pPr>
+      <w:rPr>
+        <w:rFonts w:ascii="Wingdings" w:hAnsi="Wingdings" w:hint="default"/>
+      </w:rPr>
+    </w:lvl>
+    <w:lvl w:ilvl="3" w:tplc="04090001" w:tentative="1">
+      <w:start w:val="1"/>
+      <w:numFmt w:val="bullet"/>
+      <w:lvlText w:val=""/>
+      <w:lvlJc w:val="left"/>
+      <w:pPr>
+        <w:ind w:left="2880" w:hanging="360"/>
+      </w:pPr>
+      <w:rPr>
+        <w:rFonts w:ascii="Symbol" w:hAnsi="Symbol" w:hint="default"/>
+      </w:rPr>
+    </w:lvl>
+    <w:lvl w:ilvl="4" w:tplc="04090003" w:tentative="1">
+      <w:start w:val="1"/>
+      <w:numFmt w:val="bullet"/>
+      <w:lvlText w:val="o"/>
+      <w:lvlJc w:val="left"/>
+      <w:pPr>
+        <w:ind w:left="3600" w:hanging="360"/>
+      </w:pPr>
+      <w:rPr>
+        <w:rFonts w:ascii="Courier New" w:hAnsi="Courier New" w:cs="Courier New" w:hint="default"/>
+      </w:rPr>
+    </w:lvl>
+    <w:lvl w:ilvl="5" w:tplc="04090005" w:tentative="1">
+      <w:start w:val="1"/>
+      <w:numFmt w:val="bullet"/>
+      <w:lvlText w:val=""/>
+      <w:lvlJc w:val="left"/>
+      <w:pPr>
+        <w:ind w:left="4320" w:hanging="360"/>
+      </w:pPr>
+      <w:rPr>
+        <w:rFonts w:ascii="Wingdings" w:hAnsi="Wingdings" w:hint="default"/>
+      </w:rPr>
+    </w:lvl>
+    <w:lvl w:ilvl="6" w:tplc="04090001" w:tentative="1">
+      <w:start w:val="1"/>
+      <w:numFmt w:val="bullet"/>
+      <w:lvlText w:val=""/>
+      <w:lvlJc w:val="left"/>
+      <w:pPr>
+        <w:ind w:left="5040" w:hanging="360"/>
+      </w:pPr>
+      <w:rPr>
+        <w:rFonts w:ascii="Symbol" w:hAnsi="Symbol" w:hint="default"/>
+      </w:rPr>
+    </w:lvl>
+    <w:lvl w:ilvl="7" w:tplc="04090003" w:tentative="1">
+      <w:start w:val="1"/>
+      <w:numFmt w:val="bullet"/>
+      <w:lvlText w:val="o"/>
+      <w:lvlJc w:val="left"/>
+      <w:pPr>
+        <w:ind w:left="5760" w:hanging="360"/>
+      </w:pPr>
+      <w:rPr>
+        <w:rFonts w:ascii="Courier New" w:hAnsi="Courier New" w:cs="Courier New" w:hint="default"/>
+      </w:rPr>
+    </w:lvl>
+    <w:lvl w:ilvl="8" w:tplc="04090005" w:tentative="1">
+      <w:start w:val="1"/>
+      <w:numFmt w:val="bullet"/>
+      <w:lvlText w:val=""/>
+      <w:lvlJc w:val="left"/>
+      <w:pPr>
+        <w:ind w:left="6480" w:hanging="360"/>
+      </w:pPr>
+      <w:rPr>
+        <w:rFonts w:ascii="Wingdings" w:hAnsi="Wingdings" w:hint="default"/>
       </w:rPr>
     </w:lvl>
   </w:abstractNum>
@@ -5740,6 +5430,9 @@
   <w:num w:numId="11" w16cid:durableId="1402750936">
     <w:abstractNumId w:val="6"/>
   </w:num>
+  <w:num w:numId="12" w16cid:durableId="677200169">
+    <w:abstractNumId w:val="11"/>
+  </w:num>
 </w:numbering>
 </file>
 
@@ -5756,7 +5449,7 @@
     </w:rPrDefault>
     <w:pPrDefault>
       <w:pPr>
-        <w:spacing w:after="160" w:line="259" w:lineRule="auto"/>
+        <w:spacing w:before="200" w:after="200" w:line="276" w:lineRule="auto"/>
       </w:pPr>
     </w:pPrDefault>
   </w:docDefaults>
@@ -6141,7 +5834,11 @@
   <w:style w:type="paragraph" w:default="1" w:styleId="Normal">
     <w:name w:val="Normal"/>
     <w:qFormat/>
-    <w:rsid w:val="00EF2F3F"/>
+    <w:rsid w:val="00F47636"/>
+    <w:rPr>
+      <w:sz w:val="20"/>
+      <w:szCs w:val="20"/>
+    </w:rPr>
   </w:style>
   <w:style w:type="paragraph" w:styleId="Heading1">
     <w:name w:val="heading 1"/>
@@ -6150,18 +5847,26 @@
     <w:link w:val="Heading1Char"/>
     <w:uiPriority w:val="9"/>
     <w:qFormat/>
-    <w:rsid w:val="00EF2F3F"/>
+    <w:rsid w:val="00F47636"/>
     <w:pPr>
-      <w:keepNext/>
-      <w:keepLines/>
-      <w:spacing w:before="400" w:after="40" w:line="240" w:lineRule="auto"/>
+      <w:pBdr>
+        <w:top w:val="single" w:sz="24" w:space="0" w:color="4472C4" w:themeColor="accent1"/>
+        <w:left w:val="single" w:sz="24" w:space="0" w:color="4472C4" w:themeColor="accent1"/>
+        <w:bottom w:val="single" w:sz="24" w:space="0" w:color="4472C4" w:themeColor="accent1"/>
+        <w:right w:val="single" w:sz="24" w:space="0" w:color="4472C4" w:themeColor="accent1"/>
+      </w:pBdr>
+      <w:shd w:val="clear" w:color="auto" w:fill="4472C4" w:themeFill="accent1"/>
+      <w:spacing w:after="0"/>
       <w:outlineLvl w:val="0"/>
     </w:pPr>
     <w:rPr>
-      <w:rFonts w:asciiTheme="majorHAnsi" w:eastAsiaTheme="majorEastAsia" w:hAnsiTheme="majorHAnsi" w:cstheme="majorBidi"/>
-      <w:color w:val="0A2F41" w:themeColor="accent1" w:themeShade="80"/>
-      <w:sz w:val="36"/>
-      <w:szCs w:val="36"/>
+      <w:b/>
+      <w:bCs/>
+      <w:caps/>
+      <w:color w:val="FFFFFF" w:themeColor="background1"/>
+      <w:spacing w:val="15"/>
+      <w:sz w:val="22"/>
+      <w:szCs w:val="22"/>
     </w:rPr>
   </w:style>
   <w:style w:type="paragraph" w:styleId="Heading2">
@@ -6170,21 +5875,25 @@
     <w:next w:val="Normal"/>
     <w:link w:val="Heading2Char"/>
     <w:uiPriority w:val="9"/>
-    <w:semiHidden/>
     <w:unhideWhenUsed/>
     <w:qFormat/>
-    <w:rsid w:val="00EF2F3F"/>
+    <w:rsid w:val="00F47636"/>
     <w:pPr>
-      <w:keepNext/>
-      <w:keepLines/>
-      <w:spacing w:before="40" w:after="0" w:line="240" w:lineRule="auto"/>
+      <w:pBdr>
+        <w:top w:val="single" w:sz="24" w:space="0" w:color="D9E2F3" w:themeColor="accent1" w:themeTint="33"/>
+        <w:left w:val="single" w:sz="24" w:space="0" w:color="D9E2F3" w:themeColor="accent1" w:themeTint="33"/>
+        <w:bottom w:val="single" w:sz="24" w:space="0" w:color="D9E2F3" w:themeColor="accent1" w:themeTint="33"/>
+        <w:right w:val="single" w:sz="24" w:space="0" w:color="D9E2F3" w:themeColor="accent1" w:themeTint="33"/>
+      </w:pBdr>
+      <w:shd w:val="clear" w:color="auto" w:fill="D9E2F3" w:themeFill="accent1" w:themeFillTint="33"/>
+      <w:spacing w:after="0"/>
       <w:outlineLvl w:val="1"/>
     </w:pPr>
     <w:rPr>
-      <w:rFonts w:asciiTheme="majorHAnsi" w:eastAsiaTheme="majorEastAsia" w:hAnsiTheme="majorHAnsi" w:cstheme="majorBidi"/>
-      <w:color w:val="0F4761" w:themeColor="accent1" w:themeShade="BF"/>
-      <w:sz w:val="32"/>
-      <w:szCs w:val="32"/>
+      <w:caps/>
+      <w:spacing w:val="15"/>
+      <w:sz w:val="22"/>
+      <w:szCs w:val="22"/>
     </w:rPr>
   </w:style>
   <w:style w:type="paragraph" w:styleId="Heading3">
@@ -6193,21 +5902,23 @@
     <w:next w:val="Normal"/>
     <w:link w:val="Heading3Char"/>
     <w:uiPriority w:val="9"/>
-    <w:semiHidden/>
     <w:unhideWhenUsed/>
     <w:qFormat/>
-    <w:rsid w:val="00EF2F3F"/>
+    <w:rsid w:val="00F47636"/>
     <w:pPr>
-      <w:keepNext/>
-      <w:keepLines/>
-      <w:spacing w:before="40" w:after="0" w:line="240" w:lineRule="auto"/>
+      <w:pBdr>
+        <w:top w:val="single" w:sz="6" w:space="2" w:color="4472C4" w:themeColor="accent1"/>
+        <w:left w:val="single" w:sz="6" w:space="2" w:color="4472C4" w:themeColor="accent1"/>
+      </w:pBdr>
+      <w:spacing w:before="300" w:after="0"/>
       <w:outlineLvl w:val="2"/>
     </w:pPr>
     <w:rPr>
-      <w:rFonts w:asciiTheme="majorHAnsi" w:eastAsiaTheme="majorEastAsia" w:hAnsiTheme="majorHAnsi" w:cstheme="majorBidi"/>
-      <w:color w:val="0F4761" w:themeColor="accent1" w:themeShade="BF"/>
-      <w:sz w:val="28"/>
-      <w:szCs w:val="28"/>
+      <w:caps/>
+      <w:color w:val="1F3763" w:themeColor="accent1" w:themeShade="7F"/>
+      <w:spacing w:val="15"/>
+      <w:sz w:val="22"/>
+      <w:szCs w:val="22"/>
     </w:rPr>
   </w:style>
   <w:style w:type="paragraph" w:styleId="Heading4">
@@ -6216,21 +5927,23 @@
     <w:next w:val="Normal"/>
     <w:link w:val="Heading4Char"/>
     <w:uiPriority w:val="9"/>
-    <w:semiHidden/>
     <w:unhideWhenUsed/>
     <w:qFormat/>
-    <w:rsid w:val="00EF2F3F"/>
+    <w:rsid w:val="00F47636"/>
     <w:pPr>
-      <w:keepNext/>
-      <w:keepLines/>
-      <w:spacing w:before="40" w:after="0"/>
+      <w:pBdr>
+        <w:top w:val="dotted" w:sz="6" w:space="2" w:color="4472C4" w:themeColor="accent1"/>
+        <w:left w:val="dotted" w:sz="6" w:space="2" w:color="4472C4" w:themeColor="accent1"/>
+      </w:pBdr>
+      <w:spacing w:before="300" w:after="0"/>
       <w:outlineLvl w:val="3"/>
     </w:pPr>
     <w:rPr>
-      <w:rFonts w:asciiTheme="majorHAnsi" w:eastAsiaTheme="majorEastAsia" w:hAnsiTheme="majorHAnsi" w:cstheme="majorBidi"/>
-      <w:color w:val="0F4761" w:themeColor="accent1" w:themeShade="BF"/>
-      <w:sz w:val="24"/>
-      <w:szCs w:val="24"/>
+      <w:caps/>
+      <w:color w:val="2F5496" w:themeColor="accent1" w:themeShade="BF"/>
+      <w:spacing w:val="10"/>
+      <w:sz w:val="22"/>
+      <w:szCs w:val="22"/>
     </w:rPr>
   </w:style>
   <w:style w:type="paragraph" w:styleId="Heading5">
@@ -6242,17 +5955,20 @@
     <w:semiHidden/>
     <w:unhideWhenUsed/>
     <w:qFormat/>
-    <w:rsid w:val="00EF2F3F"/>
+    <w:rsid w:val="00F47636"/>
     <w:pPr>
-      <w:keepNext/>
-      <w:keepLines/>
-      <w:spacing w:before="40" w:after="0"/>
+      <w:pBdr>
+        <w:bottom w:val="single" w:sz="6" w:space="1" w:color="4472C4" w:themeColor="accent1"/>
+      </w:pBdr>
+      <w:spacing w:before="300" w:after="0"/>
       <w:outlineLvl w:val="4"/>
     </w:pPr>
     <w:rPr>
-      <w:rFonts w:asciiTheme="majorHAnsi" w:eastAsiaTheme="majorEastAsia" w:hAnsiTheme="majorHAnsi" w:cstheme="majorBidi"/>
       <w:caps/>
-      <w:color w:val="0F4761" w:themeColor="accent1" w:themeShade="BF"/>
+      <w:color w:val="2F5496" w:themeColor="accent1" w:themeShade="BF"/>
+      <w:spacing w:val="10"/>
+      <w:sz w:val="22"/>
+      <w:szCs w:val="22"/>
     </w:rPr>
   </w:style>
   <w:style w:type="paragraph" w:styleId="Heading6">
@@ -6264,19 +5980,20 @@
     <w:semiHidden/>
     <w:unhideWhenUsed/>
     <w:qFormat/>
-    <w:rsid w:val="00EF2F3F"/>
+    <w:rsid w:val="00F47636"/>
     <w:pPr>
-      <w:keepNext/>
-      <w:keepLines/>
-      <w:spacing w:before="40" w:after="0"/>
+      <w:pBdr>
+        <w:bottom w:val="dotted" w:sz="6" w:space="1" w:color="4472C4" w:themeColor="accent1"/>
+      </w:pBdr>
+      <w:spacing w:before="300" w:after="0"/>
       <w:outlineLvl w:val="5"/>
     </w:pPr>
     <w:rPr>
-      <w:rFonts w:asciiTheme="majorHAnsi" w:eastAsiaTheme="majorEastAsia" w:hAnsiTheme="majorHAnsi" w:cstheme="majorBidi"/>
-      <w:i/>
-      <w:iCs/>
       <w:caps/>
-      <w:color w:val="0A2F41" w:themeColor="accent1" w:themeShade="80"/>
+      <w:color w:val="2F5496" w:themeColor="accent1" w:themeShade="BF"/>
+      <w:spacing w:val="10"/>
+      <w:sz w:val="22"/>
+      <w:szCs w:val="22"/>
     </w:rPr>
   </w:style>
   <w:style w:type="paragraph" w:styleId="Heading7">
@@ -6288,18 +6005,17 @@
     <w:semiHidden/>
     <w:unhideWhenUsed/>
     <w:qFormat/>
-    <w:rsid w:val="00EF2F3F"/>
+    <w:rsid w:val="00F47636"/>
     <w:pPr>
-      <w:keepNext/>
-      <w:keepLines/>
-      <w:spacing w:before="40" w:after="0"/>
+      <w:spacing w:before="300" w:after="0"/>
       <w:outlineLvl w:val="6"/>
     </w:pPr>
     <w:rPr>
-      <w:rFonts w:asciiTheme="majorHAnsi" w:eastAsiaTheme="majorEastAsia" w:hAnsiTheme="majorHAnsi" w:cstheme="majorBidi"/>
-      <w:b/>
-      <w:bCs/>
-      <w:color w:val="0A2F41" w:themeColor="accent1" w:themeShade="80"/>
+      <w:caps/>
+      <w:color w:val="2F5496" w:themeColor="accent1" w:themeShade="BF"/>
+      <w:spacing w:val="10"/>
+      <w:sz w:val="22"/>
+      <w:szCs w:val="22"/>
     </w:rPr>
   </w:style>
   <w:style w:type="paragraph" w:styleId="Heading8">
@@ -6311,20 +6027,16 @@
     <w:semiHidden/>
     <w:unhideWhenUsed/>
     <w:qFormat/>
-    <w:rsid w:val="00EF2F3F"/>
+    <w:rsid w:val="00F47636"/>
     <w:pPr>
-      <w:keepNext/>
-      <w:keepLines/>
-      <w:spacing w:before="40" w:after="0"/>
+      <w:spacing w:before="300" w:after="0"/>
       <w:outlineLvl w:val="7"/>
     </w:pPr>
     <w:rPr>
-      <w:rFonts w:asciiTheme="majorHAnsi" w:eastAsiaTheme="majorEastAsia" w:hAnsiTheme="majorHAnsi" w:cstheme="majorBidi"/>
-      <w:b/>
-      <w:bCs/>
-      <w:i/>
-      <w:iCs/>
-      <w:color w:val="0A2F41" w:themeColor="accent1" w:themeShade="80"/>
+      <w:caps/>
+      <w:spacing w:val="10"/>
+      <w:sz w:val="18"/>
+      <w:szCs w:val="18"/>
     </w:rPr>
   </w:style>
   <w:style w:type="paragraph" w:styleId="Heading9">
@@ -6336,23 +6048,23 @@
     <w:semiHidden/>
     <w:unhideWhenUsed/>
     <w:qFormat/>
-    <w:rsid w:val="00EF2F3F"/>
+    <w:rsid w:val="00F47636"/>
     <w:pPr>
-      <w:keepNext/>
-      <w:keepLines/>
-      <w:spacing w:before="40" w:after="0"/>
+      <w:spacing w:before="300" w:after="0"/>
       <w:outlineLvl w:val="8"/>
     </w:pPr>
     <w:rPr>
-      <w:rFonts w:asciiTheme="majorHAnsi" w:eastAsiaTheme="majorEastAsia" w:hAnsiTheme="majorHAnsi" w:cstheme="majorBidi"/>
       <w:i/>
-      <w:iCs/>
-      <w:color w:val="0A2F41" w:themeColor="accent1" w:themeShade="80"/>
+      <w:caps/>
+      <w:spacing w:val="10"/>
+      <w:sz w:val="18"/>
+      <w:szCs w:val="18"/>
     </w:rPr>
   </w:style>
   <w:style w:type="character" w:default="1" w:styleId="DefaultParagraphFont">
     <w:name w:val="Default Paragraph Font"/>
     <w:uiPriority w:val="1"/>
+    <w:semiHidden/>
     <w:unhideWhenUsed/>
   </w:style>
   <w:style w:type="table" w:default="1" w:styleId="TableNormal">
@@ -6381,12 +6093,14 @@
     <w:basedOn w:val="DefaultParagraphFont"/>
     <w:link w:val="Heading1"/>
     <w:uiPriority w:val="9"/>
-    <w:rsid w:val="00EF2F3F"/>
+    <w:rsid w:val="00F47636"/>
     <w:rPr>
-      <w:rFonts w:asciiTheme="majorHAnsi" w:eastAsiaTheme="majorEastAsia" w:hAnsiTheme="majorHAnsi" w:cstheme="majorBidi"/>
-      <w:color w:val="0A2F41" w:themeColor="accent1" w:themeShade="80"/>
-      <w:sz w:val="36"/>
-      <w:szCs w:val="36"/>
+      <w:b/>
+      <w:bCs/>
+      <w:caps/>
+      <w:color w:val="FFFFFF" w:themeColor="background1"/>
+      <w:spacing w:val="15"/>
+      <w:shd w:val="clear" w:color="auto" w:fill="4472C4" w:themeFill="accent1"/>
     </w:rPr>
   </w:style>
   <w:style w:type="character" w:customStyle="1" w:styleId="Heading2Char">
@@ -6394,13 +6108,11 @@
     <w:basedOn w:val="DefaultParagraphFont"/>
     <w:link w:val="Heading2"/>
     <w:uiPriority w:val="9"/>
-    <w:semiHidden/>
-    <w:rsid w:val="00EF2F3F"/>
+    <w:rsid w:val="00F47636"/>
     <w:rPr>
-      <w:rFonts w:asciiTheme="majorHAnsi" w:eastAsiaTheme="majorEastAsia" w:hAnsiTheme="majorHAnsi" w:cstheme="majorBidi"/>
-      <w:color w:val="0F4761" w:themeColor="accent1" w:themeShade="BF"/>
-      <w:sz w:val="32"/>
-      <w:szCs w:val="32"/>
+      <w:caps/>
+      <w:spacing w:val="15"/>
+      <w:shd w:val="clear" w:color="auto" w:fill="D9E2F3" w:themeFill="accent1" w:themeFillTint="33"/>
     </w:rPr>
   </w:style>
   <w:style w:type="character" w:customStyle="1" w:styleId="Heading3Char">
@@ -6408,13 +6120,11 @@
     <w:basedOn w:val="DefaultParagraphFont"/>
     <w:link w:val="Heading3"/>
     <w:uiPriority w:val="9"/>
-    <w:semiHidden/>
-    <w:rsid w:val="00EF2F3F"/>
+    <w:rsid w:val="00F47636"/>
     <w:rPr>
-      <w:rFonts w:asciiTheme="majorHAnsi" w:eastAsiaTheme="majorEastAsia" w:hAnsiTheme="majorHAnsi" w:cstheme="majorBidi"/>
-      <w:color w:val="0F4761" w:themeColor="accent1" w:themeShade="BF"/>
-      <w:sz w:val="28"/>
-      <w:szCs w:val="28"/>
+      <w:caps/>
+      <w:color w:val="1F3763" w:themeColor="accent1" w:themeShade="7F"/>
+      <w:spacing w:val="15"/>
     </w:rPr>
   </w:style>
   <w:style w:type="character" w:customStyle="1" w:styleId="Heading4Char">
@@ -6422,13 +6132,11 @@
     <w:basedOn w:val="DefaultParagraphFont"/>
     <w:link w:val="Heading4"/>
     <w:uiPriority w:val="9"/>
-    <w:semiHidden/>
-    <w:rsid w:val="00EF2F3F"/>
+    <w:rsid w:val="00F47636"/>
     <w:rPr>
-      <w:rFonts w:asciiTheme="majorHAnsi" w:eastAsiaTheme="majorEastAsia" w:hAnsiTheme="majorHAnsi" w:cstheme="majorBidi"/>
-      <w:color w:val="0F4761" w:themeColor="accent1" w:themeShade="BF"/>
-      <w:sz w:val="24"/>
-      <w:szCs w:val="24"/>
+      <w:caps/>
+      <w:color w:val="2F5496" w:themeColor="accent1" w:themeShade="BF"/>
+      <w:spacing w:val="10"/>
     </w:rPr>
   </w:style>
   <w:style w:type="character" w:customStyle="1" w:styleId="Heading5Char">
@@ -6437,11 +6145,11 @@
     <w:link w:val="Heading5"/>
     <w:uiPriority w:val="9"/>
     <w:semiHidden/>
-    <w:rsid w:val="00EF2F3F"/>
+    <w:rsid w:val="00F47636"/>
     <w:rPr>
-      <w:rFonts w:asciiTheme="majorHAnsi" w:eastAsiaTheme="majorEastAsia" w:hAnsiTheme="majorHAnsi" w:cstheme="majorBidi"/>
       <w:caps/>
-      <w:color w:val="0F4761" w:themeColor="accent1" w:themeShade="BF"/>
+      <w:color w:val="2F5496" w:themeColor="accent1" w:themeShade="BF"/>
+      <w:spacing w:val="10"/>
     </w:rPr>
   </w:style>
   <w:style w:type="character" w:customStyle="1" w:styleId="Heading6Char">
@@ -6450,13 +6158,11 @@
     <w:link w:val="Heading6"/>
     <w:uiPriority w:val="9"/>
     <w:semiHidden/>
-    <w:rsid w:val="00EF2F3F"/>
+    <w:rsid w:val="00F47636"/>
     <w:rPr>
-      <w:rFonts w:asciiTheme="majorHAnsi" w:eastAsiaTheme="majorEastAsia" w:hAnsiTheme="majorHAnsi" w:cstheme="majorBidi"/>
-      <w:i/>
-      <w:iCs/>
       <w:caps/>
-      <w:color w:val="0A2F41" w:themeColor="accent1" w:themeShade="80"/>
+      <w:color w:val="2F5496" w:themeColor="accent1" w:themeShade="BF"/>
+      <w:spacing w:val="10"/>
     </w:rPr>
   </w:style>
   <w:style w:type="character" w:customStyle="1" w:styleId="Heading7Char">
@@ -6465,12 +6171,11 @@
     <w:link w:val="Heading7"/>
     <w:uiPriority w:val="9"/>
     <w:semiHidden/>
-    <w:rsid w:val="00EF2F3F"/>
+    <w:rsid w:val="00F47636"/>
     <w:rPr>
-      <w:rFonts w:asciiTheme="majorHAnsi" w:eastAsiaTheme="majorEastAsia" w:hAnsiTheme="majorHAnsi" w:cstheme="majorBidi"/>
-      <w:b/>
-      <w:bCs/>
-      <w:color w:val="0A2F41" w:themeColor="accent1" w:themeShade="80"/>
+      <w:caps/>
+      <w:color w:val="2F5496" w:themeColor="accent1" w:themeShade="BF"/>
+      <w:spacing w:val="10"/>
     </w:rPr>
   </w:style>
   <w:style w:type="character" w:customStyle="1" w:styleId="Heading8Char">
@@ -6479,14 +6184,12 @@
     <w:link w:val="Heading8"/>
     <w:uiPriority w:val="9"/>
     <w:semiHidden/>
-    <w:rsid w:val="00EF2F3F"/>
+    <w:rsid w:val="00F47636"/>
     <w:rPr>
-      <w:rFonts w:asciiTheme="majorHAnsi" w:eastAsiaTheme="majorEastAsia" w:hAnsiTheme="majorHAnsi" w:cstheme="majorBidi"/>
-      <w:b/>
-      <w:bCs/>
-      <w:i/>
-      <w:iCs/>
-      <w:color w:val="0A2F41" w:themeColor="accent1" w:themeShade="80"/>
+      <w:caps/>
+      <w:spacing w:val="10"/>
+      <w:sz w:val="18"/>
+      <w:szCs w:val="18"/>
     </w:rPr>
   </w:style>
   <w:style w:type="character" w:customStyle="1" w:styleId="Heading9Char">
@@ -6495,12 +6198,13 @@
     <w:link w:val="Heading9"/>
     <w:uiPriority w:val="9"/>
     <w:semiHidden/>
-    <w:rsid w:val="00EF2F3F"/>
+    <w:rsid w:val="00F47636"/>
     <w:rPr>
-      <w:rFonts w:asciiTheme="majorHAnsi" w:eastAsiaTheme="majorEastAsia" w:hAnsiTheme="majorHAnsi" w:cstheme="majorBidi"/>
       <w:i/>
-      <w:iCs/>
-      <w:color w:val="0A2F41" w:themeColor="accent1" w:themeShade="80"/>
+      <w:caps/>
+      <w:spacing w:val="10"/>
+      <w:sz w:val="18"/>
+      <w:szCs w:val="18"/>
     </w:rPr>
   </w:style>
   <w:style w:type="paragraph" w:styleId="Title">
@@ -6510,18 +6214,17 @@
     <w:link w:val="TitleChar"/>
     <w:uiPriority w:val="10"/>
     <w:qFormat/>
-    <w:rsid w:val="00EF2F3F"/>
+    <w:rsid w:val="00F47636"/>
     <w:pPr>
-      <w:spacing w:after="0" w:line="204" w:lineRule="auto"/>
-      <w:contextualSpacing/>
+      <w:spacing w:before="720"/>
     </w:pPr>
     <w:rPr>
-      <w:rFonts w:asciiTheme="majorHAnsi" w:eastAsiaTheme="majorEastAsia" w:hAnsiTheme="majorHAnsi" w:cstheme="majorBidi"/>
       <w:caps/>
-      <w:color w:val="0E2841" w:themeColor="text2"/>
-      <w:spacing w:val="-15"/>
-      <w:sz w:val="72"/>
-      <w:szCs w:val="72"/>
+      <w:color w:val="4472C4" w:themeColor="accent1"/>
+      <w:spacing w:val="10"/>
+      <w:kern w:val="28"/>
+      <w:sz w:val="52"/>
+      <w:szCs w:val="52"/>
     </w:rPr>
   </w:style>
   <w:style w:type="character" w:customStyle="1" w:styleId="TitleChar">
@@ -6529,14 +6232,14 @@
     <w:basedOn w:val="DefaultParagraphFont"/>
     <w:link w:val="Title"/>
     <w:uiPriority w:val="10"/>
-    <w:rsid w:val="00EF2F3F"/>
+    <w:rsid w:val="00F47636"/>
     <w:rPr>
-      <w:rFonts w:asciiTheme="majorHAnsi" w:eastAsiaTheme="majorEastAsia" w:hAnsiTheme="majorHAnsi" w:cstheme="majorBidi"/>
       <w:caps/>
-      <w:color w:val="0E2841" w:themeColor="text2"/>
-      <w:spacing w:val="-15"/>
-      <w:sz w:val="72"/>
-      <w:szCs w:val="72"/>
+      <w:color w:val="4472C4" w:themeColor="accent1"/>
+      <w:spacing w:val="10"/>
+      <w:kern w:val="28"/>
+      <w:sz w:val="52"/>
+      <w:szCs w:val="52"/>
     </w:rPr>
   </w:style>
   <w:style w:type="paragraph" w:styleId="Subtitle">
@@ -6546,18 +6249,16 @@
     <w:link w:val="SubtitleChar"/>
     <w:uiPriority w:val="11"/>
     <w:qFormat/>
-    <w:rsid w:val="00EF2F3F"/>
+    <w:rsid w:val="00F47636"/>
     <w:pPr>
-      <w:numPr>
-        <w:ilvl w:val="1"/>
-      </w:numPr>
-      <w:spacing w:after="240" w:line="240" w:lineRule="auto"/>
+      <w:spacing w:after="1000" w:line="240" w:lineRule="auto"/>
     </w:pPr>
     <w:rPr>
-      <w:rFonts w:asciiTheme="majorHAnsi" w:eastAsiaTheme="majorEastAsia" w:hAnsiTheme="majorHAnsi" w:cstheme="majorBidi"/>
-      <w:color w:val="156082" w:themeColor="accent1"/>
-      <w:sz w:val="28"/>
-      <w:szCs w:val="28"/>
+      <w:caps/>
+      <w:color w:val="595959" w:themeColor="text1" w:themeTint="A6"/>
+      <w:spacing w:val="10"/>
+      <w:sz w:val="24"/>
+      <w:szCs w:val="24"/>
     </w:rPr>
   </w:style>
   <w:style w:type="character" w:customStyle="1" w:styleId="SubtitleChar">
@@ -6565,12 +6266,13 @@
     <w:basedOn w:val="DefaultParagraphFont"/>
     <w:link w:val="Subtitle"/>
     <w:uiPriority w:val="11"/>
-    <w:rsid w:val="00EF2F3F"/>
+    <w:rsid w:val="00F47636"/>
     <w:rPr>
-      <w:rFonts w:asciiTheme="majorHAnsi" w:eastAsiaTheme="majorEastAsia" w:hAnsiTheme="majorHAnsi" w:cstheme="majorBidi"/>
-      <w:color w:val="156082" w:themeColor="accent1"/>
-      <w:sz w:val="28"/>
-      <w:szCs w:val="28"/>
+      <w:caps/>
+      <w:color w:val="595959" w:themeColor="text1" w:themeTint="A6"/>
+      <w:spacing w:val="10"/>
+      <w:sz w:val="24"/>
+      <w:szCs w:val="24"/>
     </w:rPr>
   </w:style>
   <w:style w:type="paragraph" w:styleId="Quote">
@@ -6580,15 +6282,10 @@
     <w:link w:val="QuoteChar"/>
     <w:uiPriority w:val="29"/>
     <w:qFormat/>
-    <w:rsid w:val="00EF2F3F"/>
-    <w:pPr>
-      <w:spacing w:before="120" w:after="120"/>
-      <w:ind w:left="720"/>
-    </w:pPr>
+    <w:rsid w:val="00F47636"/>
     <w:rPr>
-      <w:color w:val="0E2841" w:themeColor="text2"/>
-      <w:sz w:val="24"/>
-      <w:szCs w:val="24"/>
+      <w:i/>
+      <w:iCs/>
     </w:rPr>
   </w:style>
   <w:style w:type="character" w:customStyle="1" w:styleId="QuoteChar">
@@ -6596,11 +6293,12 @@
     <w:basedOn w:val="DefaultParagraphFont"/>
     <w:link w:val="Quote"/>
     <w:uiPriority w:val="29"/>
-    <w:rsid w:val="00EF2F3F"/>
+    <w:rsid w:val="00F47636"/>
     <w:rPr>
-      <w:color w:val="0E2841" w:themeColor="text2"/>
-      <w:sz w:val="24"/>
-      <w:szCs w:val="24"/>
+      <w:i/>
+      <w:iCs/>
+      <w:sz w:val="20"/>
+      <w:szCs w:val="20"/>
     </w:rPr>
   </w:style>
   <w:style w:type="paragraph" w:styleId="ListParagraph">
@@ -6608,7 +6306,7 @@
     <w:basedOn w:val="Normal"/>
     <w:uiPriority w:val="34"/>
     <w:qFormat/>
-    <w:rsid w:val="001278AA"/>
+    <w:rsid w:val="00F47636"/>
     <w:pPr>
       <w:ind w:left="720"/>
       <w:contextualSpacing/>
@@ -6616,15 +6314,15 @@
   </w:style>
   <w:style w:type="character" w:styleId="IntenseEmphasis">
     <w:name w:val="Intense Emphasis"/>
-    <w:basedOn w:val="DefaultParagraphFont"/>
     <w:uiPriority w:val="21"/>
     <w:qFormat/>
-    <w:rsid w:val="00EF2F3F"/>
+    <w:rsid w:val="00F47636"/>
     <w:rPr>
       <w:b/>
       <w:bCs/>
-      <w:i/>
-      <w:iCs/>
+      <w:caps/>
+      <w:color w:val="1F3763" w:themeColor="accent1" w:themeShade="7F"/>
+      <w:spacing w:val="10"/>
     </w:rPr>
   </w:style>
   <w:style w:type="paragraph" w:styleId="IntenseQuote">
@@ -6634,18 +6332,20 @@
     <w:link w:val="IntenseQuoteChar"/>
     <w:uiPriority w:val="30"/>
     <w:qFormat/>
-    <w:rsid w:val="00EF2F3F"/>
+    <w:rsid w:val="00F47636"/>
     <w:pPr>
-      <w:spacing w:before="100" w:beforeAutospacing="1" w:after="240" w:line="240" w:lineRule="auto"/>
-      <w:ind w:left="720"/>
-      <w:jc w:val="center"/>
+      <w:pBdr>
+        <w:top w:val="single" w:sz="4" w:space="10" w:color="4472C4" w:themeColor="accent1"/>
+        <w:left w:val="single" w:sz="4" w:space="10" w:color="4472C4" w:themeColor="accent1"/>
+      </w:pBdr>
+      <w:spacing w:after="0"/>
+      <w:ind w:left="1296" w:right="1152"/>
+      <w:jc w:val="both"/>
     </w:pPr>
     <w:rPr>
-      <w:rFonts w:asciiTheme="majorHAnsi" w:eastAsiaTheme="majorEastAsia" w:hAnsiTheme="majorHAnsi" w:cstheme="majorBidi"/>
-      <w:color w:val="0E2841" w:themeColor="text2"/>
-      <w:spacing w:val="-6"/>
-      <w:sz w:val="32"/>
-      <w:szCs w:val="32"/>
+      <w:i/>
+      <w:iCs/>
+      <w:color w:val="4472C4" w:themeColor="accent1"/>
     </w:rPr>
   </w:style>
   <w:style w:type="character" w:customStyle="1" w:styleId="IntenseQuoteChar">
@@ -6653,27 +6353,27 @@
     <w:basedOn w:val="DefaultParagraphFont"/>
     <w:link w:val="IntenseQuote"/>
     <w:uiPriority w:val="30"/>
-    <w:rsid w:val="00EF2F3F"/>
+    <w:rsid w:val="00F47636"/>
     <w:rPr>
-      <w:rFonts w:asciiTheme="majorHAnsi" w:eastAsiaTheme="majorEastAsia" w:hAnsiTheme="majorHAnsi" w:cstheme="majorBidi"/>
-      <w:color w:val="0E2841" w:themeColor="text2"/>
-      <w:spacing w:val="-6"/>
-      <w:sz w:val="32"/>
-      <w:szCs w:val="32"/>
+      <w:i/>
+      <w:iCs/>
+      <w:color w:val="4472C4" w:themeColor="accent1"/>
+      <w:sz w:val="20"/>
+      <w:szCs w:val="20"/>
     </w:rPr>
   </w:style>
   <w:style w:type="character" w:styleId="IntenseReference">
     <w:name w:val="Intense Reference"/>
-    <w:basedOn w:val="DefaultParagraphFont"/>
     <w:uiPriority w:val="32"/>
     <w:qFormat/>
-    <w:rsid w:val="00EF2F3F"/>
+    <w:rsid w:val="00F47636"/>
     <w:rPr>
       <w:b/>
       <w:bCs/>
-      <w:smallCaps/>
-      <w:color w:val="0E2841" w:themeColor="text2"/>
-      <w:u w:val="single"/>
+      <w:i/>
+      <w:iCs/>
+      <w:caps/>
+      <w:color w:val="4472C4" w:themeColor="accent1"/>
     </w:rPr>
   </w:style>
   <w:style w:type="paragraph" w:styleId="Caption">
@@ -6684,23 +6384,20 @@
     <w:semiHidden/>
     <w:unhideWhenUsed/>
     <w:qFormat/>
-    <w:rsid w:val="00EF2F3F"/>
-    <w:pPr>
-      <w:spacing w:line="240" w:lineRule="auto"/>
-    </w:pPr>
+    <w:rsid w:val="00F47636"/>
     <w:rPr>
       <w:b/>
       <w:bCs/>
-      <w:smallCaps/>
-      <w:color w:val="0E2841" w:themeColor="text2"/>
+      <w:color w:val="2F5496" w:themeColor="accent1" w:themeShade="BF"/>
+      <w:sz w:val="16"/>
+      <w:szCs w:val="16"/>
     </w:rPr>
   </w:style>
   <w:style w:type="character" w:styleId="Strong">
     <w:name w:val="Strong"/>
-    <w:basedOn w:val="DefaultParagraphFont"/>
     <w:uiPriority w:val="22"/>
     <w:qFormat/>
-    <w:rsid w:val="00EF2F3F"/>
+    <w:rsid w:val="00F47636"/>
     <w:rPr>
       <w:b/>
       <w:bCs/>
@@ -6708,60 +6405,59 @@
   </w:style>
   <w:style w:type="character" w:styleId="Emphasis">
     <w:name w:val="Emphasis"/>
-    <w:basedOn w:val="DefaultParagraphFont"/>
     <w:uiPriority w:val="20"/>
     <w:qFormat/>
-    <w:rsid w:val="00EF2F3F"/>
+    <w:rsid w:val="00F47636"/>
     <w:rPr>
-      <w:i/>
-      <w:iCs/>
+      <w:caps/>
+      <w:color w:val="1F3763" w:themeColor="accent1" w:themeShade="7F"/>
+      <w:spacing w:val="5"/>
     </w:rPr>
   </w:style>
   <w:style w:type="paragraph" w:styleId="NoSpacing">
     <w:name w:val="No Spacing"/>
+    <w:basedOn w:val="Normal"/>
+    <w:link w:val="NoSpacingChar"/>
     <w:uiPriority w:val="1"/>
     <w:qFormat/>
-    <w:rsid w:val="00EF2F3F"/>
+    <w:rsid w:val="00F47636"/>
     <w:pPr>
-      <w:spacing w:after="0" w:line="240" w:lineRule="auto"/>
+      <w:spacing w:before="0" w:after="0" w:line="240" w:lineRule="auto"/>
     </w:pPr>
   </w:style>
   <w:style w:type="character" w:styleId="SubtleEmphasis">
     <w:name w:val="Subtle Emphasis"/>
-    <w:basedOn w:val="DefaultParagraphFont"/>
     <w:uiPriority w:val="19"/>
     <w:qFormat/>
-    <w:rsid w:val="00EF2F3F"/>
+    <w:rsid w:val="00F47636"/>
     <w:rPr>
       <w:i/>
       <w:iCs/>
-      <w:color w:val="595959" w:themeColor="text1" w:themeTint="A6"/>
+      <w:color w:val="1F3763" w:themeColor="accent1" w:themeShade="7F"/>
     </w:rPr>
   </w:style>
   <w:style w:type="character" w:styleId="SubtleReference">
     <w:name w:val="Subtle Reference"/>
-    <w:basedOn w:val="DefaultParagraphFont"/>
     <w:uiPriority w:val="31"/>
     <w:qFormat/>
-    <w:rsid w:val="00EF2F3F"/>
+    <w:rsid w:val="00F47636"/>
     <w:rPr>
-      <w:smallCaps/>
-      <w:color w:val="595959" w:themeColor="text1" w:themeTint="A6"/>
-      <w:u w:val="none" w:color="7F7F7F" w:themeColor="text1" w:themeTint="80"/>
-      <w:bdr w:val="none" w:sz="0" w:space="0" w:color="auto"/>
+      <w:b/>
+      <w:bCs/>
+      <w:color w:val="4472C4" w:themeColor="accent1"/>
     </w:rPr>
   </w:style>
   <w:style w:type="character" w:styleId="BookTitle">
     <w:name w:val="Book Title"/>
-    <w:basedOn w:val="DefaultParagraphFont"/>
     <w:uiPriority w:val="33"/>
     <w:qFormat/>
-    <w:rsid w:val="00EF2F3F"/>
+    <w:rsid w:val="00F47636"/>
     <w:rPr>
       <w:b/>
       <w:bCs/>
-      <w:smallCaps/>
-      <w:spacing w:val="10"/>
+      <w:i/>
+      <w:iCs/>
+      <w:spacing w:val="9"/>
     </w:rPr>
   </w:style>
   <w:style w:type="paragraph" w:styleId="TOCHeading">
@@ -6772,10 +6468,21 @@
     <w:semiHidden/>
     <w:unhideWhenUsed/>
     <w:qFormat/>
-    <w:rsid w:val="00EF2F3F"/>
+    <w:rsid w:val="00F47636"/>
     <w:pPr>
       <w:outlineLvl w:val="9"/>
     </w:pPr>
+  </w:style>
+  <w:style w:type="character" w:customStyle="1" w:styleId="NoSpacingChar">
+    <w:name w:val="No Spacing Char"/>
+    <w:basedOn w:val="DefaultParagraphFont"/>
+    <w:link w:val="NoSpacing"/>
+    <w:uiPriority w:val="1"/>
+    <w:rsid w:val="00F47636"/>
+    <w:rPr>
+      <w:sz w:val="20"/>
+      <w:szCs w:val="20"/>
+    </w:rPr>
   </w:style>
 </w:styles>
 </file>
@@ -6783,7 +6490,7 @@
 <file path=word/theme/theme1.xml><?xml version="1.0" encoding="utf-8"?>
 <a:theme xmlns:a="http://schemas.openxmlformats.org/drawingml/2006/main" name="Office Theme">
   <a:themeElements>
-    <a:clrScheme name="Office">
+    <a:clrScheme name="Office 2013 - 2022">
       <a:dk1>
         <a:sysClr val="windowText" lastClr="000000"/>
       </a:dk1>
@@ -6791,34 +6498,34 @@
         <a:sysClr val="window" lastClr="FFFFFF"/>
       </a:lt1>
       <a:dk2>
-        <a:srgbClr val="0E2841"/>
+        <a:srgbClr val="44546A"/>
       </a:dk2>
       <a:lt2>
-        <a:srgbClr val="E8E8E8"/>
+        <a:srgbClr val="E7E6E6"/>
       </a:lt2>
       <a:accent1>
-        <a:srgbClr val="156082"/>
+        <a:srgbClr val="4472C4"/>
       </a:accent1>
       <a:accent2>
-        <a:srgbClr val="E97132"/>
+        <a:srgbClr val="ED7D31"/>
       </a:accent2>
       <a:accent3>
-        <a:srgbClr val="196B24"/>
+        <a:srgbClr val="A5A5A5"/>
       </a:accent3>
       <a:accent4>
-        <a:srgbClr val="0F9ED5"/>
+        <a:srgbClr val="FFC000"/>
       </a:accent4>
       <a:accent5>
-        <a:srgbClr val="A02B93"/>
+        <a:srgbClr val="5B9BD5"/>
       </a:accent5>
       <a:accent6>
-        <a:srgbClr val="4EA72E"/>
+        <a:srgbClr val="70AD47"/>
       </a:accent6>
       <a:hlink>
-        <a:srgbClr val="467886"/>
+        <a:srgbClr val="0563C1"/>
       </a:hlink>
       <a:folHlink>
-        <a:srgbClr val="96607D"/>
+        <a:srgbClr val="954F72"/>
       </a:folHlink>
     </a:clrScheme>
     <a:fontScheme name="Office">

</xml_diff>

<commit_message>
convert plain user persona text into styled persona cards
</commit_message>
<xml_diff>
--- a/docs/Project-planning.docx
+++ b/docs/Project-planning.docx
@@ -205,21 +205,15 @@
       </w:pPr>
       <w:r>
         <w:rPr>
-          <w:noProof/>
+          <w:rFonts w:ascii="Calibri" w:hAnsi="Calibri" w:cs="Calibri"/>
+          <w:sz w:val="24"/>
+          <w:szCs w:val="24"/>
         </w:rPr>
         <w:drawing>
-          <wp:anchor distT="0" distB="0" distL="114300" distR="114300" simplePos="0" relativeHeight="251661312" behindDoc="0" locked="0" layoutInCell="1" allowOverlap="1" wp14:anchorId="317C51B8" wp14:editId="6F3D22DE">
-            <wp:simplePos x="0" y="0"/>
-            <wp:positionH relativeFrom="column">
-              <wp:posOffset>0</wp:posOffset>
-            </wp:positionH>
-            <wp:positionV relativeFrom="paragraph">
-              <wp:posOffset>50507</wp:posOffset>
-            </wp:positionV>
-            <wp:extent cx="2707553" cy="1807535"/>
-            <wp:effectExtent l="0" t="0" r="0" b="2540"/>
-            <wp:wrapSquare wrapText="bothSides"/>
-            <wp:docPr id="549173039" name="Picture 5" descr="Менеджер мужчина, результатов — 3,4 миллиона: изображения, стоковые  фотографии, картинки без лицензионных платежей | Shutterstock"/>
+          <wp:inline distT="0" distB="0" distL="0" distR="0" wp14:anchorId="51F7006D" wp14:editId="7319251A">
+            <wp:extent cx="5731510" cy="3472815"/>
+            <wp:effectExtent l="0" t="0" r="0" b="0"/>
+            <wp:docPr id="938955870" name="Picture 1"/>
             <wp:cNvGraphicFramePr>
               <a:graphicFrameLocks xmlns:a="http://schemas.openxmlformats.org/drawingml/2006/main" noChangeAspect="1"/>
             </wp:cNvGraphicFramePr>
@@ -227,448 +221,30 @@
               <a:graphicData uri="http://schemas.openxmlformats.org/drawingml/2006/picture">
                 <pic:pic xmlns:pic="http://schemas.openxmlformats.org/drawingml/2006/picture">
                   <pic:nvPicPr>
-                    <pic:cNvPr id="0" name="Picture 5" descr="Менеджер мужчина, результатов — 3,4 миллиона: изображения, стоковые  фотографии, картинки без лицензионных платежей | Shutterstock"/>
-                    <pic:cNvPicPr>
-                      <a:picLocks noChangeAspect="1" noChangeArrowheads="1"/>
-                    </pic:cNvPicPr>
+                    <pic:cNvPr id="938955870" name=""/>
+                    <pic:cNvPicPr/>
                   </pic:nvPicPr>
-                  <pic:blipFill rotWithShape="1">
-                    <a:blip r:embed="rId6">
-                      <a:extLst>
-                        <a:ext uri="{28A0092B-C50C-407E-A947-70E740481C1C}">
-                          <a14:useLocalDpi xmlns:a14="http://schemas.microsoft.com/office/drawing/2010/main" val="0"/>
-                        </a:ext>
-                      </a:extLst>
-                    </a:blip>
-                    <a:srcRect b="7176"/>
+                  <pic:blipFill>
+                    <a:blip r:embed="rId6"/>
                     <a:stretch>
                       <a:fillRect/>
                     </a:stretch>
                   </pic:blipFill>
-                  <pic:spPr bwMode="auto">
+                  <pic:spPr>
                     <a:xfrm>
                       <a:off x="0" y="0"/>
-                      <a:ext cx="2707553" cy="1807535"/>
+                      <a:ext cx="5731510" cy="3472815"/>
                     </a:xfrm>
                     <a:prstGeom prst="rect">
                       <a:avLst/>
                     </a:prstGeom>
-                    <a:noFill/>
-                    <a:ln>
-                      <a:noFill/>
-                    </a:ln>
-                    <a:extLst>
-                      <a:ext uri="{53640926-AAD7-44D8-BBD7-CCE9431645EC}">
-                        <a14:shadowObscured xmlns:a14="http://schemas.microsoft.com/office/drawing/2010/main"/>
-                      </a:ext>
-                    </a:extLst>
                   </pic:spPr>
                 </pic:pic>
               </a:graphicData>
             </a:graphic>
-          </wp:anchor>
+          </wp:inline>
         </w:drawing>
       </w:r>
-      <w:r>
-        <w:rPr>
-          <w:rFonts w:ascii="Calibri" w:hAnsi="Calibri" w:cs="Calibri"/>
-          <w:sz w:val="24"/>
-          <w:szCs w:val="24"/>
-        </w:rPr>
-        <w:t xml:space="preserve">Name: Alex </w:t>
-      </w:r>
-      <w:r>
-        <w:rPr>
-          <w:rFonts w:ascii="Calibri" w:hAnsi="Calibri" w:cs="Calibri"/>
-          <w:sz w:val="24"/>
-          <w:szCs w:val="24"/>
-        </w:rPr>
-        <w:t>O'Brien</w:t>
-      </w:r>
-    </w:p>
-    <w:p>
-      <w:pPr>
-        <w:rPr>
-          <w:rFonts w:ascii="Calibri" w:hAnsi="Calibri" w:cs="Calibri"/>
-          <w:sz w:val="24"/>
-          <w:szCs w:val="24"/>
-        </w:rPr>
-      </w:pPr>
-      <w:r>
-        <w:rPr>
-          <w:rFonts w:ascii="Calibri" w:hAnsi="Calibri" w:cs="Calibri"/>
-          <w:sz w:val="24"/>
-          <w:szCs w:val="24"/>
-        </w:rPr>
-        <w:t>Age: 35</w:t>
-      </w:r>
-    </w:p>
-    <w:p>
-      <w:pPr>
-        <w:rPr>
-          <w:rFonts w:ascii="Calibri" w:hAnsi="Calibri" w:cs="Calibri"/>
-          <w:sz w:val="24"/>
-          <w:szCs w:val="24"/>
-        </w:rPr>
-      </w:pPr>
-      <w:r>
-        <w:rPr>
-          <w:rFonts w:ascii="Calibri" w:hAnsi="Calibri" w:cs="Calibri"/>
-          <w:sz w:val="24"/>
-          <w:szCs w:val="24"/>
-        </w:rPr>
-        <w:t>Role: Supermarket Manager</w:t>
-      </w:r>
-    </w:p>
-    <w:p>
-      <w:pPr>
-        <w:rPr>
-          <w:rFonts w:ascii="Calibri" w:hAnsi="Calibri" w:cs="Calibri"/>
-          <w:sz w:val="24"/>
-          <w:szCs w:val="24"/>
-        </w:rPr>
-      </w:pPr>
-    </w:p>
-    <w:p>
-      <w:pPr>
-        <w:rPr>
-          <w:rFonts w:ascii="Calibri" w:hAnsi="Calibri" w:cs="Calibri"/>
-          <w:sz w:val="24"/>
-          <w:szCs w:val="24"/>
-        </w:rPr>
-      </w:pPr>
-    </w:p>
-    <w:p>
-      <w:pPr>
-        <w:rPr>
-          <w:rFonts w:ascii="Calibri" w:hAnsi="Calibri" w:cs="Calibri"/>
-          <w:sz w:val="24"/>
-          <w:szCs w:val="24"/>
-        </w:rPr>
-      </w:pPr>
-    </w:p>
-    <w:p>
-      <w:pPr>
-        <w:rPr>
-          <w:rFonts w:ascii="Calibri" w:hAnsi="Calibri" w:cs="Calibri"/>
-          <w:b/>
-          <w:bCs/>
-          <w:sz w:val="24"/>
-          <w:szCs w:val="24"/>
-        </w:rPr>
-      </w:pPr>
-      <w:r>
-        <w:rPr>
-          <w:rFonts w:ascii="Calibri" w:hAnsi="Calibri" w:cs="Calibri"/>
-          <w:b/>
-          <w:bCs/>
-          <w:sz w:val="24"/>
-          <w:szCs w:val="24"/>
-        </w:rPr>
-        <w:t>Goals:</w:t>
-      </w:r>
-    </w:p>
-    <w:p>
-      <w:pPr>
-        <w:rPr>
-          <w:rFonts w:ascii="Calibri" w:hAnsi="Calibri" w:cs="Calibri"/>
-          <w:sz w:val="24"/>
-          <w:szCs w:val="24"/>
-        </w:rPr>
-      </w:pPr>
-      <w:r>
-        <w:rPr>
-          <w:rFonts w:ascii="Calibri" w:hAnsi="Calibri" w:cs="Calibri"/>
-          <w:sz w:val="24"/>
-          <w:szCs w:val="24"/>
-        </w:rPr>
-        <w:t xml:space="preserve">- Manage the supermarket product </w:t>
-      </w:r>
-      <w:proofErr w:type="spellStart"/>
-      <w:r>
-        <w:rPr>
-          <w:rFonts w:ascii="Calibri" w:hAnsi="Calibri" w:cs="Calibri"/>
-          <w:sz w:val="24"/>
-          <w:szCs w:val="24"/>
-        </w:rPr>
-        <w:t>catalog</w:t>
-      </w:r>
-      <w:proofErr w:type="spellEnd"/>
-      <w:r>
-        <w:rPr>
-          <w:rFonts w:ascii="Calibri" w:hAnsi="Calibri" w:cs="Calibri"/>
-          <w:sz w:val="24"/>
-          <w:szCs w:val="24"/>
-        </w:rPr>
-        <w:t xml:space="preserve"> efficiently.</w:t>
-      </w:r>
-    </w:p>
-    <w:p>
-      <w:pPr>
-        <w:rPr>
-          <w:rFonts w:ascii="Calibri" w:hAnsi="Calibri" w:cs="Calibri"/>
-          <w:sz w:val="24"/>
-          <w:szCs w:val="24"/>
-        </w:rPr>
-      </w:pPr>
-      <w:r>
-        <w:rPr>
-          <w:rFonts w:ascii="Calibri" w:hAnsi="Calibri" w:cs="Calibri"/>
-          <w:sz w:val="24"/>
-          <w:szCs w:val="24"/>
-        </w:rPr>
-        <w:t>- Add new products when new stock arrives.</w:t>
-      </w:r>
-    </w:p>
-    <w:p>
-      <w:pPr>
-        <w:rPr>
-          <w:rFonts w:ascii="Calibri" w:hAnsi="Calibri" w:cs="Calibri"/>
-          <w:sz w:val="24"/>
-          <w:szCs w:val="24"/>
-        </w:rPr>
-      </w:pPr>
-      <w:r>
-        <w:rPr>
-          <w:rFonts w:ascii="Calibri" w:hAnsi="Calibri" w:cs="Calibri"/>
-          <w:sz w:val="24"/>
-          <w:szCs w:val="24"/>
-        </w:rPr>
-        <w:t>- Update product prices and inventory levels.</w:t>
-      </w:r>
-    </w:p>
-    <w:p>
-      <w:pPr>
-        <w:rPr>
-          <w:rFonts w:ascii="Calibri" w:hAnsi="Calibri" w:cs="Calibri"/>
-          <w:sz w:val="24"/>
-          <w:szCs w:val="24"/>
-        </w:rPr>
-      </w:pPr>
-      <w:r>
-        <w:rPr>
-          <w:rFonts w:ascii="Calibri" w:hAnsi="Calibri" w:cs="Calibri"/>
-          <w:sz w:val="24"/>
-          <w:szCs w:val="24"/>
-        </w:rPr>
-        <w:t>- Remove products that are no longer available.</w:t>
-      </w:r>
-    </w:p>
-    <w:p>
-      <w:pPr>
-        <w:rPr>
-          <w:rFonts w:ascii="Calibri" w:hAnsi="Calibri" w:cs="Calibri"/>
-          <w:b/>
-          <w:bCs/>
-          <w:sz w:val="24"/>
-          <w:szCs w:val="24"/>
-        </w:rPr>
-      </w:pPr>
-      <w:r>
-        <w:rPr>
-          <w:rFonts w:ascii="Calibri" w:hAnsi="Calibri" w:cs="Calibri"/>
-          <w:b/>
-          <w:bCs/>
-          <w:sz w:val="24"/>
-          <w:szCs w:val="24"/>
-        </w:rPr>
-        <w:t>Needs:</w:t>
-      </w:r>
-    </w:p>
-    <w:p>
-      <w:pPr>
-        <w:rPr>
-          <w:rFonts w:ascii="Calibri" w:hAnsi="Calibri" w:cs="Calibri"/>
-          <w:sz w:val="24"/>
-          <w:szCs w:val="24"/>
-        </w:rPr>
-      </w:pPr>
-      <w:r>
-        <w:rPr>
-          <w:rFonts w:ascii="Calibri" w:hAnsi="Calibri" w:cs="Calibri"/>
-          <w:sz w:val="24"/>
-          <w:szCs w:val="24"/>
-        </w:rPr>
-        <w:t>- A clear dashboard to manage products and categories.</w:t>
-      </w:r>
-    </w:p>
-    <w:p>
-      <w:pPr>
-        <w:rPr>
-          <w:rFonts w:ascii="Calibri" w:hAnsi="Calibri" w:cs="Calibri"/>
-          <w:sz w:val="24"/>
-          <w:szCs w:val="24"/>
-        </w:rPr>
-      </w:pPr>
-      <w:r>
-        <w:rPr>
-          <w:rFonts w:ascii="Calibri" w:hAnsi="Calibri" w:cs="Calibri"/>
-          <w:sz w:val="24"/>
-          <w:szCs w:val="24"/>
-        </w:rPr>
-        <w:t>- Easy forms for adding and editing product information.</w:t>
-      </w:r>
-    </w:p>
-    <w:p>
-      <w:pPr>
-        <w:rPr>
-          <w:rFonts w:ascii="Calibri" w:hAnsi="Calibri" w:cs="Calibri"/>
-          <w:sz w:val="24"/>
-          <w:szCs w:val="24"/>
-        </w:rPr>
-      </w:pPr>
-      <w:r>
-        <w:rPr>
-          <w:rFonts w:ascii="Calibri" w:hAnsi="Calibri" w:cs="Calibri"/>
-          <w:sz w:val="24"/>
-          <w:szCs w:val="24"/>
-        </w:rPr>
-        <w:t>- Quick access to stock information.</w:t>
-      </w:r>
-    </w:p>
-    <w:p>
-      <w:pPr>
-        <w:rPr>
-          <w:rFonts w:ascii="Calibri" w:hAnsi="Calibri" w:cs="Calibri"/>
-          <w:b/>
-          <w:bCs/>
-          <w:sz w:val="24"/>
-          <w:szCs w:val="24"/>
-        </w:rPr>
-      </w:pPr>
-      <w:r>
-        <w:rPr>
-          <w:rFonts w:ascii="Calibri" w:hAnsi="Calibri" w:cs="Calibri"/>
-          <w:b/>
-          <w:bCs/>
-          <w:sz w:val="24"/>
-          <w:szCs w:val="24"/>
-        </w:rPr>
-        <w:t>Behaviours:</w:t>
-      </w:r>
-    </w:p>
-    <w:p>
-      <w:pPr>
-        <w:rPr>
-          <w:rFonts w:ascii="Calibri" w:hAnsi="Calibri" w:cs="Calibri"/>
-          <w:sz w:val="24"/>
-          <w:szCs w:val="24"/>
-        </w:rPr>
-      </w:pPr>
-      <w:r>
-        <w:rPr>
-          <w:rFonts w:ascii="Calibri" w:hAnsi="Calibri" w:cs="Calibri"/>
-          <w:sz w:val="24"/>
-          <w:szCs w:val="24"/>
-        </w:rPr>
-        <w:t>- Logs into the system daily to monitor products.</w:t>
-      </w:r>
-    </w:p>
-    <w:p>
-      <w:pPr>
-        <w:rPr>
-          <w:rFonts w:ascii="Calibri" w:hAnsi="Calibri" w:cs="Calibri"/>
-          <w:sz w:val="24"/>
-          <w:szCs w:val="24"/>
-        </w:rPr>
-      </w:pPr>
-      <w:r>
-        <w:rPr>
-          <w:rFonts w:ascii="Calibri" w:hAnsi="Calibri" w:cs="Calibri"/>
-          <w:sz w:val="24"/>
-          <w:szCs w:val="24"/>
-        </w:rPr>
-        <w:t>- Updates stock levels and product details regularly.</w:t>
-      </w:r>
-    </w:p>
-    <w:p>
-      <w:pPr>
-        <w:rPr>
-          <w:rFonts w:ascii="Calibri" w:hAnsi="Calibri" w:cs="Calibri"/>
-          <w:sz w:val="24"/>
-          <w:szCs w:val="24"/>
-        </w:rPr>
-      </w:pPr>
-      <w:r>
-        <w:rPr>
-          <w:rFonts w:ascii="Calibri" w:hAnsi="Calibri" w:cs="Calibri"/>
-          <w:sz w:val="24"/>
-          <w:szCs w:val="24"/>
-        </w:rPr>
-        <w:t>- Reviews product availability to ensure accurate inventory data.</w:t>
-      </w:r>
-    </w:p>
-    <w:p>
-      <w:pPr>
-        <w:rPr>
-          <w:rFonts w:ascii="Calibri" w:hAnsi="Calibri" w:cs="Calibri"/>
-          <w:b/>
-          <w:bCs/>
-          <w:sz w:val="24"/>
-          <w:szCs w:val="24"/>
-        </w:rPr>
-      </w:pPr>
-      <w:r>
-        <w:rPr>
-          <w:rFonts w:ascii="Calibri" w:hAnsi="Calibri" w:cs="Calibri"/>
-          <w:b/>
-          <w:bCs/>
-          <w:sz w:val="24"/>
-          <w:szCs w:val="24"/>
-        </w:rPr>
-        <w:t>Frustrations:</w:t>
-      </w:r>
-    </w:p>
-    <w:p>
-      <w:pPr>
-        <w:rPr>
-          <w:rFonts w:ascii="Calibri" w:hAnsi="Calibri" w:cs="Calibri"/>
-          <w:sz w:val="24"/>
-          <w:szCs w:val="24"/>
-        </w:rPr>
-      </w:pPr>
-      <w:r>
-        <w:rPr>
-          <w:rFonts w:ascii="Calibri" w:hAnsi="Calibri" w:cs="Calibri"/>
-          <w:sz w:val="24"/>
-          <w:szCs w:val="24"/>
-        </w:rPr>
-        <w:t>- Manual inventory management is time-consuming.</w:t>
-      </w:r>
-    </w:p>
-    <w:p>
-      <w:pPr>
-        <w:rPr>
-          <w:rFonts w:ascii="Calibri" w:hAnsi="Calibri" w:cs="Calibri"/>
-          <w:sz w:val="24"/>
-          <w:szCs w:val="24"/>
-        </w:rPr>
-      </w:pPr>
-      <w:r>
-        <w:rPr>
-          <w:rFonts w:ascii="Calibri" w:hAnsi="Calibri" w:cs="Calibri"/>
-          <w:sz w:val="24"/>
-          <w:szCs w:val="24"/>
-        </w:rPr>
-        <w:t>- Outdated product information can confuse customers.</w:t>
-      </w:r>
-    </w:p>
-    <w:p>
-      <w:pPr>
-        <w:rPr>
-          <w:rFonts w:ascii="Calibri" w:hAnsi="Calibri" w:cs="Calibri"/>
-          <w:sz w:val="24"/>
-          <w:szCs w:val="24"/>
-        </w:rPr>
-      </w:pPr>
-      <w:r>
-        <w:rPr>
-          <w:rFonts w:ascii="Calibri" w:hAnsi="Calibri" w:cs="Calibri"/>
-          <w:sz w:val="24"/>
-          <w:szCs w:val="24"/>
-        </w:rPr>
-        <w:t>- Lack of a centralized system for product management.</w:t>
-      </w:r>
     </w:p>
     <w:p>
       <w:pPr>
@@ -684,7 +260,6 @@
         <w:pStyle w:val="Heading3"/>
       </w:pPr>
       <w:r>
-        <w:lastRenderedPageBreak/>
         <w:t>Persona 2: Customer</w:t>
       </w:r>
     </w:p>
@@ -692,28 +267,21 @@
       <w:pPr>
         <w:rPr>
           <w:rFonts w:ascii="Calibri" w:hAnsi="Calibri" w:cs="Calibri"/>
-          <w:color w:val="FF0000"/>
-          <w:sz w:val="24"/>
-          <w:szCs w:val="24"/>
-        </w:rPr>
-      </w:pPr>
-      <w:r>
-        <w:rPr>
-          <w:noProof/>
+          <w:sz w:val="24"/>
+          <w:szCs w:val="24"/>
+        </w:rPr>
+      </w:pPr>
+      <w:r>
+        <w:rPr>
+          <w:rFonts w:ascii="Calibri" w:hAnsi="Calibri" w:cs="Calibri"/>
+          <w:sz w:val="24"/>
+          <w:szCs w:val="24"/>
         </w:rPr>
         <w:drawing>
-          <wp:anchor distT="0" distB="0" distL="114300" distR="114300" simplePos="0" relativeHeight="251658240" behindDoc="0" locked="0" layoutInCell="1" allowOverlap="1" wp14:anchorId="4EC4892E" wp14:editId="23782614">
-            <wp:simplePos x="0" y="0"/>
-            <wp:positionH relativeFrom="margin">
-              <wp:align>left</wp:align>
-            </wp:positionH>
-            <wp:positionV relativeFrom="paragraph">
-              <wp:posOffset>48806</wp:posOffset>
-            </wp:positionV>
-            <wp:extent cx="1200785" cy="1804670"/>
-            <wp:effectExtent l="0" t="0" r="0" b="5080"/>
-            <wp:wrapSquare wrapText="bothSides"/>
-            <wp:docPr id="1848916903" name="Picture 1" descr="Фотографии на тему «Женщина в магазине» — скачивайте бесплатные изображения  высокого качества | Freepik"/>
+          <wp:inline distT="0" distB="0" distL="0" distR="0" wp14:anchorId="334D6ADA" wp14:editId="515F6244">
+            <wp:extent cx="5731510" cy="3347085"/>
+            <wp:effectExtent l="0" t="0" r="0" b="5715"/>
+            <wp:docPr id="1122050814" name="Picture 1"/>
             <wp:cNvGraphicFramePr>
               <a:graphicFrameLocks xmlns:a="http://schemas.openxmlformats.org/drawingml/2006/main" noChangeAspect="1"/>
             </wp:cNvGraphicFramePr>
@@ -721,422 +289,29 @@
               <a:graphicData uri="http://schemas.openxmlformats.org/drawingml/2006/picture">
                 <pic:pic xmlns:pic="http://schemas.openxmlformats.org/drawingml/2006/picture">
                   <pic:nvPicPr>
-                    <pic:cNvPr id="0" name="Picture 1" descr="Фотографии на тему «Женщина в магазине» — скачивайте бесплатные изображения  высокого качества | Freepik"/>
-                    <pic:cNvPicPr>
-                      <a:picLocks noChangeAspect="1" noChangeArrowheads="1"/>
-                    </pic:cNvPicPr>
+                    <pic:cNvPr id="1122050814" name=""/>
+                    <pic:cNvPicPr/>
                   </pic:nvPicPr>
                   <pic:blipFill>
-                    <a:blip r:embed="rId7" cstate="print">
-                      <a:extLst>
-                        <a:ext uri="{28A0092B-C50C-407E-A947-70E740481C1C}">
-                          <a14:useLocalDpi xmlns:a14="http://schemas.microsoft.com/office/drawing/2010/main" val="0"/>
-                        </a:ext>
-                      </a:extLst>
-                    </a:blip>
-                    <a:srcRect/>
+                    <a:blip r:embed="rId7"/>
                     <a:stretch>
                       <a:fillRect/>
                     </a:stretch>
                   </pic:blipFill>
-                  <pic:spPr bwMode="auto">
+                  <pic:spPr>
                     <a:xfrm>
                       <a:off x="0" y="0"/>
-                      <a:ext cx="1200785" cy="1804670"/>
+                      <a:ext cx="5731510" cy="3347085"/>
                     </a:xfrm>
                     <a:prstGeom prst="rect">
                       <a:avLst/>
                     </a:prstGeom>
-                    <a:noFill/>
-                    <a:ln>
-                      <a:noFill/>
-                    </a:ln>
                   </pic:spPr>
                 </pic:pic>
               </a:graphicData>
             </a:graphic>
-            <wp14:sizeRelH relativeFrom="page">
-              <wp14:pctWidth>0</wp14:pctWidth>
-            </wp14:sizeRelH>
-            <wp14:sizeRelV relativeFrom="page">
-              <wp14:pctHeight>0</wp14:pctHeight>
-            </wp14:sizeRelV>
-          </wp:anchor>
+          </wp:inline>
         </w:drawing>
-      </w:r>
-    </w:p>
-    <w:p>
-      <w:pPr>
-        <w:rPr>
-          <w:rFonts w:ascii="Calibri" w:hAnsi="Calibri" w:cs="Calibri"/>
-          <w:sz w:val="24"/>
-          <w:szCs w:val="24"/>
-        </w:rPr>
-      </w:pPr>
-      <w:r>
-        <w:rPr>
-          <w:rFonts w:ascii="Calibri" w:hAnsi="Calibri" w:cs="Calibri"/>
-          <w:sz w:val="24"/>
-          <w:szCs w:val="24"/>
-        </w:rPr>
-        <w:t>Name: Emma O'Sullivan</w:t>
-      </w:r>
-    </w:p>
-    <w:p>
-      <w:pPr>
-        <w:rPr>
-          <w:rFonts w:ascii="Calibri" w:hAnsi="Calibri" w:cs="Calibri"/>
-          <w:sz w:val="24"/>
-          <w:szCs w:val="24"/>
-        </w:rPr>
-      </w:pPr>
-      <w:r>
-        <w:rPr>
-          <w:rFonts w:ascii="Calibri" w:hAnsi="Calibri" w:cs="Calibri"/>
-          <w:sz w:val="24"/>
-          <w:szCs w:val="24"/>
-        </w:rPr>
-        <w:t>Age: 28</w:t>
-      </w:r>
-    </w:p>
-    <w:p>
-      <w:pPr>
-        <w:rPr>
-          <w:rFonts w:ascii="Calibri" w:hAnsi="Calibri" w:cs="Calibri"/>
-          <w:sz w:val="24"/>
-          <w:szCs w:val="24"/>
-        </w:rPr>
-      </w:pPr>
-      <w:r>
-        <w:rPr>
-          <w:rFonts w:ascii="Calibri" w:hAnsi="Calibri" w:cs="Calibri"/>
-          <w:sz w:val="24"/>
-          <w:szCs w:val="24"/>
-        </w:rPr>
-        <w:t>Role: Supermarket Customer</w:t>
-      </w:r>
-    </w:p>
-    <w:p>
-      <w:pPr>
-        <w:rPr>
-          <w:rFonts w:ascii="Calibri" w:hAnsi="Calibri" w:cs="Calibri"/>
-          <w:sz w:val="24"/>
-          <w:szCs w:val="24"/>
-        </w:rPr>
-      </w:pPr>
-    </w:p>
-    <w:p>
-      <w:pPr>
-        <w:rPr>
-          <w:rFonts w:ascii="Calibri" w:hAnsi="Calibri" w:cs="Calibri"/>
-          <w:sz w:val="24"/>
-          <w:szCs w:val="24"/>
-        </w:rPr>
-      </w:pPr>
-    </w:p>
-    <w:p>
-      <w:pPr>
-        <w:rPr>
-          <w:rFonts w:ascii="Calibri" w:hAnsi="Calibri" w:cs="Calibri"/>
-          <w:b/>
-          <w:bCs/>
-          <w:sz w:val="24"/>
-          <w:szCs w:val="24"/>
-        </w:rPr>
-      </w:pPr>
-      <w:r>
-        <w:rPr>
-          <w:rFonts w:ascii="Calibri" w:hAnsi="Calibri" w:cs="Calibri"/>
-          <w:b/>
-          <w:bCs/>
-          <w:sz w:val="24"/>
-          <w:szCs w:val="24"/>
-        </w:rPr>
-        <w:t>Goals:</w:t>
-      </w:r>
-    </w:p>
-    <w:p>
-      <w:pPr>
-        <w:rPr>
-          <w:rFonts w:ascii="Calibri" w:hAnsi="Calibri" w:cs="Calibri"/>
-          <w:sz w:val="24"/>
-          <w:szCs w:val="24"/>
-        </w:rPr>
-      </w:pPr>
-      <w:r>
-        <w:rPr>
-          <w:rFonts w:ascii="Calibri" w:hAnsi="Calibri" w:cs="Calibri"/>
-          <w:sz w:val="24"/>
-          <w:szCs w:val="24"/>
-        </w:rPr>
-        <w:t>- Browse available supermarket products online.</w:t>
-      </w:r>
-    </w:p>
-    <w:p>
-      <w:pPr>
-        <w:rPr>
-          <w:rFonts w:ascii="Calibri" w:hAnsi="Calibri" w:cs="Calibri"/>
-          <w:sz w:val="24"/>
-          <w:szCs w:val="24"/>
-        </w:rPr>
-      </w:pPr>
-      <w:r>
-        <w:rPr>
-          <w:rFonts w:ascii="Calibri" w:hAnsi="Calibri" w:cs="Calibri"/>
-          <w:sz w:val="24"/>
-          <w:szCs w:val="24"/>
-        </w:rPr>
-        <w:t>- Check prices and product availability before visiting the store.</w:t>
-      </w:r>
-    </w:p>
-    <w:p>
-      <w:pPr>
-        <w:rPr>
-          <w:rFonts w:ascii="Calibri" w:hAnsi="Calibri" w:cs="Calibri"/>
-          <w:sz w:val="24"/>
-          <w:szCs w:val="24"/>
-        </w:rPr>
-      </w:pPr>
-      <w:r>
-        <w:rPr>
-          <w:rFonts w:ascii="Calibri" w:hAnsi="Calibri" w:cs="Calibri"/>
-          <w:sz w:val="24"/>
-          <w:szCs w:val="24"/>
-        </w:rPr>
-        <w:t>- Quickly find products using search or categories.</w:t>
-      </w:r>
-    </w:p>
-    <w:p>
-      <w:pPr>
-        <w:rPr>
-          <w:rFonts w:ascii="Calibri" w:hAnsi="Calibri" w:cs="Calibri"/>
-          <w:b/>
-          <w:bCs/>
-          <w:sz w:val="24"/>
-          <w:szCs w:val="24"/>
-        </w:rPr>
-      </w:pPr>
-      <w:r>
-        <w:rPr>
-          <w:rFonts w:ascii="Calibri" w:hAnsi="Calibri" w:cs="Calibri"/>
-          <w:b/>
-          <w:bCs/>
-          <w:sz w:val="24"/>
-          <w:szCs w:val="24"/>
-        </w:rPr>
-        <w:t>Needs:</w:t>
-      </w:r>
-    </w:p>
-    <w:p>
-      <w:pPr>
-        <w:rPr>
-          <w:rFonts w:ascii="Calibri" w:hAnsi="Calibri" w:cs="Calibri"/>
-          <w:sz w:val="24"/>
-          <w:szCs w:val="24"/>
-        </w:rPr>
-      </w:pPr>
-      <w:r>
-        <w:rPr>
-          <w:rFonts w:ascii="Calibri" w:hAnsi="Calibri" w:cs="Calibri"/>
-          <w:sz w:val="24"/>
-          <w:szCs w:val="24"/>
-        </w:rPr>
-        <w:t>- Clear product listings with images and prices.</w:t>
-      </w:r>
-    </w:p>
-    <w:p>
-      <w:pPr>
-        <w:rPr>
-          <w:rFonts w:ascii="Calibri" w:hAnsi="Calibri" w:cs="Calibri"/>
-          <w:sz w:val="24"/>
-          <w:szCs w:val="24"/>
-        </w:rPr>
-      </w:pPr>
-      <w:r>
-        <w:rPr>
-          <w:rFonts w:ascii="Calibri" w:hAnsi="Calibri" w:cs="Calibri"/>
-          <w:sz w:val="24"/>
-          <w:szCs w:val="24"/>
-        </w:rPr>
-        <w:t>- Simple navigation through product categories.</w:t>
-      </w:r>
-    </w:p>
-    <w:p>
-      <w:pPr>
-        <w:rPr>
-          <w:rFonts w:ascii="Calibri" w:hAnsi="Calibri" w:cs="Calibri"/>
-          <w:sz w:val="24"/>
-          <w:szCs w:val="24"/>
-        </w:rPr>
-      </w:pPr>
-      <w:r>
-        <w:rPr>
-          <w:rFonts w:ascii="Calibri" w:hAnsi="Calibri" w:cs="Calibri"/>
-          <w:sz w:val="24"/>
-          <w:szCs w:val="24"/>
-        </w:rPr>
-        <w:t>- A fast and reliable checkout process.</w:t>
-      </w:r>
-    </w:p>
-    <w:p>
-      <w:pPr>
-        <w:rPr>
-          <w:rFonts w:ascii="Calibri" w:hAnsi="Calibri" w:cs="Calibri"/>
-          <w:b/>
-          <w:bCs/>
-          <w:sz w:val="24"/>
-          <w:szCs w:val="24"/>
-        </w:rPr>
-      </w:pPr>
-      <w:r>
-        <w:rPr>
-          <w:rFonts w:ascii="Calibri" w:hAnsi="Calibri" w:cs="Calibri"/>
-          <w:b/>
-          <w:bCs/>
-          <w:sz w:val="24"/>
-          <w:szCs w:val="24"/>
-        </w:rPr>
-        <w:t>Behaviours:</w:t>
-      </w:r>
-    </w:p>
-    <w:p>
-      <w:pPr>
-        <w:rPr>
-          <w:rFonts w:ascii="Calibri" w:hAnsi="Calibri" w:cs="Calibri"/>
-          <w:sz w:val="24"/>
-          <w:szCs w:val="24"/>
-        </w:rPr>
-      </w:pPr>
-      <w:r>
-        <w:rPr>
-          <w:rFonts w:ascii="Calibri" w:hAnsi="Calibri" w:cs="Calibri"/>
-          <w:sz w:val="24"/>
-          <w:szCs w:val="24"/>
-        </w:rPr>
-        <w:t>- Visits the website occasionally before shopping.</w:t>
-      </w:r>
-    </w:p>
-    <w:p>
-      <w:pPr>
-        <w:rPr>
-          <w:rFonts w:ascii="Calibri" w:hAnsi="Calibri" w:cs="Calibri"/>
-          <w:sz w:val="24"/>
-          <w:szCs w:val="24"/>
-        </w:rPr>
-      </w:pPr>
-      <w:r>
-        <w:rPr>
-          <w:rFonts w:ascii="Calibri" w:hAnsi="Calibri" w:cs="Calibri"/>
-          <w:sz w:val="24"/>
-          <w:szCs w:val="24"/>
-        </w:rPr>
-        <w:t>- Searches for specific products using filters or keywords.</w:t>
-      </w:r>
-    </w:p>
-    <w:p>
-      <w:pPr>
-        <w:rPr>
-          <w:rFonts w:ascii="Calibri" w:hAnsi="Calibri" w:cs="Calibri"/>
-          <w:sz w:val="24"/>
-          <w:szCs w:val="24"/>
-        </w:rPr>
-      </w:pPr>
-      <w:r>
-        <w:rPr>
-          <w:rFonts w:ascii="Calibri" w:hAnsi="Calibri" w:cs="Calibri"/>
-          <w:sz w:val="24"/>
-          <w:szCs w:val="24"/>
-        </w:rPr>
-        <w:t>- Adds items to the cart and places orders online.</w:t>
-      </w:r>
-    </w:p>
-    <w:p>
-      <w:pPr>
-        <w:rPr>
-          <w:rFonts w:ascii="Calibri" w:hAnsi="Calibri" w:cs="Calibri"/>
-          <w:b/>
-          <w:bCs/>
-          <w:sz w:val="24"/>
-          <w:szCs w:val="24"/>
-        </w:rPr>
-      </w:pPr>
-      <w:r>
-        <w:rPr>
-          <w:rFonts w:ascii="Calibri" w:hAnsi="Calibri" w:cs="Calibri"/>
-          <w:b/>
-          <w:bCs/>
-          <w:sz w:val="24"/>
-          <w:szCs w:val="24"/>
-        </w:rPr>
-        <w:t>Frustrations:</w:t>
-      </w:r>
-    </w:p>
-    <w:p>
-      <w:pPr>
-        <w:rPr>
-          <w:rFonts w:ascii="Calibri" w:hAnsi="Calibri" w:cs="Calibri"/>
-          <w:sz w:val="24"/>
-          <w:szCs w:val="24"/>
-        </w:rPr>
-      </w:pPr>
-      <w:r>
-        <w:rPr>
-          <w:rFonts w:ascii="Calibri" w:hAnsi="Calibri" w:cs="Calibri"/>
-          <w:sz w:val="24"/>
-          <w:szCs w:val="24"/>
-        </w:rPr>
-        <w:t>- Difficulty finding products in large supermarkets.</w:t>
-      </w:r>
-    </w:p>
-    <w:p>
-      <w:pPr>
-        <w:rPr>
-          <w:rFonts w:ascii="Calibri" w:hAnsi="Calibri" w:cs="Calibri"/>
-          <w:sz w:val="24"/>
-          <w:szCs w:val="24"/>
-        </w:rPr>
-      </w:pPr>
-      <w:r>
-        <w:rPr>
-          <w:rFonts w:ascii="Calibri" w:hAnsi="Calibri" w:cs="Calibri"/>
-          <w:sz w:val="24"/>
-          <w:szCs w:val="24"/>
-        </w:rPr>
-        <w:t>- Lack of clear price information.</w:t>
-      </w:r>
-    </w:p>
-    <w:p>
-      <w:pPr>
-        <w:rPr>
-          <w:rFonts w:ascii="Calibri" w:hAnsi="Calibri" w:cs="Calibri"/>
-          <w:sz w:val="24"/>
-          <w:szCs w:val="24"/>
-        </w:rPr>
-      </w:pPr>
-      <w:r>
-        <w:rPr>
-          <w:rFonts w:ascii="Calibri" w:hAnsi="Calibri" w:cs="Calibri"/>
-          <w:sz w:val="24"/>
-          <w:szCs w:val="24"/>
-        </w:rPr>
-        <w:t>- Limited ability to check product availability in advance.</w:t>
-      </w:r>
-    </w:p>
-    <w:p>
-      <w:pPr>
-        <w:rPr>
-          <w:rFonts w:ascii="Calibri" w:hAnsi="Calibri" w:cs="Calibri"/>
-          <w:sz w:val="24"/>
-          <w:szCs w:val="24"/>
-        </w:rPr>
-      </w:pPr>
-      <w:r>
-        <w:rPr>
-          <w:rFonts w:ascii="Calibri" w:hAnsi="Calibri" w:cs="Calibri"/>
-          <w:sz w:val="24"/>
-          <w:szCs w:val="24"/>
-        </w:rPr>
-        <w:br w:type="page"/>
       </w:r>
     </w:p>
     <w:p>
@@ -1151,21 +326,6 @@
     <w:p>
       <w:pPr>
         <w:pStyle w:val="Heading4"/>
-      </w:pPr>
-      <w:r>
-        <w:t xml:space="preserve">3.1. </w:t>
-      </w:r>
-      <w:r>
-        <w:t>Store Manager Flow</w:t>
-      </w:r>
-    </w:p>
-    <w:p>
-      <w:pPr>
-        <w:rPr>
-          <w:rFonts w:ascii="Calibri" w:hAnsi="Calibri" w:cs="Calibri"/>
-          <w:sz w:val="24"/>
-          <w:szCs w:val="24"/>
-        </w:rPr>
       </w:pPr>
       <w:r>
         <w:rPr>
@@ -1177,16 +337,16 @@
           <w:szCs w:val="24"/>
         </w:rPr>
         <w:drawing>
-          <wp:anchor distT="0" distB="0" distL="114300" distR="114300" simplePos="0" relativeHeight="251660288" behindDoc="0" locked="0" layoutInCell="1" allowOverlap="1" wp14:anchorId="3AAB44EC" wp14:editId="36025EDE">
+          <wp:anchor distT="0" distB="0" distL="114300" distR="114300" simplePos="0" relativeHeight="251660288" behindDoc="0" locked="0" layoutInCell="1" allowOverlap="1" wp14:anchorId="3AAB44EC" wp14:editId="3B4C0179">
             <wp:simplePos x="0" y="0"/>
             <wp:positionH relativeFrom="column">
-              <wp:posOffset>85725</wp:posOffset>
+              <wp:posOffset>309261</wp:posOffset>
             </wp:positionH>
             <wp:positionV relativeFrom="paragraph">
-              <wp:posOffset>149535</wp:posOffset>
+              <wp:posOffset>309245</wp:posOffset>
             </wp:positionV>
-            <wp:extent cx="1152525" cy="3819525"/>
-            <wp:effectExtent l="0" t="0" r="3175" b="3175"/>
+            <wp:extent cx="982345" cy="3256280"/>
+            <wp:effectExtent l="0" t="0" r="0" b="0"/>
             <wp:wrapSquare wrapText="bothSides"/>
             <wp:docPr id="1929928172" name="Picture 3" descr="A diagram of a product&#10;&#10;AI-generated content may be incorrect."/>
             <wp:cNvGraphicFramePr>
@@ -1214,7 +374,7 @@
                   <pic:spPr>
                     <a:xfrm>
                       <a:off x="0" y="0"/>
-                      <a:ext cx="1152525" cy="3819525"/>
+                      <a:ext cx="982345" cy="3256280"/>
                     </a:xfrm>
                     <a:prstGeom prst="rect">
                       <a:avLst/>
@@ -1226,10 +386,28 @@
             <wp14:sizeRelH relativeFrom="margin">
               <wp14:pctWidth>0</wp14:pctWidth>
             </wp14:sizeRelH>
+            <wp14:sizeRelV relativeFrom="margin">
+              <wp14:pctHeight>0</wp14:pctHeight>
+            </wp14:sizeRelV>
           </wp:anchor>
         </w:drawing>
       </w:r>
       <w:r>
+        <w:t xml:space="preserve">3.1. </w:t>
+      </w:r>
+      <w:r>
+        <w:t>Store Manager Flow</w:t>
+      </w:r>
+    </w:p>
+    <w:p>
+      <w:pPr>
+        <w:rPr>
+          <w:rFonts w:ascii="Calibri" w:hAnsi="Calibri" w:cs="Calibri"/>
+          <w:sz w:val="24"/>
+          <w:szCs w:val="24"/>
+        </w:rPr>
+      </w:pPr>
+      <w:r>
         <w:rPr>
           <w:rFonts w:ascii="Calibri" w:hAnsi="Calibri" w:cs="Calibri"/>
           <w:sz w:val="24"/>
@@ -1361,62 +539,6 @@
           <w:szCs w:val="24"/>
         </w:rPr>
       </w:pPr>
-    </w:p>
-    <w:p>
-      <w:pPr>
-        <w:rPr>
-          <w:rFonts w:ascii="Calibri" w:hAnsi="Calibri" w:cs="Calibri"/>
-          <w:sz w:val="24"/>
-          <w:szCs w:val="24"/>
-        </w:rPr>
-      </w:pPr>
-    </w:p>
-    <w:p>
-      <w:pPr>
-        <w:rPr>
-          <w:rFonts w:ascii="Calibri" w:hAnsi="Calibri" w:cs="Calibri"/>
-          <w:sz w:val="24"/>
-          <w:szCs w:val="24"/>
-        </w:rPr>
-      </w:pPr>
-    </w:p>
-    <w:p>
-      <w:pPr>
-        <w:pStyle w:val="Heading3"/>
-      </w:pPr>
-      <w:r>
-        <w:t xml:space="preserve">3.2. </w:t>
-      </w:r>
-      <w:r>
-        <w:t>Customer Flow</w:t>
-      </w:r>
-    </w:p>
-    <w:p>
-      <w:pPr>
-        <w:rPr>
-          <w:rFonts w:ascii="Calibri" w:hAnsi="Calibri" w:cs="Calibri"/>
-          <w:color w:val="FF0000"/>
-          <w:sz w:val="24"/>
-          <w:szCs w:val="24"/>
-        </w:rPr>
-      </w:pPr>
-      <w:r>
-        <w:rPr>
-          <w:rFonts w:ascii="Calibri" w:hAnsi="Calibri" w:cs="Calibri"/>
-          <w:sz w:val="24"/>
-          <w:szCs w:val="24"/>
-        </w:rPr>
-        <w:t>Visit website → Browse products → Select product → View product details → Decide whether to add the product to the cart → Add to cart → Decide whether to continue shopping or proceed to checkout → Confirm order.</w:t>
-      </w:r>
-    </w:p>
-    <w:p>
-      <w:pPr>
-        <w:rPr>
-          <w:rFonts w:ascii="Calibri" w:hAnsi="Calibri" w:cs="Calibri"/>
-          <w:sz w:val="24"/>
-          <w:szCs w:val="24"/>
-        </w:rPr>
-      </w:pPr>
       <w:r>
         <w:rPr>
           <w:rFonts w:ascii="Calibri" w:hAnsi="Calibri" w:cs="Calibri"/>
@@ -1424,18 +546,17 @@
           <w:sz w:val="24"/>
           <w:szCs w:val="24"/>
         </w:rPr>
-        <w:lastRenderedPageBreak/>
         <w:drawing>
-          <wp:anchor distT="0" distB="0" distL="114300" distR="114300" simplePos="0" relativeHeight="251659264" behindDoc="0" locked="0" layoutInCell="1" allowOverlap="1" wp14:anchorId="1C981648" wp14:editId="1D06EBFA">
+          <wp:anchor distT="0" distB="0" distL="114300" distR="114300" simplePos="0" relativeHeight="251659264" behindDoc="0" locked="0" layoutInCell="1" allowOverlap="1" wp14:anchorId="1C981648" wp14:editId="28C2EE18">
             <wp:simplePos x="0" y="0"/>
             <wp:positionH relativeFrom="margin">
-              <wp:posOffset>-159661</wp:posOffset>
+              <wp:posOffset>-295275</wp:posOffset>
             </wp:positionH>
             <wp:positionV relativeFrom="paragraph">
-              <wp:posOffset>215430</wp:posOffset>
+              <wp:posOffset>406400</wp:posOffset>
             </wp:positionV>
-            <wp:extent cx="1844675" cy="4346575"/>
-            <wp:effectExtent l="0" t="0" r="3175" b="0"/>
+            <wp:extent cx="1851025" cy="4363085"/>
+            <wp:effectExtent l="0" t="0" r="3175" b="5715"/>
             <wp:wrapSquare wrapText="bothSides"/>
             <wp:docPr id="1721594281" name="Picture 2" descr="A diagram of a product&#10;&#10;AI-generated content may be incorrect."/>
             <wp:cNvGraphicFramePr>
@@ -1463,7 +584,7 @@
                   <pic:spPr>
                     <a:xfrm>
                       <a:off x="0" y="0"/>
-                      <a:ext cx="1844675" cy="4346575"/>
+                      <a:ext cx="1851025" cy="4363085"/>
                     </a:xfrm>
                     <a:prstGeom prst="rect">
                       <a:avLst/>
@@ -1484,6 +605,44 @@
     </w:p>
     <w:p>
       <w:pPr>
+        <w:pStyle w:val="Heading3"/>
+      </w:pPr>
+      <w:r>
+        <w:t xml:space="preserve">3.2. </w:t>
+      </w:r>
+      <w:r>
+        <w:t>Customer Flow</w:t>
+      </w:r>
+    </w:p>
+    <w:p>
+      <w:pPr>
+        <w:rPr>
+          <w:rFonts w:ascii="Calibri" w:hAnsi="Calibri" w:cs="Calibri"/>
+          <w:color w:val="FF0000"/>
+          <w:sz w:val="24"/>
+          <w:szCs w:val="24"/>
+        </w:rPr>
+      </w:pPr>
+      <w:r>
+        <w:rPr>
+          <w:rFonts w:ascii="Calibri" w:hAnsi="Calibri" w:cs="Calibri"/>
+          <w:sz w:val="24"/>
+          <w:szCs w:val="24"/>
+        </w:rPr>
+        <w:t>Visit website → Browse products → Select product → View product details → Decide whether to add the product to the cart → Add to cart → Decide whether to continue shopping or proceed to checkout → Confirm order.</w:t>
+      </w:r>
+    </w:p>
+    <w:p>
+      <w:pPr>
+        <w:rPr>
+          <w:rFonts w:ascii="Calibri" w:hAnsi="Calibri" w:cs="Calibri"/>
+          <w:sz w:val="24"/>
+          <w:szCs w:val="24"/>
+        </w:rPr>
+      </w:pPr>
+    </w:p>
+    <w:p>
+      <w:pPr>
         <w:rPr>
           <w:rFonts w:ascii="Calibri" w:hAnsi="Calibri" w:cs="Calibri"/>
           <w:b/>
@@ -1536,16 +695,14 @@
         </w:rPr>
         <w:t xml:space="preserve">2. The customer browses the product </w:t>
       </w:r>
-      <w:proofErr w:type="spellStart"/>
-      <w:r>
-        <w:rPr>
-          <w:rFonts w:ascii="Calibri" w:hAnsi="Calibri" w:cs="Calibri"/>
-          <w:sz w:val="24"/>
-          <w:szCs w:val="24"/>
-        </w:rPr>
-        <w:t>catalog</w:t>
-      </w:r>
-      <w:proofErr w:type="spellEnd"/>
+      <w:r>
+        <w:rPr>
+          <w:rFonts w:ascii="Calibri" w:hAnsi="Calibri" w:cs="Calibri"/>
+          <w:sz w:val="24"/>
+          <w:szCs w:val="24"/>
+        </w:rPr>
+        <w:t>catalogue</w:t>
+      </w:r>
       <w:r>
         <w:rPr>
           <w:rFonts w:ascii="Calibri" w:hAnsi="Calibri" w:cs="Calibri"/>
@@ -1637,6 +794,7 @@
           <w:sz w:val="24"/>
           <w:szCs w:val="24"/>
         </w:rPr>
+        <w:lastRenderedPageBreak/>
         <w:t>7. The customer then decides whether to continue shopping or proceed to checkout.</w:t>
       </w:r>
     </w:p>
@@ -1920,218 +1078,199 @@
     </w:p>
     <w:p>
       <w:pPr>
-        <w:ind w:firstLine="720"/>
-        <w:rPr>
-          <w:rFonts w:ascii="Calibri" w:hAnsi="Calibri" w:cs="Calibri"/>
-          <w:b/>
-          <w:bCs/>
-          <w:sz w:val="24"/>
-          <w:szCs w:val="24"/>
+        <w:pStyle w:val="Heading3"/>
+        <w:rPr>
           <w:lang w:val="ru-RU"/>
         </w:rPr>
       </w:pPr>
       <w:r>
-        <w:rPr>
-          <w:rFonts w:ascii="Calibri" w:hAnsi="Calibri" w:cs="Calibri"/>
-          <w:b/>
-          <w:bCs/>
+        <w:t>Included Features</w:t>
+      </w:r>
+    </w:p>
+    <w:p>
+      <w:pPr>
+        <w:rPr>
+          <w:rFonts w:ascii="Calibri" w:hAnsi="Calibri" w:cs="Calibri"/>
+          <w:sz w:val="24"/>
+          <w:szCs w:val="24"/>
+        </w:rPr>
+      </w:pPr>
+      <w:r>
+        <w:rPr>
+          <w:rFonts w:ascii="Calibri" w:hAnsi="Calibri" w:cs="Calibri"/>
+          <w:sz w:val="24"/>
+          <w:szCs w:val="24"/>
+        </w:rPr>
+        <w:t>The system will include the following features:</w:t>
+      </w:r>
+    </w:p>
+    <w:p>
+      <w:pPr>
+        <w:rPr>
+          <w:rFonts w:ascii="Calibri" w:hAnsi="Calibri" w:cs="Calibri"/>
+          <w:sz w:val="24"/>
+          <w:szCs w:val="24"/>
+        </w:rPr>
+      </w:pPr>
+      <w:r>
+        <w:rPr>
+          <w:rFonts w:ascii="Calibri" w:hAnsi="Calibri" w:cs="Calibri"/>
+          <w:sz w:val="24"/>
+          <w:szCs w:val="24"/>
+        </w:rPr>
+        <w:t>- User authentication including registration and login</w:t>
+      </w:r>
+    </w:p>
+    <w:p>
+      <w:pPr>
+        <w:rPr>
+          <w:rFonts w:ascii="Calibri" w:hAnsi="Calibri" w:cs="Calibri"/>
+          <w:sz w:val="24"/>
+          <w:szCs w:val="24"/>
+        </w:rPr>
+      </w:pPr>
+      <w:r>
+        <w:rPr>
+          <w:rFonts w:ascii="Calibri" w:hAnsi="Calibri" w:cs="Calibri"/>
+          <w:sz w:val="24"/>
+          <w:szCs w:val="24"/>
+        </w:rPr>
+        <w:t xml:space="preserve">- Product </w:t>
+      </w:r>
+      <w:r>
+        <w:rPr>
+          <w:rFonts w:ascii="Calibri" w:hAnsi="Calibri" w:cs="Calibri"/>
+          <w:sz w:val="24"/>
+          <w:szCs w:val="24"/>
+        </w:rPr>
+        <w:t>catalogue</w:t>
+      </w:r>
+      <w:r>
+        <w:rPr>
+          <w:rFonts w:ascii="Calibri" w:hAnsi="Calibri" w:cs="Calibri"/>
+          <w:sz w:val="24"/>
+          <w:szCs w:val="24"/>
+        </w:rPr>
+        <w:t xml:space="preserve"> browsing for customers</w:t>
+      </w:r>
+    </w:p>
+    <w:p>
+      <w:pPr>
+        <w:rPr>
+          <w:rFonts w:ascii="Calibri" w:hAnsi="Calibri" w:cs="Calibri"/>
+          <w:sz w:val="24"/>
+          <w:szCs w:val="24"/>
+        </w:rPr>
+      </w:pPr>
+      <w:r>
+        <w:rPr>
+          <w:rFonts w:ascii="Calibri" w:hAnsi="Calibri" w:cs="Calibri"/>
+          <w:sz w:val="24"/>
+          <w:szCs w:val="24"/>
+        </w:rPr>
+        <w:t>- Product management using CRUD operations</w:t>
+      </w:r>
+    </w:p>
+    <w:p>
+      <w:pPr>
+        <w:rPr>
+          <w:rFonts w:ascii="Calibri" w:hAnsi="Calibri" w:cs="Calibri"/>
+          <w:sz w:val="24"/>
+          <w:szCs w:val="24"/>
+        </w:rPr>
+      </w:pPr>
+      <w:r>
+        <w:rPr>
+          <w:rFonts w:ascii="Calibri" w:hAnsi="Calibri" w:cs="Calibri"/>
+          <w:sz w:val="24"/>
+          <w:szCs w:val="24"/>
+        </w:rPr>
+        <w:t>- Category-based product organization</w:t>
+      </w:r>
+    </w:p>
+    <w:p>
+      <w:pPr>
+        <w:rPr>
+          <w:rFonts w:ascii="Calibri" w:hAnsi="Calibri" w:cs="Calibri"/>
+          <w:sz w:val="24"/>
+          <w:szCs w:val="24"/>
+        </w:rPr>
+      </w:pPr>
+      <w:r>
+        <w:rPr>
+          <w:rFonts w:ascii="Calibri" w:hAnsi="Calibri" w:cs="Calibri"/>
+          <w:sz w:val="24"/>
+          <w:szCs w:val="24"/>
+        </w:rPr>
+        <w:t>- Shopping cart functionality</w:t>
+      </w:r>
+    </w:p>
+    <w:p>
+      <w:pPr>
+        <w:rPr>
+          <w:rFonts w:ascii="Calibri" w:hAnsi="Calibri" w:cs="Calibri"/>
+          <w:sz w:val="24"/>
+          <w:szCs w:val="24"/>
+        </w:rPr>
+      </w:pPr>
+      <w:r>
+        <w:rPr>
+          <w:rFonts w:ascii="Calibri" w:hAnsi="Calibri" w:cs="Calibri"/>
+          <w:sz w:val="24"/>
+          <w:szCs w:val="24"/>
+        </w:rPr>
+        <w:t>- Order creation and order history</w:t>
+      </w:r>
+    </w:p>
+    <w:p>
+      <w:pPr>
+        <w:rPr>
+          <w:rFonts w:ascii="Calibri" w:hAnsi="Calibri" w:cs="Calibri"/>
+          <w:sz w:val="24"/>
+          <w:szCs w:val="24"/>
+        </w:rPr>
+      </w:pPr>
+      <w:r>
+        <w:rPr>
+          <w:rFonts w:ascii="Calibri" w:hAnsi="Calibri" w:cs="Calibri"/>
+          <w:sz w:val="24"/>
+          <w:szCs w:val="24"/>
+        </w:rPr>
+        <w:t>- Form validation on both client side and server side</w:t>
+      </w:r>
+    </w:p>
+    <w:p>
+      <w:pPr>
+        <w:rPr>
+          <w:rFonts w:ascii="Calibri" w:hAnsi="Calibri" w:cs="Calibri"/>
+          <w:sz w:val="24"/>
+          <w:szCs w:val="24"/>
+        </w:rPr>
+      </w:pPr>
+    </w:p>
+    <w:p>
+      <w:pPr>
+        <w:pStyle w:val="Heading3"/>
+      </w:pPr>
+      <w:r>
+        <w:t>Excluded Features</w:t>
+      </w:r>
+    </w:p>
+    <w:p>
+      <w:pPr>
+        <w:rPr>
+          <w:rFonts w:ascii="Calibri" w:hAnsi="Calibri" w:cs="Calibri"/>
+          <w:sz w:val="24"/>
+          <w:szCs w:val="24"/>
+        </w:rPr>
+      </w:pPr>
+      <w:r>
+        <w:rPr>
+          <w:rFonts w:ascii="Calibri" w:hAnsi="Calibri" w:cs="Calibri"/>
           <w:sz w:val="24"/>
           <w:szCs w:val="24"/>
         </w:rPr>
         <w:lastRenderedPageBreak/>
-        <w:t>Included Features</w:t>
-      </w:r>
-    </w:p>
-    <w:p>
-      <w:pPr>
-        <w:rPr>
-          <w:rFonts w:ascii="Calibri" w:hAnsi="Calibri" w:cs="Calibri"/>
-          <w:sz w:val="24"/>
-          <w:szCs w:val="24"/>
-        </w:rPr>
-      </w:pPr>
-      <w:r>
-        <w:rPr>
-          <w:rFonts w:ascii="Calibri" w:hAnsi="Calibri" w:cs="Calibri"/>
-          <w:sz w:val="24"/>
-          <w:szCs w:val="24"/>
-        </w:rPr>
-        <w:t>The system will include the following features:</w:t>
-      </w:r>
-    </w:p>
-    <w:p>
-      <w:pPr>
-        <w:rPr>
-          <w:rFonts w:ascii="Calibri" w:hAnsi="Calibri" w:cs="Calibri"/>
-          <w:sz w:val="24"/>
-          <w:szCs w:val="24"/>
-        </w:rPr>
-      </w:pPr>
-      <w:r>
-        <w:rPr>
-          <w:rFonts w:ascii="Calibri" w:hAnsi="Calibri" w:cs="Calibri"/>
-          <w:sz w:val="24"/>
-          <w:szCs w:val="24"/>
-        </w:rPr>
-        <w:t>- User authentication including registration and login</w:t>
-      </w:r>
-    </w:p>
-    <w:p>
-      <w:pPr>
-        <w:rPr>
-          <w:rFonts w:ascii="Calibri" w:hAnsi="Calibri" w:cs="Calibri"/>
-          <w:sz w:val="24"/>
-          <w:szCs w:val="24"/>
-        </w:rPr>
-      </w:pPr>
-      <w:r>
-        <w:rPr>
-          <w:rFonts w:ascii="Calibri" w:hAnsi="Calibri" w:cs="Calibri"/>
-          <w:sz w:val="24"/>
-          <w:szCs w:val="24"/>
-        </w:rPr>
-        <w:t xml:space="preserve">- Product </w:t>
-      </w:r>
-      <w:proofErr w:type="spellStart"/>
-      <w:r>
-        <w:rPr>
-          <w:rFonts w:ascii="Calibri" w:hAnsi="Calibri" w:cs="Calibri"/>
-          <w:sz w:val="24"/>
-          <w:szCs w:val="24"/>
-        </w:rPr>
-        <w:t>catalog</w:t>
-      </w:r>
-      <w:proofErr w:type="spellEnd"/>
-      <w:r>
-        <w:rPr>
-          <w:rFonts w:ascii="Calibri" w:hAnsi="Calibri" w:cs="Calibri"/>
-          <w:sz w:val="24"/>
-          <w:szCs w:val="24"/>
-        </w:rPr>
-        <w:t xml:space="preserve"> browsing for customers</w:t>
-      </w:r>
-    </w:p>
-    <w:p>
-      <w:pPr>
-        <w:rPr>
-          <w:rFonts w:ascii="Calibri" w:hAnsi="Calibri" w:cs="Calibri"/>
-          <w:sz w:val="24"/>
-          <w:szCs w:val="24"/>
-        </w:rPr>
-      </w:pPr>
-      <w:r>
-        <w:rPr>
-          <w:rFonts w:ascii="Calibri" w:hAnsi="Calibri" w:cs="Calibri"/>
-          <w:sz w:val="24"/>
-          <w:szCs w:val="24"/>
-        </w:rPr>
-        <w:t>- Product management using CRUD operations</w:t>
-      </w:r>
-    </w:p>
-    <w:p>
-      <w:pPr>
-        <w:rPr>
-          <w:rFonts w:ascii="Calibri" w:hAnsi="Calibri" w:cs="Calibri"/>
-          <w:sz w:val="24"/>
-          <w:szCs w:val="24"/>
-        </w:rPr>
-      </w:pPr>
-      <w:r>
-        <w:rPr>
-          <w:rFonts w:ascii="Calibri" w:hAnsi="Calibri" w:cs="Calibri"/>
-          <w:sz w:val="24"/>
-          <w:szCs w:val="24"/>
-        </w:rPr>
-        <w:t>- Category-based product organization</w:t>
-      </w:r>
-    </w:p>
-    <w:p>
-      <w:pPr>
-        <w:rPr>
-          <w:rFonts w:ascii="Calibri" w:hAnsi="Calibri" w:cs="Calibri"/>
-          <w:sz w:val="24"/>
-          <w:szCs w:val="24"/>
-        </w:rPr>
-      </w:pPr>
-      <w:r>
-        <w:rPr>
-          <w:rFonts w:ascii="Calibri" w:hAnsi="Calibri" w:cs="Calibri"/>
-          <w:sz w:val="24"/>
-          <w:szCs w:val="24"/>
-        </w:rPr>
-        <w:t>- Shopping cart functionality</w:t>
-      </w:r>
-    </w:p>
-    <w:p>
-      <w:pPr>
-        <w:rPr>
-          <w:rFonts w:ascii="Calibri" w:hAnsi="Calibri" w:cs="Calibri"/>
-          <w:sz w:val="24"/>
-          <w:szCs w:val="24"/>
-        </w:rPr>
-      </w:pPr>
-      <w:r>
-        <w:rPr>
-          <w:rFonts w:ascii="Calibri" w:hAnsi="Calibri" w:cs="Calibri"/>
-          <w:sz w:val="24"/>
-          <w:szCs w:val="24"/>
-        </w:rPr>
-        <w:t>- Order creation and order history</w:t>
-      </w:r>
-    </w:p>
-    <w:p>
-      <w:pPr>
-        <w:rPr>
-          <w:rFonts w:ascii="Calibri" w:hAnsi="Calibri" w:cs="Calibri"/>
-          <w:sz w:val="24"/>
-          <w:szCs w:val="24"/>
-        </w:rPr>
-      </w:pPr>
-      <w:r>
-        <w:rPr>
-          <w:rFonts w:ascii="Calibri" w:hAnsi="Calibri" w:cs="Calibri"/>
-          <w:sz w:val="24"/>
-          <w:szCs w:val="24"/>
-        </w:rPr>
-        <w:t>- Form validation on both client side and server side</w:t>
-      </w:r>
-    </w:p>
-    <w:p>
-      <w:pPr>
-        <w:ind w:left="720"/>
-        <w:rPr>
-          <w:rFonts w:ascii="Calibri" w:hAnsi="Calibri" w:cs="Calibri"/>
-          <w:b/>
-          <w:bCs/>
-          <w:sz w:val="24"/>
-          <w:szCs w:val="24"/>
-        </w:rPr>
-      </w:pPr>
-      <w:r>
-        <w:rPr>
-          <w:rFonts w:ascii="Calibri" w:hAnsi="Calibri" w:cs="Calibri"/>
-          <w:b/>
-          <w:bCs/>
-          <w:sz w:val="24"/>
-          <w:szCs w:val="24"/>
-        </w:rPr>
-        <w:t>Excluded Features</w:t>
-      </w:r>
-    </w:p>
-    <w:p>
-      <w:pPr>
-        <w:rPr>
-          <w:rFonts w:ascii="Calibri" w:hAnsi="Calibri" w:cs="Calibri"/>
-          <w:sz w:val="24"/>
-          <w:szCs w:val="24"/>
-        </w:rPr>
-      </w:pPr>
-      <w:r>
-        <w:rPr>
-          <w:rFonts w:ascii="Calibri" w:hAnsi="Calibri" w:cs="Calibri"/>
-          <w:sz w:val="24"/>
-          <w:szCs w:val="24"/>
-        </w:rPr>
         <w:t>To keep the project manageable within the time frame, the following features are excluded:</w:t>
       </w:r>
     </w:p>
@@ -2472,7 +1611,6 @@
           <w:sz w:val="24"/>
           <w:szCs w:val="24"/>
         </w:rPr>
-        <w:lastRenderedPageBreak/>
         <w:t>users</w:t>
       </w:r>
       <w:r>
@@ -2708,6 +1846,7 @@
           <w:sz w:val="24"/>
           <w:szCs w:val="24"/>
         </w:rPr>
+        <w:lastRenderedPageBreak/>
         <w:t xml:space="preserve">price &gt; 0 </w:t>
       </w:r>
     </w:p>
@@ -3098,7 +2237,6 @@
           <w:sz w:val="24"/>
           <w:szCs w:val="24"/>
         </w:rPr>
-        <w:lastRenderedPageBreak/>
         <w:t xml:space="preserve">Cart </w:t>
       </w:r>
     </w:p>
@@ -3274,6 +2412,7 @@
           <w:sz w:val="24"/>
           <w:szCs w:val="24"/>
         </w:rPr>
+        <w:lastRenderedPageBreak/>
         <w:t xml:space="preserve">Views </w:t>
       </w:r>
     </w:p>

</xml_diff>

<commit_message>
add suggested data model section with full ER diagram and table relationships
</commit_message>
<xml_diff>
--- a/docs/Project-planning.docx
+++ b/docs/Project-planning.docx
@@ -206,6 +206,7 @@
       <w:r>
         <w:rPr>
           <w:rFonts w:ascii="Calibri" w:hAnsi="Calibri" w:cs="Calibri"/>
+          <w:noProof/>
           <w:sz w:val="24"/>
           <w:szCs w:val="24"/>
         </w:rPr>
@@ -274,6 +275,7 @@
       <w:r>
         <w:rPr>
           <w:rFonts w:ascii="Calibri" w:hAnsi="Calibri" w:cs="Calibri"/>
+          <w:noProof/>
           <w:sz w:val="24"/>
           <w:szCs w:val="24"/>
         </w:rPr>
@@ -1554,228 +1556,78 @@
           <w:szCs w:val="24"/>
         </w:rPr>
       </w:pPr>
+      <w:r>
+        <w:rPr>
+          <w:rFonts w:ascii="Calibri" w:hAnsi="Calibri" w:cs="Calibri"/>
+          <w:color w:val="FF0000"/>
+          <w:sz w:val="24"/>
+          <w:szCs w:val="24"/>
+        </w:rPr>
+        <w:br w:type="page"/>
+      </w:r>
     </w:p>
     <w:p>
       <w:pPr>
         <w:pStyle w:val="Heading2"/>
       </w:pPr>
       <w:r>
+        <w:lastRenderedPageBreak/>
         <w:t>7. Suggested Data Model</w:t>
       </w:r>
     </w:p>
     <w:p>
       <w:pPr>
-        <w:ind w:left="720"/>
-        <w:rPr>
-          <w:rFonts w:ascii="Calibri" w:hAnsi="Calibri" w:cs="Calibri"/>
-          <w:color w:val="FF0000"/>
-          <w:sz w:val="24"/>
-          <w:szCs w:val="24"/>
-        </w:rPr>
-      </w:pPr>
-      <w:proofErr w:type="spellStart"/>
-      <w:r>
-        <w:rPr>
-          <w:rFonts w:ascii="Calibri" w:hAnsi="Calibri" w:cs="Calibri"/>
-          <w:color w:val="FF0000"/>
-          <w:sz w:val="24"/>
-          <w:szCs w:val="24"/>
-        </w:rPr>
-        <w:t>Таблицы</w:t>
-      </w:r>
-      <w:proofErr w:type="spellEnd"/>
-      <w:r>
-        <w:rPr>
-          <w:rFonts w:ascii="Calibri" w:hAnsi="Calibri" w:cs="Calibri"/>
-          <w:color w:val="FF0000"/>
-          <w:sz w:val="24"/>
-          <w:szCs w:val="24"/>
-        </w:rPr>
-        <w:t>:</w:t>
-      </w:r>
-    </w:p>
-    <w:p>
-      <w:pPr>
-        <w:ind w:left="720"/>
-        <w:rPr>
-          <w:rFonts w:ascii="Calibri" w:hAnsi="Calibri" w:cs="Calibri"/>
-          <w:color w:val="FF0000"/>
-          <w:sz w:val="24"/>
-          <w:szCs w:val="24"/>
-        </w:rPr>
-      </w:pPr>
-      <w:r>
-        <w:rPr>
-          <w:rFonts w:ascii="Calibri" w:hAnsi="Calibri" w:cs="Calibri"/>
-          <w:color w:val="FF0000"/>
-          <w:sz w:val="24"/>
-          <w:szCs w:val="24"/>
-        </w:rPr>
-        <w:t>users</w:t>
-      </w:r>
-      <w:r>
-        <w:rPr>
-          <w:rFonts w:ascii="Calibri" w:hAnsi="Calibri" w:cs="Calibri"/>
-          <w:color w:val="FF0000"/>
-          <w:sz w:val="24"/>
-          <w:szCs w:val="24"/>
-        </w:rPr>
-        <w:br/>
-        <w:t>roles</w:t>
-      </w:r>
-      <w:r>
-        <w:rPr>
-          <w:rFonts w:ascii="Calibri" w:hAnsi="Calibri" w:cs="Calibri"/>
-          <w:color w:val="FF0000"/>
-          <w:sz w:val="24"/>
-          <w:szCs w:val="24"/>
-        </w:rPr>
-        <w:br/>
-        <w:t>products</w:t>
-      </w:r>
-      <w:r>
-        <w:rPr>
-          <w:rFonts w:ascii="Calibri" w:hAnsi="Calibri" w:cs="Calibri"/>
-          <w:color w:val="FF0000"/>
-          <w:sz w:val="24"/>
-          <w:szCs w:val="24"/>
-        </w:rPr>
-        <w:br/>
-        <w:t>categories</w:t>
-      </w:r>
-      <w:r>
-        <w:rPr>
-          <w:rFonts w:ascii="Calibri" w:hAnsi="Calibri" w:cs="Calibri"/>
-          <w:color w:val="FF0000"/>
-          <w:sz w:val="24"/>
-          <w:szCs w:val="24"/>
-        </w:rPr>
-        <w:br/>
-        <w:t>orders</w:t>
-      </w:r>
-      <w:r>
-        <w:rPr>
-          <w:rFonts w:ascii="Calibri" w:hAnsi="Calibri" w:cs="Calibri"/>
-          <w:color w:val="FF0000"/>
-          <w:sz w:val="24"/>
-          <w:szCs w:val="24"/>
-        </w:rPr>
-        <w:br/>
-      </w:r>
-      <w:proofErr w:type="spellStart"/>
-      <w:r>
-        <w:rPr>
-          <w:rFonts w:ascii="Calibri" w:hAnsi="Calibri" w:cs="Calibri"/>
-          <w:color w:val="FF0000"/>
-          <w:sz w:val="24"/>
-          <w:szCs w:val="24"/>
-        </w:rPr>
-        <w:t>order_items</w:t>
-      </w:r>
-      <w:proofErr w:type="spellEnd"/>
-      <w:r>
-        <w:rPr>
-          <w:rFonts w:ascii="Calibri" w:hAnsi="Calibri" w:cs="Calibri"/>
-          <w:color w:val="FF0000"/>
-          <w:sz w:val="24"/>
-          <w:szCs w:val="24"/>
-        </w:rPr>
-        <w:br/>
-        <w:t>carts</w:t>
-      </w:r>
-      <w:r>
-        <w:rPr>
-          <w:rFonts w:ascii="Calibri" w:hAnsi="Calibri" w:cs="Calibri"/>
-          <w:color w:val="FF0000"/>
-          <w:sz w:val="24"/>
-          <w:szCs w:val="24"/>
-        </w:rPr>
-        <w:br/>
-      </w:r>
-      <w:proofErr w:type="spellStart"/>
-      <w:r>
-        <w:rPr>
-          <w:rFonts w:ascii="Calibri" w:hAnsi="Calibri" w:cs="Calibri"/>
-          <w:color w:val="FF0000"/>
-          <w:sz w:val="24"/>
-          <w:szCs w:val="24"/>
-        </w:rPr>
-        <w:t>cart_items</w:t>
-      </w:r>
-      <w:proofErr w:type="spellEnd"/>
-    </w:p>
-    <w:p>
-      <w:pPr>
-        <w:numPr>
-          <w:ilvl w:val="0"/>
-          <w:numId w:val="5"/>
-        </w:numPr>
-        <w:rPr>
-          <w:rFonts w:ascii="Calibri" w:hAnsi="Calibri" w:cs="Calibri"/>
-          <w:color w:val="FF0000"/>
-          <w:sz w:val="24"/>
-          <w:szCs w:val="24"/>
-        </w:rPr>
-      </w:pPr>
-      <w:proofErr w:type="spellStart"/>
-      <w:r>
-        <w:rPr>
-          <w:rFonts w:ascii="Calibri" w:hAnsi="Calibri" w:cs="Calibri"/>
-          <w:color w:val="FF0000"/>
-          <w:sz w:val="24"/>
-          <w:szCs w:val="24"/>
-        </w:rPr>
-        <w:t>связи</w:t>
-      </w:r>
-      <w:proofErr w:type="spellEnd"/>
-      <w:r>
-        <w:rPr>
-          <w:rFonts w:ascii="Calibri" w:hAnsi="Calibri" w:cs="Calibri"/>
-          <w:color w:val="FF0000"/>
-          <w:sz w:val="24"/>
-          <w:szCs w:val="24"/>
-        </w:rPr>
-        <w:t xml:space="preserve"> </w:t>
-      </w:r>
-      <w:proofErr w:type="spellStart"/>
-      <w:r>
-        <w:rPr>
-          <w:rFonts w:ascii="Calibri" w:hAnsi="Calibri" w:cs="Calibri"/>
-          <w:color w:val="FF0000"/>
-          <w:sz w:val="24"/>
-          <w:szCs w:val="24"/>
-        </w:rPr>
-        <w:t>между</w:t>
-      </w:r>
-      <w:proofErr w:type="spellEnd"/>
-      <w:r>
-        <w:rPr>
-          <w:rFonts w:ascii="Calibri" w:hAnsi="Calibri" w:cs="Calibri"/>
-          <w:color w:val="FF0000"/>
-          <w:sz w:val="24"/>
-          <w:szCs w:val="24"/>
-        </w:rPr>
-        <w:t xml:space="preserve"> </w:t>
-      </w:r>
-      <w:proofErr w:type="spellStart"/>
-      <w:r>
-        <w:rPr>
-          <w:rFonts w:ascii="Calibri" w:hAnsi="Calibri" w:cs="Calibri"/>
-          <w:color w:val="FF0000"/>
-          <w:sz w:val="24"/>
-          <w:szCs w:val="24"/>
-        </w:rPr>
-        <w:t>ними</w:t>
-      </w:r>
-      <w:proofErr w:type="spellEnd"/>
-      <w:r>
-        <w:rPr>
-          <w:rFonts w:ascii="Calibri" w:hAnsi="Calibri" w:cs="Calibri"/>
-          <w:color w:val="FF0000"/>
-          <w:sz w:val="24"/>
-          <w:szCs w:val="24"/>
-        </w:rPr>
-        <w:t xml:space="preserve"> </w:t>
+        <w:rPr>
+          <w:rFonts w:ascii="Calibri" w:hAnsi="Calibri" w:cs="Calibri"/>
+          <w:color w:val="FF0000"/>
+          <w:sz w:val="24"/>
+          <w:szCs w:val="24"/>
+          <w:lang w:val="ru-RU"/>
+        </w:rPr>
+      </w:pPr>
+      <w:r>
+        <w:rPr>
+          <w:rFonts w:ascii="Calibri" w:hAnsi="Calibri" w:cs="Calibri"/>
+          <w:color w:val="FF0000"/>
+          <w:sz w:val="24"/>
+          <w:szCs w:val="24"/>
+          <w:lang w:val="ru-RU"/>
+        </w:rPr>
+        <w:drawing>
+          <wp:inline distT="0" distB="0" distL="0" distR="0" wp14:anchorId="4D0C8565" wp14:editId="615A3859">
+            <wp:extent cx="5928360" cy="6509636"/>
+            <wp:effectExtent l="0" t="0" r="2540" b="5715"/>
+            <wp:docPr id="1316320703" name="Picture 1"/>
+            <wp:cNvGraphicFramePr>
+              <a:graphicFrameLocks xmlns:a="http://schemas.openxmlformats.org/drawingml/2006/main" noChangeAspect="1"/>
+            </wp:cNvGraphicFramePr>
+            <a:graphic xmlns:a="http://schemas.openxmlformats.org/drawingml/2006/main">
+              <a:graphicData uri="http://schemas.openxmlformats.org/drawingml/2006/picture">
+                <pic:pic xmlns:pic="http://schemas.openxmlformats.org/drawingml/2006/picture">
+                  <pic:nvPicPr>
+                    <pic:cNvPr id="1316320703" name=""/>
+                    <pic:cNvPicPr/>
+                  </pic:nvPicPr>
+                  <pic:blipFill>
+                    <a:blip r:embed="rId10"/>
+                    <a:stretch>
+                      <a:fillRect/>
+                    </a:stretch>
+                  </pic:blipFill>
+                  <pic:spPr>
+                    <a:xfrm>
+                      <a:off x="0" y="0"/>
+                      <a:ext cx="5933161" cy="6514908"/>
+                    </a:xfrm>
+                    <a:prstGeom prst="rect">
+                      <a:avLst/>
+                    </a:prstGeom>
+                  </pic:spPr>
+                </pic:pic>
+              </a:graphicData>
+            </a:graphic>
+          </wp:inline>
+        </w:drawing>
       </w:r>
     </w:p>
     <w:p>
@@ -1846,7 +1698,6 @@
           <w:sz w:val="24"/>
           <w:szCs w:val="24"/>
         </w:rPr>
-        <w:lastRenderedPageBreak/>
         <w:t xml:space="preserve">price &gt; 0 </w:t>
       </w:r>
     </w:p>
@@ -1893,6 +1744,7 @@
           <w:sz w:val="24"/>
           <w:szCs w:val="24"/>
         </w:rPr>
+        <w:lastRenderedPageBreak/>
         <w:t xml:space="preserve">email unique </w:t>
       </w:r>
     </w:p>
@@ -2412,7 +2264,6 @@
           <w:sz w:val="24"/>
           <w:szCs w:val="24"/>
         </w:rPr>
-        <w:lastRenderedPageBreak/>
         <w:t xml:space="preserve">Views </w:t>
       </w:r>
     </w:p>
@@ -2459,6 +2310,7 @@
           <w:sz w:val="24"/>
           <w:szCs w:val="24"/>
         </w:rPr>
+        <w:lastRenderedPageBreak/>
         <w:t>Middleware</w:t>
       </w:r>
     </w:p>

</xml_diff>